<commit_message>
Update Word report with boundary results
</commit_message>
<xml_diff>
--- a/reports/weedmap_progress_report.docx
+++ b/reports/weedmap_progress_report.docx
@@ -199,7 +199,7 @@
                 <w:rFonts w:ascii="Arial" w:hAnsi="Arial" w:eastAsia="Arial Unicode MS"/>
                 <w:sz w:val="19"/>
               </w:rPr>
-              <w:t>Synthetic 与真实 WeedMap 实验完成，已完成严格公平输入对比、best checkpoint 验证、类别权重调参、20 epochs 与多 seed loss 对比</w:t>
+              <w:t>Synthetic 与真实 WeedMap 实验完成，已完成严格公平输入对比、best checkpoint 验证、类别权重调参、20 epochs、多 seed loss 对比及边界误差分析</w:t>
             </w:r>
           </w:p>
         </w:tc>
@@ -277,7 +277,7 @@
           <w:color w:val="2F5597"/>
           <w:sz w:val="22"/>
         </w:rPr>
-        <w:t>阶段结论  稳定 baseline 的 Mean IoU 为 74.78% ± 0.82%，Weed IoU 为 56.89% ± 2.06%</w:t>
+        <w:t>阶段结论  Boundary weighted CE 的 Mean IoU 为 75.08% ± 1.10%，Weed IoU 为 57.66% ± 1.58%；Weighted CE 为稳定 baseline</w:t>
       </w:r>
     </w:p>
     <w:p>
@@ -1387,7 +1387,7 @@
                 <w:color w:val="000000"/>
                 <w:sz w:val="20"/>
               </w:rPr>
-              <w:t>真实预测可视化与误差分析</w:t>
+              <w:t>Boundary error analysis 与 boundary weighted CE</w:t>
             </w:r>
           </w:p>
         </w:tc>
@@ -1445,7 +1445,7 @@
                 <w:color w:val="000000"/>
                 <w:sz w:val="20"/>
               </w:rPr>
-              <w:t>关键指标和变量解释</w:t>
+              <w:t>真实预测可视化与误差分析</w:t>
             </w:r>
           </w:p>
         </w:tc>
@@ -1501,7 +1501,7 @@
                 <w:color w:val="000000"/>
                 <w:sz w:val="20"/>
               </w:rPr>
-              <w:t>当前结论</w:t>
+              <w:t>关键指标和变量解释</w:t>
             </w:r>
           </w:p>
         </w:tc>
@@ -1559,7 +1559,7 @@
                 <w:color w:val="000000"/>
                 <w:sz w:val="20"/>
               </w:rPr>
-              <w:t>下一步计划</w:t>
+              <w:t>当前结论</w:t>
             </w:r>
           </w:p>
         </w:tc>
@@ -1601,6 +1601,64 @@
               <w:bottom w:w="70" w:type="dxa"/>
               <w:end w:w="100" w:type="dxa"/>
             </w:tcMar>
+            <w:vAlign w:val="center"/>
+          </w:tcPr>
+          <w:p>
+            <w:pPr>
+              <w:spacing w:after="0"/>
+              <w:jc w:val="left"/>
+            </w:pPr>
+            <w:r>
+              <w:rPr>
+                <w:rFonts w:ascii="Arial" w:hAnsi="Arial" w:eastAsia="Arial Unicode MS"/>
+                <w:b w:val="0"/>
+                <w:color w:val="000000"/>
+                <w:sz w:val="20"/>
+              </w:rPr>
+              <w:t>下一步计划</w:t>
+            </w:r>
+          </w:p>
+        </w:tc>
+      </w:tr>
+      <w:tr>
+        <w:tc>
+          <w:tcPr>
+            <w:tcW w:type="dxa" w:w="737"/>
+            <w:tcMar>
+              <w:top w:w="70" w:type="dxa"/>
+              <w:start w:w="100" w:type="dxa"/>
+              <w:bottom w:w="70" w:type="dxa"/>
+              <w:end w:w="100" w:type="dxa"/>
+            </w:tcMar>
+            <w:shd w:fill="F5F7FA"/>
+            <w:vAlign w:val="center"/>
+          </w:tcPr>
+          <w:p>
+            <w:pPr>
+              <w:spacing w:after="0"/>
+              <w:jc w:val="center"/>
+            </w:pPr>
+            <w:r>
+              <w:rPr>
+                <w:rFonts w:ascii="Arial" w:hAnsi="Arial" w:eastAsia="Hiragino Sans GB"/>
+                <w:b/>
+                <w:color w:val="2F5597"/>
+                <w:sz w:val="20"/>
+              </w:rPr>
+              <w:t>24</w:t>
+            </w:r>
+          </w:p>
+        </w:tc>
+        <w:tc>
+          <w:tcPr>
+            <w:tcW w:type="dxa" w:w="8220"/>
+            <w:tcMar>
+              <w:top w:w="70" w:type="dxa"/>
+              <w:start w:w="100" w:type="dxa"/>
+              <w:bottom w:w="70" w:type="dxa"/>
+              <w:end w:w="100" w:type="dxa"/>
+            </w:tcMar>
+            <w:shd w:fill="F5F7FA"/>
             <w:vAlign w:val="center"/>
           </w:tcPr>
           <w:p>
@@ -2618,7 +2676,7 @@
         <w:rPr>
           <w:rFonts w:ascii="Arial" w:hAnsi="Arial" w:eastAsia="Arial Unicode MS"/>
         </w:rPr>
-        <w:t>当前已完成真实预测可视化、严格公平 RGB 与 multispectral 对比、best checkpoint 验证、weed class weight 调参、20 epochs 多 seed 重复和三种 loss 的多 seed 对比。</w:t>
+        <w:t>当前已完成真实预测可视化、严格公平 RGB 与 multispectral 对比、best checkpoint 验证、weed class weight 调参、20 epochs 多 seed 重复、三种 loss 的多 seed 对比，以及边界误差分析和 boundary weighted CE 实验。</w:t>
       </w:r>
     </w:p>
     <w:p>
@@ -19561,8 +19619,15 @@
       <w:r>
         <w:rPr>
           <w:rFonts w:ascii="Arial" w:hAnsi="Arial" w:eastAsia="Arial Unicode MS"/>
+          <w:b/>
         </w:rPr>
-        <w:t>当前最稳定 baseline 是 multispectral + weighted CE + class weights 1/4/8 + 20 epochs + best checkpoint。主结果为 Pixel Accuracy = 96.38% ± 0.36%，Mean IoU = 74.78% ± 0.82%，Weed IoU = 56.89% ± 2.06%（均值 ± 样本标准差）。</w:t>
+        <w:t>阶段结论：</w:t>
+      </w:r>
+      <w:r>
+        <w:rPr>
+          <w:rFonts w:ascii="Arial" w:hAnsi="Arial" w:eastAsia="Arial Unicode MS"/>
+        </w:rPr>
+        <w:t>在这三种 loss 中，Weighted CE 是稳定 baseline：multispectral + class weights 1/4/8 + 20 epochs + best checkpoint。其 Pixel Accuracy = 96.38% ± 0.36%，Mean IoU = 74.78% ± 0.82%，Weed IoU = 56.89% ± 2.06%（均值 ± 样本标准差）。</w:t>
       </w:r>
     </w:p>
     <w:p>
@@ -19576,7 +19641,2511 @@
           <w:b/>
           <w:color w:val="000000"/>
         </w:rPr>
-        <w:t>19 真实预测可视化与误差分析</w:t>
+        <w:t>19 Boundary error analysis 与 boundary weighted CE</w:t>
+      </w:r>
+    </w:p>
+    <w:p>
+      <w:pPr>
+        <w:pStyle w:val="Heading2"/>
+        <w:keepNext/>
+      </w:pPr>
+      <w:r>
+        <w:rPr>
+          <w:rFonts w:ascii="Arial" w:hAnsi="Arial" w:eastAsia="Hiragino Sans GB"/>
+          <w:b/>
+          <w:color w:val="000000"/>
+        </w:rPr>
+        <w:t>19.1 问题观察与边界误差定位</w:t>
+      </w:r>
+    </w:p>
+    <w:p>
+      <w:pPr>
+        <w:ind w:firstLine="420"/>
+      </w:pPr>
+      <w:r>
+        <w:rPr>
+          <w:rFonts w:ascii="Arial" w:hAnsi="Arial" w:eastAsia="Arial Unicode MS"/>
+        </w:rPr>
+        <w:t>预测图和 error map 显示，错误主要集中在 crop/weed 轮廓附近。当前 U-Net 已有 encoder-decoder skip connection，并通过 concat 融合特征；但边界仍是分割的主要难点。因此先量化边界误差，再尝试让训练损失更关注边界像素。</w:t>
+      </w:r>
+    </w:p>
+    <w:p>
+      <w:pPr>
+        <w:ind w:firstLine="420"/>
+      </w:pPr>
+      <w:r>
+        <w:rPr>
+          <w:rFonts w:ascii="Arial" w:hAnsi="Arial" w:eastAsia="Arial Unicode MS"/>
+        </w:rPr>
+        <w:t>对 Weighted CE 20 epochs best checkpoint 的 sample index=0 进行统计：5px 边界区域占有效像素的 34.06%，却包含 95.18% 的错误。边界内错误率为 14.48%，边界外仅为 0.38%，说明错误集中在边界，而非大面积内部区域。</w:t>
+      </w:r>
+    </w:p>
+    <w:tbl>
+      <w:tblPr>
+        <w:tblW w:type="auto" w:w="0"/>
+        <w:jc w:val="center"/>
+        <w:tblLayout w:type="fixed"/>
+        <w:tblLook w:firstColumn="1" w:firstRow="1" w:lastColumn="0" w:lastRow="0" w:noHBand="0" w:noVBand="1" w:val="04A0"/>
+        <w:tblBorders>
+          <w:top w:val="single" w:sz="5" w:space="0" w:color="D9E1E8"/>
+          <w:left w:val="single" w:sz="5" w:space="0" w:color="D9E1E8"/>
+          <w:bottom w:val="single" w:sz="5" w:space="0" w:color="D9E1E8"/>
+          <w:right w:val="single" w:sz="5" w:space="0" w:color="D9E1E8"/>
+          <w:insideH w:val="single" w:sz="5" w:space="0" w:color="D9E1E8"/>
+          <w:insideV w:val="single" w:sz="5" w:space="0" w:color="D9E1E8"/>
+        </w:tblBorders>
+      </w:tblPr>
+      <w:tblGrid>
+        <w:gridCol w:w="2948"/>
+        <w:gridCol w:w="3005"/>
+        <w:gridCol w:w="3005"/>
+      </w:tblGrid>
+      <w:tr>
+        <w:trPr>
+          <w:tblHeader w:val="true"/>
+          <w:cantSplit/>
+        </w:trPr>
+        <w:tc>
+          <w:tcPr>
+            <w:tcW w:type="dxa" w:w="2948"/>
+            <w:shd w:fill="17365D"/>
+            <w:vAlign w:val="center"/>
+            <w:tcMar>
+              <w:top w:w="90" w:type="dxa"/>
+              <w:start w:w="100" w:type="dxa"/>
+              <w:bottom w:w="90" w:type="dxa"/>
+              <w:end w:w="100" w:type="dxa"/>
+            </w:tcMar>
+          </w:tcPr>
+          <w:p>
+            <w:pPr>
+              <w:spacing w:after="0" w:line="252" w:lineRule="auto"/>
+              <w:jc w:val="center"/>
+            </w:pPr>
+            <w:r>
+              <w:rPr>
+                <w:rFonts w:ascii="Arial" w:hAnsi="Arial" w:eastAsia="Hiragino Sans GB"/>
+                <w:b/>
+                <w:color w:val="FFFFFF"/>
+                <w:sz w:val="17"/>
+              </w:rPr>
+              <w:t>Weighted CE：sample index=0</w:t>
+            </w:r>
+          </w:p>
+        </w:tc>
+        <w:tc>
+          <w:tcPr>
+            <w:tcW w:type="dxa" w:w="3005"/>
+            <w:shd w:fill="17365D"/>
+            <w:vAlign w:val="center"/>
+            <w:tcMar>
+              <w:top w:w="90" w:type="dxa"/>
+              <w:start w:w="100" w:type="dxa"/>
+              <w:bottom w:w="90" w:type="dxa"/>
+              <w:end w:w="100" w:type="dxa"/>
+            </w:tcMar>
+          </w:tcPr>
+          <w:p>
+            <w:pPr>
+              <w:spacing w:after="0" w:line="252" w:lineRule="auto"/>
+              <w:jc w:val="center"/>
+            </w:pPr>
+            <w:r>
+              <w:rPr>
+                <w:rFonts w:ascii="Arial" w:hAnsi="Arial" w:eastAsia="Hiragino Sans GB"/>
+                <w:b/>
+                <w:color w:val="FFFFFF"/>
+                <w:sz w:val="17"/>
+              </w:rPr>
+              <w:t>5px 边界内</w:t>
+            </w:r>
+          </w:p>
+        </w:tc>
+        <w:tc>
+          <w:tcPr>
+            <w:tcW w:type="dxa" w:w="3005"/>
+            <w:shd w:fill="17365D"/>
+            <w:vAlign w:val="center"/>
+            <w:tcMar>
+              <w:top w:w="90" w:type="dxa"/>
+              <w:start w:w="100" w:type="dxa"/>
+              <w:bottom w:w="90" w:type="dxa"/>
+              <w:end w:w="100" w:type="dxa"/>
+            </w:tcMar>
+          </w:tcPr>
+          <w:p>
+            <w:pPr>
+              <w:spacing w:after="0" w:line="252" w:lineRule="auto"/>
+              <w:jc w:val="center"/>
+            </w:pPr>
+            <w:r>
+              <w:rPr>
+                <w:rFonts w:ascii="Arial" w:hAnsi="Arial" w:eastAsia="Hiragino Sans GB"/>
+                <w:b/>
+                <w:color w:val="FFFFFF"/>
+                <w:sz w:val="17"/>
+              </w:rPr>
+              <w:t>5px 边界外</w:t>
+            </w:r>
+          </w:p>
+        </w:tc>
+      </w:tr>
+      <w:tr>
+        <w:trPr>
+          <w:cantSplit/>
+        </w:trPr>
+        <w:tc>
+          <w:tcPr>
+            <w:tcW w:type="dxa" w:w="2948"/>
+            <w:vAlign w:val="center"/>
+            <w:tcMar>
+              <w:top w:w="90" w:type="dxa"/>
+              <w:start w:w="100" w:type="dxa"/>
+              <w:bottom w:w="90" w:type="dxa"/>
+              <w:end w:w="100" w:type="dxa"/>
+            </w:tcMar>
+          </w:tcPr>
+          <w:p>
+            <w:pPr>
+              <w:spacing w:after="0" w:line="252" w:lineRule="auto"/>
+              <w:jc w:val="left"/>
+            </w:pPr>
+            <w:r>
+              <w:rPr>
+                <w:rFonts w:ascii="Arial" w:hAnsi="Arial" w:eastAsia="Arial Unicode MS"/>
+                <w:sz w:val="17"/>
+              </w:rPr>
+              <w:t>错误像素</w:t>
+            </w:r>
+          </w:p>
+        </w:tc>
+        <w:tc>
+          <w:tcPr>
+            <w:tcW w:type="dxa" w:w="3005"/>
+            <w:vAlign w:val="center"/>
+            <w:tcMar>
+              <w:top w:w="90" w:type="dxa"/>
+              <w:start w:w="100" w:type="dxa"/>
+              <w:bottom w:w="90" w:type="dxa"/>
+              <w:end w:w="100" w:type="dxa"/>
+            </w:tcMar>
+          </w:tcPr>
+          <w:p>
+            <w:pPr>
+              <w:spacing w:after="0" w:line="252" w:lineRule="auto"/>
+              <w:jc w:val="center"/>
+            </w:pPr>
+            <w:r>
+              <w:rPr>
+                <w:rFonts w:ascii="Arial" w:hAnsi="Arial" w:eastAsia="Arial Unicode MS"/>
+                <w:sz w:val="17"/>
+              </w:rPr>
+              <w:t>5532（占全部错误 95.18%）</w:t>
+            </w:r>
+          </w:p>
+        </w:tc>
+        <w:tc>
+          <w:tcPr>
+            <w:tcW w:type="dxa" w:w="3005"/>
+            <w:vAlign w:val="center"/>
+            <w:tcMar>
+              <w:top w:w="90" w:type="dxa"/>
+              <w:start w:w="100" w:type="dxa"/>
+              <w:bottom w:w="90" w:type="dxa"/>
+              <w:end w:w="100" w:type="dxa"/>
+            </w:tcMar>
+          </w:tcPr>
+          <w:p>
+            <w:pPr>
+              <w:spacing w:after="0" w:line="252" w:lineRule="auto"/>
+              <w:jc w:val="center"/>
+            </w:pPr>
+            <w:r>
+              <w:rPr>
+                <w:rFonts w:ascii="Arial" w:hAnsi="Arial" w:eastAsia="Arial Unicode MS"/>
+                <w:sz w:val="17"/>
+              </w:rPr>
+              <w:t>280（占全部错误 4.82%）</w:t>
+            </w:r>
+          </w:p>
+        </w:tc>
+      </w:tr>
+      <w:tr>
+        <w:trPr>
+          <w:cantSplit/>
+        </w:trPr>
+        <w:tc>
+          <w:tcPr>
+            <w:tcW w:type="dxa" w:w="2948"/>
+            <w:vAlign w:val="center"/>
+            <w:tcMar>
+              <w:top w:w="90" w:type="dxa"/>
+              <w:start w:w="100" w:type="dxa"/>
+              <w:bottom w:w="90" w:type="dxa"/>
+              <w:end w:w="100" w:type="dxa"/>
+            </w:tcMar>
+            <w:shd w:fill="F5F7FA"/>
+          </w:tcPr>
+          <w:p>
+            <w:pPr>
+              <w:spacing w:after="0" w:line="252" w:lineRule="auto"/>
+              <w:jc w:val="left"/>
+            </w:pPr>
+            <w:r>
+              <w:rPr>
+                <w:rFonts w:ascii="Arial" w:hAnsi="Arial" w:eastAsia="Arial Unicode MS"/>
+                <w:sz w:val="17"/>
+              </w:rPr>
+              <w:t>错误率</w:t>
+            </w:r>
+          </w:p>
+        </w:tc>
+        <w:tc>
+          <w:tcPr>
+            <w:tcW w:type="dxa" w:w="3005"/>
+            <w:vAlign w:val="center"/>
+            <w:tcMar>
+              <w:top w:w="90" w:type="dxa"/>
+              <w:start w:w="100" w:type="dxa"/>
+              <w:bottom w:w="90" w:type="dxa"/>
+              <w:end w:w="100" w:type="dxa"/>
+            </w:tcMar>
+            <w:shd w:fill="F5F7FA"/>
+          </w:tcPr>
+          <w:p>
+            <w:pPr>
+              <w:spacing w:after="0" w:line="252" w:lineRule="auto"/>
+              <w:jc w:val="center"/>
+            </w:pPr>
+            <w:r>
+              <w:rPr>
+                <w:rFonts w:ascii="Arial" w:hAnsi="Arial" w:eastAsia="Arial Unicode MS"/>
+                <w:sz w:val="17"/>
+              </w:rPr>
+              <w:t>14.48%</w:t>
+            </w:r>
+          </w:p>
+        </w:tc>
+        <w:tc>
+          <w:tcPr>
+            <w:tcW w:type="dxa" w:w="3005"/>
+            <w:vAlign w:val="center"/>
+            <w:tcMar>
+              <w:top w:w="90" w:type="dxa"/>
+              <w:start w:w="100" w:type="dxa"/>
+              <w:bottom w:w="90" w:type="dxa"/>
+              <w:end w:w="100" w:type="dxa"/>
+            </w:tcMar>
+            <w:shd w:fill="F5F7FA"/>
+          </w:tcPr>
+          <w:p>
+            <w:pPr>
+              <w:spacing w:after="0" w:line="252" w:lineRule="auto"/>
+              <w:jc w:val="center"/>
+            </w:pPr>
+            <w:r>
+              <w:rPr>
+                <w:rFonts w:ascii="Arial" w:hAnsi="Arial" w:eastAsia="Arial Unicode MS"/>
+                <w:sz w:val="17"/>
+              </w:rPr>
+              <w:t>0.38%</w:t>
+            </w:r>
+          </w:p>
+        </w:tc>
+      </w:tr>
+    </w:tbl>
+    <w:p>
+      <w:pPr>
+        <w:spacing w:after="20"/>
+      </w:pPr>
+    </w:p>
+    <w:p>
+      <w:pPr>
+        <w:pStyle w:val="Heading2"/>
+        <w:keepNext/>
+      </w:pPr>
+      <w:r>
+        <w:rPr>
+          <w:rFonts w:ascii="Arial" w:hAnsi="Arial" w:eastAsia="Hiragino Sans GB"/>
+          <w:b/>
+          <w:color w:val="000000"/>
+        </w:rPr>
+        <w:t>19.2 Boundary weighted CE 设置与多 seed 结果</w:t>
+      </w:r>
+    </w:p>
+    <w:p>
+      <w:pPr>
+        <w:ind w:firstLine="420"/>
+      </w:pPr>
+      <w:r>
+        <w:rPr>
+          <w:rFonts w:ascii="Arial" w:hAnsi="Arial" w:eastAsia="Arial Unicode MS"/>
+        </w:rPr>
+        <w:t>在 Weighted CE 的类别权重基础上，对边界附近像素提高损失权重：boundary radius=5、boundary weight=3.0。保持 multispectral 输入、20 epochs、batch size=2、相同样本列表 splits/real_weedmap_common_samples.csv 和 best checkpoint 选择规则，运行 seed 0/1/2。</w:t>
+      </w:r>
+    </w:p>
+    <w:tbl>
+      <w:tblPr>
+        <w:tblW w:type="auto" w:w="0"/>
+        <w:jc w:val="center"/>
+        <w:tblLayout w:type="fixed"/>
+        <w:tblLook w:firstColumn="1" w:firstRow="1" w:lastColumn="0" w:lastRow="0" w:noHBand="0" w:noVBand="1" w:val="04A0"/>
+        <w:tblBorders>
+          <w:top w:val="single" w:sz="5" w:space="0" w:color="D9E1E8"/>
+          <w:left w:val="single" w:sz="5" w:space="0" w:color="D9E1E8"/>
+          <w:bottom w:val="single" w:sz="5" w:space="0" w:color="D9E1E8"/>
+          <w:right w:val="single" w:sz="5" w:space="0" w:color="D9E1E8"/>
+          <w:insideH w:val="single" w:sz="5" w:space="0" w:color="D9E1E8"/>
+          <w:insideV w:val="single" w:sz="5" w:space="0" w:color="D9E1E8"/>
+        </w:tblBorders>
+      </w:tblPr>
+      <w:tblGrid>
+        <w:gridCol w:w="680"/>
+        <w:gridCol w:w="1134"/>
+        <w:gridCol w:w="1304"/>
+        <w:gridCol w:w="1304"/>
+        <w:gridCol w:w="1814"/>
+        <w:gridCol w:w="1361"/>
+        <w:gridCol w:w="1361"/>
+      </w:tblGrid>
+      <w:tr>
+        <w:trPr>
+          <w:tblHeader w:val="true"/>
+          <w:cantSplit/>
+        </w:trPr>
+        <w:tc>
+          <w:tcPr>
+            <w:tcW w:type="dxa" w:w="680"/>
+            <w:shd w:fill="17365D"/>
+            <w:vAlign w:val="center"/>
+            <w:tcMar>
+              <w:top w:w="90" w:type="dxa"/>
+              <w:start w:w="100" w:type="dxa"/>
+              <w:bottom w:w="90" w:type="dxa"/>
+              <w:end w:w="100" w:type="dxa"/>
+            </w:tcMar>
+          </w:tcPr>
+          <w:p>
+            <w:pPr>
+              <w:spacing w:after="0" w:line="252" w:lineRule="auto"/>
+              <w:jc w:val="center"/>
+            </w:pPr>
+            <w:r>
+              <w:rPr>
+                <w:rFonts w:ascii="Arial" w:hAnsi="Arial" w:eastAsia="Hiragino Sans GB"/>
+                <w:b/>
+                <w:color w:val="FFFFFF"/>
+                <w:sz w:val="15"/>
+              </w:rPr>
+              <w:t>Seed</w:t>
+            </w:r>
+          </w:p>
+        </w:tc>
+        <w:tc>
+          <w:tcPr>
+            <w:tcW w:type="dxa" w:w="1134"/>
+            <w:shd w:fill="17365D"/>
+            <w:vAlign w:val="center"/>
+            <w:tcMar>
+              <w:top w:w="90" w:type="dxa"/>
+              <w:start w:w="100" w:type="dxa"/>
+              <w:bottom w:w="90" w:type="dxa"/>
+              <w:end w:w="100" w:type="dxa"/>
+            </w:tcMar>
+          </w:tcPr>
+          <w:p>
+            <w:pPr>
+              <w:spacing w:after="0" w:line="252" w:lineRule="auto"/>
+              <w:jc w:val="center"/>
+            </w:pPr>
+            <w:r>
+              <w:rPr>
+                <w:rFonts w:ascii="Arial" w:hAnsi="Arial" w:eastAsia="Hiragino Sans GB"/>
+                <w:b/>
+                <w:color w:val="FFFFFF"/>
+                <w:sz w:val="15"/>
+              </w:rPr>
+              <w:t>Best Epoch</w:t>
+            </w:r>
+          </w:p>
+        </w:tc>
+        <w:tc>
+          <w:tcPr>
+            <w:tcW w:type="dxa" w:w="1304"/>
+            <w:shd w:fill="17365D"/>
+            <w:vAlign w:val="center"/>
+            <w:tcMar>
+              <w:top w:w="90" w:type="dxa"/>
+              <w:start w:w="100" w:type="dxa"/>
+              <w:bottom w:w="90" w:type="dxa"/>
+              <w:end w:w="100" w:type="dxa"/>
+            </w:tcMar>
+          </w:tcPr>
+          <w:p>
+            <w:pPr>
+              <w:spacing w:after="0" w:line="252" w:lineRule="auto"/>
+              <w:jc w:val="center"/>
+            </w:pPr>
+            <w:r>
+              <w:rPr>
+                <w:rFonts w:ascii="Arial" w:hAnsi="Arial" w:eastAsia="Hiragino Sans GB"/>
+                <w:b/>
+                <w:color w:val="FFFFFF"/>
+                <w:sz w:val="15"/>
+              </w:rPr>
+              <w:t>Pixel Acc</w:t>
+            </w:r>
+          </w:p>
+        </w:tc>
+        <w:tc>
+          <w:tcPr>
+            <w:tcW w:type="dxa" w:w="1304"/>
+            <w:shd w:fill="17365D"/>
+            <w:vAlign w:val="center"/>
+            <w:tcMar>
+              <w:top w:w="90" w:type="dxa"/>
+              <w:start w:w="100" w:type="dxa"/>
+              <w:bottom w:w="90" w:type="dxa"/>
+              <w:end w:w="100" w:type="dxa"/>
+            </w:tcMar>
+          </w:tcPr>
+          <w:p>
+            <w:pPr>
+              <w:spacing w:after="0" w:line="252" w:lineRule="auto"/>
+              <w:jc w:val="center"/>
+            </w:pPr>
+            <w:r>
+              <w:rPr>
+                <w:rFonts w:ascii="Arial" w:hAnsi="Arial" w:eastAsia="Hiragino Sans GB"/>
+                <w:b/>
+                <w:color w:val="FFFFFF"/>
+                <w:sz w:val="15"/>
+              </w:rPr>
+              <w:t>Mean IoU</w:t>
+            </w:r>
+          </w:p>
+        </w:tc>
+        <w:tc>
+          <w:tcPr>
+            <w:tcW w:type="dxa" w:w="1814"/>
+            <w:shd w:fill="17365D"/>
+            <w:vAlign w:val="center"/>
+            <w:tcMar>
+              <w:top w:w="90" w:type="dxa"/>
+              <w:start w:w="100" w:type="dxa"/>
+              <w:bottom w:w="90" w:type="dxa"/>
+              <w:end w:w="100" w:type="dxa"/>
+            </w:tcMar>
+          </w:tcPr>
+          <w:p>
+            <w:pPr>
+              <w:spacing w:after="0" w:line="252" w:lineRule="auto"/>
+              <w:jc w:val="center"/>
+            </w:pPr>
+            <w:r>
+              <w:rPr>
+                <w:rFonts w:ascii="Arial" w:hAnsi="Arial" w:eastAsia="Hiragino Sans GB"/>
+                <w:b/>
+                <w:color w:val="FFFFFF"/>
+                <w:sz w:val="15"/>
+              </w:rPr>
+              <w:t>Background IoU</w:t>
+            </w:r>
+          </w:p>
+        </w:tc>
+        <w:tc>
+          <w:tcPr>
+            <w:tcW w:type="dxa" w:w="1361"/>
+            <w:shd w:fill="17365D"/>
+            <w:vAlign w:val="center"/>
+            <w:tcMar>
+              <w:top w:w="90" w:type="dxa"/>
+              <w:start w:w="100" w:type="dxa"/>
+              <w:bottom w:w="90" w:type="dxa"/>
+              <w:end w:w="100" w:type="dxa"/>
+            </w:tcMar>
+          </w:tcPr>
+          <w:p>
+            <w:pPr>
+              <w:spacing w:after="0" w:line="252" w:lineRule="auto"/>
+              <w:jc w:val="center"/>
+            </w:pPr>
+            <w:r>
+              <w:rPr>
+                <w:rFonts w:ascii="Arial" w:hAnsi="Arial" w:eastAsia="Hiragino Sans GB"/>
+                <w:b/>
+                <w:color w:val="FFFFFF"/>
+                <w:sz w:val="15"/>
+              </w:rPr>
+              <w:t>Crop IoU</w:t>
+            </w:r>
+          </w:p>
+        </w:tc>
+        <w:tc>
+          <w:tcPr>
+            <w:tcW w:type="dxa" w:w="1361"/>
+            <w:shd w:fill="17365D"/>
+            <w:vAlign w:val="center"/>
+            <w:tcMar>
+              <w:top w:w="90" w:type="dxa"/>
+              <w:start w:w="100" w:type="dxa"/>
+              <w:bottom w:w="90" w:type="dxa"/>
+              <w:end w:w="100" w:type="dxa"/>
+            </w:tcMar>
+          </w:tcPr>
+          <w:p>
+            <w:pPr>
+              <w:spacing w:after="0" w:line="252" w:lineRule="auto"/>
+              <w:jc w:val="center"/>
+            </w:pPr>
+            <w:r>
+              <w:rPr>
+                <w:rFonts w:ascii="Arial" w:hAnsi="Arial" w:eastAsia="Hiragino Sans GB"/>
+                <w:b/>
+                <w:color w:val="FFFFFF"/>
+                <w:sz w:val="15"/>
+              </w:rPr>
+              <w:t>Weed IoU</w:t>
+            </w:r>
+          </w:p>
+        </w:tc>
+      </w:tr>
+      <w:tr>
+        <w:trPr>
+          <w:cantSplit/>
+        </w:trPr>
+        <w:tc>
+          <w:tcPr>
+            <w:tcW w:type="dxa" w:w="680"/>
+            <w:vAlign w:val="center"/>
+            <w:tcMar>
+              <w:top w:w="90" w:type="dxa"/>
+              <w:start w:w="100" w:type="dxa"/>
+              <w:bottom w:w="90" w:type="dxa"/>
+              <w:end w:w="100" w:type="dxa"/>
+            </w:tcMar>
+          </w:tcPr>
+          <w:p>
+            <w:pPr>
+              <w:spacing w:after="0" w:line="252" w:lineRule="auto"/>
+              <w:jc w:val="center"/>
+            </w:pPr>
+            <w:r>
+              <w:rPr>
+                <w:rFonts w:ascii="Arial" w:hAnsi="Arial" w:eastAsia="Arial Unicode MS"/>
+                <w:sz w:val="15"/>
+              </w:rPr>
+              <w:t>0</w:t>
+            </w:r>
+          </w:p>
+        </w:tc>
+        <w:tc>
+          <w:tcPr>
+            <w:tcW w:type="dxa" w:w="1134"/>
+            <w:vAlign w:val="center"/>
+            <w:tcMar>
+              <w:top w:w="90" w:type="dxa"/>
+              <w:start w:w="100" w:type="dxa"/>
+              <w:bottom w:w="90" w:type="dxa"/>
+              <w:end w:w="100" w:type="dxa"/>
+            </w:tcMar>
+          </w:tcPr>
+          <w:p>
+            <w:pPr>
+              <w:spacing w:after="0" w:line="252" w:lineRule="auto"/>
+              <w:jc w:val="center"/>
+            </w:pPr>
+            <w:r>
+              <w:rPr>
+                <w:rFonts w:ascii="Arial" w:hAnsi="Arial" w:eastAsia="Arial Unicode MS"/>
+                <w:sz w:val="15"/>
+              </w:rPr>
+              <w:t>20</w:t>
+            </w:r>
+          </w:p>
+        </w:tc>
+        <w:tc>
+          <w:tcPr>
+            <w:tcW w:type="dxa" w:w="1304"/>
+            <w:vAlign w:val="center"/>
+            <w:tcMar>
+              <w:top w:w="90" w:type="dxa"/>
+              <w:start w:w="100" w:type="dxa"/>
+              <w:bottom w:w="90" w:type="dxa"/>
+              <w:end w:w="100" w:type="dxa"/>
+            </w:tcMar>
+          </w:tcPr>
+          <w:p>
+            <w:pPr>
+              <w:spacing w:after="0" w:line="252" w:lineRule="auto"/>
+              <w:jc w:val="center"/>
+            </w:pPr>
+            <w:r>
+              <w:rPr>
+                <w:rFonts w:ascii="Arial" w:hAnsi="Arial" w:eastAsia="Arial Unicode MS"/>
+                <w:sz w:val="15"/>
+              </w:rPr>
+              <w:t>96.71%</w:t>
+            </w:r>
+          </w:p>
+        </w:tc>
+        <w:tc>
+          <w:tcPr>
+            <w:tcW w:type="dxa" w:w="1304"/>
+            <w:vAlign w:val="center"/>
+            <w:tcMar>
+              <w:top w:w="90" w:type="dxa"/>
+              <w:start w:w="100" w:type="dxa"/>
+              <w:bottom w:w="90" w:type="dxa"/>
+              <w:end w:w="100" w:type="dxa"/>
+            </w:tcMar>
+          </w:tcPr>
+          <w:p>
+            <w:pPr>
+              <w:spacing w:after="0" w:line="252" w:lineRule="auto"/>
+              <w:jc w:val="center"/>
+            </w:pPr>
+            <w:r>
+              <w:rPr>
+                <w:rFonts w:ascii="Arial" w:hAnsi="Arial" w:eastAsia="Arial Unicode MS"/>
+                <w:sz w:val="15"/>
+              </w:rPr>
+              <w:t>75.95%</w:t>
+            </w:r>
+          </w:p>
+        </w:tc>
+        <w:tc>
+          <w:tcPr>
+            <w:tcW w:type="dxa" w:w="1814"/>
+            <w:vAlign w:val="center"/>
+            <w:tcMar>
+              <w:top w:w="90" w:type="dxa"/>
+              <w:start w:w="100" w:type="dxa"/>
+              <w:bottom w:w="90" w:type="dxa"/>
+              <w:end w:w="100" w:type="dxa"/>
+            </w:tcMar>
+          </w:tcPr>
+          <w:p>
+            <w:pPr>
+              <w:spacing w:after="0" w:line="252" w:lineRule="auto"/>
+              <w:jc w:val="center"/>
+            </w:pPr>
+            <w:r>
+              <w:rPr>
+                <w:rFonts w:ascii="Arial" w:hAnsi="Arial" w:eastAsia="Arial Unicode MS"/>
+                <w:sz w:val="15"/>
+              </w:rPr>
+              <w:t>97.10%</w:t>
+            </w:r>
+          </w:p>
+        </w:tc>
+        <w:tc>
+          <w:tcPr>
+            <w:tcW w:type="dxa" w:w="1361"/>
+            <w:vAlign w:val="center"/>
+            <w:tcMar>
+              <w:top w:w="90" w:type="dxa"/>
+              <w:start w:w="100" w:type="dxa"/>
+              <w:bottom w:w="90" w:type="dxa"/>
+              <w:end w:w="100" w:type="dxa"/>
+            </w:tcMar>
+          </w:tcPr>
+          <w:p>
+            <w:pPr>
+              <w:spacing w:after="0" w:line="252" w:lineRule="auto"/>
+              <w:jc w:val="center"/>
+            </w:pPr>
+            <w:r>
+              <w:rPr>
+                <w:rFonts w:ascii="Arial" w:hAnsi="Arial" w:eastAsia="Arial Unicode MS"/>
+                <w:sz w:val="15"/>
+              </w:rPr>
+              <w:t>71.66%</w:t>
+            </w:r>
+          </w:p>
+        </w:tc>
+        <w:tc>
+          <w:tcPr>
+            <w:tcW w:type="dxa" w:w="1361"/>
+            <w:vAlign w:val="center"/>
+            <w:tcMar>
+              <w:top w:w="90" w:type="dxa"/>
+              <w:start w:w="100" w:type="dxa"/>
+              <w:bottom w:w="90" w:type="dxa"/>
+              <w:end w:w="100" w:type="dxa"/>
+            </w:tcMar>
+          </w:tcPr>
+          <w:p>
+            <w:pPr>
+              <w:spacing w:after="0" w:line="252" w:lineRule="auto"/>
+              <w:jc w:val="center"/>
+            </w:pPr>
+            <w:r>
+              <w:rPr>
+                <w:rFonts w:ascii="Arial" w:hAnsi="Arial" w:eastAsia="Arial Unicode MS"/>
+                <w:sz w:val="15"/>
+              </w:rPr>
+              <w:t>59.09%</w:t>
+            </w:r>
+          </w:p>
+        </w:tc>
+      </w:tr>
+      <w:tr>
+        <w:trPr>
+          <w:cantSplit/>
+        </w:trPr>
+        <w:tc>
+          <w:tcPr>
+            <w:tcW w:type="dxa" w:w="680"/>
+            <w:vAlign w:val="center"/>
+            <w:tcMar>
+              <w:top w:w="90" w:type="dxa"/>
+              <w:start w:w="100" w:type="dxa"/>
+              <w:bottom w:w="90" w:type="dxa"/>
+              <w:end w:w="100" w:type="dxa"/>
+            </w:tcMar>
+            <w:shd w:fill="F5F7FA"/>
+          </w:tcPr>
+          <w:p>
+            <w:pPr>
+              <w:spacing w:after="0" w:line="252" w:lineRule="auto"/>
+              <w:jc w:val="center"/>
+            </w:pPr>
+            <w:r>
+              <w:rPr>
+                <w:rFonts w:ascii="Arial" w:hAnsi="Arial" w:eastAsia="Arial Unicode MS"/>
+                <w:sz w:val="15"/>
+              </w:rPr>
+              <w:t>1</w:t>
+            </w:r>
+          </w:p>
+        </w:tc>
+        <w:tc>
+          <w:tcPr>
+            <w:tcW w:type="dxa" w:w="1134"/>
+            <w:vAlign w:val="center"/>
+            <w:tcMar>
+              <w:top w:w="90" w:type="dxa"/>
+              <w:start w:w="100" w:type="dxa"/>
+              <w:bottom w:w="90" w:type="dxa"/>
+              <w:end w:w="100" w:type="dxa"/>
+            </w:tcMar>
+            <w:shd w:fill="F5F7FA"/>
+          </w:tcPr>
+          <w:p>
+            <w:pPr>
+              <w:spacing w:after="0" w:line="252" w:lineRule="auto"/>
+              <w:jc w:val="center"/>
+            </w:pPr>
+            <w:r>
+              <w:rPr>
+                <w:rFonts w:ascii="Arial" w:hAnsi="Arial" w:eastAsia="Arial Unicode MS"/>
+                <w:sz w:val="15"/>
+              </w:rPr>
+              <w:t>16</w:t>
+            </w:r>
+          </w:p>
+        </w:tc>
+        <w:tc>
+          <w:tcPr>
+            <w:tcW w:type="dxa" w:w="1304"/>
+            <w:vAlign w:val="center"/>
+            <w:tcMar>
+              <w:top w:w="90" w:type="dxa"/>
+              <w:start w:w="100" w:type="dxa"/>
+              <w:bottom w:w="90" w:type="dxa"/>
+              <w:end w:w="100" w:type="dxa"/>
+            </w:tcMar>
+            <w:shd w:fill="F5F7FA"/>
+          </w:tcPr>
+          <w:p>
+            <w:pPr>
+              <w:spacing w:after="0" w:line="252" w:lineRule="auto"/>
+              <w:jc w:val="center"/>
+            </w:pPr>
+            <w:r>
+              <w:rPr>
+                <w:rFonts w:ascii="Arial" w:hAnsi="Arial" w:eastAsia="Arial Unicode MS"/>
+                <w:sz w:val="15"/>
+              </w:rPr>
+              <w:t>96.73%</w:t>
+            </w:r>
+          </w:p>
+        </w:tc>
+        <w:tc>
+          <w:tcPr>
+            <w:tcW w:type="dxa" w:w="1304"/>
+            <w:vAlign w:val="center"/>
+            <w:tcMar>
+              <w:top w:w="90" w:type="dxa"/>
+              <w:start w:w="100" w:type="dxa"/>
+              <w:bottom w:w="90" w:type="dxa"/>
+              <w:end w:w="100" w:type="dxa"/>
+            </w:tcMar>
+            <w:shd w:fill="F5F7FA"/>
+          </w:tcPr>
+          <w:p>
+            <w:pPr>
+              <w:spacing w:after="0" w:line="252" w:lineRule="auto"/>
+              <w:jc w:val="center"/>
+            </w:pPr>
+            <w:r>
+              <w:rPr>
+                <w:rFonts w:ascii="Arial" w:hAnsi="Arial" w:eastAsia="Arial Unicode MS"/>
+                <w:sz w:val="15"/>
+              </w:rPr>
+              <w:t>73.84%</w:t>
+            </w:r>
+          </w:p>
+        </w:tc>
+        <w:tc>
+          <w:tcPr>
+            <w:tcW w:type="dxa" w:w="1814"/>
+            <w:vAlign w:val="center"/>
+            <w:tcMar>
+              <w:top w:w="90" w:type="dxa"/>
+              <w:start w:w="100" w:type="dxa"/>
+              <w:bottom w:w="90" w:type="dxa"/>
+              <w:end w:w="100" w:type="dxa"/>
+            </w:tcMar>
+            <w:shd w:fill="F5F7FA"/>
+          </w:tcPr>
+          <w:p>
+            <w:pPr>
+              <w:spacing w:after="0" w:line="252" w:lineRule="auto"/>
+              <w:jc w:val="center"/>
+            </w:pPr>
+            <w:r>
+              <w:rPr>
+                <w:rFonts w:ascii="Arial" w:hAnsi="Arial" w:eastAsia="Arial Unicode MS"/>
+                <w:sz w:val="15"/>
+              </w:rPr>
+              <w:t>97.15%</w:t>
+            </w:r>
+          </w:p>
+        </w:tc>
+        <w:tc>
+          <w:tcPr>
+            <w:tcW w:type="dxa" w:w="1361"/>
+            <w:vAlign w:val="center"/>
+            <w:tcMar>
+              <w:top w:w="90" w:type="dxa"/>
+              <w:start w:w="100" w:type="dxa"/>
+              <w:bottom w:w="90" w:type="dxa"/>
+              <w:end w:w="100" w:type="dxa"/>
+            </w:tcMar>
+            <w:shd w:fill="F5F7FA"/>
+          </w:tcPr>
+          <w:p>
+            <w:pPr>
+              <w:spacing w:after="0" w:line="252" w:lineRule="auto"/>
+              <w:jc w:val="center"/>
+            </w:pPr>
+            <w:r>
+              <w:rPr>
+                <w:rFonts w:ascii="Arial" w:hAnsi="Arial" w:eastAsia="Arial Unicode MS"/>
+                <w:sz w:val="15"/>
+              </w:rPr>
+              <w:t>68.42%</w:t>
+            </w:r>
+          </w:p>
+        </w:tc>
+        <w:tc>
+          <w:tcPr>
+            <w:tcW w:type="dxa" w:w="1361"/>
+            <w:vAlign w:val="center"/>
+            <w:tcMar>
+              <w:top w:w="90" w:type="dxa"/>
+              <w:start w:w="100" w:type="dxa"/>
+              <w:bottom w:w="90" w:type="dxa"/>
+              <w:end w:w="100" w:type="dxa"/>
+            </w:tcMar>
+            <w:shd w:fill="F5F7FA"/>
+          </w:tcPr>
+          <w:p>
+            <w:pPr>
+              <w:spacing w:after="0" w:line="252" w:lineRule="auto"/>
+              <w:jc w:val="center"/>
+            </w:pPr>
+            <w:r>
+              <w:rPr>
+                <w:rFonts w:ascii="Arial" w:hAnsi="Arial" w:eastAsia="Arial Unicode MS"/>
+                <w:sz w:val="15"/>
+              </w:rPr>
+              <w:t>55.97%</w:t>
+            </w:r>
+          </w:p>
+        </w:tc>
+      </w:tr>
+      <w:tr>
+        <w:trPr>
+          <w:cantSplit/>
+        </w:trPr>
+        <w:tc>
+          <w:tcPr>
+            <w:tcW w:type="dxa" w:w="680"/>
+            <w:vAlign w:val="center"/>
+            <w:tcMar>
+              <w:top w:w="90" w:type="dxa"/>
+              <w:start w:w="100" w:type="dxa"/>
+              <w:bottom w:w="90" w:type="dxa"/>
+              <w:end w:w="100" w:type="dxa"/>
+            </w:tcMar>
+          </w:tcPr>
+          <w:p>
+            <w:pPr>
+              <w:spacing w:after="0" w:line="252" w:lineRule="auto"/>
+              <w:jc w:val="center"/>
+            </w:pPr>
+            <w:r>
+              <w:rPr>
+                <w:rFonts w:ascii="Arial" w:hAnsi="Arial" w:eastAsia="Arial Unicode MS"/>
+                <w:sz w:val="15"/>
+              </w:rPr>
+              <w:t>2</w:t>
+            </w:r>
+          </w:p>
+        </w:tc>
+        <w:tc>
+          <w:tcPr>
+            <w:tcW w:type="dxa" w:w="1134"/>
+            <w:vAlign w:val="center"/>
+            <w:tcMar>
+              <w:top w:w="90" w:type="dxa"/>
+              <w:start w:w="100" w:type="dxa"/>
+              <w:bottom w:w="90" w:type="dxa"/>
+              <w:end w:w="100" w:type="dxa"/>
+            </w:tcMar>
+          </w:tcPr>
+          <w:p>
+            <w:pPr>
+              <w:spacing w:after="0" w:line="252" w:lineRule="auto"/>
+              <w:jc w:val="center"/>
+            </w:pPr>
+            <w:r>
+              <w:rPr>
+                <w:rFonts w:ascii="Arial" w:hAnsi="Arial" w:eastAsia="Arial Unicode MS"/>
+                <w:sz w:val="15"/>
+              </w:rPr>
+              <w:t>18</w:t>
+            </w:r>
+          </w:p>
+        </w:tc>
+        <w:tc>
+          <w:tcPr>
+            <w:tcW w:type="dxa" w:w="1304"/>
+            <w:vAlign w:val="center"/>
+            <w:tcMar>
+              <w:top w:w="90" w:type="dxa"/>
+              <w:start w:w="100" w:type="dxa"/>
+              <w:bottom w:w="90" w:type="dxa"/>
+              <w:end w:w="100" w:type="dxa"/>
+            </w:tcMar>
+          </w:tcPr>
+          <w:p>
+            <w:pPr>
+              <w:spacing w:after="0" w:line="252" w:lineRule="auto"/>
+              <w:jc w:val="center"/>
+            </w:pPr>
+            <w:r>
+              <w:rPr>
+                <w:rFonts w:ascii="Arial" w:hAnsi="Arial" w:eastAsia="Arial Unicode MS"/>
+                <w:sz w:val="15"/>
+              </w:rPr>
+              <w:t>97.04%</w:t>
+            </w:r>
+          </w:p>
+        </w:tc>
+        <w:tc>
+          <w:tcPr>
+            <w:tcW w:type="dxa" w:w="1304"/>
+            <w:vAlign w:val="center"/>
+            <w:tcMar>
+              <w:top w:w="90" w:type="dxa"/>
+              <w:start w:w="100" w:type="dxa"/>
+              <w:bottom w:w="90" w:type="dxa"/>
+              <w:end w:w="100" w:type="dxa"/>
+            </w:tcMar>
+          </w:tcPr>
+          <w:p>
+            <w:pPr>
+              <w:spacing w:after="0" w:line="252" w:lineRule="auto"/>
+              <w:jc w:val="center"/>
+            </w:pPr>
+            <w:r>
+              <w:rPr>
+                <w:rFonts w:ascii="Arial" w:hAnsi="Arial" w:eastAsia="Arial Unicode MS"/>
+                <w:sz w:val="15"/>
+              </w:rPr>
+              <w:t>75.43%</w:t>
+            </w:r>
+          </w:p>
+        </w:tc>
+        <w:tc>
+          <w:tcPr>
+            <w:tcW w:type="dxa" w:w="1814"/>
+            <w:vAlign w:val="center"/>
+            <w:tcMar>
+              <w:top w:w="90" w:type="dxa"/>
+              <w:start w:w="100" w:type="dxa"/>
+              <w:bottom w:w="90" w:type="dxa"/>
+              <w:end w:w="100" w:type="dxa"/>
+            </w:tcMar>
+          </w:tcPr>
+          <w:p>
+            <w:pPr>
+              <w:spacing w:after="0" w:line="252" w:lineRule="auto"/>
+              <w:jc w:val="center"/>
+            </w:pPr>
+            <w:r>
+              <w:rPr>
+                <w:rFonts w:ascii="Arial" w:hAnsi="Arial" w:eastAsia="Arial Unicode MS"/>
+                <w:sz w:val="15"/>
+              </w:rPr>
+              <w:t>97.33%</w:t>
+            </w:r>
+          </w:p>
+        </w:tc>
+        <w:tc>
+          <w:tcPr>
+            <w:tcW w:type="dxa" w:w="1361"/>
+            <w:vAlign w:val="center"/>
+            <w:tcMar>
+              <w:top w:w="90" w:type="dxa"/>
+              <w:start w:w="100" w:type="dxa"/>
+              <w:bottom w:w="90" w:type="dxa"/>
+              <w:end w:w="100" w:type="dxa"/>
+            </w:tcMar>
+          </w:tcPr>
+          <w:p>
+            <w:pPr>
+              <w:spacing w:after="0" w:line="252" w:lineRule="auto"/>
+              <w:jc w:val="center"/>
+            </w:pPr>
+            <w:r>
+              <w:rPr>
+                <w:rFonts w:ascii="Arial" w:hAnsi="Arial" w:eastAsia="Arial Unicode MS"/>
+                <w:sz w:val="15"/>
+              </w:rPr>
+              <w:t>71.06%</w:t>
+            </w:r>
+          </w:p>
+        </w:tc>
+        <w:tc>
+          <w:tcPr>
+            <w:tcW w:type="dxa" w:w="1361"/>
+            <w:vAlign w:val="center"/>
+            <w:tcMar>
+              <w:top w:w="90" w:type="dxa"/>
+              <w:start w:w="100" w:type="dxa"/>
+              <w:bottom w:w="90" w:type="dxa"/>
+              <w:end w:w="100" w:type="dxa"/>
+            </w:tcMar>
+          </w:tcPr>
+          <w:p>
+            <w:pPr>
+              <w:spacing w:after="0" w:line="252" w:lineRule="auto"/>
+              <w:jc w:val="center"/>
+            </w:pPr>
+            <w:r>
+              <w:rPr>
+                <w:rFonts w:ascii="Arial" w:hAnsi="Arial" w:eastAsia="Arial Unicode MS"/>
+                <w:sz w:val="15"/>
+              </w:rPr>
+              <w:t>57.92%</w:t>
+            </w:r>
+          </w:p>
+        </w:tc>
+      </w:tr>
+    </w:tbl>
+    <w:p>
+      <w:pPr>
+        <w:spacing w:after="20"/>
+      </w:pPr>
+    </w:p>
+    <w:p>
+      <w:pPr>
+        <w:ind w:firstLine="420"/>
+      </w:pPr>
+      <w:r>
+        <w:rPr>
+          <w:rFonts w:ascii="Arial" w:hAnsi="Arial" w:eastAsia="Arial Unicode MS"/>
+        </w:rPr>
+        <w:t>三 seed 平均 Mean IoU = 75.08% ± 1.10%，Weed IoU = 57.66% ± 1.58%（均值 ± 样本标准差）。与 Weighted CE 的 74.78% ± 0.82% 和 56.89% ± 2.06% 相比，均值分别小幅提高 0.30 和 0.77 个百分点；Mean IoU 的跨 seed 波动仍需关注。</w:t>
+      </w:r>
+    </w:p>
+    <w:tbl>
+      <w:tblPr>
+        <w:tblW w:type="auto" w:w="0"/>
+        <w:jc w:val="center"/>
+        <w:tblLayout w:type="fixed"/>
+        <w:tblLook w:firstColumn="1" w:firstRow="1" w:lastColumn="0" w:lastRow="0" w:noHBand="0" w:noVBand="1" w:val="04A0"/>
+        <w:tblBorders>
+          <w:top w:val="single" w:sz="5" w:space="0" w:color="D9E1E8"/>
+          <w:left w:val="single" w:sz="5" w:space="0" w:color="D9E1E8"/>
+          <w:bottom w:val="single" w:sz="5" w:space="0" w:color="D9E1E8"/>
+          <w:right w:val="single" w:sz="5" w:space="0" w:color="D9E1E8"/>
+          <w:insideH w:val="single" w:sz="5" w:space="0" w:color="D9E1E8"/>
+          <w:insideV w:val="single" w:sz="5" w:space="0" w:color="D9E1E8"/>
+        </w:tblBorders>
+      </w:tblPr>
+      <w:tblGrid>
+        <w:gridCol w:w="2154"/>
+        <w:gridCol w:w="1701"/>
+        <w:gridCol w:w="1701"/>
+        <w:gridCol w:w="1701"/>
+        <w:gridCol w:w="1701"/>
+      </w:tblGrid>
+      <w:tr>
+        <w:trPr>
+          <w:tblHeader w:val="true"/>
+          <w:cantSplit/>
+        </w:trPr>
+        <w:tc>
+          <w:tcPr>
+            <w:tcW w:type="dxa" w:w="2154"/>
+            <w:shd w:fill="17365D"/>
+            <w:vAlign w:val="center"/>
+            <w:tcMar>
+              <w:top w:w="90" w:type="dxa"/>
+              <w:start w:w="100" w:type="dxa"/>
+              <w:bottom w:w="90" w:type="dxa"/>
+              <w:end w:w="100" w:type="dxa"/>
+            </w:tcMar>
+          </w:tcPr>
+          <w:p>
+            <w:pPr>
+              <w:spacing w:after="0" w:line="252" w:lineRule="auto"/>
+              <w:jc w:val="center"/>
+            </w:pPr>
+            <w:r>
+              <w:rPr>
+                <w:rFonts w:ascii="Arial" w:hAnsi="Arial" w:eastAsia="Hiragino Sans GB"/>
+                <w:b/>
+                <w:color w:val="FFFFFF"/>
+                <w:sz w:val="15"/>
+              </w:rPr>
+              <w:t>Loss（三 seed）</w:t>
+            </w:r>
+          </w:p>
+        </w:tc>
+        <w:tc>
+          <w:tcPr>
+            <w:tcW w:type="dxa" w:w="1701"/>
+            <w:shd w:fill="17365D"/>
+            <w:vAlign w:val="center"/>
+            <w:tcMar>
+              <w:top w:w="90" w:type="dxa"/>
+              <w:start w:w="100" w:type="dxa"/>
+              <w:bottom w:w="90" w:type="dxa"/>
+              <w:end w:w="100" w:type="dxa"/>
+            </w:tcMar>
+          </w:tcPr>
+          <w:p>
+            <w:pPr>
+              <w:spacing w:after="0" w:line="252" w:lineRule="auto"/>
+              <w:jc w:val="center"/>
+            </w:pPr>
+            <w:r>
+              <w:rPr>
+                <w:rFonts w:ascii="Arial" w:hAnsi="Arial" w:eastAsia="Hiragino Sans GB"/>
+                <w:b/>
+                <w:color w:val="FFFFFF"/>
+                <w:sz w:val="15"/>
+              </w:rPr>
+              <w:t>Pixel Acc</w:t>
+            </w:r>
+          </w:p>
+        </w:tc>
+        <w:tc>
+          <w:tcPr>
+            <w:tcW w:type="dxa" w:w="1701"/>
+            <w:shd w:fill="17365D"/>
+            <w:vAlign w:val="center"/>
+            <w:tcMar>
+              <w:top w:w="90" w:type="dxa"/>
+              <w:start w:w="100" w:type="dxa"/>
+              <w:bottom w:w="90" w:type="dxa"/>
+              <w:end w:w="100" w:type="dxa"/>
+            </w:tcMar>
+          </w:tcPr>
+          <w:p>
+            <w:pPr>
+              <w:spacing w:after="0" w:line="252" w:lineRule="auto"/>
+              <w:jc w:val="center"/>
+            </w:pPr>
+            <w:r>
+              <w:rPr>
+                <w:rFonts w:ascii="Arial" w:hAnsi="Arial" w:eastAsia="Hiragino Sans GB"/>
+                <w:b/>
+                <w:color w:val="FFFFFF"/>
+                <w:sz w:val="15"/>
+              </w:rPr>
+              <w:t>Mean IoU</w:t>
+            </w:r>
+          </w:p>
+        </w:tc>
+        <w:tc>
+          <w:tcPr>
+            <w:tcW w:type="dxa" w:w="1701"/>
+            <w:shd w:fill="17365D"/>
+            <w:vAlign w:val="center"/>
+            <w:tcMar>
+              <w:top w:w="90" w:type="dxa"/>
+              <w:start w:w="100" w:type="dxa"/>
+              <w:bottom w:w="90" w:type="dxa"/>
+              <w:end w:w="100" w:type="dxa"/>
+            </w:tcMar>
+          </w:tcPr>
+          <w:p>
+            <w:pPr>
+              <w:spacing w:after="0" w:line="252" w:lineRule="auto"/>
+              <w:jc w:val="center"/>
+            </w:pPr>
+            <w:r>
+              <w:rPr>
+                <w:rFonts w:ascii="Arial" w:hAnsi="Arial" w:eastAsia="Hiragino Sans GB"/>
+                <w:b/>
+                <w:color w:val="FFFFFF"/>
+                <w:sz w:val="15"/>
+              </w:rPr>
+              <w:t>Crop IoU</w:t>
+            </w:r>
+          </w:p>
+        </w:tc>
+        <w:tc>
+          <w:tcPr>
+            <w:tcW w:type="dxa" w:w="1701"/>
+            <w:shd w:fill="17365D"/>
+            <w:vAlign w:val="center"/>
+            <w:tcMar>
+              <w:top w:w="90" w:type="dxa"/>
+              <w:start w:w="100" w:type="dxa"/>
+              <w:bottom w:w="90" w:type="dxa"/>
+              <w:end w:w="100" w:type="dxa"/>
+            </w:tcMar>
+          </w:tcPr>
+          <w:p>
+            <w:pPr>
+              <w:spacing w:after="0" w:line="252" w:lineRule="auto"/>
+              <w:jc w:val="center"/>
+            </w:pPr>
+            <w:r>
+              <w:rPr>
+                <w:rFonts w:ascii="Arial" w:hAnsi="Arial" w:eastAsia="Hiragino Sans GB"/>
+                <w:b/>
+                <w:color w:val="FFFFFF"/>
+                <w:sz w:val="15"/>
+              </w:rPr>
+              <w:t>Weed IoU</w:t>
+            </w:r>
+          </w:p>
+        </w:tc>
+      </w:tr>
+      <w:tr>
+        <w:trPr>
+          <w:cantSplit/>
+        </w:trPr>
+        <w:tc>
+          <w:tcPr>
+            <w:tcW w:type="dxa" w:w="2154"/>
+            <w:vAlign w:val="center"/>
+            <w:tcMar>
+              <w:top w:w="90" w:type="dxa"/>
+              <w:start w:w="100" w:type="dxa"/>
+              <w:bottom w:w="90" w:type="dxa"/>
+              <w:end w:w="100" w:type="dxa"/>
+            </w:tcMar>
+          </w:tcPr>
+          <w:p>
+            <w:pPr>
+              <w:spacing w:after="0" w:line="252" w:lineRule="auto"/>
+              <w:jc w:val="left"/>
+            </w:pPr>
+            <w:r>
+              <w:rPr>
+                <w:rFonts w:ascii="Arial" w:hAnsi="Arial" w:eastAsia="Arial Unicode MS"/>
+                <w:sz w:val="15"/>
+              </w:rPr>
+              <w:t>Weighted CE</w:t>
+            </w:r>
+          </w:p>
+        </w:tc>
+        <w:tc>
+          <w:tcPr>
+            <w:tcW w:type="dxa" w:w="1701"/>
+            <w:vAlign w:val="center"/>
+            <w:tcMar>
+              <w:top w:w="90" w:type="dxa"/>
+              <w:start w:w="100" w:type="dxa"/>
+              <w:bottom w:w="90" w:type="dxa"/>
+              <w:end w:w="100" w:type="dxa"/>
+            </w:tcMar>
+          </w:tcPr>
+          <w:p>
+            <w:pPr>
+              <w:spacing w:after="0" w:line="252" w:lineRule="auto"/>
+              <w:jc w:val="center"/>
+            </w:pPr>
+            <w:r>
+              <w:rPr>
+                <w:rFonts w:ascii="Arial" w:hAnsi="Arial" w:eastAsia="Arial Unicode MS"/>
+                <w:sz w:val="15"/>
+              </w:rPr>
+              <w:t>96.38% ± 0.36%</w:t>
+            </w:r>
+          </w:p>
+        </w:tc>
+        <w:tc>
+          <w:tcPr>
+            <w:tcW w:type="dxa" w:w="1701"/>
+            <w:vAlign w:val="center"/>
+            <w:tcMar>
+              <w:top w:w="90" w:type="dxa"/>
+              <w:start w:w="100" w:type="dxa"/>
+              <w:bottom w:w="90" w:type="dxa"/>
+              <w:end w:w="100" w:type="dxa"/>
+            </w:tcMar>
+          </w:tcPr>
+          <w:p>
+            <w:pPr>
+              <w:spacing w:after="0" w:line="252" w:lineRule="auto"/>
+              <w:jc w:val="center"/>
+            </w:pPr>
+            <w:r>
+              <w:rPr>
+                <w:rFonts w:ascii="Arial" w:hAnsi="Arial" w:eastAsia="Arial Unicode MS"/>
+                <w:sz w:val="15"/>
+              </w:rPr>
+              <w:t>74.78% ± 0.82%</w:t>
+            </w:r>
+          </w:p>
+        </w:tc>
+        <w:tc>
+          <w:tcPr>
+            <w:tcW w:type="dxa" w:w="1701"/>
+            <w:vAlign w:val="center"/>
+            <w:tcMar>
+              <w:top w:w="90" w:type="dxa"/>
+              <w:start w:w="100" w:type="dxa"/>
+              <w:bottom w:w="90" w:type="dxa"/>
+              <w:end w:w="100" w:type="dxa"/>
+            </w:tcMar>
+          </w:tcPr>
+          <w:p>
+            <w:pPr>
+              <w:spacing w:after="0" w:line="252" w:lineRule="auto"/>
+              <w:jc w:val="center"/>
+            </w:pPr>
+            <w:r>
+              <w:rPr>
+                <w:rFonts w:ascii="Arial" w:hAnsi="Arial" w:eastAsia="Arial Unicode MS"/>
+                <w:sz w:val="15"/>
+              </w:rPr>
+              <w:t>70.76% ± 1.11%</w:t>
+            </w:r>
+          </w:p>
+        </w:tc>
+        <w:tc>
+          <w:tcPr>
+            <w:tcW w:type="dxa" w:w="1701"/>
+            <w:vAlign w:val="center"/>
+            <w:tcMar>
+              <w:top w:w="90" w:type="dxa"/>
+              <w:start w:w="100" w:type="dxa"/>
+              <w:bottom w:w="90" w:type="dxa"/>
+              <w:end w:w="100" w:type="dxa"/>
+            </w:tcMar>
+          </w:tcPr>
+          <w:p>
+            <w:pPr>
+              <w:spacing w:after="0" w:line="252" w:lineRule="auto"/>
+              <w:jc w:val="center"/>
+            </w:pPr>
+            <w:r>
+              <w:rPr>
+                <w:rFonts w:ascii="Arial" w:hAnsi="Arial" w:eastAsia="Arial Unicode MS"/>
+                <w:sz w:val="15"/>
+              </w:rPr>
+              <w:t>56.89% ± 2.06%</w:t>
+            </w:r>
+          </w:p>
+        </w:tc>
+      </w:tr>
+      <w:tr>
+        <w:trPr>
+          <w:cantSplit/>
+        </w:trPr>
+        <w:tc>
+          <w:tcPr>
+            <w:tcW w:type="dxa" w:w="2154"/>
+            <w:vAlign w:val="center"/>
+            <w:tcMar>
+              <w:top w:w="90" w:type="dxa"/>
+              <w:start w:w="100" w:type="dxa"/>
+              <w:bottom w:w="90" w:type="dxa"/>
+              <w:end w:w="100" w:type="dxa"/>
+            </w:tcMar>
+            <w:shd w:fill="F5F7FA"/>
+          </w:tcPr>
+          <w:p>
+            <w:pPr>
+              <w:spacing w:after="0" w:line="252" w:lineRule="auto"/>
+              <w:jc w:val="left"/>
+            </w:pPr>
+            <w:r>
+              <w:rPr>
+                <w:rFonts w:ascii="Arial" w:hAnsi="Arial" w:eastAsia="Arial Unicode MS"/>
+                <w:sz w:val="15"/>
+              </w:rPr>
+              <w:t>Boundary weighted CE</w:t>
+            </w:r>
+          </w:p>
+        </w:tc>
+        <w:tc>
+          <w:tcPr>
+            <w:tcW w:type="dxa" w:w="1701"/>
+            <w:vAlign w:val="center"/>
+            <w:tcMar>
+              <w:top w:w="90" w:type="dxa"/>
+              <w:start w:w="100" w:type="dxa"/>
+              <w:bottom w:w="90" w:type="dxa"/>
+              <w:end w:w="100" w:type="dxa"/>
+            </w:tcMar>
+            <w:shd w:fill="F5F7FA"/>
+          </w:tcPr>
+          <w:p>
+            <w:pPr>
+              <w:spacing w:after="0" w:line="252" w:lineRule="auto"/>
+              <w:jc w:val="center"/>
+            </w:pPr>
+            <w:r>
+              <w:rPr>
+                <w:rFonts w:ascii="Arial" w:hAnsi="Arial" w:eastAsia="Arial Unicode MS"/>
+                <w:sz w:val="15"/>
+              </w:rPr>
+              <w:t>96.83% ± 0.19%</w:t>
+            </w:r>
+          </w:p>
+        </w:tc>
+        <w:tc>
+          <w:tcPr>
+            <w:tcW w:type="dxa" w:w="1701"/>
+            <w:vAlign w:val="center"/>
+            <w:tcMar>
+              <w:top w:w="90" w:type="dxa"/>
+              <w:start w:w="100" w:type="dxa"/>
+              <w:bottom w:w="90" w:type="dxa"/>
+              <w:end w:w="100" w:type="dxa"/>
+            </w:tcMar>
+            <w:shd w:fill="F5F7FA"/>
+          </w:tcPr>
+          <w:p>
+            <w:pPr>
+              <w:spacing w:after="0" w:line="252" w:lineRule="auto"/>
+              <w:jc w:val="center"/>
+            </w:pPr>
+            <w:r>
+              <w:rPr>
+                <w:rFonts w:ascii="Arial" w:hAnsi="Arial" w:eastAsia="Arial Unicode MS"/>
+                <w:sz w:val="15"/>
+              </w:rPr>
+              <w:t>75.08% ± 1.10%</w:t>
+            </w:r>
+          </w:p>
+        </w:tc>
+        <w:tc>
+          <w:tcPr>
+            <w:tcW w:type="dxa" w:w="1701"/>
+            <w:vAlign w:val="center"/>
+            <w:tcMar>
+              <w:top w:w="90" w:type="dxa"/>
+              <w:start w:w="100" w:type="dxa"/>
+              <w:bottom w:w="90" w:type="dxa"/>
+              <w:end w:w="100" w:type="dxa"/>
+            </w:tcMar>
+            <w:shd w:fill="F5F7FA"/>
+          </w:tcPr>
+          <w:p>
+            <w:pPr>
+              <w:spacing w:after="0" w:line="252" w:lineRule="auto"/>
+              <w:jc w:val="center"/>
+            </w:pPr>
+            <w:r>
+              <w:rPr>
+                <w:rFonts w:ascii="Arial" w:hAnsi="Arial" w:eastAsia="Arial Unicode MS"/>
+                <w:sz w:val="15"/>
+              </w:rPr>
+              <w:t>70.38% ± 1.73%</w:t>
+            </w:r>
+          </w:p>
+        </w:tc>
+        <w:tc>
+          <w:tcPr>
+            <w:tcW w:type="dxa" w:w="1701"/>
+            <w:vAlign w:val="center"/>
+            <w:tcMar>
+              <w:top w:w="90" w:type="dxa"/>
+              <w:start w:w="100" w:type="dxa"/>
+              <w:bottom w:w="90" w:type="dxa"/>
+              <w:end w:w="100" w:type="dxa"/>
+            </w:tcMar>
+            <w:shd w:fill="F5F7FA"/>
+          </w:tcPr>
+          <w:p>
+            <w:pPr>
+              <w:spacing w:after="0" w:line="252" w:lineRule="auto"/>
+              <w:jc w:val="center"/>
+            </w:pPr>
+            <w:r>
+              <w:rPr>
+                <w:rFonts w:ascii="Arial" w:hAnsi="Arial" w:eastAsia="Arial Unicode MS"/>
+                <w:sz w:val="15"/>
+              </w:rPr>
+              <w:t>57.66% ± 1.58%</w:t>
+            </w:r>
+          </w:p>
+        </w:tc>
+      </w:tr>
+    </w:tbl>
+    <w:p>
+      <w:pPr>
+        <w:spacing w:after="20"/>
+      </w:pPr>
+    </w:p>
+    <w:p>
+      <w:pPr>
+        <w:pStyle w:val="Heading2"/>
+        <w:keepNext/>
+      </w:pPr>
+      <w:r>
+        <w:rPr>
+          <w:rFonts w:ascii="Arial" w:hAnsi="Arial" w:eastAsia="Hiragino Sans GB"/>
+          <w:b/>
+          <w:color w:val="000000"/>
+        </w:rPr>
+        <w:t>19.3 Sample index=0 的边界错误对比</w:t>
+      </w:r>
+    </w:p>
+    <w:tbl>
+      <w:tblPr>
+        <w:tblW w:type="auto" w:w="0"/>
+        <w:jc w:val="center"/>
+        <w:tblLayout w:type="fixed"/>
+        <w:tblLook w:firstColumn="1" w:firstRow="1" w:lastColumn="0" w:lastRow="0" w:noHBand="0" w:noVBand="1" w:val="04A0"/>
+        <w:tblBorders>
+          <w:top w:val="single" w:sz="5" w:space="0" w:color="D9E1E8"/>
+          <w:left w:val="single" w:sz="5" w:space="0" w:color="D9E1E8"/>
+          <w:bottom w:val="single" w:sz="5" w:space="0" w:color="D9E1E8"/>
+          <w:right w:val="single" w:sz="5" w:space="0" w:color="D9E1E8"/>
+          <w:insideH w:val="single" w:sz="5" w:space="0" w:color="D9E1E8"/>
+          <w:insideV w:val="single" w:sz="5" w:space="0" w:color="D9E1E8"/>
+        </w:tblBorders>
+      </w:tblPr>
+      <w:tblGrid>
+        <w:gridCol w:w="2438"/>
+        <w:gridCol w:w="1531"/>
+        <w:gridCol w:w="1587"/>
+        <w:gridCol w:w="1701"/>
+        <w:gridCol w:w="1701"/>
+      </w:tblGrid>
+      <w:tr>
+        <w:trPr>
+          <w:tblHeader w:val="true"/>
+          <w:cantSplit/>
+        </w:trPr>
+        <w:tc>
+          <w:tcPr>
+            <w:tcW w:type="dxa" w:w="2438"/>
+            <w:shd w:fill="17365D"/>
+            <w:vAlign w:val="center"/>
+            <w:tcMar>
+              <w:top w:w="90" w:type="dxa"/>
+              <w:start w:w="100" w:type="dxa"/>
+              <w:bottom w:w="90" w:type="dxa"/>
+              <w:end w:w="100" w:type="dxa"/>
+            </w:tcMar>
+          </w:tcPr>
+          <w:p>
+            <w:pPr>
+              <w:spacing w:after="0" w:line="252" w:lineRule="auto"/>
+              <w:jc w:val="center"/>
+            </w:pPr>
+            <w:r>
+              <w:rPr>
+                <w:rFonts w:ascii="Arial" w:hAnsi="Arial" w:eastAsia="Hiragino Sans GB"/>
+                <w:b/>
+                <w:color w:val="FFFFFF"/>
+                <w:sz w:val="16"/>
+              </w:rPr>
+              <w:t>Loss</w:t>
+            </w:r>
+          </w:p>
+        </w:tc>
+        <w:tc>
+          <w:tcPr>
+            <w:tcW w:type="dxa" w:w="1531"/>
+            <w:shd w:fill="17365D"/>
+            <w:vAlign w:val="center"/>
+            <w:tcMar>
+              <w:top w:w="90" w:type="dxa"/>
+              <w:start w:w="100" w:type="dxa"/>
+              <w:bottom w:w="90" w:type="dxa"/>
+              <w:end w:w="100" w:type="dxa"/>
+            </w:tcMar>
+          </w:tcPr>
+          <w:p>
+            <w:pPr>
+              <w:spacing w:after="0" w:line="252" w:lineRule="auto"/>
+              <w:jc w:val="center"/>
+            </w:pPr>
+            <w:r>
+              <w:rPr>
+                <w:rFonts w:ascii="Arial" w:hAnsi="Arial" w:eastAsia="Hiragino Sans GB"/>
+                <w:b/>
+                <w:color w:val="FFFFFF"/>
+                <w:sz w:val="16"/>
+              </w:rPr>
+              <w:t>Pixel Acc</w:t>
+            </w:r>
+          </w:p>
+        </w:tc>
+        <w:tc>
+          <w:tcPr>
+            <w:tcW w:type="dxa" w:w="1587"/>
+            <w:shd w:fill="17365D"/>
+            <w:vAlign w:val="center"/>
+            <w:tcMar>
+              <w:top w:w="90" w:type="dxa"/>
+              <w:start w:w="100" w:type="dxa"/>
+              <w:bottom w:w="90" w:type="dxa"/>
+              <w:end w:w="100" w:type="dxa"/>
+            </w:tcMar>
+          </w:tcPr>
+          <w:p>
+            <w:pPr>
+              <w:spacing w:after="0" w:line="252" w:lineRule="auto"/>
+              <w:jc w:val="center"/>
+            </w:pPr>
+            <w:r>
+              <w:rPr>
+                <w:rFonts w:ascii="Arial" w:hAnsi="Arial" w:eastAsia="Hiragino Sans GB"/>
+                <w:b/>
+                <w:color w:val="FFFFFF"/>
+                <w:sz w:val="16"/>
+              </w:rPr>
+              <w:t>Mean IoU</w:t>
+            </w:r>
+          </w:p>
+        </w:tc>
+        <w:tc>
+          <w:tcPr>
+            <w:tcW w:type="dxa" w:w="1701"/>
+            <w:shd w:fill="17365D"/>
+            <w:vAlign w:val="center"/>
+            <w:tcMar>
+              <w:top w:w="90" w:type="dxa"/>
+              <w:start w:w="100" w:type="dxa"/>
+              <w:bottom w:w="90" w:type="dxa"/>
+              <w:end w:w="100" w:type="dxa"/>
+            </w:tcMar>
+          </w:tcPr>
+          <w:p>
+            <w:pPr>
+              <w:spacing w:after="0" w:line="252" w:lineRule="auto"/>
+              <w:jc w:val="center"/>
+            </w:pPr>
+            <w:r>
+              <w:rPr>
+                <w:rFonts w:ascii="Arial" w:hAnsi="Arial" w:eastAsia="Hiragino Sans GB"/>
+                <w:b/>
+                <w:color w:val="FFFFFF"/>
+                <w:sz w:val="16"/>
+              </w:rPr>
+              <w:t>Crop IoU</w:t>
+            </w:r>
+          </w:p>
+        </w:tc>
+        <w:tc>
+          <w:tcPr>
+            <w:tcW w:type="dxa" w:w="1701"/>
+            <w:shd w:fill="17365D"/>
+            <w:vAlign w:val="center"/>
+            <w:tcMar>
+              <w:top w:w="90" w:type="dxa"/>
+              <w:start w:w="100" w:type="dxa"/>
+              <w:bottom w:w="90" w:type="dxa"/>
+              <w:end w:w="100" w:type="dxa"/>
+            </w:tcMar>
+          </w:tcPr>
+          <w:p>
+            <w:pPr>
+              <w:spacing w:after="0" w:line="252" w:lineRule="auto"/>
+              <w:jc w:val="center"/>
+            </w:pPr>
+            <w:r>
+              <w:rPr>
+                <w:rFonts w:ascii="Arial" w:hAnsi="Arial" w:eastAsia="Hiragino Sans GB"/>
+                <w:b/>
+                <w:color w:val="FFFFFF"/>
+                <w:sz w:val="16"/>
+              </w:rPr>
+              <w:t>Weed IoU</w:t>
+            </w:r>
+          </w:p>
+        </w:tc>
+      </w:tr>
+      <w:tr>
+        <w:trPr>
+          <w:cantSplit/>
+        </w:trPr>
+        <w:tc>
+          <w:tcPr>
+            <w:tcW w:type="dxa" w:w="2438"/>
+            <w:vAlign w:val="center"/>
+            <w:tcMar>
+              <w:top w:w="90" w:type="dxa"/>
+              <w:start w:w="100" w:type="dxa"/>
+              <w:bottom w:w="90" w:type="dxa"/>
+              <w:end w:w="100" w:type="dxa"/>
+            </w:tcMar>
+          </w:tcPr>
+          <w:p>
+            <w:pPr>
+              <w:spacing w:after="0" w:line="252" w:lineRule="auto"/>
+              <w:jc w:val="left"/>
+            </w:pPr>
+            <w:r>
+              <w:rPr>
+                <w:rFonts w:ascii="Arial" w:hAnsi="Arial" w:eastAsia="Arial Unicode MS"/>
+                <w:sz w:val="16"/>
+              </w:rPr>
+              <w:t>Weighted CE 20 epochs best</w:t>
+            </w:r>
+          </w:p>
+        </w:tc>
+        <w:tc>
+          <w:tcPr>
+            <w:tcW w:type="dxa" w:w="1531"/>
+            <w:vAlign w:val="center"/>
+            <w:tcMar>
+              <w:top w:w="90" w:type="dxa"/>
+              <w:start w:w="100" w:type="dxa"/>
+              <w:bottom w:w="90" w:type="dxa"/>
+              <w:end w:w="100" w:type="dxa"/>
+            </w:tcMar>
+          </w:tcPr>
+          <w:p>
+            <w:pPr>
+              <w:spacing w:after="0" w:line="252" w:lineRule="auto"/>
+              <w:jc w:val="center"/>
+            </w:pPr>
+            <w:r>
+              <w:rPr>
+                <w:rFonts w:ascii="Arial" w:hAnsi="Arial" w:eastAsia="Arial Unicode MS"/>
+                <w:sz w:val="16"/>
+              </w:rPr>
+              <w:t>94.82%</w:t>
+            </w:r>
+          </w:p>
+        </w:tc>
+        <w:tc>
+          <w:tcPr>
+            <w:tcW w:type="dxa" w:w="1587"/>
+            <w:vAlign w:val="center"/>
+            <w:tcMar>
+              <w:top w:w="90" w:type="dxa"/>
+              <w:start w:w="100" w:type="dxa"/>
+              <w:bottom w:w="90" w:type="dxa"/>
+              <w:end w:w="100" w:type="dxa"/>
+            </w:tcMar>
+          </w:tcPr>
+          <w:p>
+            <w:pPr>
+              <w:spacing w:after="0" w:line="252" w:lineRule="auto"/>
+              <w:jc w:val="center"/>
+            </w:pPr>
+            <w:r>
+              <w:rPr>
+                <w:rFonts w:ascii="Arial" w:hAnsi="Arial" w:eastAsia="Arial Unicode MS"/>
+                <w:sz w:val="16"/>
+              </w:rPr>
+              <w:t>63.90%</w:t>
+            </w:r>
+          </w:p>
+        </w:tc>
+        <w:tc>
+          <w:tcPr>
+            <w:tcW w:type="dxa" w:w="1701"/>
+            <w:vAlign w:val="center"/>
+            <w:tcMar>
+              <w:top w:w="90" w:type="dxa"/>
+              <w:start w:w="100" w:type="dxa"/>
+              <w:bottom w:w="90" w:type="dxa"/>
+              <w:end w:w="100" w:type="dxa"/>
+            </w:tcMar>
+          </w:tcPr>
+          <w:p>
+            <w:pPr>
+              <w:spacing w:after="0" w:line="252" w:lineRule="auto"/>
+              <w:jc w:val="center"/>
+            </w:pPr>
+            <w:r>
+              <w:rPr>
+                <w:rFonts w:ascii="Arial" w:hAnsi="Arial" w:eastAsia="Arial Unicode MS"/>
+                <w:sz w:val="16"/>
+              </w:rPr>
+              <w:t>59.39%</w:t>
+            </w:r>
+          </w:p>
+        </w:tc>
+        <w:tc>
+          <w:tcPr>
+            <w:tcW w:type="dxa" w:w="1701"/>
+            <w:vAlign w:val="center"/>
+            <w:tcMar>
+              <w:top w:w="90" w:type="dxa"/>
+              <w:start w:w="100" w:type="dxa"/>
+              <w:bottom w:w="90" w:type="dxa"/>
+              <w:end w:w="100" w:type="dxa"/>
+            </w:tcMar>
+          </w:tcPr>
+          <w:p>
+            <w:pPr>
+              <w:spacing w:after="0" w:line="252" w:lineRule="auto"/>
+              <w:jc w:val="center"/>
+            </w:pPr>
+            <w:r>
+              <w:rPr>
+                <w:rFonts w:ascii="Arial" w:hAnsi="Arial" w:eastAsia="Arial Unicode MS"/>
+                <w:sz w:val="16"/>
+              </w:rPr>
+              <w:t>36.99%</w:t>
+            </w:r>
+          </w:p>
+        </w:tc>
+      </w:tr>
+      <w:tr>
+        <w:trPr>
+          <w:cantSplit/>
+        </w:trPr>
+        <w:tc>
+          <w:tcPr>
+            <w:tcW w:type="dxa" w:w="2438"/>
+            <w:vAlign w:val="center"/>
+            <w:tcMar>
+              <w:top w:w="90" w:type="dxa"/>
+              <w:start w:w="100" w:type="dxa"/>
+              <w:bottom w:w="90" w:type="dxa"/>
+              <w:end w:w="100" w:type="dxa"/>
+            </w:tcMar>
+            <w:shd w:fill="F5F7FA"/>
+          </w:tcPr>
+          <w:p>
+            <w:pPr>
+              <w:spacing w:after="0" w:line="252" w:lineRule="auto"/>
+              <w:jc w:val="left"/>
+            </w:pPr>
+            <w:r>
+              <w:rPr>
+                <w:rFonts w:ascii="Arial" w:hAnsi="Arial" w:eastAsia="Arial Unicode MS"/>
+                <w:sz w:val="16"/>
+              </w:rPr>
+              <w:t>Boundary weighted CE</w:t>
+            </w:r>
+          </w:p>
+        </w:tc>
+        <w:tc>
+          <w:tcPr>
+            <w:tcW w:type="dxa" w:w="1531"/>
+            <w:vAlign w:val="center"/>
+            <w:tcMar>
+              <w:top w:w="90" w:type="dxa"/>
+              <w:start w:w="100" w:type="dxa"/>
+              <w:bottom w:w="90" w:type="dxa"/>
+              <w:end w:w="100" w:type="dxa"/>
+            </w:tcMar>
+            <w:shd w:fill="F5F7FA"/>
+          </w:tcPr>
+          <w:p>
+            <w:pPr>
+              <w:spacing w:after="0" w:line="252" w:lineRule="auto"/>
+              <w:jc w:val="center"/>
+            </w:pPr>
+            <w:r>
+              <w:rPr>
+                <w:rFonts w:ascii="Arial" w:hAnsi="Arial" w:eastAsia="Arial Unicode MS"/>
+                <w:sz w:val="16"/>
+              </w:rPr>
+              <w:t>96.66%</w:t>
+            </w:r>
+          </w:p>
+        </w:tc>
+        <w:tc>
+          <w:tcPr>
+            <w:tcW w:type="dxa" w:w="1587"/>
+            <w:vAlign w:val="center"/>
+            <w:tcMar>
+              <w:top w:w="90" w:type="dxa"/>
+              <w:start w:w="100" w:type="dxa"/>
+              <w:bottom w:w="90" w:type="dxa"/>
+              <w:end w:w="100" w:type="dxa"/>
+            </w:tcMar>
+            <w:shd w:fill="F5F7FA"/>
+          </w:tcPr>
+          <w:p>
+            <w:pPr>
+              <w:spacing w:after="0" w:line="252" w:lineRule="auto"/>
+              <w:jc w:val="center"/>
+            </w:pPr>
+            <w:r>
+              <w:rPr>
+                <w:rFonts w:ascii="Arial" w:hAnsi="Arial" w:eastAsia="Arial Unicode MS"/>
+                <w:sz w:val="16"/>
+              </w:rPr>
+              <w:t>68.86%</w:t>
+            </w:r>
+          </w:p>
+        </w:tc>
+        <w:tc>
+          <w:tcPr>
+            <w:tcW w:type="dxa" w:w="1701"/>
+            <w:vAlign w:val="center"/>
+            <w:tcMar>
+              <w:top w:w="90" w:type="dxa"/>
+              <w:start w:w="100" w:type="dxa"/>
+              <w:bottom w:w="90" w:type="dxa"/>
+              <w:end w:w="100" w:type="dxa"/>
+            </w:tcMar>
+            <w:shd w:fill="F5F7FA"/>
+          </w:tcPr>
+          <w:p>
+            <w:pPr>
+              <w:spacing w:after="0" w:line="252" w:lineRule="auto"/>
+              <w:jc w:val="center"/>
+            </w:pPr>
+            <w:r>
+              <w:rPr>
+                <w:rFonts w:ascii="Arial" w:hAnsi="Arial" w:eastAsia="Arial Unicode MS"/>
+                <w:sz w:val="16"/>
+              </w:rPr>
+              <w:t>66.02%</w:t>
+            </w:r>
+          </w:p>
+        </w:tc>
+        <w:tc>
+          <w:tcPr>
+            <w:tcW w:type="dxa" w:w="1701"/>
+            <w:vAlign w:val="center"/>
+            <w:tcMar>
+              <w:top w:w="90" w:type="dxa"/>
+              <w:start w:w="100" w:type="dxa"/>
+              <w:bottom w:w="90" w:type="dxa"/>
+              <w:end w:w="100" w:type="dxa"/>
+            </w:tcMar>
+            <w:shd w:fill="F5F7FA"/>
+          </w:tcPr>
+          <w:p>
+            <w:pPr>
+              <w:spacing w:after="0" w:line="252" w:lineRule="auto"/>
+              <w:jc w:val="center"/>
+            </w:pPr>
+            <w:r>
+              <w:rPr>
+                <w:rFonts w:ascii="Arial" w:hAnsi="Arial" w:eastAsia="Arial Unicode MS"/>
+                <w:sz w:val="16"/>
+              </w:rPr>
+              <w:t>43.22%</w:t>
+            </w:r>
+          </w:p>
+        </w:tc>
+      </w:tr>
+    </w:tbl>
+    <w:p>
+      <w:pPr>
+        <w:spacing w:after="20"/>
+      </w:pPr>
+    </w:p>
+    <w:tbl>
+      <w:tblPr>
+        <w:tblW w:type="auto" w:w="0"/>
+        <w:jc w:val="center"/>
+        <w:tblLayout w:type="fixed"/>
+        <w:tblLook w:firstColumn="1" w:firstRow="1" w:lastColumn="0" w:lastRow="0" w:noHBand="0" w:noVBand="1" w:val="04A0"/>
+        <w:tblBorders>
+          <w:top w:val="single" w:sz="5" w:space="0" w:color="D9E1E8"/>
+          <w:left w:val="single" w:sz="5" w:space="0" w:color="D9E1E8"/>
+          <w:bottom w:val="single" w:sz="5" w:space="0" w:color="D9E1E8"/>
+          <w:right w:val="single" w:sz="5" w:space="0" w:color="D9E1E8"/>
+          <w:insideH w:val="single" w:sz="5" w:space="0" w:color="D9E1E8"/>
+          <w:insideV w:val="single" w:sz="5" w:space="0" w:color="D9E1E8"/>
+        </w:tblBorders>
+      </w:tblPr>
+      <w:tblGrid>
+        <w:gridCol w:w="2211"/>
+        <w:gridCol w:w="1587"/>
+        <w:gridCol w:w="1871"/>
+        <w:gridCol w:w="2098"/>
+        <w:gridCol w:w="1191"/>
+      </w:tblGrid>
+      <w:tr>
+        <w:trPr>
+          <w:tblHeader w:val="true"/>
+          <w:cantSplit/>
+        </w:trPr>
+        <w:tc>
+          <w:tcPr>
+            <w:tcW w:type="dxa" w:w="2211"/>
+            <w:shd w:fill="17365D"/>
+            <w:vAlign w:val="center"/>
+            <w:tcMar>
+              <w:top w:w="90" w:type="dxa"/>
+              <w:start w:w="100" w:type="dxa"/>
+              <w:bottom w:w="90" w:type="dxa"/>
+              <w:end w:w="100" w:type="dxa"/>
+            </w:tcMar>
+          </w:tcPr>
+          <w:p>
+            <w:pPr>
+              <w:spacing w:after="0" w:line="252" w:lineRule="auto"/>
+              <w:jc w:val="center"/>
+            </w:pPr>
+            <w:r>
+              <w:rPr>
+                <w:rFonts w:ascii="Arial" w:hAnsi="Arial" w:eastAsia="Hiragino Sans GB"/>
+                <w:b/>
+                <w:color w:val="FFFFFF"/>
+                <w:sz w:val="16"/>
+              </w:rPr>
+              <w:t>Loss</w:t>
+            </w:r>
+          </w:p>
+        </w:tc>
+        <w:tc>
+          <w:tcPr>
+            <w:tcW w:type="dxa" w:w="1587"/>
+            <w:shd w:fill="17365D"/>
+            <w:vAlign w:val="center"/>
+            <w:tcMar>
+              <w:top w:w="90" w:type="dxa"/>
+              <w:start w:w="100" w:type="dxa"/>
+              <w:bottom w:w="90" w:type="dxa"/>
+              <w:end w:w="100" w:type="dxa"/>
+            </w:tcMar>
+          </w:tcPr>
+          <w:p>
+            <w:pPr>
+              <w:spacing w:after="0" w:line="252" w:lineRule="auto"/>
+              <w:jc w:val="center"/>
+            </w:pPr>
+            <w:r>
+              <w:rPr>
+                <w:rFonts w:ascii="Arial" w:hAnsi="Arial" w:eastAsia="Hiragino Sans GB"/>
+                <w:b/>
+                <w:color w:val="FFFFFF"/>
+                <w:sz w:val="16"/>
+              </w:rPr>
+              <w:t>Overall error rate</w:t>
+            </w:r>
+          </w:p>
+        </w:tc>
+        <w:tc>
+          <w:tcPr>
+            <w:tcW w:type="dxa" w:w="1871"/>
+            <w:shd w:fill="17365D"/>
+            <w:vAlign w:val="center"/>
+            <w:tcMar>
+              <w:top w:w="90" w:type="dxa"/>
+              <w:start w:w="100" w:type="dxa"/>
+              <w:bottom w:w="90" w:type="dxa"/>
+              <w:end w:w="100" w:type="dxa"/>
+            </w:tcMar>
+          </w:tcPr>
+          <w:p>
+            <w:pPr>
+              <w:spacing w:after="0" w:line="252" w:lineRule="auto"/>
+              <w:jc w:val="center"/>
+            </w:pPr>
+            <w:r>
+              <w:rPr>
+                <w:rFonts w:ascii="Arial" w:hAnsi="Arial" w:eastAsia="Hiragino Sans GB"/>
+                <w:b/>
+                <w:color w:val="FFFFFF"/>
+                <w:sz w:val="16"/>
+              </w:rPr>
+              <w:t>5px 边界错误率</w:t>
+            </w:r>
+          </w:p>
+        </w:tc>
+        <w:tc>
+          <w:tcPr>
+            <w:tcW w:type="dxa" w:w="2098"/>
+            <w:shd w:fill="17365D"/>
+            <w:vAlign w:val="center"/>
+            <w:tcMar>
+              <w:top w:w="90" w:type="dxa"/>
+              <w:start w:w="100" w:type="dxa"/>
+              <w:bottom w:w="90" w:type="dxa"/>
+              <w:end w:w="100" w:type="dxa"/>
+            </w:tcMar>
+          </w:tcPr>
+          <w:p>
+            <w:pPr>
+              <w:spacing w:after="0" w:line="252" w:lineRule="auto"/>
+              <w:jc w:val="center"/>
+            </w:pPr>
+            <w:r>
+              <w:rPr>
+                <w:rFonts w:ascii="Arial" w:hAnsi="Arial" w:eastAsia="Hiragino Sans GB"/>
+                <w:b/>
+                <w:color w:val="FFFFFF"/>
+                <w:sz w:val="16"/>
+              </w:rPr>
+              <w:t>5px 边界外错误率</w:t>
+            </w:r>
+          </w:p>
+        </w:tc>
+        <w:tc>
+          <w:tcPr>
+            <w:tcW w:type="dxa" w:w="1191"/>
+            <w:shd w:fill="17365D"/>
+            <w:vAlign w:val="center"/>
+            <w:tcMar>
+              <w:top w:w="90" w:type="dxa"/>
+              <w:start w:w="100" w:type="dxa"/>
+              <w:bottom w:w="90" w:type="dxa"/>
+              <w:end w:w="100" w:type="dxa"/>
+            </w:tcMar>
+          </w:tcPr>
+          <w:p>
+            <w:pPr>
+              <w:spacing w:after="0" w:line="252" w:lineRule="auto"/>
+              <w:jc w:val="center"/>
+            </w:pPr>
+            <w:r>
+              <w:rPr>
+                <w:rFonts w:ascii="Arial" w:hAnsi="Arial" w:eastAsia="Hiragino Sans GB"/>
+                <w:b/>
+                <w:color w:val="FFFFFF"/>
+                <w:sz w:val="16"/>
+              </w:rPr>
+              <w:t>错误像素数</w:t>
+            </w:r>
+          </w:p>
+        </w:tc>
+      </w:tr>
+      <w:tr>
+        <w:trPr>
+          <w:cantSplit/>
+        </w:trPr>
+        <w:tc>
+          <w:tcPr>
+            <w:tcW w:type="dxa" w:w="2211"/>
+            <w:vAlign w:val="center"/>
+            <w:tcMar>
+              <w:top w:w="90" w:type="dxa"/>
+              <w:start w:w="100" w:type="dxa"/>
+              <w:bottom w:w="90" w:type="dxa"/>
+              <w:end w:w="100" w:type="dxa"/>
+            </w:tcMar>
+          </w:tcPr>
+          <w:p>
+            <w:pPr>
+              <w:spacing w:after="0" w:line="252" w:lineRule="auto"/>
+              <w:jc w:val="left"/>
+            </w:pPr>
+            <w:r>
+              <w:rPr>
+                <w:rFonts w:ascii="Arial" w:hAnsi="Arial" w:eastAsia="Arial Unicode MS"/>
+                <w:sz w:val="16"/>
+              </w:rPr>
+              <w:t>Weighted CE</w:t>
+            </w:r>
+          </w:p>
+        </w:tc>
+        <w:tc>
+          <w:tcPr>
+            <w:tcW w:type="dxa" w:w="1587"/>
+            <w:vAlign w:val="center"/>
+            <w:tcMar>
+              <w:top w:w="90" w:type="dxa"/>
+              <w:start w:w="100" w:type="dxa"/>
+              <w:bottom w:w="90" w:type="dxa"/>
+              <w:end w:w="100" w:type="dxa"/>
+            </w:tcMar>
+          </w:tcPr>
+          <w:p>
+            <w:pPr>
+              <w:spacing w:after="0" w:line="252" w:lineRule="auto"/>
+              <w:jc w:val="center"/>
+            </w:pPr>
+            <w:r>
+              <w:rPr>
+                <w:rFonts w:ascii="Arial" w:hAnsi="Arial" w:eastAsia="Arial Unicode MS"/>
+                <w:sz w:val="16"/>
+              </w:rPr>
+              <w:t>5.18%</w:t>
+            </w:r>
+          </w:p>
+        </w:tc>
+        <w:tc>
+          <w:tcPr>
+            <w:tcW w:type="dxa" w:w="1871"/>
+            <w:vAlign w:val="center"/>
+            <w:tcMar>
+              <w:top w:w="90" w:type="dxa"/>
+              <w:start w:w="100" w:type="dxa"/>
+              <w:bottom w:w="90" w:type="dxa"/>
+              <w:end w:w="100" w:type="dxa"/>
+            </w:tcMar>
+          </w:tcPr>
+          <w:p>
+            <w:pPr>
+              <w:spacing w:after="0" w:line="252" w:lineRule="auto"/>
+              <w:jc w:val="center"/>
+            </w:pPr>
+            <w:r>
+              <w:rPr>
+                <w:rFonts w:ascii="Arial" w:hAnsi="Arial" w:eastAsia="Arial Unicode MS"/>
+                <w:sz w:val="16"/>
+              </w:rPr>
+              <w:t>14.48%</w:t>
+            </w:r>
+          </w:p>
+        </w:tc>
+        <w:tc>
+          <w:tcPr>
+            <w:tcW w:type="dxa" w:w="2098"/>
+            <w:vAlign w:val="center"/>
+            <w:tcMar>
+              <w:top w:w="90" w:type="dxa"/>
+              <w:start w:w="100" w:type="dxa"/>
+              <w:bottom w:w="90" w:type="dxa"/>
+              <w:end w:w="100" w:type="dxa"/>
+            </w:tcMar>
+          </w:tcPr>
+          <w:p>
+            <w:pPr>
+              <w:spacing w:after="0" w:line="252" w:lineRule="auto"/>
+              <w:jc w:val="center"/>
+            </w:pPr>
+            <w:r>
+              <w:rPr>
+                <w:rFonts w:ascii="Arial" w:hAnsi="Arial" w:eastAsia="Arial Unicode MS"/>
+                <w:sz w:val="16"/>
+              </w:rPr>
+              <w:t>0.38%</w:t>
+            </w:r>
+          </w:p>
+        </w:tc>
+        <w:tc>
+          <w:tcPr>
+            <w:tcW w:type="dxa" w:w="1191"/>
+            <w:vAlign w:val="center"/>
+            <w:tcMar>
+              <w:top w:w="90" w:type="dxa"/>
+              <w:start w:w="100" w:type="dxa"/>
+              <w:bottom w:w="90" w:type="dxa"/>
+              <w:end w:w="100" w:type="dxa"/>
+            </w:tcMar>
+          </w:tcPr>
+          <w:p>
+            <w:pPr>
+              <w:spacing w:after="0" w:line="252" w:lineRule="auto"/>
+              <w:jc w:val="center"/>
+            </w:pPr>
+            <w:r>
+              <w:rPr>
+                <w:rFonts w:ascii="Arial" w:hAnsi="Arial" w:eastAsia="Arial Unicode MS"/>
+                <w:sz w:val="16"/>
+              </w:rPr>
+              <w:t>5812</w:t>
+            </w:r>
+          </w:p>
+        </w:tc>
+      </w:tr>
+      <w:tr>
+        <w:trPr>
+          <w:cantSplit/>
+        </w:trPr>
+        <w:tc>
+          <w:tcPr>
+            <w:tcW w:type="dxa" w:w="2211"/>
+            <w:vAlign w:val="center"/>
+            <w:tcMar>
+              <w:top w:w="90" w:type="dxa"/>
+              <w:start w:w="100" w:type="dxa"/>
+              <w:bottom w:w="90" w:type="dxa"/>
+              <w:end w:w="100" w:type="dxa"/>
+            </w:tcMar>
+            <w:shd w:fill="F5F7FA"/>
+          </w:tcPr>
+          <w:p>
+            <w:pPr>
+              <w:spacing w:after="0" w:line="252" w:lineRule="auto"/>
+              <w:jc w:val="left"/>
+            </w:pPr>
+            <w:r>
+              <w:rPr>
+                <w:rFonts w:ascii="Arial" w:hAnsi="Arial" w:eastAsia="Arial Unicode MS"/>
+                <w:sz w:val="16"/>
+              </w:rPr>
+              <w:t>Boundary weighted CE</w:t>
+            </w:r>
+          </w:p>
+        </w:tc>
+        <w:tc>
+          <w:tcPr>
+            <w:tcW w:type="dxa" w:w="1587"/>
+            <w:vAlign w:val="center"/>
+            <w:tcMar>
+              <w:top w:w="90" w:type="dxa"/>
+              <w:start w:w="100" w:type="dxa"/>
+              <w:bottom w:w="90" w:type="dxa"/>
+              <w:end w:w="100" w:type="dxa"/>
+            </w:tcMar>
+            <w:shd w:fill="F5F7FA"/>
+          </w:tcPr>
+          <w:p>
+            <w:pPr>
+              <w:spacing w:after="0" w:line="252" w:lineRule="auto"/>
+              <w:jc w:val="center"/>
+            </w:pPr>
+            <w:r>
+              <w:rPr>
+                <w:rFonts w:ascii="Arial" w:hAnsi="Arial" w:eastAsia="Arial Unicode MS"/>
+                <w:sz w:val="16"/>
+              </w:rPr>
+              <w:t>3.34%</w:t>
+            </w:r>
+          </w:p>
+        </w:tc>
+        <w:tc>
+          <w:tcPr>
+            <w:tcW w:type="dxa" w:w="1871"/>
+            <w:vAlign w:val="center"/>
+            <w:tcMar>
+              <w:top w:w="90" w:type="dxa"/>
+              <w:start w:w="100" w:type="dxa"/>
+              <w:bottom w:w="90" w:type="dxa"/>
+              <w:end w:w="100" w:type="dxa"/>
+            </w:tcMar>
+            <w:shd w:fill="F5F7FA"/>
+          </w:tcPr>
+          <w:p>
+            <w:pPr>
+              <w:spacing w:after="0" w:line="252" w:lineRule="auto"/>
+              <w:jc w:val="center"/>
+            </w:pPr>
+            <w:r>
+              <w:rPr>
+                <w:rFonts w:ascii="Arial" w:hAnsi="Arial" w:eastAsia="Arial Unicode MS"/>
+                <w:sz w:val="16"/>
+              </w:rPr>
+              <w:t>9.50%</w:t>
+            </w:r>
+          </w:p>
+        </w:tc>
+        <w:tc>
+          <w:tcPr>
+            <w:tcW w:type="dxa" w:w="2098"/>
+            <w:vAlign w:val="center"/>
+            <w:tcMar>
+              <w:top w:w="90" w:type="dxa"/>
+              <w:start w:w="100" w:type="dxa"/>
+              <w:bottom w:w="90" w:type="dxa"/>
+              <w:end w:w="100" w:type="dxa"/>
+            </w:tcMar>
+            <w:shd w:fill="F5F7FA"/>
+          </w:tcPr>
+          <w:p>
+            <w:pPr>
+              <w:spacing w:after="0" w:line="252" w:lineRule="auto"/>
+              <w:jc w:val="center"/>
+            </w:pPr>
+            <w:r>
+              <w:rPr>
+                <w:rFonts w:ascii="Arial" w:hAnsi="Arial" w:eastAsia="Arial Unicode MS"/>
+                <w:sz w:val="16"/>
+              </w:rPr>
+              <w:t>0.16%</w:t>
+            </w:r>
+          </w:p>
+        </w:tc>
+        <w:tc>
+          <w:tcPr>
+            <w:tcW w:type="dxa" w:w="1191"/>
+            <w:vAlign w:val="center"/>
+            <w:tcMar>
+              <w:top w:w="90" w:type="dxa"/>
+              <w:start w:w="100" w:type="dxa"/>
+              <w:bottom w:w="90" w:type="dxa"/>
+              <w:end w:w="100" w:type="dxa"/>
+            </w:tcMar>
+            <w:shd w:fill="F5F7FA"/>
+          </w:tcPr>
+          <w:p>
+            <w:pPr>
+              <w:spacing w:after="0" w:line="252" w:lineRule="auto"/>
+              <w:jc w:val="center"/>
+            </w:pPr>
+            <w:r>
+              <w:rPr>
+                <w:rFonts w:ascii="Arial" w:hAnsi="Arial" w:eastAsia="Arial Unicode MS"/>
+                <w:sz w:val="16"/>
+              </w:rPr>
+              <w:t>3746</w:t>
+            </w:r>
+          </w:p>
+        </w:tc>
+      </w:tr>
+    </w:tbl>
+    <w:p>
+      <w:pPr>
+        <w:spacing w:after="20"/>
+      </w:pPr>
+    </w:p>
+    <w:p>
+      <w:pPr>
+        <w:ind w:firstLine="420"/>
+      </w:pPr>
+      <w:r>
+        <w:rPr>
+          <w:rFonts w:ascii="Arial" w:hAnsi="Arial" w:eastAsia="Arial Unicode MS"/>
+        </w:rPr>
+        <w:t>Boundary weighted CE 将 sample index=0 的 5px 边界错误率从 14.48% 降至 9.50%，错误像素总数从 5812 降至 3746。剩余错误中仍有 96.90% 落在 5px 边界内，说明边界仍是后续优化重点。</w:t>
+      </w:r>
+    </w:p>
+    <w:p>
+      <w:pPr>
+        <w:ind w:firstLine="420"/>
+      </w:pPr>
+      <w:r>
+        <w:rPr>
+          <w:rFonts w:ascii="Arial" w:hAnsi="Arial" w:eastAsia="Arial Unicode MS"/>
+          <w:b/>
+        </w:rPr>
+        <w:t>阶段性结论：</w:t>
+      </w:r>
+      <w:r>
+        <w:rPr>
+          <w:rFonts w:ascii="Arial" w:hAnsi="Arial" w:eastAsia="Arial Unicode MS"/>
+        </w:rPr>
+        <w:t>Boundary weighted CE 是当前新的候选主结果，但三 seed 指标仅小幅提升，应继续检验不同边界权重和预测图。Weighted CE 继续作为稳定 baseline。</w:t>
+      </w:r>
+    </w:p>
+    <w:p>
+      <w:pPr>
+        <w:pStyle w:val="Heading1"/>
+        <w:keepNext/>
+      </w:pPr>
+      <w:r>
+        <w:rPr>
+          <w:rFonts w:ascii="Arial" w:hAnsi="Arial" w:eastAsia="Hiragino Sans GB"/>
+          <w:b/>
+          <w:color w:val="000000"/>
+        </w:rPr>
+        <w:t>20 真实预测可视化与误差分析</w:t>
       </w:r>
     </w:p>
     <w:p>
@@ -20042,7 +22611,7 @@
           <w:b/>
           <w:color w:val="000000"/>
         </w:rPr>
-        <w:t>20 关键指标和变量解释</w:t>
+        <w:t>21 关键指标和变量解释</w:t>
       </w:r>
     </w:p>
     <w:tbl>
@@ -20534,7 +23103,7 @@
           <w:b/>
           <w:color w:val="000000"/>
         </w:rPr>
-        <w:t>21 当前结论</w:t>
+        <w:t>22 当前结论</w:t>
       </w:r>
     </w:p>
     <w:p>
@@ -20702,7 +23271,7 @@
         <w:rPr>
           <w:rFonts w:ascii="Arial" w:hAnsi="Arial" w:eastAsia="Arial Unicode MS"/>
         </w:rPr>
-        <w:t>14.  Loss 多 seed 对比中，Weighted CE 的平均 mean IoU 和 weed IoU 最高；Dice + CE 的 seed 2 明显下降，稳定性仍需验证。</w:t>
+        <w:t>14.  在 Weighted CE、Focal Loss、Dice + CE 的多 seed 对比中，Weighted CE 的平均 mean IoU 和 weed IoU 最高；Dice + CE 的 seed 2 明显下降，稳定性仍需验证。</w:t>
       </w:r>
     </w:p>
     <w:p>
@@ -20714,7 +23283,7 @@
         <w:rPr>
           <w:rFonts w:ascii="Arial" w:hAnsi="Arial" w:eastAsia="Arial Unicode MS"/>
         </w:rPr>
-        <w:t>15.  当前最稳定 baseline 是 multispectral + weighted CE + class weights 1/4/8 + 20 epochs + best checkpoint。</w:t>
+        <w:t>15.  Boundary error analysis 显示，sample index=0 的 5px 边界区域占有效像素 34.06%，却包含 Weighted CE 的 95.18% 错误；U-Net 虽已有 skip connection，边界仍是主要难点。</w:t>
       </w:r>
     </w:p>
     <w:p>
@@ -20726,7 +23295,31 @@
         <w:rPr>
           <w:rFonts w:ascii="Arial" w:hAnsi="Arial" w:eastAsia="Arial Unicode MS"/>
         </w:rPr>
-        <w:t>16.  当前主结果：Pixel Accuracy = 96.38% ± 0.36%，Mean IoU = 74.78% ± 0.82%，Weed IoU = 56.89% ± 2.06%。</w:t>
+        <w:t>16.  Boundary weighted CE 将 sample index=0 的 5px 边界错误率从 14.48% 降至 9.50%。</w:t>
+      </w:r>
+    </w:p>
+    <w:p>
+      <w:pPr>
+        <w:spacing w:after="60"/>
+        <w:ind w:left="369" w:hanging="215"/>
+      </w:pPr>
+      <w:r>
+        <w:rPr>
+          <w:rFonts w:ascii="Arial" w:hAnsi="Arial" w:eastAsia="Arial Unicode MS"/>
+        </w:rPr>
+        <w:t>17.  Boundary weighted CE 是当前新的候选主结果：三 seed 平均 Mean IoU = 75.08% ± 1.10%，Weed IoU = 57.66% ± 1.58%；相对 Weighted CE 是小幅提升。</w:t>
+      </w:r>
+    </w:p>
+    <w:p>
+      <w:pPr>
+        <w:spacing w:after="60"/>
+        <w:ind w:left="369" w:hanging="215"/>
+      </w:pPr>
+      <w:r>
+        <w:rPr>
+          <w:rFonts w:ascii="Arial" w:hAnsi="Arial" w:eastAsia="Arial Unicode MS"/>
+        </w:rPr>
+        <w:t>18.  Multispectral + weighted CE + class weights 1/4/8 + 20 epochs + best checkpoint 继续作为稳定 baseline。</w:t>
       </w:r>
     </w:p>
     <w:p>
@@ -20740,7 +23333,7 @@
           <w:b/>
           <w:color w:val="000000"/>
         </w:rPr>
-        <w:t>21.1 当前项目完成内容</w:t>
+        <w:t>22.1 当前项目完成内容</w:t>
       </w:r>
     </w:p>
     <w:tbl>
@@ -22182,6 +24775,169 @@
                 <w:rFonts w:ascii="Arial" w:hAnsi="Arial" w:eastAsia="Arial Unicode MS"/>
                 <w:sz w:val="17"/>
               </w:rPr>
+              <w:t>Boundary error analysis</w:t>
+            </w:r>
+          </w:p>
+        </w:tc>
+        <w:tc>
+          <w:tcPr>
+            <w:tcW w:type="dxa" w:w="5329"/>
+            <w:vAlign w:val="center"/>
+            <w:tcMar>
+              <w:top w:w="90" w:type="dxa"/>
+              <w:start w:w="100" w:type="dxa"/>
+              <w:bottom w:w="90" w:type="dxa"/>
+              <w:end w:w="100" w:type="dxa"/>
+            </w:tcMar>
+          </w:tcPr>
+          <w:p>
+            <w:pPr>
+              <w:spacing w:after="0" w:line="252" w:lineRule="auto"/>
+              <w:jc w:val="left"/>
+            </w:pPr>
+            <w:r>
+              <w:rPr>
+                <w:rFonts w:ascii="Arial" w:hAnsi="Arial" w:eastAsia="Arial Unicode MS"/>
+                <w:sz w:val="17"/>
+              </w:rPr>
+              <w:t>Sample index=0 的 1/3/5px 边界错误统计</w:t>
+            </w:r>
+          </w:p>
+        </w:tc>
+        <w:tc>
+          <w:tcPr>
+            <w:tcW w:type="dxa" w:w="1247"/>
+            <w:vAlign w:val="center"/>
+            <w:tcMar>
+              <w:top w:w="90" w:type="dxa"/>
+              <w:start w:w="100" w:type="dxa"/>
+              <w:bottom w:w="90" w:type="dxa"/>
+              <w:end w:w="100" w:type="dxa"/>
+            </w:tcMar>
+          </w:tcPr>
+          <w:p>
+            <w:pPr>
+              <w:spacing w:after="0" w:line="252" w:lineRule="auto"/>
+              <w:jc w:val="center"/>
+            </w:pPr>
+            <w:r>
+              <w:rPr>
+                <w:rFonts w:ascii="Arial" w:hAnsi="Arial" w:eastAsia="Arial Unicode MS"/>
+                <w:sz w:val="17"/>
+              </w:rPr>
+              <w:t>完成</w:t>
+            </w:r>
+          </w:p>
+        </w:tc>
+      </w:tr>
+      <w:tr>
+        <w:trPr>
+          <w:cantSplit/>
+        </w:trPr>
+        <w:tc>
+          <w:tcPr>
+            <w:tcW w:type="dxa" w:w="2381"/>
+            <w:vAlign w:val="center"/>
+            <w:tcMar>
+              <w:top w:w="90" w:type="dxa"/>
+              <w:start w:w="100" w:type="dxa"/>
+              <w:bottom w:w="90" w:type="dxa"/>
+              <w:end w:w="100" w:type="dxa"/>
+            </w:tcMar>
+            <w:shd w:fill="F5F7FA"/>
+          </w:tcPr>
+          <w:p>
+            <w:pPr>
+              <w:spacing w:after="0" w:line="252" w:lineRule="auto"/>
+              <w:jc w:val="left"/>
+            </w:pPr>
+            <w:r>
+              <w:rPr>
+                <w:rFonts w:ascii="Arial" w:hAnsi="Arial" w:eastAsia="Arial Unicode MS"/>
+                <w:sz w:val="17"/>
+              </w:rPr>
+              <w:t>Boundary weighted CE</w:t>
+            </w:r>
+          </w:p>
+        </w:tc>
+        <w:tc>
+          <w:tcPr>
+            <w:tcW w:type="dxa" w:w="5329"/>
+            <w:vAlign w:val="center"/>
+            <w:tcMar>
+              <w:top w:w="90" w:type="dxa"/>
+              <w:start w:w="100" w:type="dxa"/>
+              <w:bottom w:w="90" w:type="dxa"/>
+              <w:end w:w="100" w:type="dxa"/>
+            </w:tcMar>
+            <w:shd w:fill="F5F7FA"/>
+          </w:tcPr>
+          <w:p>
+            <w:pPr>
+              <w:spacing w:after="0" w:line="252" w:lineRule="auto"/>
+              <w:jc w:val="left"/>
+            </w:pPr>
+            <w:r>
+              <w:rPr>
+                <w:rFonts w:ascii="Arial" w:hAnsi="Arial" w:eastAsia="Arial Unicode MS"/>
+                <w:sz w:val="17"/>
+              </w:rPr>
+              <w:t>Boundary radius 5、weight 3.0，Seed 0/1/2</w:t>
+            </w:r>
+          </w:p>
+        </w:tc>
+        <w:tc>
+          <w:tcPr>
+            <w:tcW w:type="dxa" w:w="1247"/>
+            <w:vAlign w:val="center"/>
+            <w:tcMar>
+              <w:top w:w="90" w:type="dxa"/>
+              <w:start w:w="100" w:type="dxa"/>
+              <w:bottom w:w="90" w:type="dxa"/>
+              <w:end w:w="100" w:type="dxa"/>
+            </w:tcMar>
+            <w:shd w:fill="F5F7FA"/>
+          </w:tcPr>
+          <w:p>
+            <w:pPr>
+              <w:spacing w:after="0" w:line="252" w:lineRule="auto"/>
+              <w:jc w:val="center"/>
+            </w:pPr>
+            <w:r>
+              <w:rPr>
+                <w:rFonts w:ascii="Arial" w:hAnsi="Arial" w:eastAsia="Arial Unicode MS"/>
+                <w:sz w:val="17"/>
+              </w:rPr>
+              <w:t>完成</w:t>
+            </w:r>
+          </w:p>
+        </w:tc>
+      </w:tr>
+      <w:tr>
+        <w:trPr>
+          <w:cantSplit/>
+        </w:trPr>
+        <w:tc>
+          <w:tcPr>
+            <w:tcW w:type="dxa" w:w="2381"/>
+            <w:vAlign w:val="center"/>
+            <w:tcMar>
+              <w:top w:w="90" w:type="dxa"/>
+              <w:start w:w="100" w:type="dxa"/>
+              <w:bottom w:w="90" w:type="dxa"/>
+              <w:end w:w="100" w:type="dxa"/>
+            </w:tcMar>
+          </w:tcPr>
+          <w:p>
+            <w:pPr>
+              <w:spacing w:after="0" w:line="252" w:lineRule="auto"/>
+              <w:jc w:val="left"/>
+            </w:pPr>
+            <w:r>
+              <w:rPr>
+                <w:rFonts w:ascii="Arial" w:hAnsi="Arial" w:eastAsia="Arial Unicode MS"/>
+                <w:sz w:val="17"/>
+              </w:rPr>
               <w:t>预测可视化</w:t>
             </w:r>
           </w:p>
@@ -22254,7 +25010,7 @@
           <w:b/>
           <w:color w:val="000000"/>
         </w:rPr>
-        <w:t>22 下一步计划</w:t>
+        <w:t>23 下一步计划</w:t>
       </w:r>
     </w:p>
     <w:p>
@@ -22266,7 +25022,7 @@
         <w:rPr>
           <w:rFonts w:ascii="Arial" w:hAnsi="Arial" w:eastAsia="Arial Unicode MS"/>
         </w:rPr>
-        <w:t>1.  Loss 后续调参：尝试 CE + 0.5 Dice 或 CE + 2 Dice，并增加 seed 验证稳定性。</w:t>
+        <w:t>1.  Boundary weighted CE 后续分析：测试 boundary weight 2.0 和 4.0，并生成预测对比图及 loss 对比曲线。</w:t>
       </w:r>
     </w:p>
     <w:p>
@@ -22278,7 +25034,7 @@
         <w:rPr>
           <w:rFonts w:ascii="Arial" w:hAnsi="Arial" w:eastAsia="Arial Unicode MS"/>
         </w:rPr>
-        <w:t>2.  更长训练：可尝试 30 epochs，但继续根据验证集 mean IoU 使用 best checkpoint。</w:t>
+        <w:t>2.  其他 loss 调参：尝试 CE + 0.5 Dice 或 CE + 2 Dice，并增加 seed 验证稳定性。</w:t>
       </w:r>
     </w:p>
     <w:p>
@@ -22290,7 +25046,7 @@
         <w:rPr>
           <w:rFonts w:ascii="Arial" w:hAnsi="Arial" w:eastAsia="Arial Unicode MS"/>
         </w:rPr>
-        <w:t>3.  数据增强：加入 random flip、rotation、brightness/noise，提高对视角、光照与成像噪声的适应性。</w:t>
+        <w:t>3.  更长训练：可尝试 30 epochs，但继续根据验证集 mean IoU 使用 best checkpoint。</w:t>
       </w:r>
     </w:p>
     <w:p>
@@ -22302,7 +25058,19 @@
         <w:rPr>
           <w:rFonts w:ascii="Arial" w:hAnsi="Arial" w:eastAsia="Arial Unicode MS"/>
         </w:rPr>
-        <w:t>4.  迁移到导师实验田：面向水稻田和柑橘田的作物、杂草、土壤区分，按实际传感器与标签调整输入和预处理。</w:t>
+        <w:t>4.  数据增强：加入 random flip、rotation、brightness/noise，提高对视角、光照与成像噪声的适应性。</w:t>
+      </w:r>
+    </w:p>
+    <w:p>
+      <w:pPr>
+        <w:spacing w:after="60"/>
+        <w:ind w:left="369" w:hanging="215"/>
+      </w:pPr>
+      <w:r>
+        <w:rPr>
+          <w:rFonts w:ascii="Arial" w:hAnsi="Arial" w:eastAsia="Arial Unicode MS"/>
+        </w:rPr>
+        <w:t>5.  迁移到导师实验田：面向水稻田和柑橘田的作物、杂草、土壤区分，按实际传感器与标签调整输入和预处理。</w:t>
       </w:r>
     </w:p>
     <w:p>
@@ -22316,7 +25084,7 @@
           <w:b/>
           <w:color w:val="000000"/>
         </w:rPr>
-        <w:t>23 给导师汇报时可以说的话</w:t>
+        <w:t>24 给导师汇报时可以说的话</w:t>
       </w:r>
     </w:p>
     <w:p>
@@ -22328,7 +25096,7 @@
         <w:rPr>
           <w:rFonts w:ascii="Arial" w:hAnsi="Arial" w:eastAsia="Arial Unicode MS"/>
         </w:rPr>
-        <w:t>老师，目前我已经完成了从模拟数据到真实 WeedMap 多光谱无人机数据的完整语义分割流程。前期实验确认类别不平衡会使模型忽视 weed，加入 class weights 后 weed IoU 明显提升。真实数据实验中，我完成了标签映射与无效区域处理，并在相同 454 个样本上进行了严格公平的 RGB 与 multispectral 对比。Multispectral 的 mean IoU 和 weed IoU 更高，其中 weed IoU 比 RGB 高 12.17 个百分点。随后验证了 best checkpoint 的必要性，并比较 weed weight 8、12、16，结果显示 1/4/8 的类别权重最好。使用这一设置训练 20 epochs 后，三个 seed 均在 Epoch 15 取得 best checkpoint。进一步比较 Weighted CE、Focal Loss 和 Dice + CE 的多 seed 结果，Weighted CE 的平均 mean IoU 和 weed IoU 最高，Dice + CE 的跨 seed 波动较大。因此当前最稳定 baseline 是 multispectral + weighted CE + class weights 1/4/8 + 20 epochs + best checkpoint。主要结果为 Pixel Accuracy = 96.38% ± 0.36%，Mean IoU = 74.78% ± 0.82%，Weed IoU = 56.89% ± 2.06%，均为三次 seed 实验的均值 ± 样本标准差。</w:t>
+        <w:t>老师，目前我已经完成了从模拟数据到真实 WeedMap 多光谱无人机数据的完整语义分割流程。前期实验确认类别不平衡会使模型忽视 weed，加入 class weights 后 weed IoU 明显提升。真实数据实验中，我完成了标签映射与无效区域处理，并在相同 454 个样本上进行了严格公平的 RGB 与 multispectral 对比。Multispectral 的 mean IoU 和 weed IoU 更高，其中 weed IoU 比 RGB 高 12.17 个百分点。随后验证了 best checkpoint 的必要性，并比较 weed weight 8、12、16，结果显示 1/4/8 的类别权重最好。使用这一设置训练 20 epochs 后，三个 seed 均在 Epoch 15 取得 best checkpoint。进一步比较 Weighted CE、Focal Loss 和 Dice + CE 的多 seed 结果，Weighted CE 在这三种 loss 中的平均 mean IoU 和 weed IoU 最高。预测图显示 crop/weed 错误集中在边界；虽然 U-Net 已有 skip connection，边界仍是主要难点。Sample index=0 的 5px 边界区域包含 Weighted CE 的 95.18% 错误，因此尝试 boundary weighted CE。该样本边界错误率从 14.48% 降至 9.50%；三 seed 平均 Mean IoU 从 74.78% 小幅升至 75.08% ± 1.10%，Weed IoU 从 56.89% 升至 57.66% ± 1.58%。目前将 boundary weighted CE 作为候选主结果，保留 Weighted CE 作为稳定 baseline，并继续测试不同 boundary weight。</w:t>
       </w:r>
     </w:p>
     <w:sectPr>

</xml_diff>

<commit_message>
Update Word report with latest project summary
</commit_message>
<xml_diff>
--- a/reports/weedmap_progress_report.docx
+++ b/reports/weedmap_progress_report.docx
@@ -5118,7 +5118,7 @@
     </w:p>
     <w:p>
       <w:r>
-        <w:t>相对原 SmallUNet + Weighted CE baseline 的均值提升（百分点）：Pixel Accuracy +0.60、Mean IoU +1.93、Background IoU +0.56、Crop IoU +2.28、Weed IoU +2.93。结果表明方案 A 的浅层 encoder 改造与 boundary weighted CE 在当前实验中可以叠加提升。</w:t>
+        <w:t>相对 SmallUNet + Weighted CE baseline，Mean IoU 从 74.78% ± 0.82% 提升至 76.71% ± 0.55%（+1.93 个百分点）；Weed IoU 从 56.89% ± 2.06% 提升至 59.82% ± 0.64%（+2.93 个百分点）。结果表明方案 A 的浅层 encoder 改造与 boundary weighted CE 在当前实验中可以叠加提升，尤其对 weed 类识别更有帮助。</w:t>
       </w:r>
     </w:p>
     <w:p>
@@ -5624,7 +5624,7 @@
     </w:p>
     <w:p>
       <w:r>
-        <w:t>WeedMap common split 的 454 张样本中，VCR 均值 0.7928、中位数 0.9116、最小值 0.0000、最大值 0.9999。绝大多数样本为高植被覆盖场景。0.20 和 0.30 是初始经验阈值，后续需结合人工样本检查与实际除草需求调整。</w:t>
+        <w:t>WeedMap common split 共 454 张样本：sparse 13 张、transition 9 张、dense 432 张；VCR 均值 0.7928、中位数 0.9116、最小值 0.0000、最大值 0.9999。dense 占 432 / 454 ≈ 95.15%，sparse 占 13 / 454 ≈ 2.86%，transition 占 9 / 454 ≈ 1.98%。当前绝大多数样本属于高植被覆盖场景，因此继续优化 U-Net / MobileNetV2ShallowUNet 语义分割模型是合理的；YOLO 更适合作为低覆盖稀疏场景下的候选路线或后续扩展。0.20 和 0.30 是初始经验阈值。</w:t>
       </w:r>
     </w:p>
     <w:p>
@@ -5632,7 +5632,69 @@
         <w:pStyle w:val="Heading1"/>
       </w:pPr>
       <w:r>
-        <w:t>11 YOLO / U-Net 路线选择标准</w:t>
+        <w:t>11 YOLO detection pipeline 的两个阶段</w:t>
+      </w:r>
+    </w:p>
+    <w:p>
+      <w:pPr>
+        <w:pStyle w:val="Heading2"/>
+      </w:pPr>
+      <w:r>
+        <w:t>A Detection Dataset 构建阶段</w:t>
+      </w:r>
+    </w:p>
+    <w:p>
+      <w:r>
+        <w:t>WeedMap semantic mask → target mask → connected components → component bbox → bbox statistics → visualization / statistical analysis → dataset bbox filtering rules → YOLO labels → Detection Dataset。</w:t>
+      </w:r>
+    </w:p>
+    <w:p>
+      <w:r>
+        <w:t>这一阶段的 filtering 是数据集构建阶段的 bbox 清洗：先统计并可视化连通域候选框，再根据 bbox filtering rules 从 semantic mask 自动生成较合理的 YOLO 训练标签。</w:t>
+      </w:r>
+    </w:p>
+    <w:p>
+      <w:pPr>
+        <w:pStyle w:val="Heading2"/>
+      </w:pPr>
+      <w:r>
+        <w:t>B YOLO 训练与推理阶段</w:t>
+      </w:r>
+    </w:p>
+    <w:p>
+      <w:r>
+        <w:t>Detection Dataset → YOLOv8n smoke test / training → network candidate predictions → confidence filtering → NMS → final bounding boxes。</w:t>
+      </w:r>
+    </w:p>
+    <w:p>
+      <w:r>
+        <w:t>这一阶段的 filtering 是模型推理阶段的预测框后处理。YOLO 网络输出候选框、类别和置信度；confidence filtering 去掉低置信度框，NMS 去掉高度重叠的重复框。confidence filtering 和 NMS 不属于 backbone，也不属于 U-Net 或 YOLO 的特征提取网络。</w:t>
+      </w:r>
+    </w:p>
+    <w:p>
+      <w:pPr>
+        <w:pStyle w:val="Heading1"/>
+      </w:pPr>
+      <w:r>
+        <w:t>12 YOLOv8n 的定位与标签局限</w:t>
+      </w:r>
+    </w:p>
+    <w:p>
+      <w:r>
+        <w:t>YOLOv8n 当前只作为 mask → connected components → bbox → YOLO dataset → training/inference 的 pipeline smoke test，不是论文 MobileNetV3-YOLOv3 的复现。</w:t>
+      </w:r>
+    </w:p>
+    <w:p>
+      <w:r>
+        <w:t>WeedMap 原始标签是 semantic segmentation mask，不包含 instance identity。因此 connected component 只能作为 bbox 自动生成的近似方法，不能默认一个 connected component 就一定对应一株独立 weed 或 crop。密集或粘连区域中，大面积 component 可能包含多个植株或片状杂草区域。</w:t>
+      </w:r>
+    </w:p>
+    <w:p>
+      <w:pPr>
+        <w:pStyle w:val="Heading1"/>
+      </w:pPr>
+      <w:r>
+        <w:t>13 YOLO / U-Net 路线选择标准</w:t>
       </w:r>
     </w:p>
     <w:p>
@@ -6027,22 +6089,22 @@
         <w:pStyle w:val="Heading1"/>
       </w:pPr>
       <w:r>
-        <w:t>12 给老师汇报用总结</w:t>
+        <w:t>14 给老师汇报用总结</w:t>
       </w:r>
     </w:p>
     <w:p>
       <w:r>
-        <w:t>老师，目前我已经完成从模拟数据到真实 WeedMap 多光谱无人机数据的语义分割流程。前期用 NDVI、NDRE 模拟作物、杂草和土壤的光谱差异，并在 synthetic 数据上训练 U-Net。普通 CE 容易忽视 weed，加入 class weights 后 Weed IoU 大幅提升。随后我整理真实 WeedMap Tiles，验证标签映射；本地 GroundTruth_color 的语义最清楚，因此 Dataset 由它生成 0/1/2 标签，mask=255 作为 ignore 区域。严格公平的 RGB 与多光谱对比使用相同的 454 个样本，其中训练 363 个、验证 91 个。多光谱的 Mean IoU 和 Weed IoU 均高于 RGB，说明额外光谱通道对杂草识别有帮助。</w:t>
+        <w:t>老师，目前我已经完成了从模拟数据到真实 WeedMap 多光谱无人机数据的完整语义分割流程。前期我先用 NDVI、NDRE 做了作物、杂草和土壤的光谱差异模拟，之后用 synthetic 数据训练 U-Net，发现普通 CE 会忽视 weed，加入 class weights 后 weed IoU 大幅提升。接着我整理了真实 WeedMap Tiles 数据并完成标签映射验证；本地数据中 color 标签的类别语义最明确，因此 Dataset 从 GroundTruth_color 生成 0/1/2 标签，并把 mask=255 作为 ignore 区域。严格公平的 RGB 与 multispectral 对比使用相同的 454 个样本，其中 train 363 个、val 91 个。Multispectral 的 mean IoU 和 weed IoU 均高于 RGB，说明多光谱通道对杂草识别更有帮助。</w:t>
       </w:r>
     </w:p>
     <w:p>
       <w:r>
-        <w:t>真实数据中，Weighted CE 是稳定的基础 loss。分析 sample index=0 后发现，5px 边界区域包含 Weighted CE 的 95.18% 错误，因此加入 boundary weighted CE。SmallUNet 的 r5_w4 三 seed 平均 Mean IoU 达到 75.17%，Weed IoU 达到 58.29%。接着实现 MobileNetV2ShallowUNet 方案 A：这是浅层 MobileNetV2-style encoder 改造，保留当前两级 U-Net decoder，并非论文完整 MobileNetV2-U-Net 复现。方案 A 单用 Weighted CE 已优于原 SmallUNet；与 boundary weighted CE r5_w4 结合后，三 seed 平均 Mean IoU 为 76.71% ± 0.55%，Weed IoU 为 59.82% ± 0.64%，是目前最好的语义分割结果。</w:t>
+        <w:t>在真实数据实验中，Weighted CE 是最稳定的基础 loss。进一步分析 sample index=0 后发现，5px 边界区域包含 Weighted CE 的 95.18% 错误，因此我加入了 boundary weighted CE。SmallUNet 上 boundary weighted CE r5_w4 的三 seed 平均 Mean IoU 达到 75.17%，Weed IoU 达到 58.29%。之后我实现了 MobileNetV2ShallowUNet 方案 A，它不是论文完整 MobileNetV2-U-Net 复现，而是浅层 MobileNetV2-style encoder 改造，保留当前两级 U-Net decoder。该模型在 weighted CE 下已经优于原 SmallUNet。进一步将 MobileNetV2ShallowUNet 与 boundary weighted CE r5_w4 结合后，三 seed 平均 Mean IoU 达到 76.71% ± 0.55%，Weed IoU 达到 59.82% ± 0.64%，是目前最好的结果。说明浅层 MobileNetV2-style encoder 与 boundary-aware loss 可以叠加提升，尤其对 weed 类识别更有帮助。</w:t>
       </w:r>
     </w:p>
     <w:p>
       <w:r>
-        <w:t>我还新增了植被覆盖率 VCR 作为模型路线选择指标，通过 NDVI 区分植物与土壤并计算每张图的覆盖率。WeedMap common split 中 dense 样本占 95.15%，说明当前数据以高植被覆盖场景为主，继续优化 U-Net / MobileNetV2ShallowUNet 语义分割是合理的；YOLO 更适合作为低覆盖稀疏场景的补充路线，用于单株或单簇定位与点状精准除草。VCR 阈值仍需结合人工检查和实际作业需求校准。</w:t>
+        <w:t>另外，我新增了一个基于植被覆盖率 VCR 的模型选择指标。通过 NDVI 区分植物与土壤，并计算每张图像的植被覆盖率。统计结果显示 WeedMap common split 中 dense 样本占 95.15%，说明当前数据集以密集植被覆盖场景为主，因此继续优化 U-Net / MobileNetV2ShallowUNet 这类语义分割模型是合理的；YOLO 更适合作为低覆盖稀疏场景下的补充路线，用于单株或单簇定位和点状精准除草。</w:t>
       </w:r>
     </w:p>
     <w:sectPr>

</xml_diff>

<commit_message>
Update Word report with YOLO detection results
</commit_message>
<xml_diff>
--- a/reports/weedmap_progress_report.docx
+++ b/reports/weedmap_progress_report.docx
@@ -12,7 +12,7 @@
     </w:p>
     <w:p>
       <w:r>
-        <w:t>面向导师的阶段性汇报。报告总结真实 WeedMap 数据处理、统一样本对照、三 seed 模型实验，以及基于植被覆盖率的后续模型路线。当前最佳设置为 MobileNetV2ShallowUNet 方案 A + boundary weighted CE r5_w4：验证集 Mean IoU 76.71% ± 0.55%，Weed IoU 59.82% ± 0.64%。</w:t>
+        <w:t>面向导师的阶段性汇报。报告总结真实 WeedMap 数据处理、统一样本对照、三 seed 语义分割实验、VCR 场景分析，以及近期 YOLOv8n 检测支线对照。当前语义分割主线最佳设置为 MobileNetV2ShallowUNet 方案 A + boundary weighted CE r5_w4：验证集 Mean IoU 76.71% ± 0.55%，Weed IoU 59.82% ± 0.64%。YOLO 暂以 crop+weed r010 作为检测候选 baseline。</w:t>
       </w:r>
     </w:p>
     <w:p>
@@ -5668,7 +5668,7 @@
     </w:p>
     <w:p>
       <w:r>
-        <w:t>这一阶段的 filtering 是模型推理阶段的预测框后处理。YOLO 网络输出候选框、类别和置信度；confidence filtering 去掉低置信度框，NMS 去掉高度重叠的重复框。confidence filtering 和 NMS 不属于 backbone，也不属于 U-Net 或 YOLO 的特征提取网络。</w:t>
+        <w:t>YOLO 网络输出候选框、类别和置信度；confidence filtering 去掉低置信度预测框，NMS 去掉高度重叠的重复预测框。两者属于 inference post-processing，不属于 backbone，也不同于 A 阶段用于生成训练标签的 dataset bbox filtering。</w:t>
       </w:r>
     </w:p>
     <w:p>
@@ -5676,17 +5676,403 @@
         <w:pStyle w:val="Heading1"/>
       </w:pPr>
       <w:r>
-        <w:t>12 YOLOv8n 的定位与标签局限</w:t>
+        <w:t>12 YOLO bbox 分布与标签局限</w:t>
       </w:r>
     </w:p>
     <w:p>
       <w:r>
-        <w:t>YOLOv8n 当前只作为 mask → connected components → bbox → YOLO dataset → training/inference 的 pipeline smoke test，不是论文 MobileNetV3-YOLOv3 的复现。</w:t>
+        <w:t>当前 crop+weed YOLO baseline 检测数据集的 bbox 统计如下。YOLO labels 由 WeedMap semantic mask 的 target mask 和 connected components 自动生成，不是人工标注的 instance bbox。</w:t>
       </w:r>
+    </w:p>
+    <w:tbl>
+      <w:tblPr>
+        <w:tblW w:type="auto" w:w="0"/>
+        <w:jc w:val="center"/>
+        <w:tblLayout w:type="fixed"/>
+        <w:tblLook w:firstColumn="1" w:firstRow="1" w:lastColumn="0" w:lastRow="0" w:noHBand="0" w:noVBand="1" w:val="04A0"/>
+        <w:tblBorders>
+          <w:top w:val="single" w:sz="5" w:color="D9D9D9"/>
+          <w:left w:val="single" w:sz="5" w:color="D9D9D9"/>
+          <w:bottom w:val="single" w:sz="5" w:color="D9D9D9"/>
+          <w:right w:val="single" w:sz="5" w:color="D9D9D9"/>
+          <w:insideH w:val="single" w:sz="5" w:color="D9D9D9"/>
+          <w:insideV w:val="single" w:sz="5" w:color="D9D9D9"/>
+        </w:tblBorders>
+      </w:tblPr>
+      <w:tblGrid>
+        <w:gridCol w:w="5102"/>
+        <w:gridCol w:w="4535"/>
+      </w:tblGrid>
+      <w:tr>
+        <w:trPr>
+          <w:tblHeader w:val="true"/>
+          <w:cantSplit/>
+        </w:trPr>
+        <w:tc>
+          <w:tcPr>
+            <w:tcW w:type="dxa" w:w="5102"/>
+            <w:vAlign w:val="center"/>
+            <w:shd w:fill="213B58"/>
+            <w:tcMar>
+              <w:top w:w="95" w:type="dxa"/>
+              <w:bottom w:w="95" w:type="dxa"/>
+              <w:start w:w="90" w:type="dxa"/>
+              <w:end w:w="90" w:type="dxa"/>
+            </w:tcMar>
+          </w:tcPr>
+          <w:p>
+            <w:pPr>
+              <w:spacing w:after="0" w:line="259" w:lineRule="auto"/>
+              <w:jc w:val="left"/>
+            </w:pPr>
+            <w:r>
+              <w:rPr>
+                <w:rFonts w:ascii="Arial" w:hAnsi="Arial" w:eastAsia="PingFang SC"/>
+                <w:b/>
+                <w:color w:val="FFFFFF"/>
+                <w:sz w:val="17"/>
+              </w:rPr>
+              <w:t>统计项</w:t>
+            </w:r>
+          </w:p>
+        </w:tc>
+        <w:tc>
+          <w:tcPr>
+            <w:tcW w:type="dxa" w:w="4535"/>
+            <w:vAlign w:val="center"/>
+            <w:shd w:fill="213B58"/>
+            <w:tcMar>
+              <w:top w:w="95" w:type="dxa"/>
+              <w:bottom w:w="95" w:type="dxa"/>
+              <w:start w:w="90" w:type="dxa"/>
+              <w:end w:w="90" w:type="dxa"/>
+            </w:tcMar>
+          </w:tcPr>
+          <w:p>
+            <w:pPr>
+              <w:spacing w:after="0" w:line="259" w:lineRule="auto"/>
+              <w:jc w:val="center"/>
+            </w:pPr>
+            <w:r>
+              <w:rPr>
+                <w:rFonts w:ascii="Arial" w:hAnsi="Arial" w:eastAsia="PingFang SC"/>
+                <w:b/>
+                <w:color w:val="FFFFFF"/>
+                <w:sz w:val="17"/>
+              </w:rPr>
+              <w:t>结果</w:t>
+            </w:r>
+          </w:p>
+        </w:tc>
+      </w:tr>
+      <w:tr>
+        <w:trPr>
+          <w:cantSplit/>
+        </w:trPr>
+        <w:tc>
+          <w:tcPr>
+            <w:tcW w:type="dxa" w:w="5102"/>
+            <w:vAlign w:val="center"/>
+            <w:tcMar>
+              <w:top w:w="95" w:type="dxa"/>
+              <w:bottom w:w="95" w:type="dxa"/>
+              <w:start w:w="90" w:type="dxa"/>
+              <w:end w:w="90" w:type="dxa"/>
+            </w:tcMar>
+          </w:tcPr>
+          <w:p>
+            <w:pPr>
+              <w:spacing w:after="0" w:line="259" w:lineRule="auto"/>
+              <w:jc w:val="left"/>
+            </w:pPr>
+            <w:r>
+              <w:rPr>
+                <w:rFonts w:ascii="Arial" w:hAnsi="Arial" w:eastAsia="PingFang SC"/>
+                <w:b w:val="0"/>
+                <w:color w:val="17212B"/>
+                <w:sz w:val="17"/>
+              </w:rPr>
+              <w:t>Total boxes</w:t>
+            </w:r>
+          </w:p>
+        </w:tc>
+        <w:tc>
+          <w:tcPr>
+            <w:tcW w:type="dxa" w:w="4535"/>
+            <w:vAlign w:val="center"/>
+            <w:tcMar>
+              <w:top w:w="95" w:type="dxa"/>
+              <w:bottom w:w="95" w:type="dxa"/>
+              <w:start w:w="90" w:type="dxa"/>
+              <w:end w:w="90" w:type="dxa"/>
+            </w:tcMar>
+          </w:tcPr>
+          <w:p>
+            <w:pPr>
+              <w:spacing w:after="0" w:line="259" w:lineRule="auto"/>
+              <w:jc w:val="center"/>
+            </w:pPr>
+            <w:r>
+              <w:rPr>
+                <w:rFonts w:ascii="Arial" w:hAnsi="Arial" w:eastAsia="PingFang SC"/>
+                <w:b w:val="0"/>
+                <w:color w:val="17212B"/>
+                <w:sz w:val="17"/>
+              </w:rPr>
+              <w:t>19,443</w:t>
+            </w:r>
+          </w:p>
+        </w:tc>
+      </w:tr>
+      <w:tr>
+        <w:trPr>
+          <w:cantSplit/>
+        </w:trPr>
+        <w:tc>
+          <w:tcPr>
+            <w:tcW w:type="dxa" w:w="5102"/>
+            <w:vAlign w:val="center"/>
+            <w:shd w:fill="F2F6FA"/>
+            <w:tcMar>
+              <w:top w:w="95" w:type="dxa"/>
+              <w:bottom w:w="95" w:type="dxa"/>
+              <w:start w:w="90" w:type="dxa"/>
+              <w:end w:w="90" w:type="dxa"/>
+            </w:tcMar>
+          </w:tcPr>
+          <w:p>
+            <w:pPr>
+              <w:spacing w:after="0" w:line="259" w:lineRule="auto"/>
+              <w:jc w:val="left"/>
+            </w:pPr>
+            <w:r>
+              <w:rPr>
+                <w:rFonts w:ascii="Arial" w:hAnsi="Arial" w:eastAsia="PingFang SC"/>
+                <w:b w:val="0"/>
+                <w:color w:val="17212B"/>
+                <w:sz w:val="17"/>
+              </w:rPr>
+              <w:t>Crop boxes</w:t>
+            </w:r>
+          </w:p>
+        </w:tc>
+        <w:tc>
+          <w:tcPr>
+            <w:tcW w:type="dxa" w:w="4535"/>
+            <w:vAlign w:val="center"/>
+            <w:shd w:fill="F2F6FA"/>
+            <w:tcMar>
+              <w:top w:w="95" w:type="dxa"/>
+              <w:bottom w:w="95" w:type="dxa"/>
+              <w:start w:w="90" w:type="dxa"/>
+              <w:end w:w="90" w:type="dxa"/>
+            </w:tcMar>
+          </w:tcPr>
+          <w:p>
+            <w:pPr>
+              <w:spacing w:after="0" w:line="259" w:lineRule="auto"/>
+              <w:jc w:val="center"/>
+            </w:pPr>
+            <w:r>
+              <w:rPr>
+                <w:rFonts w:ascii="Arial" w:hAnsi="Arial" w:eastAsia="PingFang SC"/>
+                <w:b w:val="0"/>
+                <w:color w:val="17212B"/>
+                <w:sz w:val="17"/>
+              </w:rPr>
+              <w:t>12,311</w:t>
+            </w:r>
+          </w:p>
+        </w:tc>
+      </w:tr>
+      <w:tr>
+        <w:trPr>
+          <w:cantSplit/>
+        </w:trPr>
+        <w:tc>
+          <w:tcPr>
+            <w:tcW w:type="dxa" w:w="5102"/>
+            <w:vAlign w:val="center"/>
+            <w:tcMar>
+              <w:top w:w="95" w:type="dxa"/>
+              <w:bottom w:w="95" w:type="dxa"/>
+              <w:start w:w="90" w:type="dxa"/>
+              <w:end w:w="90" w:type="dxa"/>
+            </w:tcMar>
+          </w:tcPr>
+          <w:p>
+            <w:pPr>
+              <w:spacing w:after="0" w:line="259" w:lineRule="auto"/>
+              <w:jc w:val="left"/>
+            </w:pPr>
+            <w:r>
+              <w:rPr>
+                <w:rFonts w:ascii="Arial" w:hAnsi="Arial" w:eastAsia="PingFang SC"/>
+                <w:b w:val="0"/>
+                <w:color w:val="17212B"/>
+                <w:sz w:val="17"/>
+              </w:rPr>
+              <w:t>Weed boxes</w:t>
+            </w:r>
+          </w:p>
+        </w:tc>
+        <w:tc>
+          <w:tcPr>
+            <w:tcW w:type="dxa" w:w="4535"/>
+            <w:vAlign w:val="center"/>
+            <w:tcMar>
+              <w:top w:w="95" w:type="dxa"/>
+              <w:bottom w:w="95" w:type="dxa"/>
+              <w:start w:w="90" w:type="dxa"/>
+              <w:end w:w="90" w:type="dxa"/>
+            </w:tcMar>
+          </w:tcPr>
+          <w:p>
+            <w:pPr>
+              <w:spacing w:after="0" w:line="259" w:lineRule="auto"/>
+              <w:jc w:val="center"/>
+            </w:pPr>
+            <w:r>
+              <w:rPr>
+                <w:rFonts w:ascii="Arial" w:hAnsi="Arial" w:eastAsia="PingFang SC"/>
+                <w:b w:val="0"/>
+                <w:color w:val="17212B"/>
+                <w:sz w:val="17"/>
+              </w:rPr>
+              <w:t>7,132</w:t>
+            </w:r>
+          </w:p>
+        </w:tc>
+      </w:tr>
+      <w:tr>
+        <w:trPr>
+          <w:cantSplit/>
+        </w:trPr>
+        <w:tc>
+          <w:tcPr>
+            <w:tcW w:type="dxa" w:w="5102"/>
+            <w:vAlign w:val="center"/>
+            <w:shd w:fill="F2F6FA"/>
+            <w:tcMar>
+              <w:top w:w="95" w:type="dxa"/>
+              <w:bottom w:w="95" w:type="dxa"/>
+              <w:start w:w="90" w:type="dxa"/>
+              <w:end w:w="90" w:type="dxa"/>
+            </w:tcMar>
+          </w:tcPr>
+          <w:p>
+            <w:pPr>
+              <w:spacing w:after="0" w:line="259" w:lineRule="auto"/>
+              <w:jc w:val="left"/>
+            </w:pPr>
+            <w:r>
+              <w:rPr>
+                <w:rFonts w:ascii="Arial" w:hAnsi="Arial" w:eastAsia="PingFang SC"/>
+                <w:b w:val="0"/>
+                <w:color w:val="17212B"/>
+                <w:sz w:val="17"/>
+              </w:rPr>
+              <w:t>Mean boxes per image</w:t>
+            </w:r>
+          </w:p>
+        </w:tc>
+        <w:tc>
+          <w:tcPr>
+            <w:tcW w:type="dxa" w:w="4535"/>
+            <w:vAlign w:val="center"/>
+            <w:shd w:fill="F2F6FA"/>
+            <w:tcMar>
+              <w:top w:w="95" w:type="dxa"/>
+              <w:bottom w:w="95" w:type="dxa"/>
+              <w:start w:w="90" w:type="dxa"/>
+              <w:end w:w="90" w:type="dxa"/>
+            </w:tcMar>
+          </w:tcPr>
+          <w:p>
+            <w:pPr>
+              <w:spacing w:after="0" w:line="259" w:lineRule="auto"/>
+              <w:jc w:val="center"/>
+            </w:pPr>
+            <w:r>
+              <w:rPr>
+                <w:rFonts w:ascii="Arial" w:hAnsi="Arial" w:eastAsia="PingFang SC"/>
+                <w:b w:val="0"/>
+                <w:color w:val="17212B"/>
+                <w:sz w:val="17"/>
+              </w:rPr>
+              <w:t>42.83</w:t>
+            </w:r>
+          </w:p>
+        </w:tc>
+      </w:tr>
+      <w:tr>
+        <w:trPr>
+          <w:cantSplit/>
+        </w:trPr>
+        <w:tc>
+          <w:tcPr>
+            <w:tcW w:type="dxa" w:w="5102"/>
+            <w:vAlign w:val="center"/>
+            <w:tcMar>
+              <w:top w:w="95" w:type="dxa"/>
+              <w:bottom w:w="95" w:type="dxa"/>
+              <w:start w:w="90" w:type="dxa"/>
+              <w:end w:w="90" w:type="dxa"/>
+            </w:tcMar>
+          </w:tcPr>
+          <w:p>
+            <w:pPr>
+              <w:spacing w:after="0" w:line="259" w:lineRule="auto"/>
+              <w:jc w:val="left"/>
+            </w:pPr>
+            <w:r>
+              <w:rPr>
+                <w:rFonts w:ascii="Arial" w:hAnsi="Arial" w:eastAsia="PingFang SC"/>
+                <w:b w:val="0"/>
+                <w:color w:val="17212B"/>
+                <w:sz w:val="17"/>
+              </w:rPr>
+              <w:t>Min / median / max boxes per image</w:t>
+            </w:r>
+          </w:p>
+        </w:tc>
+        <w:tc>
+          <w:tcPr>
+            <w:tcW w:type="dxa" w:w="4535"/>
+            <w:vAlign w:val="center"/>
+            <w:tcMar>
+              <w:top w:w="95" w:type="dxa"/>
+              <w:bottom w:w="95" w:type="dxa"/>
+              <w:start w:w="90" w:type="dxa"/>
+              <w:end w:w="90" w:type="dxa"/>
+            </w:tcMar>
+          </w:tcPr>
+          <w:p>
+            <w:pPr>
+              <w:spacing w:after="0" w:line="259" w:lineRule="auto"/>
+              <w:jc w:val="center"/>
+            </w:pPr>
+            <w:r>
+              <w:rPr>
+                <w:rFonts w:ascii="Arial" w:hAnsi="Arial" w:eastAsia="PingFang SC"/>
+                <w:b w:val="0"/>
+                <w:color w:val="17212B"/>
+                <w:sz w:val="17"/>
+              </w:rPr>
+              <w:t>0 / 44 / 120</w:t>
+            </w:r>
+          </w:p>
+        </w:tc>
+      </w:tr>
+    </w:tbl>
+    <w:p>
+      <w:pPr>
+        <w:spacing w:after="0"/>
+      </w:pPr>
     </w:p>
     <w:p>
       <w:r>
-        <w:t>WeedMap 原始标签是 semantic segmentation mask，不包含 instance identity。因此 connected component 只能作为 bbox 自动生成的近似方法，不能默认一个 connected component 就一定对应一株独立 weed 或 crop。密集或粘连区域中，大面积 component 可能包含多个植株或片状杂草区域。</w:t>
+        <w:t>连通域框只是实例目标的近似标签。稀疏场景中的独立小框可能接近单株或单簇；大面积粘连 component 可能包含多株植物或片状杂草，不能直接解释为单株植物。bbox 分布统计和可视化用于判断数据集阶段的过滤规则。</w:t>
       </w:r>
     </w:p>
     <w:p>
@@ -5694,7 +6080,1081 @@
         <w:pStyle w:val="Heading1"/>
       </w:pPr>
       <w:r>
-        <w:t>13 YOLO / U-Net 路线选择标准</w:t>
+        <w:t>13 YOLOv8n r020 与 r010 大框过滤对比</w:t>
+      </w:r>
+    </w:p>
+    <w:p>
+      <w:r>
+        <w:t>两组 crop+weed YOLOv8n 实验仅调整数据集构建阶段的 max-box-area-ratio：r020 为 0.20，r010 为 0.10。下表列出验证集 weed 类指标。</w:t>
+      </w:r>
+    </w:p>
+    <w:tbl>
+      <w:tblPr>
+        <w:tblW w:type="auto" w:w="0"/>
+        <w:jc w:val="center"/>
+        <w:tblLayout w:type="fixed"/>
+        <w:tblLook w:firstColumn="1" w:firstRow="1" w:lastColumn="0" w:lastRow="0" w:noHBand="0" w:noVBand="1" w:val="04A0"/>
+        <w:tblBorders>
+          <w:top w:val="single" w:sz="5" w:color="D9D9D9"/>
+          <w:left w:val="single" w:sz="5" w:color="D9D9D9"/>
+          <w:bottom w:val="single" w:sz="5" w:color="D9D9D9"/>
+          <w:right w:val="single" w:sz="5" w:color="D9D9D9"/>
+          <w:insideH w:val="single" w:sz="5" w:color="D9D9D9"/>
+          <w:insideV w:val="single" w:sz="5" w:color="D9D9D9"/>
+        </w:tblBorders>
+      </w:tblPr>
+      <w:tblGrid>
+        <w:gridCol w:w="1361"/>
+        <w:gridCol w:w="1587"/>
+        <w:gridCol w:w="1361"/>
+        <w:gridCol w:w="1361"/>
+        <w:gridCol w:w="1928"/>
+        <w:gridCol w:w="2041"/>
+      </w:tblGrid>
+      <w:tr>
+        <w:trPr>
+          <w:tblHeader w:val="true"/>
+          <w:cantSplit/>
+        </w:trPr>
+        <w:tc>
+          <w:tcPr>
+            <w:tcW w:type="dxa" w:w="1361"/>
+            <w:vAlign w:val="center"/>
+            <w:shd w:fill="213B58"/>
+            <w:tcMar>
+              <w:top w:w="95" w:type="dxa"/>
+              <w:bottom w:w="95" w:type="dxa"/>
+              <w:start w:w="90" w:type="dxa"/>
+              <w:end w:w="90" w:type="dxa"/>
+            </w:tcMar>
+          </w:tcPr>
+          <w:p>
+            <w:pPr>
+              <w:spacing w:after="0" w:line="259" w:lineRule="auto"/>
+              <w:jc w:val="left"/>
+            </w:pPr>
+            <w:r>
+              <w:rPr>
+                <w:rFonts w:ascii="Arial" w:hAnsi="Arial" w:eastAsia="PingFang SC"/>
+                <w:b/>
+                <w:color w:val="FFFFFF"/>
+                <w:sz w:val="16"/>
+              </w:rPr>
+              <w:t>设置</w:t>
+            </w:r>
+          </w:p>
+        </w:tc>
+        <w:tc>
+          <w:tcPr>
+            <w:tcW w:type="dxa" w:w="1587"/>
+            <w:vAlign w:val="center"/>
+            <w:shd w:fill="213B58"/>
+            <w:tcMar>
+              <w:top w:w="95" w:type="dxa"/>
+              <w:bottom w:w="95" w:type="dxa"/>
+              <w:start w:w="90" w:type="dxa"/>
+              <w:end w:w="90" w:type="dxa"/>
+            </w:tcMar>
+          </w:tcPr>
+          <w:p>
+            <w:pPr>
+              <w:spacing w:after="0" w:line="259" w:lineRule="auto"/>
+              <w:jc w:val="center"/>
+            </w:pPr>
+            <w:r>
+              <w:rPr>
+                <w:rFonts w:ascii="Arial" w:hAnsi="Arial" w:eastAsia="PingFang SC"/>
+                <w:b/>
+                <w:color w:val="FFFFFF"/>
+                <w:sz w:val="16"/>
+              </w:rPr>
+              <w:t>Max area ratio</w:t>
+            </w:r>
+          </w:p>
+        </w:tc>
+        <w:tc>
+          <w:tcPr>
+            <w:tcW w:type="dxa" w:w="1361"/>
+            <w:vAlign w:val="center"/>
+            <w:shd w:fill="213B58"/>
+            <w:tcMar>
+              <w:top w:w="95" w:type="dxa"/>
+              <w:bottom w:w="95" w:type="dxa"/>
+              <w:start w:w="90" w:type="dxa"/>
+              <w:end w:w="90" w:type="dxa"/>
+            </w:tcMar>
+          </w:tcPr>
+          <w:p>
+            <w:pPr>
+              <w:spacing w:after="0" w:line="259" w:lineRule="auto"/>
+              <w:jc w:val="center"/>
+            </w:pPr>
+            <w:r>
+              <w:rPr>
+                <w:rFonts w:ascii="Arial" w:hAnsi="Arial" w:eastAsia="PingFang SC"/>
+                <w:b/>
+                <w:color w:val="FFFFFF"/>
+                <w:sz w:val="16"/>
+              </w:rPr>
+              <w:t>Weed P</w:t>
+            </w:r>
+          </w:p>
+        </w:tc>
+        <w:tc>
+          <w:tcPr>
+            <w:tcW w:type="dxa" w:w="1361"/>
+            <w:vAlign w:val="center"/>
+            <w:shd w:fill="213B58"/>
+            <w:tcMar>
+              <w:top w:w="95" w:type="dxa"/>
+              <w:bottom w:w="95" w:type="dxa"/>
+              <w:start w:w="90" w:type="dxa"/>
+              <w:end w:w="90" w:type="dxa"/>
+            </w:tcMar>
+          </w:tcPr>
+          <w:p>
+            <w:pPr>
+              <w:spacing w:after="0" w:line="259" w:lineRule="auto"/>
+              <w:jc w:val="center"/>
+            </w:pPr>
+            <w:r>
+              <w:rPr>
+                <w:rFonts w:ascii="Arial" w:hAnsi="Arial" w:eastAsia="PingFang SC"/>
+                <w:b/>
+                <w:color w:val="FFFFFF"/>
+                <w:sz w:val="16"/>
+              </w:rPr>
+              <w:t>Weed R</w:t>
+            </w:r>
+          </w:p>
+        </w:tc>
+        <w:tc>
+          <w:tcPr>
+            <w:tcW w:type="dxa" w:w="1928"/>
+            <w:vAlign w:val="center"/>
+            <w:shd w:fill="213B58"/>
+            <w:tcMar>
+              <w:top w:w="95" w:type="dxa"/>
+              <w:bottom w:w="95" w:type="dxa"/>
+              <w:start w:w="90" w:type="dxa"/>
+              <w:end w:w="90" w:type="dxa"/>
+            </w:tcMar>
+          </w:tcPr>
+          <w:p>
+            <w:pPr>
+              <w:spacing w:after="0" w:line="259" w:lineRule="auto"/>
+              <w:jc w:val="center"/>
+            </w:pPr>
+            <w:r>
+              <w:rPr>
+                <w:rFonts w:ascii="Arial" w:hAnsi="Arial" w:eastAsia="PingFang SC"/>
+                <w:b/>
+                <w:color w:val="FFFFFF"/>
+                <w:sz w:val="16"/>
+              </w:rPr>
+              <w:t>Weed mAP50</w:t>
+            </w:r>
+          </w:p>
+        </w:tc>
+        <w:tc>
+          <w:tcPr>
+            <w:tcW w:type="dxa" w:w="2041"/>
+            <w:vAlign w:val="center"/>
+            <w:shd w:fill="213B58"/>
+            <w:tcMar>
+              <w:top w:w="95" w:type="dxa"/>
+              <w:bottom w:w="95" w:type="dxa"/>
+              <w:start w:w="90" w:type="dxa"/>
+              <w:end w:w="90" w:type="dxa"/>
+            </w:tcMar>
+          </w:tcPr>
+          <w:p>
+            <w:pPr>
+              <w:spacing w:after="0" w:line="259" w:lineRule="auto"/>
+              <w:jc w:val="center"/>
+            </w:pPr>
+            <w:r>
+              <w:rPr>
+                <w:rFonts w:ascii="Arial" w:hAnsi="Arial" w:eastAsia="PingFang SC"/>
+                <w:b/>
+                <w:color w:val="FFFFFF"/>
+                <w:sz w:val="16"/>
+              </w:rPr>
+              <w:t>Weed mAP50-95</w:t>
+            </w:r>
+          </w:p>
+        </w:tc>
+      </w:tr>
+      <w:tr>
+        <w:trPr>
+          <w:cantSplit/>
+        </w:trPr>
+        <w:tc>
+          <w:tcPr>
+            <w:tcW w:type="dxa" w:w="1361"/>
+            <w:vAlign w:val="center"/>
+            <w:tcMar>
+              <w:top w:w="95" w:type="dxa"/>
+              <w:bottom w:w="95" w:type="dxa"/>
+              <w:start w:w="90" w:type="dxa"/>
+              <w:end w:w="90" w:type="dxa"/>
+            </w:tcMar>
+          </w:tcPr>
+          <w:p>
+            <w:pPr>
+              <w:spacing w:after="0" w:line="259" w:lineRule="auto"/>
+              <w:jc w:val="left"/>
+            </w:pPr>
+            <w:r>
+              <w:rPr>
+                <w:rFonts w:ascii="Arial" w:hAnsi="Arial" w:eastAsia="PingFang SC"/>
+                <w:b w:val="0"/>
+                <w:color w:val="17212B"/>
+                <w:sz w:val="16"/>
+              </w:rPr>
+              <w:t>r020</w:t>
+            </w:r>
+          </w:p>
+        </w:tc>
+        <w:tc>
+          <w:tcPr>
+            <w:tcW w:type="dxa" w:w="1587"/>
+            <w:vAlign w:val="center"/>
+            <w:tcMar>
+              <w:top w:w="95" w:type="dxa"/>
+              <w:bottom w:w="95" w:type="dxa"/>
+              <w:start w:w="90" w:type="dxa"/>
+              <w:end w:w="90" w:type="dxa"/>
+            </w:tcMar>
+          </w:tcPr>
+          <w:p>
+            <w:pPr>
+              <w:spacing w:after="0" w:line="259" w:lineRule="auto"/>
+              <w:jc w:val="center"/>
+            </w:pPr>
+            <w:r>
+              <w:rPr>
+                <w:rFonts w:ascii="Arial" w:hAnsi="Arial" w:eastAsia="PingFang SC"/>
+                <w:b w:val="0"/>
+                <w:color w:val="17212B"/>
+                <w:sz w:val="16"/>
+              </w:rPr>
+              <w:t>0.20</w:t>
+            </w:r>
+          </w:p>
+        </w:tc>
+        <w:tc>
+          <w:tcPr>
+            <w:tcW w:type="dxa" w:w="1361"/>
+            <w:vAlign w:val="center"/>
+            <w:tcMar>
+              <w:top w:w="95" w:type="dxa"/>
+              <w:bottom w:w="95" w:type="dxa"/>
+              <w:start w:w="90" w:type="dxa"/>
+              <w:end w:w="90" w:type="dxa"/>
+            </w:tcMar>
+          </w:tcPr>
+          <w:p>
+            <w:pPr>
+              <w:spacing w:after="0" w:line="259" w:lineRule="auto"/>
+              <w:jc w:val="center"/>
+            </w:pPr>
+            <w:r>
+              <w:rPr>
+                <w:rFonts w:ascii="Arial" w:hAnsi="Arial" w:eastAsia="PingFang SC"/>
+                <w:b w:val="0"/>
+                <w:color w:val="17212B"/>
+                <w:sz w:val="16"/>
+              </w:rPr>
+              <w:t>0.470</w:t>
+            </w:r>
+          </w:p>
+        </w:tc>
+        <w:tc>
+          <w:tcPr>
+            <w:tcW w:type="dxa" w:w="1361"/>
+            <w:vAlign w:val="center"/>
+            <w:tcMar>
+              <w:top w:w="95" w:type="dxa"/>
+              <w:bottom w:w="95" w:type="dxa"/>
+              <w:start w:w="90" w:type="dxa"/>
+              <w:end w:w="90" w:type="dxa"/>
+            </w:tcMar>
+          </w:tcPr>
+          <w:p>
+            <w:pPr>
+              <w:spacing w:after="0" w:line="259" w:lineRule="auto"/>
+              <w:jc w:val="center"/>
+            </w:pPr>
+            <w:r>
+              <w:rPr>
+                <w:rFonts w:ascii="Arial" w:hAnsi="Arial" w:eastAsia="PingFang SC"/>
+                <w:b w:val="0"/>
+                <w:color w:val="17212B"/>
+                <w:sz w:val="16"/>
+              </w:rPr>
+              <w:t>0.538</w:t>
+            </w:r>
+          </w:p>
+        </w:tc>
+        <w:tc>
+          <w:tcPr>
+            <w:tcW w:type="dxa" w:w="1928"/>
+            <w:vAlign w:val="center"/>
+            <w:tcMar>
+              <w:top w:w="95" w:type="dxa"/>
+              <w:bottom w:w="95" w:type="dxa"/>
+              <w:start w:w="90" w:type="dxa"/>
+              <w:end w:w="90" w:type="dxa"/>
+            </w:tcMar>
+          </w:tcPr>
+          <w:p>
+            <w:pPr>
+              <w:spacing w:after="0" w:line="259" w:lineRule="auto"/>
+              <w:jc w:val="center"/>
+            </w:pPr>
+            <w:r>
+              <w:rPr>
+                <w:rFonts w:ascii="Arial" w:hAnsi="Arial" w:eastAsia="PingFang SC"/>
+                <w:b w:val="0"/>
+                <w:color w:val="17212B"/>
+                <w:sz w:val="16"/>
+              </w:rPr>
+              <w:t>0.457</w:t>
+            </w:r>
+          </w:p>
+        </w:tc>
+        <w:tc>
+          <w:tcPr>
+            <w:tcW w:type="dxa" w:w="2041"/>
+            <w:vAlign w:val="center"/>
+            <w:tcMar>
+              <w:top w:w="95" w:type="dxa"/>
+              <w:bottom w:w="95" w:type="dxa"/>
+              <w:start w:w="90" w:type="dxa"/>
+              <w:end w:w="90" w:type="dxa"/>
+            </w:tcMar>
+          </w:tcPr>
+          <w:p>
+            <w:pPr>
+              <w:spacing w:after="0" w:line="259" w:lineRule="auto"/>
+              <w:jc w:val="center"/>
+            </w:pPr>
+            <w:r>
+              <w:rPr>
+                <w:rFonts w:ascii="Arial" w:hAnsi="Arial" w:eastAsia="PingFang SC"/>
+                <w:b w:val="0"/>
+                <w:color w:val="17212B"/>
+                <w:sz w:val="16"/>
+              </w:rPr>
+              <w:t>0.212</w:t>
+            </w:r>
+          </w:p>
+        </w:tc>
+      </w:tr>
+      <w:tr>
+        <w:trPr>
+          <w:cantSplit/>
+        </w:trPr>
+        <w:tc>
+          <w:tcPr>
+            <w:tcW w:type="dxa" w:w="1361"/>
+            <w:vAlign w:val="center"/>
+            <w:shd w:fill="F2F6FA"/>
+            <w:tcMar>
+              <w:top w:w="95" w:type="dxa"/>
+              <w:bottom w:w="95" w:type="dxa"/>
+              <w:start w:w="90" w:type="dxa"/>
+              <w:end w:w="90" w:type="dxa"/>
+            </w:tcMar>
+          </w:tcPr>
+          <w:p>
+            <w:pPr>
+              <w:spacing w:after="0" w:line="259" w:lineRule="auto"/>
+              <w:jc w:val="left"/>
+            </w:pPr>
+            <w:r>
+              <w:rPr>
+                <w:rFonts w:ascii="Arial" w:hAnsi="Arial" w:eastAsia="PingFang SC"/>
+                <w:b w:val="0"/>
+                <w:color w:val="17212B"/>
+                <w:sz w:val="16"/>
+              </w:rPr>
+              <w:t>r010</w:t>
+            </w:r>
+          </w:p>
+        </w:tc>
+        <w:tc>
+          <w:tcPr>
+            <w:tcW w:type="dxa" w:w="1587"/>
+            <w:vAlign w:val="center"/>
+            <w:shd w:fill="F2F6FA"/>
+            <w:tcMar>
+              <w:top w:w="95" w:type="dxa"/>
+              <w:bottom w:w="95" w:type="dxa"/>
+              <w:start w:w="90" w:type="dxa"/>
+              <w:end w:w="90" w:type="dxa"/>
+            </w:tcMar>
+          </w:tcPr>
+          <w:p>
+            <w:pPr>
+              <w:spacing w:after="0" w:line="259" w:lineRule="auto"/>
+              <w:jc w:val="center"/>
+            </w:pPr>
+            <w:r>
+              <w:rPr>
+                <w:rFonts w:ascii="Arial" w:hAnsi="Arial" w:eastAsia="PingFang SC"/>
+                <w:b w:val="0"/>
+                <w:color w:val="17212B"/>
+                <w:sz w:val="16"/>
+              </w:rPr>
+              <w:t>0.10</w:t>
+            </w:r>
+          </w:p>
+        </w:tc>
+        <w:tc>
+          <w:tcPr>
+            <w:tcW w:type="dxa" w:w="1361"/>
+            <w:vAlign w:val="center"/>
+            <w:shd w:fill="F2F6FA"/>
+            <w:tcMar>
+              <w:top w:w="95" w:type="dxa"/>
+              <w:bottom w:w="95" w:type="dxa"/>
+              <w:start w:w="90" w:type="dxa"/>
+              <w:end w:w="90" w:type="dxa"/>
+            </w:tcMar>
+          </w:tcPr>
+          <w:p>
+            <w:pPr>
+              <w:spacing w:after="0" w:line="259" w:lineRule="auto"/>
+              <w:jc w:val="center"/>
+            </w:pPr>
+            <w:r>
+              <w:rPr>
+                <w:rFonts w:ascii="Arial" w:hAnsi="Arial" w:eastAsia="PingFang SC"/>
+                <w:b w:val="0"/>
+                <w:color w:val="17212B"/>
+                <w:sz w:val="16"/>
+              </w:rPr>
+              <w:t>0.482</w:t>
+            </w:r>
+          </w:p>
+        </w:tc>
+        <w:tc>
+          <w:tcPr>
+            <w:tcW w:type="dxa" w:w="1361"/>
+            <w:vAlign w:val="center"/>
+            <w:shd w:fill="F2F6FA"/>
+            <w:tcMar>
+              <w:top w:w="95" w:type="dxa"/>
+              <w:bottom w:w="95" w:type="dxa"/>
+              <w:start w:w="90" w:type="dxa"/>
+              <w:end w:w="90" w:type="dxa"/>
+            </w:tcMar>
+          </w:tcPr>
+          <w:p>
+            <w:pPr>
+              <w:spacing w:after="0" w:line="259" w:lineRule="auto"/>
+              <w:jc w:val="center"/>
+            </w:pPr>
+            <w:r>
+              <w:rPr>
+                <w:rFonts w:ascii="Arial" w:hAnsi="Arial" w:eastAsia="PingFang SC"/>
+                <w:b w:val="0"/>
+                <w:color w:val="17212B"/>
+                <w:sz w:val="16"/>
+              </w:rPr>
+              <w:t>0.530</w:t>
+            </w:r>
+          </w:p>
+        </w:tc>
+        <w:tc>
+          <w:tcPr>
+            <w:tcW w:type="dxa" w:w="1928"/>
+            <w:vAlign w:val="center"/>
+            <w:shd w:fill="F2F6FA"/>
+            <w:tcMar>
+              <w:top w:w="95" w:type="dxa"/>
+              <w:bottom w:w="95" w:type="dxa"/>
+              <w:start w:w="90" w:type="dxa"/>
+              <w:end w:w="90" w:type="dxa"/>
+            </w:tcMar>
+          </w:tcPr>
+          <w:p>
+            <w:pPr>
+              <w:spacing w:after="0" w:line="259" w:lineRule="auto"/>
+              <w:jc w:val="center"/>
+            </w:pPr>
+            <w:r>
+              <w:rPr>
+                <w:rFonts w:ascii="Arial" w:hAnsi="Arial" w:eastAsia="PingFang SC"/>
+                <w:b w:val="0"/>
+                <w:color w:val="17212B"/>
+                <w:sz w:val="16"/>
+              </w:rPr>
+              <w:t>0.460</w:t>
+            </w:r>
+          </w:p>
+        </w:tc>
+        <w:tc>
+          <w:tcPr>
+            <w:tcW w:type="dxa" w:w="2041"/>
+            <w:vAlign w:val="center"/>
+            <w:shd w:fill="F2F6FA"/>
+            <w:tcMar>
+              <w:top w:w="95" w:type="dxa"/>
+              <w:bottom w:w="95" w:type="dxa"/>
+              <w:start w:w="90" w:type="dxa"/>
+              <w:end w:w="90" w:type="dxa"/>
+            </w:tcMar>
+          </w:tcPr>
+          <w:p>
+            <w:pPr>
+              <w:spacing w:after="0" w:line="259" w:lineRule="auto"/>
+              <w:jc w:val="center"/>
+            </w:pPr>
+            <w:r>
+              <w:rPr>
+                <w:rFonts w:ascii="Arial" w:hAnsi="Arial" w:eastAsia="PingFang SC"/>
+                <w:b w:val="0"/>
+                <w:color w:val="17212B"/>
+                <w:sz w:val="16"/>
+              </w:rPr>
+              <w:t>0.215</w:t>
+            </w:r>
+          </w:p>
+        </w:tc>
+      </w:tr>
+    </w:tbl>
+    <w:p>
+      <w:pPr>
+        <w:spacing w:after="0"/>
+      </w:pPr>
+    </w:p>
+    <w:p>
+      <w:r>
+        <w:t>r010 的 weed mAP50 和 mAP50-95 分别提高 0.003，weed recall 下降 0.008。提升幅度有限；r010 可作为当前 YOLO 候选设置，但不能认为它显著优于 r020。</w:t>
+      </w:r>
+    </w:p>
+    <w:p>
+      <w:pPr>
+        <w:pStyle w:val="Heading1"/>
+      </w:pPr>
+      <w:r>
+        <w:t>14 YOLO weed-only 与 crop+weed 对照</w:t>
+      </w:r>
+    </w:p>
+    <w:p>
+      <w:r>
+        <w:t>在 r010 数据集过滤设置下比较两类检测与只检测 weed。下表均为验证集 weed 类指标。</w:t>
+      </w:r>
+    </w:p>
+    <w:tbl>
+      <w:tblPr>
+        <w:tblW w:type="auto" w:w="0"/>
+        <w:jc w:val="center"/>
+        <w:tblLayout w:type="fixed"/>
+        <w:tblLook w:firstColumn="1" w:firstRow="1" w:lastColumn="0" w:lastRow="0" w:noHBand="0" w:noVBand="1" w:val="04A0"/>
+        <w:tblBorders>
+          <w:top w:val="single" w:sz="5" w:color="D9D9D9"/>
+          <w:left w:val="single" w:sz="5" w:color="D9D9D9"/>
+          <w:bottom w:val="single" w:sz="5" w:color="D9D9D9"/>
+          <w:right w:val="single" w:sz="5" w:color="D9D9D9"/>
+          <w:insideH w:val="single" w:sz="5" w:color="D9D9D9"/>
+          <w:insideV w:val="single" w:sz="5" w:color="D9D9D9"/>
+        </w:tblBorders>
+      </w:tblPr>
+      <w:tblGrid>
+        <w:gridCol w:w="2608"/>
+        <w:gridCol w:w="1417"/>
+        <w:gridCol w:w="1417"/>
+        <w:gridCol w:w="2041"/>
+        <w:gridCol w:w="2154"/>
+      </w:tblGrid>
+      <w:tr>
+        <w:trPr>
+          <w:tblHeader w:val="true"/>
+          <w:cantSplit/>
+        </w:trPr>
+        <w:tc>
+          <w:tcPr>
+            <w:tcW w:type="dxa" w:w="2608"/>
+            <w:vAlign w:val="center"/>
+            <w:shd w:fill="213B58"/>
+            <w:tcMar>
+              <w:top w:w="95" w:type="dxa"/>
+              <w:bottom w:w="95" w:type="dxa"/>
+              <w:start w:w="90" w:type="dxa"/>
+              <w:end w:w="90" w:type="dxa"/>
+            </w:tcMar>
+          </w:tcPr>
+          <w:p>
+            <w:pPr>
+              <w:spacing w:after="0" w:line="259" w:lineRule="auto"/>
+              <w:jc w:val="left"/>
+            </w:pPr>
+            <w:r>
+              <w:rPr>
+                <w:rFonts w:ascii="Arial" w:hAnsi="Arial" w:eastAsia="PingFang SC"/>
+                <w:b/>
+                <w:color w:val="FFFFFF"/>
+                <w:sz w:val="16"/>
+              </w:rPr>
+              <w:t>设置</w:t>
+            </w:r>
+          </w:p>
+        </w:tc>
+        <w:tc>
+          <w:tcPr>
+            <w:tcW w:type="dxa" w:w="1417"/>
+            <w:vAlign w:val="center"/>
+            <w:shd w:fill="213B58"/>
+            <w:tcMar>
+              <w:top w:w="95" w:type="dxa"/>
+              <w:bottom w:w="95" w:type="dxa"/>
+              <w:start w:w="90" w:type="dxa"/>
+              <w:end w:w="90" w:type="dxa"/>
+            </w:tcMar>
+          </w:tcPr>
+          <w:p>
+            <w:pPr>
+              <w:spacing w:after="0" w:line="259" w:lineRule="auto"/>
+              <w:jc w:val="center"/>
+            </w:pPr>
+            <w:r>
+              <w:rPr>
+                <w:rFonts w:ascii="Arial" w:hAnsi="Arial" w:eastAsia="PingFang SC"/>
+                <w:b/>
+                <w:color w:val="FFFFFF"/>
+                <w:sz w:val="16"/>
+              </w:rPr>
+              <w:t>Weed P</w:t>
+            </w:r>
+          </w:p>
+        </w:tc>
+        <w:tc>
+          <w:tcPr>
+            <w:tcW w:type="dxa" w:w="1417"/>
+            <w:vAlign w:val="center"/>
+            <w:shd w:fill="213B58"/>
+            <w:tcMar>
+              <w:top w:w="95" w:type="dxa"/>
+              <w:bottom w:w="95" w:type="dxa"/>
+              <w:start w:w="90" w:type="dxa"/>
+              <w:end w:w="90" w:type="dxa"/>
+            </w:tcMar>
+          </w:tcPr>
+          <w:p>
+            <w:pPr>
+              <w:spacing w:after="0" w:line="259" w:lineRule="auto"/>
+              <w:jc w:val="center"/>
+            </w:pPr>
+            <w:r>
+              <w:rPr>
+                <w:rFonts w:ascii="Arial" w:hAnsi="Arial" w:eastAsia="PingFang SC"/>
+                <w:b/>
+                <w:color w:val="FFFFFF"/>
+                <w:sz w:val="16"/>
+              </w:rPr>
+              <w:t>Weed R</w:t>
+            </w:r>
+          </w:p>
+        </w:tc>
+        <w:tc>
+          <w:tcPr>
+            <w:tcW w:type="dxa" w:w="2041"/>
+            <w:vAlign w:val="center"/>
+            <w:shd w:fill="213B58"/>
+            <w:tcMar>
+              <w:top w:w="95" w:type="dxa"/>
+              <w:bottom w:w="95" w:type="dxa"/>
+              <w:start w:w="90" w:type="dxa"/>
+              <w:end w:w="90" w:type="dxa"/>
+            </w:tcMar>
+          </w:tcPr>
+          <w:p>
+            <w:pPr>
+              <w:spacing w:after="0" w:line="259" w:lineRule="auto"/>
+              <w:jc w:val="center"/>
+            </w:pPr>
+            <w:r>
+              <w:rPr>
+                <w:rFonts w:ascii="Arial" w:hAnsi="Arial" w:eastAsia="PingFang SC"/>
+                <w:b/>
+                <w:color w:val="FFFFFF"/>
+                <w:sz w:val="16"/>
+              </w:rPr>
+              <w:t>Weed mAP50</w:t>
+            </w:r>
+          </w:p>
+        </w:tc>
+        <w:tc>
+          <w:tcPr>
+            <w:tcW w:type="dxa" w:w="2154"/>
+            <w:vAlign w:val="center"/>
+            <w:shd w:fill="213B58"/>
+            <w:tcMar>
+              <w:top w:w="95" w:type="dxa"/>
+              <w:bottom w:w="95" w:type="dxa"/>
+              <w:start w:w="90" w:type="dxa"/>
+              <w:end w:w="90" w:type="dxa"/>
+            </w:tcMar>
+          </w:tcPr>
+          <w:p>
+            <w:pPr>
+              <w:spacing w:after="0" w:line="259" w:lineRule="auto"/>
+              <w:jc w:val="center"/>
+            </w:pPr>
+            <w:r>
+              <w:rPr>
+                <w:rFonts w:ascii="Arial" w:hAnsi="Arial" w:eastAsia="PingFang SC"/>
+                <w:b/>
+                <w:color w:val="FFFFFF"/>
+                <w:sz w:val="16"/>
+              </w:rPr>
+              <w:t>Weed mAP50-95</w:t>
+            </w:r>
+          </w:p>
+        </w:tc>
+      </w:tr>
+      <w:tr>
+        <w:trPr>
+          <w:cantSplit/>
+        </w:trPr>
+        <w:tc>
+          <w:tcPr>
+            <w:tcW w:type="dxa" w:w="2608"/>
+            <w:vAlign w:val="center"/>
+            <w:tcMar>
+              <w:top w:w="95" w:type="dxa"/>
+              <w:bottom w:w="95" w:type="dxa"/>
+              <w:start w:w="90" w:type="dxa"/>
+              <w:end w:w="90" w:type="dxa"/>
+            </w:tcMar>
+          </w:tcPr>
+          <w:p>
+            <w:pPr>
+              <w:spacing w:after="0" w:line="259" w:lineRule="auto"/>
+              <w:jc w:val="left"/>
+            </w:pPr>
+            <w:r>
+              <w:rPr>
+                <w:rFonts w:ascii="Arial" w:hAnsi="Arial" w:eastAsia="PingFang SC"/>
+                <w:b w:val="0"/>
+                <w:color w:val="17212B"/>
+                <w:sz w:val="16"/>
+              </w:rPr>
+              <w:t>crop+weed r010</w:t>
+            </w:r>
+          </w:p>
+        </w:tc>
+        <w:tc>
+          <w:tcPr>
+            <w:tcW w:type="dxa" w:w="1417"/>
+            <w:vAlign w:val="center"/>
+            <w:tcMar>
+              <w:top w:w="95" w:type="dxa"/>
+              <w:bottom w:w="95" w:type="dxa"/>
+              <w:start w:w="90" w:type="dxa"/>
+              <w:end w:w="90" w:type="dxa"/>
+            </w:tcMar>
+          </w:tcPr>
+          <w:p>
+            <w:pPr>
+              <w:spacing w:after="0" w:line="259" w:lineRule="auto"/>
+              <w:jc w:val="center"/>
+            </w:pPr>
+            <w:r>
+              <w:rPr>
+                <w:rFonts w:ascii="Arial" w:hAnsi="Arial" w:eastAsia="PingFang SC"/>
+                <w:b w:val="0"/>
+                <w:color w:val="17212B"/>
+                <w:sz w:val="16"/>
+              </w:rPr>
+              <w:t>0.482</w:t>
+            </w:r>
+          </w:p>
+        </w:tc>
+        <w:tc>
+          <w:tcPr>
+            <w:tcW w:type="dxa" w:w="1417"/>
+            <w:vAlign w:val="center"/>
+            <w:tcMar>
+              <w:top w:w="95" w:type="dxa"/>
+              <w:bottom w:w="95" w:type="dxa"/>
+              <w:start w:w="90" w:type="dxa"/>
+              <w:end w:w="90" w:type="dxa"/>
+            </w:tcMar>
+          </w:tcPr>
+          <w:p>
+            <w:pPr>
+              <w:spacing w:after="0" w:line="259" w:lineRule="auto"/>
+              <w:jc w:val="center"/>
+            </w:pPr>
+            <w:r>
+              <w:rPr>
+                <w:rFonts w:ascii="Arial" w:hAnsi="Arial" w:eastAsia="PingFang SC"/>
+                <w:b w:val="0"/>
+                <w:color w:val="17212B"/>
+                <w:sz w:val="16"/>
+              </w:rPr>
+              <w:t>0.530</w:t>
+            </w:r>
+          </w:p>
+        </w:tc>
+        <w:tc>
+          <w:tcPr>
+            <w:tcW w:type="dxa" w:w="2041"/>
+            <w:vAlign w:val="center"/>
+            <w:tcMar>
+              <w:top w:w="95" w:type="dxa"/>
+              <w:bottom w:w="95" w:type="dxa"/>
+              <w:start w:w="90" w:type="dxa"/>
+              <w:end w:w="90" w:type="dxa"/>
+            </w:tcMar>
+          </w:tcPr>
+          <w:p>
+            <w:pPr>
+              <w:spacing w:after="0" w:line="259" w:lineRule="auto"/>
+              <w:jc w:val="center"/>
+            </w:pPr>
+            <w:r>
+              <w:rPr>
+                <w:rFonts w:ascii="Arial" w:hAnsi="Arial" w:eastAsia="PingFang SC"/>
+                <w:b w:val="0"/>
+                <w:color w:val="17212B"/>
+                <w:sz w:val="16"/>
+              </w:rPr>
+              <w:t>0.460</w:t>
+            </w:r>
+          </w:p>
+        </w:tc>
+        <w:tc>
+          <w:tcPr>
+            <w:tcW w:type="dxa" w:w="2154"/>
+            <w:vAlign w:val="center"/>
+            <w:tcMar>
+              <w:top w:w="95" w:type="dxa"/>
+              <w:bottom w:w="95" w:type="dxa"/>
+              <w:start w:w="90" w:type="dxa"/>
+              <w:end w:w="90" w:type="dxa"/>
+            </w:tcMar>
+          </w:tcPr>
+          <w:p>
+            <w:pPr>
+              <w:spacing w:after="0" w:line="259" w:lineRule="auto"/>
+              <w:jc w:val="center"/>
+            </w:pPr>
+            <w:r>
+              <w:rPr>
+                <w:rFonts w:ascii="Arial" w:hAnsi="Arial" w:eastAsia="PingFang SC"/>
+                <w:b w:val="0"/>
+                <w:color w:val="17212B"/>
+                <w:sz w:val="16"/>
+              </w:rPr>
+              <w:t>0.215</w:t>
+            </w:r>
+          </w:p>
+        </w:tc>
+      </w:tr>
+      <w:tr>
+        <w:trPr>
+          <w:cantSplit/>
+        </w:trPr>
+        <w:tc>
+          <w:tcPr>
+            <w:tcW w:type="dxa" w:w="2608"/>
+            <w:vAlign w:val="center"/>
+            <w:shd w:fill="F2F6FA"/>
+            <w:tcMar>
+              <w:top w:w="95" w:type="dxa"/>
+              <w:bottom w:w="95" w:type="dxa"/>
+              <w:start w:w="90" w:type="dxa"/>
+              <w:end w:w="90" w:type="dxa"/>
+            </w:tcMar>
+          </w:tcPr>
+          <w:p>
+            <w:pPr>
+              <w:spacing w:after="0" w:line="259" w:lineRule="auto"/>
+              <w:jc w:val="left"/>
+            </w:pPr>
+            <w:r>
+              <w:rPr>
+                <w:rFonts w:ascii="Arial" w:hAnsi="Arial" w:eastAsia="PingFang SC"/>
+                <w:b w:val="0"/>
+                <w:color w:val="17212B"/>
+                <w:sz w:val="16"/>
+              </w:rPr>
+              <w:t>weed-only r010</w:t>
+            </w:r>
+          </w:p>
+        </w:tc>
+        <w:tc>
+          <w:tcPr>
+            <w:tcW w:type="dxa" w:w="1417"/>
+            <w:vAlign w:val="center"/>
+            <w:shd w:fill="F2F6FA"/>
+            <w:tcMar>
+              <w:top w:w="95" w:type="dxa"/>
+              <w:bottom w:w="95" w:type="dxa"/>
+              <w:start w:w="90" w:type="dxa"/>
+              <w:end w:w="90" w:type="dxa"/>
+            </w:tcMar>
+          </w:tcPr>
+          <w:p>
+            <w:pPr>
+              <w:spacing w:after="0" w:line="259" w:lineRule="auto"/>
+              <w:jc w:val="center"/>
+            </w:pPr>
+            <w:r>
+              <w:rPr>
+                <w:rFonts w:ascii="Arial" w:hAnsi="Arial" w:eastAsia="PingFang SC"/>
+                <w:b w:val="0"/>
+                <w:color w:val="17212B"/>
+                <w:sz w:val="16"/>
+              </w:rPr>
+              <w:t>0.431</w:t>
+            </w:r>
+          </w:p>
+        </w:tc>
+        <w:tc>
+          <w:tcPr>
+            <w:tcW w:type="dxa" w:w="1417"/>
+            <w:vAlign w:val="center"/>
+            <w:shd w:fill="F2F6FA"/>
+            <w:tcMar>
+              <w:top w:w="95" w:type="dxa"/>
+              <w:bottom w:w="95" w:type="dxa"/>
+              <w:start w:w="90" w:type="dxa"/>
+              <w:end w:w="90" w:type="dxa"/>
+            </w:tcMar>
+          </w:tcPr>
+          <w:p>
+            <w:pPr>
+              <w:spacing w:after="0" w:line="259" w:lineRule="auto"/>
+              <w:jc w:val="center"/>
+            </w:pPr>
+            <w:r>
+              <w:rPr>
+                <w:rFonts w:ascii="Arial" w:hAnsi="Arial" w:eastAsia="PingFang SC"/>
+                <w:b w:val="0"/>
+                <w:color w:val="17212B"/>
+                <w:sz w:val="16"/>
+              </w:rPr>
+              <w:t>0.488</w:t>
+            </w:r>
+          </w:p>
+        </w:tc>
+        <w:tc>
+          <w:tcPr>
+            <w:tcW w:type="dxa" w:w="2041"/>
+            <w:vAlign w:val="center"/>
+            <w:shd w:fill="F2F6FA"/>
+            <w:tcMar>
+              <w:top w:w="95" w:type="dxa"/>
+              <w:bottom w:w="95" w:type="dxa"/>
+              <w:start w:w="90" w:type="dxa"/>
+              <w:end w:w="90" w:type="dxa"/>
+            </w:tcMar>
+          </w:tcPr>
+          <w:p>
+            <w:pPr>
+              <w:spacing w:after="0" w:line="259" w:lineRule="auto"/>
+              <w:jc w:val="center"/>
+            </w:pPr>
+            <w:r>
+              <w:rPr>
+                <w:rFonts w:ascii="Arial" w:hAnsi="Arial" w:eastAsia="PingFang SC"/>
+                <w:b w:val="0"/>
+                <w:color w:val="17212B"/>
+                <w:sz w:val="16"/>
+              </w:rPr>
+              <w:t>0.421</w:t>
+            </w:r>
+          </w:p>
+        </w:tc>
+        <w:tc>
+          <w:tcPr>
+            <w:tcW w:type="dxa" w:w="2154"/>
+            <w:vAlign w:val="center"/>
+            <w:shd w:fill="F2F6FA"/>
+            <w:tcMar>
+              <w:top w:w="95" w:type="dxa"/>
+              <w:bottom w:w="95" w:type="dxa"/>
+              <w:start w:w="90" w:type="dxa"/>
+              <w:end w:w="90" w:type="dxa"/>
+            </w:tcMar>
+          </w:tcPr>
+          <w:p>
+            <w:pPr>
+              <w:spacing w:after="0" w:line="259" w:lineRule="auto"/>
+              <w:jc w:val="center"/>
+            </w:pPr>
+            <w:r>
+              <w:rPr>
+                <w:rFonts w:ascii="Arial" w:hAnsi="Arial" w:eastAsia="PingFang SC"/>
+                <w:b w:val="0"/>
+                <w:color w:val="17212B"/>
+                <w:sz w:val="16"/>
+              </w:rPr>
+              <w:t>0.182</w:t>
+            </w:r>
+          </w:p>
+        </w:tc>
+      </w:tr>
+    </w:tbl>
+    <w:p>
+      <w:pPr>
+        <w:spacing w:after="0"/>
+      </w:pPr>
+    </w:p>
+    <w:p>
+      <w:r>
+        <w:t>当前设置下，weed-only 的四项 weed 指标均未超过 crop+weed。保留 crop 类可能有助于模型学习作物行结构以及 weed/crop 区分；这一解释尚需进一步验证。</w:t>
+      </w:r>
+    </w:p>
+    <w:p>
+      <w:pPr>
+        <w:pStyle w:val="Heading1"/>
+      </w:pPr>
+      <w:r>
+        <w:t>15 YOLO 预测可视化与 confidence threshold</w:t>
+      </w:r>
+    </w:p>
+    <w:p>
+      <w:r>
+        <w:t>visualize_yolo_predictions.py 用于比较 crop+weed r010 与 weed-only r010 在同一 validation sample 上的 ground truth 和预测框。sample index=0 的可视化中，crop+weed r010 的预测框数量更克制、输出更干净；weed-only r010 更容易产生密集 weed 候选框。这是单张样本的定性观察，整体效果仍以验证集指标为准。</w:t>
+      </w:r>
+    </w:p>
+    <w:p>
+      <w:r>
+        <w:t>将 conf threshold 从 0.25 提高到 0.40 后，低置信度预测框减少，可视化更干净。提高 conf 可能减少误检，也可能增加漏检，因此不能直接认为 0.40 是最优阈值。conf filtering 与 NMS 均在推理后处理阶段执行，不改变 backbone 或数据集 bbox 过滤规则。</w:t>
+      </w:r>
+    </w:p>
+    <w:p>
+      <w:pPr>
+        <w:pStyle w:val="Heading1"/>
+      </w:pPr>
+      <w:r>
+        <w:t>16 当前 YOLO 阶段结论与后续规划</w:t>
+      </w:r>
+    </w:p>
+    <w:p>
+      <w:r>
+        <w:t>当前 YOLO 检测支线已完成 bbox 分布统计、r020/r010 大框过滤对比、weed-only 对照实验，以及 prediction visualization 与 confidence threshold 观察。crop+weed r010 暂时是较合理的 YOLO baseline；YOLO 仍定位为稀疏场景候选路线和 detection pipeline 探索。项目主线仍是 MobileNetV2ShallowUNet + boundary CE r5_w4 语义分割，Mean IoU 为 76.71% ± 0.55%，Weed IoU 为 59.82% ± 0.64%。</w:t>
+      </w:r>
+    </w:p>
+    <w:p>
+      <w:r>
+        <w:t>原始 YOLOv8n baseline 稳定后，可研究 MobileNetV3-YOLOv8n 轻量化变体：用 MobileNetV3-style backbone 改造 YOLOv8n 的特征提取部分，保留 YOLOv8 Neck、Detection Head 和 anchor-free detection framework。当前阶段先记录 YOLOv8n 的 Precision、Recall、mAP50、mAP50-95、Params、FLOPs、model size 和 inference speed，再评估 backbone 改造；本阶段不实现该变体。</w:t>
+      </w:r>
+    </w:p>
+    <w:p>
+      <w:pPr>
+        <w:pStyle w:val="Heading1"/>
+      </w:pPr>
+      <w:r>
+        <w:t>17 YOLO / U-Net 路线选择标准</w:t>
       </w:r>
     </w:p>
     <w:p>
@@ -6081,7 +7541,7 @@
     </w:p>
     <w:p>
       <w:r>
-        <w:t>common split 中 dense 占约 95.15%，因此当前阶段以 U-Net / MobileNetV2ShallowUNet 语义分割为主路线有数据依据。YOLO 适合作为低覆盖稀疏场景的候选路线或后续扩展；目前仅完成 smoke test，尚无与 U-Net 在相同条件下的正式效果对比。</w:t>
+        <w:t>common split 中 dense 占约 95.15%，因此当前阶段以 U-Net / MobileNetV2ShallowUNet 语义分割为主路线有数据依据。YOLO 已完成初步检测对照，适合作为低覆盖稀疏场景的候选路线或后续扩展；尚无与语义分割模型在相同条件下的正式效果对比。</w:t>
       </w:r>
     </w:p>
     <w:p>
@@ -6089,7 +7549,7 @@
         <w:pStyle w:val="Heading1"/>
       </w:pPr>
       <w:r>
-        <w:t>14 给老师汇报用总结</w:t>
+        <w:t>18 给老师汇报用总结</w:t>
       </w:r>
     </w:p>
     <w:p>
@@ -6105,6 +7565,11 @@
     <w:p>
       <w:r>
         <w:t>另外，我新增了一个基于植被覆盖率 VCR 的模型选择指标。通过 NDVI 区分植物与土壤，并计算每张图像的植被覆盖率。统计结果显示 WeedMap common split 中 dense 样本占 95.15%，说明当前数据集以密集植被覆盖场景为主，因此继续优化 U-Net / MobileNetV2ShallowUNet 这类语义分割模型是合理的；YOLO 更适合作为低覆盖稀疏场景下的补充路线，用于单株或单簇定位和点状精准除草。</w:t>
+      </w:r>
+    </w:p>
+    <w:p>
+      <w:r>
+        <w:t>YOLO 检测支线现已完成 bbox 统计、r020/r010 大框过滤实验、weed-only 对照以及同一验证样本的预测可视化。r010 相比 r020 的 weed mAP 略升但 recall 略降，weed-only 在当前设置下也未超过 crop+weed；因此暂选 crop+weed r010 作为 YOLOv8n 候选 baseline。调整推理 conf 阈值可减少低置信度框，但仍需权衡漏检。后续先稳定并完整记录 YOLOv8n 指标与计算成本，再考虑 MobileNetV3-style backbone 轻量化。语义分割仍是当前项目主线。</w:t>
       </w:r>
     </w:p>
     <w:sectPr>

</xml_diff>

<commit_message>
Update Word report for advisor meeting
</commit_message>
<xml_diff>
--- a/reports/weedmap_progress_report.docx
+++ b/reports/weedmap_progress_report.docx
@@ -12,7 +12,7 @@
     </w:p>
     <w:p>
       <w:r>
-        <w:t>面向导师的阶段性汇报。报告总结真实 WeedMap 数据处理、统一样本对照、三 seed 语义分割实验、VCR 场景分析，以及近期 YOLOv8n 检测支线对照。当前语义分割主线最佳设置为 MobileNetV2ShallowUNet 方案 A + boundary weighted CE r5_w4：验证集 Mean IoU 76.71% ± 0.55%，Weed IoU 59.82% ± 0.64%。YOLO 暂以 crop+weed r010 作为检测候选 baseline。</w:t>
+        <w:t>面向导师的阶段性汇报。报告总结真实 WeedMap 数据处理、统一样本对照、三 seed 语义分割实验、VCR 场景分析，以及 YOLOv8n 检测支线和推理后处理阈值分析。当前语义分割主线最佳设置为 MobileNetV2ShallowUNet 方案 A + boundary weighted CE r5_w4：验证集 Pixel accuracy 96.98% ± 0.24%，Mean IoU 76.71% ± 0.55%，Weed IoU 59.82% ± 0.64%。YOLO 当前最佳 baseline 为 crop+weed r010，作为稀疏植被场景的候选路线。</w:t>
       </w:r>
     </w:p>
     <w:p>
@@ -7136,17 +7136,1174 @@
         <w:pStyle w:val="Heading1"/>
       </w:pPr>
       <w:r>
-        <w:t>16 当前 YOLO 阶段结论与后续规划</w:t>
+        <w:t>16 YOLO Post-processing Threshold Analysis</w:t>
       </w:r>
     </w:p>
     <w:p>
       <w:r>
-        <w:t>当前 YOLO 检测支线已完成 bbox 分布统计、r020/r010 大框过滤对比、weed-only 对照实验，以及 prediction visualization 与 confidence threshold 观察。crop+weed r010 暂时是较合理的 YOLO baseline；YOLO 仍定位为稀疏场景候选路线和 detection pipeline 探索。项目主线仍是 MobileNetV2ShallowUNet + boundary CE r5_w4 语义分割，Mean IoU 为 76.71% ± 0.55%，Weed IoU 为 59.82% ± 0.64%。</w:t>
+        <w:t>分析对象为当前最佳 YOLO baseline：YOLOv8n crop+weed r010。使用前 20 张 validation images，比较不同 confidence threshold 和 NMS IoU threshold 对预测框数量、weed 预测框数量及平均置信度的影响。confidence filtering 与 NMS 属于推理后处理，不改变模型训练或数据集 bbox 过滤规则。</w:t>
+      </w:r>
+    </w:p>
+    <w:p>
+      <w:pPr>
+        <w:pStyle w:val="Heading2"/>
+      </w:pPr>
+      <w:r>
+        <w:t>Confidence threshold 是主要影响因素</w:t>
       </w:r>
     </w:p>
     <w:p>
       <w:r>
-        <w:t>原始 YOLOv8n baseline 稳定后，可研究 MobileNetV3-YOLOv8n 轻量化变体：用 MobileNetV3-style backbone 改造 YOLOv8n 的特征提取部分，保留 YOLOv8 Neck、Detection Head 和 anchor-free detection framework。当前阶段先记录 YOLOv8n 的 Precision、Recall、mAP50、mAP50-95、Params、FLOPs、model size 和 inference speed，再评估 backbone 改造；本阶段不实现该变体。</w:t>
+        <w:t>固定 NMS IoU = 0.50，结果如下。crop 和 weed 框数均为 20 张图像的合计。</w:t>
+      </w:r>
+    </w:p>
+    <w:tbl>
+      <w:tblPr>
+        <w:tblW w:type="auto" w:w="0"/>
+        <w:jc w:val="center"/>
+        <w:tblLayout w:type="fixed"/>
+        <w:tblLook w:firstColumn="1" w:firstRow="1" w:lastColumn="0" w:lastRow="0" w:noHBand="0" w:noVBand="1" w:val="04A0"/>
+        <w:tblBorders>
+          <w:top w:val="single" w:sz="5" w:color="D9D9D9"/>
+          <w:left w:val="single" w:sz="5" w:color="D9D9D9"/>
+          <w:bottom w:val="single" w:sz="5" w:color="D9D9D9"/>
+          <w:right w:val="single" w:sz="5" w:color="D9D9D9"/>
+          <w:insideH w:val="single" w:sz="5" w:color="D9D9D9"/>
+          <w:insideV w:val="single" w:sz="5" w:color="D9D9D9"/>
+        </w:tblBorders>
+      </w:tblPr>
+      <w:tblGrid>
+        <w:gridCol w:w="1417"/>
+        <w:gridCol w:w="2381"/>
+        <w:gridCol w:w="1701"/>
+        <w:gridCol w:w="1701"/>
+        <w:gridCol w:w="2438"/>
+      </w:tblGrid>
+      <w:tr>
+        <w:trPr>
+          <w:tblHeader w:val="true"/>
+          <w:cantSplit/>
+        </w:trPr>
+        <w:tc>
+          <w:tcPr>
+            <w:tcW w:type="dxa" w:w="1417"/>
+            <w:vAlign w:val="center"/>
+            <w:shd w:fill="213B58"/>
+            <w:tcMar>
+              <w:top w:w="95" w:type="dxa"/>
+              <w:bottom w:w="95" w:type="dxa"/>
+              <w:start w:w="90" w:type="dxa"/>
+              <w:end w:w="90" w:type="dxa"/>
+            </w:tcMar>
+          </w:tcPr>
+          <w:p>
+            <w:pPr>
+              <w:spacing w:after="0" w:line="259" w:lineRule="auto"/>
+              <w:jc w:val="left"/>
+            </w:pPr>
+            <w:r>
+              <w:rPr>
+                <w:rFonts w:ascii="Arial" w:hAnsi="Arial" w:eastAsia="PingFang SC"/>
+                <w:b/>
+                <w:color w:val="FFFFFF"/>
+                <w:sz w:val="16"/>
+              </w:rPr>
+              <w:t>Confidence</w:t>
+            </w:r>
+          </w:p>
+        </w:tc>
+        <w:tc>
+          <w:tcPr>
+            <w:tcW w:type="dxa" w:w="2381"/>
+            <w:vAlign w:val="center"/>
+            <w:shd w:fill="213B58"/>
+            <w:tcMar>
+              <w:top w:w="95" w:type="dxa"/>
+              <w:bottom w:w="95" w:type="dxa"/>
+              <w:start w:w="90" w:type="dxa"/>
+              <w:end w:w="90" w:type="dxa"/>
+            </w:tcMar>
+          </w:tcPr>
+          <w:p>
+            <w:pPr>
+              <w:spacing w:after="0" w:line="259" w:lineRule="auto"/>
+              <w:jc w:val="center"/>
+            </w:pPr>
+            <w:r>
+              <w:rPr>
+                <w:rFonts w:ascii="Arial" w:hAnsi="Arial" w:eastAsia="PingFang SC"/>
+                <w:b/>
+                <w:color w:val="FFFFFF"/>
+                <w:sz w:val="16"/>
+              </w:rPr>
+              <w:t>Mean boxes/image</w:t>
+            </w:r>
+          </w:p>
+        </w:tc>
+        <w:tc>
+          <w:tcPr>
+            <w:tcW w:type="dxa" w:w="1701"/>
+            <w:vAlign w:val="center"/>
+            <w:shd w:fill="213B58"/>
+            <w:tcMar>
+              <w:top w:w="95" w:type="dxa"/>
+              <w:bottom w:w="95" w:type="dxa"/>
+              <w:start w:w="90" w:type="dxa"/>
+              <w:end w:w="90" w:type="dxa"/>
+            </w:tcMar>
+          </w:tcPr>
+          <w:p>
+            <w:pPr>
+              <w:spacing w:after="0" w:line="259" w:lineRule="auto"/>
+              <w:jc w:val="center"/>
+            </w:pPr>
+            <w:r>
+              <w:rPr>
+                <w:rFonts w:ascii="Arial" w:hAnsi="Arial" w:eastAsia="PingFang SC"/>
+                <w:b/>
+                <w:color w:val="FFFFFF"/>
+                <w:sz w:val="16"/>
+              </w:rPr>
+              <w:t>Crop boxes</w:t>
+            </w:r>
+          </w:p>
+        </w:tc>
+        <w:tc>
+          <w:tcPr>
+            <w:tcW w:type="dxa" w:w="1701"/>
+            <w:vAlign w:val="center"/>
+            <w:shd w:fill="213B58"/>
+            <w:tcMar>
+              <w:top w:w="95" w:type="dxa"/>
+              <w:bottom w:w="95" w:type="dxa"/>
+              <w:start w:w="90" w:type="dxa"/>
+              <w:end w:w="90" w:type="dxa"/>
+            </w:tcMar>
+          </w:tcPr>
+          <w:p>
+            <w:pPr>
+              <w:spacing w:after="0" w:line="259" w:lineRule="auto"/>
+              <w:jc w:val="center"/>
+            </w:pPr>
+            <w:r>
+              <w:rPr>
+                <w:rFonts w:ascii="Arial" w:hAnsi="Arial" w:eastAsia="PingFang SC"/>
+                <w:b/>
+                <w:color w:val="FFFFFF"/>
+                <w:sz w:val="16"/>
+              </w:rPr>
+              <w:t>Weed boxes</w:t>
+            </w:r>
+          </w:p>
+        </w:tc>
+        <w:tc>
+          <w:tcPr>
+            <w:tcW w:type="dxa" w:w="2438"/>
+            <w:vAlign w:val="center"/>
+            <w:shd w:fill="213B58"/>
+            <w:tcMar>
+              <w:top w:w="95" w:type="dxa"/>
+              <w:bottom w:w="95" w:type="dxa"/>
+              <w:start w:w="90" w:type="dxa"/>
+              <w:end w:w="90" w:type="dxa"/>
+            </w:tcMar>
+          </w:tcPr>
+          <w:p>
+            <w:pPr>
+              <w:spacing w:after="0" w:line="259" w:lineRule="auto"/>
+              <w:jc w:val="center"/>
+            </w:pPr>
+            <w:r>
+              <w:rPr>
+                <w:rFonts w:ascii="Arial" w:hAnsi="Arial" w:eastAsia="PingFang SC"/>
+                <w:b/>
+                <w:color w:val="FFFFFF"/>
+                <w:sz w:val="16"/>
+              </w:rPr>
+              <w:t>Mean confidence</w:t>
+            </w:r>
+          </w:p>
+        </w:tc>
+      </w:tr>
+      <w:tr>
+        <w:trPr>
+          <w:cantSplit/>
+        </w:trPr>
+        <w:tc>
+          <w:tcPr>
+            <w:tcW w:type="dxa" w:w="1417"/>
+            <w:vAlign w:val="center"/>
+            <w:tcMar>
+              <w:top w:w="95" w:type="dxa"/>
+              <w:bottom w:w="95" w:type="dxa"/>
+              <w:start w:w="90" w:type="dxa"/>
+              <w:end w:w="90" w:type="dxa"/>
+            </w:tcMar>
+          </w:tcPr>
+          <w:p>
+            <w:pPr>
+              <w:spacing w:after="0" w:line="259" w:lineRule="auto"/>
+              <w:jc w:val="left"/>
+            </w:pPr>
+            <w:r>
+              <w:rPr>
+                <w:rFonts w:ascii="Arial" w:hAnsi="Arial" w:eastAsia="PingFang SC"/>
+                <w:b w:val="0"/>
+                <w:color w:val="17212B"/>
+                <w:sz w:val="16"/>
+              </w:rPr>
+              <w:t>0.25</w:t>
+            </w:r>
+          </w:p>
+        </w:tc>
+        <w:tc>
+          <w:tcPr>
+            <w:tcW w:type="dxa" w:w="2381"/>
+            <w:vAlign w:val="center"/>
+            <w:tcMar>
+              <w:top w:w="95" w:type="dxa"/>
+              <w:bottom w:w="95" w:type="dxa"/>
+              <w:start w:w="90" w:type="dxa"/>
+              <w:end w:w="90" w:type="dxa"/>
+            </w:tcMar>
+          </w:tcPr>
+          <w:p>
+            <w:pPr>
+              <w:spacing w:after="0" w:line="259" w:lineRule="auto"/>
+              <w:jc w:val="center"/>
+            </w:pPr>
+            <w:r>
+              <w:rPr>
+                <w:rFonts w:ascii="Arial" w:hAnsi="Arial" w:eastAsia="PingFang SC"/>
+                <w:b w:val="0"/>
+                <w:color w:val="17212B"/>
+                <w:sz w:val="16"/>
+              </w:rPr>
+              <w:t>34.25</w:t>
+            </w:r>
+          </w:p>
+        </w:tc>
+        <w:tc>
+          <w:tcPr>
+            <w:tcW w:type="dxa" w:w="1701"/>
+            <w:vAlign w:val="center"/>
+            <w:tcMar>
+              <w:top w:w="95" w:type="dxa"/>
+              <w:bottom w:w="95" w:type="dxa"/>
+              <w:start w:w="90" w:type="dxa"/>
+              <w:end w:w="90" w:type="dxa"/>
+            </w:tcMar>
+          </w:tcPr>
+          <w:p>
+            <w:pPr>
+              <w:spacing w:after="0" w:line="259" w:lineRule="auto"/>
+              <w:jc w:val="center"/>
+            </w:pPr>
+            <w:r>
+              <w:rPr>
+                <w:rFonts w:ascii="Arial" w:hAnsi="Arial" w:eastAsia="PingFang SC"/>
+                <w:b w:val="0"/>
+                <w:color w:val="17212B"/>
+                <w:sz w:val="16"/>
+              </w:rPr>
+              <w:t>263</w:t>
+            </w:r>
+          </w:p>
+        </w:tc>
+        <w:tc>
+          <w:tcPr>
+            <w:tcW w:type="dxa" w:w="1701"/>
+            <w:vAlign w:val="center"/>
+            <w:tcMar>
+              <w:top w:w="95" w:type="dxa"/>
+              <w:bottom w:w="95" w:type="dxa"/>
+              <w:start w:w="90" w:type="dxa"/>
+              <w:end w:w="90" w:type="dxa"/>
+            </w:tcMar>
+          </w:tcPr>
+          <w:p>
+            <w:pPr>
+              <w:spacing w:after="0" w:line="259" w:lineRule="auto"/>
+              <w:jc w:val="center"/>
+            </w:pPr>
+            <w:r>
+              <w:rPr>
+                <w:rFonts w:ascii="Arial" w:hAnsi="Arial" w:eastAsia="PingFang SC"/>
+                <w:b w:val="0"/>
+                <w:color w:val="17212B"/>
+                <w:sz w:val="16"/>
+              </w:rPr>
+              <w:t>422</w:t>
+            </w:r>
+          </w:p>
+        </w:tc>
+        <w:tc>
+          <w:tcPr>
+            <w:tcW w:type="dxa" w:w="2438"/>
+            <w:vAlign w:val="center"/>
+            <w:tcMar>
+              <w:top w:w="95" w:type="dxa"/>
+              <w:bottom w:w="95" w:type="dxa"/>
+              <w:start w:w="90" w:type="dxa"/>
+              <w:end w:w="90" w:type="dxa"/>
+            </w:tcMar>
+          </w:tcPr>
+          <w:p>
+            <w:pPr>
+              <w:spacing w:after="0" w:line="259" w:lineRule="auto"/>
+              <w:jc w:val="center"/>
+            </w:pPr>
+            <w:r>
+              <w:rPr>
+                <w:rFonts w:ascii="Arial" w:hAnsi="Arial" w:eastAsia="PingFang SC"/>
+                <w:b w:val="0"/>
+                <w:color w:val="17212B"/>
+                <w:sz w:val="16"/>
+              </w:rPr>
+              <w:t>0.4140</w:t>
+            </w:r>
+          </w:p>
+        </w:tc>
+      </w:tr>
+      <w:tr>
+        <w:trPr>
+          <w:cantSplit/>
+        </w:trPr>
+        <w:tc>
+          <w:tcPr>
+            <w:tcW w:type="dxa" w:w="1417"/>
+            <w:vAlign w:val="center"/>
+            <w:shd w:fill="F2F6FA"/>
+            <w:tcMar>
+              <w:top w:w="95" w:type="dxa"/>
+              <w:bottom w:w="95" w:type="dxa"/>
+              <w:start w:w="90" w:type="dxa"/>
+              <w:end w:w="90" w:type="dxa"/>
+            </w:tcMar>
+          </w:tcPr>
+          <w:p>
+            <w:pPr>
+              <w:spacing w:after="0" w:line="259" w:lineRule="auto"/>
+              <w:jc w:val="left"/>
+            </w:pPr>
+            <w:r>
+              <w:rPr>
+                <w:rFonts w:ascii="Arial" w:hAnsi="Arial" w:eastAsia="PingFang SC"/>
+                <w:b w:val="0"/>
+                <w:color w:val="17212B"/>
+                <w:sz w:val="16"/>
+              </w:rPr>
+              <w:t>0.30</w:t>
+            </w:r>
+          </w:p>
+        </w:tc>
+        <w:tc>
+          <w:tcPr>
+            <w:tcW w:type="dxa" w:w="2381"/>
+            <w:vAlign w:val="center"/>
+            <w:shd w:fill="F2F6FA"/>
+            <w:tcMar>
+              <w:top w:w="95" w:type="dxa"/>
+              <w:bottom w:w="95" w:type="dxa"/>
+              <w:start w:w="90" w:type="dxa"/>
+              <w:end w:w="90" w:type="dxa"/>
+            </w:tcMar>
+          </w:tcPr>
+          <w:p>
+            <w:pPr>
+              <w:spacing w:after="0" w:line="259" w:lineRule="auto"/>
+              <w:jc w:val="center"/>
+            </w:pPr>
+            <w:r>
+              <w:rPr>
+                <w:rFonts w:ascii="Arial" w:hAnsi="Arial" w:eastAsia="PingFang SC"/>
+                <w:b w:val="0"/>
+                <w:color w:val="17212B"/>
+                <w:sz w:val="16"/>
+              </w:rPr>
+              <w:t>25.15</w:t>
+            </w:r>
+          </w:p>
+        </w:tc>
+        <w:tc>
+          <w:tcPr>
+            <w:tcW w:type="dxa" w:w="1701"/>
+            <w:vAlign w:val="center"/>
+            <w:shd w:fill="F2F6FA"/>
+            <w:tcMar>
+              <w:top w:w="95" w:type="dxa"/>
+              <w:bottom w:w="95" w:type="dxa"/>
+              <w:start w:w="90" w:type="dxa"/>
+              <w:end w:w="90" w:type="dxa"/>
+            </w:tcMar>
+          </w:tcPr>
+          <w:p>
+            <w:pPr>
+              <w:spacing w:after="0" w:line="259" w:lineRule="auto"/>
+              <w:jc w:val="center"/>
+            </w:pPr>
+            <w:r>
+              <w:rPr>
+                <w:rFonts w:ascii="Arial" w:hAnsi="Arial" w:eastAsia="PingFang SC"/>
+                <w:b w:val="0"/>
+                <w:color w:val="17212B"/>
+                <w:sz w:val="16"/>
+              </w:rPr>
+              <w:t>179</w:t>
+            </w:r>
+          </w:p>
+        </w:tc>
+        <w:tc>
+          <w:tcPr>
+            <w:tcW w:type="dxa" w:w="1701"/>
+            <w:vAlign w:val="center"/>
+            <w:shd w:fill="F2F6FA"/>
+            <w:tcMar>
+              <w:top w:w="95" w:type="dxa"/>
+              <w:bottom w:w="95" w:type="dxa"/>
+              <w:start w:w="90" w:type="dxa"/>
+              <w:end w:w="90" w:type="dxa"/>
+            </w:tcMar>
+          </w:tcPr>
+          <w:p>
+            <w:pPr>
+              <w:spacing w:after="0" w:line="259" w:lineRule="auto"/>
+              <w:jc w:val="center"/>
+            </w:pPr>
+            <w:r>
+              <w:rPr>
+                <w:rFonts w:ascii="Arial" w:hAnsi="Arial" w:eastAsia="PingFang SC"/>
+                <w:b w:val="0"/>
+                <w:color w:val="17212B"/>
+                <w:sz w:val="16"/>
+              </w:rPr>
+              <w:t>324</w:t>
+            </w:r>
+          </w:p>
+        </w:tc>
+        <w:tc>
+          <w:tcPr>
+            <w:tcW w:type="dxa" w:w="2438"/>
+            <w:vAlign w:val="center"/>
+            <w:shd w:fill="F2F6FA"/>
+            <w:tcMar>
+              <w:top w:w="95" w:type="dxa"/>
+              <w:bottom w:w="95" w:type="dxa"/>
+              <w:start w:w="90" w:type="dxa"/>
+              <w:end w:w="90" w:type="dxa"/>
+            </w:tcMar>
+          </w:tcPr>
+          <w:p>
+            <w:pPr>
+              <w:spacing w:after="0" w:line="259" w:lineRule="auto"/>
+              <w:jc w:val="center"/>
+            </w:pPr>
+            <w:r>
+              <w:rPr>
+                <w:rFonts w:ascii="Arial" w:hAnsi="Arial" w:eastAsia="PingFang SC"/>
+                <w:b w:val="0"/>
+                <w:color w:val="17212B"/>
+                <w:sz w:val="16"/>
+              </w:rPr>
+              <w:t>0.4644</w:t>
+            </w:r>
+          </w:p>
+        </w:tc>
+      </w:tr>
+      <w:tr>
+        <w:trPr>
+          <w:cantSplit/>
+        </w:trPr>
+        <w:tc>
+          <w:tcPr>
+            <w:tcW w:type="dxa" w:w="1417"/>
+            <w:vAlign w:val="center"/>
+            <w:tcMar>
+              <w:top w:w="95" w:type="dxa"/>
+              <w:bottom w:w="95" w:type="dxa"/>
+              <w:start w:w="90" w:type="dxa"/>
+              <w:end w:w="90" w:type="dxa"/>
+            </w:tcMar>
+          </w:tcPr>
+          <w:p>
+            <w:pPr>
+              <w:spacing w:after="0" w:line="259" w:lineRule="auto"/>
+              <w:jc w:val="left"/>
+            </w:pPr>
+            <w:r>
+              <w:rPr>
+                <w:rFonts w:ascii="Arial" w:hAnsi="Arial" w:eastAsia="PingFang SC"/>
+                <w:b w:val="0"/>
+                <w:color w:val="17212B"/>
+                <w:sz w:val="16"/>
+              </w:rPr>
+              <w:t>0.40</w:t>
+            </w:r>
+          </w:p>
+        </w:tc>
+        <w:tc>
+          <w:tcPr>
+            <w:tcW w:type="dxa" w:w="2381"/>
+            <w:vAlign w:val="center"/>
+            <w:tcMar>
+              <w:top w:w="95" w:type="dxa"/>
+              <w:bottom w:w="95" w:type="dxa"/>
+              <w:start w:w="90" w:type="dxa"/>
+              <w:end w:w="90" w:type="dxa"/>
+            </w:tcMar>
+          </w:tcPr>
+          <w:p>
+            <w:pPr>
+              <w:spacing w:after="0" w:line="259" w:lineRule="auto"/>
+              <w:jc w:val="center"/>
+            </w:pPr>
+            <w:r>
+              <w:rPr>
+                <w:rFonts w:ascii="Arial" w:hAnsi="Arial" w:eastAsia="PingFang SC"/>
+                <w:b w:val="0"/>
+                <w:color w:val="17212B"/>
+                <w:sz w:val="16"/>
+              </w:rPr>
+              <w:t>14.40</w:t>
+            </w:r>
+          </w:p>
+        </w:tc>
+        <w:tc>
+          <w:tcPr>
+            <w:tcW w:type="dxa" w:w="1701"/>
+            <w:vAlign w:val="center"/>
+            <w:tcMar>
+              <w:top w:w="95" w:type="dxa"/>
+              <w:bottom w:w="95" w:type="dxa"/>
+              <w:start w:w="90" w:type="dxa"/>
+              <w:end w:w="90" w:type="dxa"/>
+            </w:tcMar>
+          </w:tcPr>
+          <w:p>
+            <w:pPr>
+              <w:spacing w:after="0" w:line="259" w:lineRule="auto"/>
+              <w:jc w:val="center"/>
+            </w:pPr>
+            <w:r>
+              <w:rPr>
+                <w:rFonts w:ascii="Arial" w:hAnsi="Arial" w:eastAsia="PingFang SC"/>
+                <w:b w:val="0"/>
+                <w:color w:val="17212B"/>
+                <w:sz w:val="16"/>
+              </w:rPr>
+              <w:t>95</w:t>
+            </w:r>
+          </w:p>
+        </w:tc>
+        <w:tc>
+          <w:tcPr>
+            <w:tcW w:type="dxa" w:w="1701"/>
+            <w:vAlign w:val="center"/>
+            <w:tcMar>
+              <w:top w:w="95" w:type="dxa"/>
+              <w:bottom w:w="95" w:type="dxa"/>
+              <w:start w:w="90" w:type="dxa"/>
+              <w:end w:w="90" w:type="dxa"/>
+            </w:tcMar>
+          </w:tcPr>
+          <w:p>
+            <w:pPr>
+              <w:spacing w:after="0" w:line="259" w:lineRule="auto"/>
+              <w:jc w:val="center"/>
+            </w:pPr>
+            <w:r>
+              <w:rPr>
+                <w:rFonts w:ascii="Arial" w:hAnsi="Arial" w:eastAsia="PingFang SC"/>
+                <w:b w:val="0"/>
+                <w:color w:val="17212B"/>
+                <w:sz w:val="16"/>
+              </w:rPr>
+              <w:t>193</w:t>
+            </w:r>
+          </w:p>
+        </w:tc>
+        <w:tc>
+          <w:tcPr>
+            <w:tcW w:type="dxa" w:w="2438"/>
+            <w:vAlign w:val="center"/>
+            <w:tcMar>
+              <w:top w:w="95" w:type="dxa"/>
+              <w:bottom w:w="95" w:type="dxa"/>
+              <w:start w:w="90" w:type="dxa"/>
+              <w:end w:w="90" w:type="dxa"/>
+            </w:tcMar>
+          </w:tcPr>
+          <w:p>
+            <w:pPr>
+              <w:spacing w:after="0" w:line="259" w:lineRule="auto"/>
+              <w:jc w:val="center"/>
+            </w:pPr>
+            <w:r>
+              <w:rPr>
+                <w:rFonts w:ascii="Arial" w:hAnsi="Arial" w:eastAsia="PingFang SC"/>
+                <w:b w:val="0"/>
+                <w:color w:val="17212B"/>
+                <w:sz w:val="16"/>
+              </w:rPr>
+              <w:t>0.5539</w:t>
+            </w:r>
+          </w:p>
+        </w:tc>
+      </w:tr>
+      <w:tr>
+        <w:trPr>
+          <w:cantSplit/>
+        </w:trPr>
+        <w:tc>
+          <w:tcPr>
+            <w:tcW w:type="dxa" w:w="1417"/>
+            <w:vAlign w:val="center"/>
+            <w:shd w:fill="F2F6FA"/>
+            <w:tcMar>
+              <w:top w:w="95" w:type="dxa"/>
+              <w:bottom w:w="95" w:type="dxa"/>
+              <w:start w:w="90" w:type="dxa"/>
+              <w:end w:w="90" w:type="dxa"/>
+            </w:tcMar>
+          </w:tcPr>
+          <w:p>
+            <w:pPr>
+              <w:spacing w:after="0" w:line="259" w:lineRule="auto"/>
+              <w:jc w:val="left"/>
+            </w:pPr>
+            <w:r>
+              <w:rPr>
+                <w:rFonts w:ascii="Arial" w:hAnsi="Arial" w:eastAsia="PingFang SC"/>
+                <w:b w:val="0"/>
+                <w:color w:val="17212B"/>
+                <w:sz w:val="16"/>
+              </w:rPr>
+              <w:t>0.50</w:t>
+            </w:r>
+          </w:p>
+        </w:tc>
+        <w:tc>
+          <w:tcPr>
+            <w:tcW w:type="dxa" w:w="2381"/>
+            <w:vAlign w:val="center"/>
+            <w:shd w:fill="F2F6FA"/>
+            <w:tcMar>
+              <w:top w:w="95" w:type="dxa"/>
+              <w:bottom w:w="95" w:type="dxa"/>
+              <w:start w:w="90" w:type="dxa"/>
+              <w:end w:w="90" w:type="dxa"/>
+            </w:tcMar>
+          </w:tcPr>
+          <w:p>
+            <w:pPr>
+              <w:spacing w:after="0" w:line="259" w:lineRule="auto"/>
+              <w:jc w:val="center"/>
+            </w:pPr>
+            <w:r>
+              <w:rPr>
+                <w:rFonts w:ascii="Arial" w:hAnsi="Arial" w:eastAsia="PingFang SC"/>
+                <w:b w:val="0"/>
+                <w:color w:val="17212B"/>
+                <w:sz w:val="16"/>
+              </w:rPr>
+              <w:t>8.60</w:t>
+            </w:r>
+          </w:p>
+        </w:tc>
+        <w:tc>
+          <w:tcPr>
+            <w:tcW w:type="dxa" w:w="1701"/>
+            <w:vAlign w:val="center"/>
+            <w:shd w:fill="F2F6FA"/>
+            <w:tcMar>
+              <w:top w:w="95" w:type="dxa"/>
+              <w:bottom w:w="95" w:type="dxa"/>
+              <w:start w:w="90" w:type="dxa"/>
+              <w:end w:w="90" w:type="dxa"/>
+            </w:tcMar>
+          </w:tcPr>
+          <w:p>
+            <w:pPr>
+              <w:spacing w:after="0" w:line="259" w:lineRule="auto"/>
+              <w:jc w:val="center"/>
+            </w:pPr>
+            <w:r>
+              <w:rPr>
+                <w:rFonts w:ascii="Arial" w:hAnsi="Arial" w:eastAsia="PingFang SC"/>
+                <w:b w:val="0"/>
+                <w:color w:val="17212B"/>
+                <w:sz w:val="16"/>
+              </w:rPr>
+              <w:t>55</w:t>
+            </w:r>
+          </w:p>
+        </w:tc>
+        <w:tc>
+          <w:tcPr>
+            <w:tcW w:type="dxa" w:w="1701"/>
+            <w:vAlign w:val="center"/>
+            <w:shd w:fill="F2F6FA"/>
+            <w:tcMar>
+              <w:top w:w="95" w:type="dxa"/>
+              <w:bottom w:w="95" w:type="dxa"/>
+              <w:start w:w="90" w:type="dxa"/>
+              <w:end w:w="90" w:type="dxa"/>
+            </w:tcMar>
+          </w:tcPr>
+          <w:p>
+            <w:pPr>
+              <w:spacing w:after="0" w:line="259" w:lineRule="auto"/>
+              <w:jc w:val="center"/>
+            </w:pPr>
+            <w:r>
+              <w:rPr>
+                <w:rFonts w:ascii="Arial" w:hAnsi="Arial" w:eastAsia="PingFang SC"/>
+                <w:b w:val="0"/>
+                <w:color w:val="17212B"/>
+                <w:sz w:val="16"/>
+              </w:rPr>
+              <w:t>117</w:t>
+            </w:r>
+          </w:p>
+        </w:tc>
+        <w:tc>
+          <w:tcPr>
+            <w:tcW w:type="dxa" w:w="2438"/>
+            <w:vAlign w:val="center"/>
+            <w:shd w:fill="F2F6FA"/>
+            <w:tcMar>
+              <w:top w:w="95" w:type="dxa"/>
+              <w:bottom w:w="95" w:type="dxa"/>
+              <w:start w:w="90" w:type="dxa"/>
+              <w:end w:w="90" w:type="dxa"/>
+            </w:tcMar>
+          </w:tcPr>
+          <w:p>
+            <w:pPr>
+              <w:spacing w:after="0" w:line="259" w:lineRule="auto"/>
+              <w:jc w:val="center"/>
+            </w:pPr>
+            <w:r>
+              <w:rPr>
+                <w:rFonts w:ascii="Arial" w:hAnsi="Arial" w:eastAsia="PingFang SC"/>
+                <w:b w:val="0"/>
+                <w:color w:val="17212B"/>
+                <w:sz w:val="16"/>
+              </w:rPr>
+              <w:t>0.6243</w:t>
+            </w:r>
+          </w:p>
+        </w:tc>
+      </w:tr>
+    </w:tbl>
+    <w:p>
+      <w:pPr>
+        <w:spacing w:after="0"/>
+      </w:pPr>
+    </w:p>
+    <w:p>
+      <w:r>
+        <w:t>从 conf=0.25 提高到 conf=0.40 后，mean boxes/image 从 34.25 降到 14.40，weed predicted boxes 从 422 降到 193，可视化结果明显更干净。</w:t>
+      </w:r>
+    </w:p>
+    <w:p>
+      <w:pPr>
+        <w:pStyle w:val="Heading2"/>
+      </w:pPr>
+      <w:r>
+        <w:t>NMS IoU threshold 影响较小</w:t>
+      </w:r>
+    </w:p>
+    <w:p>
+      <w:r>
+        <w:t>固定 conf=0.40，结果如下。</w:t>
+      </w:r>
+    </w:p>
+    <w:tbl>
+      <w:tblPr>
+        <w:tblW w:type="auto" w:w="0"/>
+        <w:jc w:val="center"/>
+        <w:tblLayout w:type="fixed"/>
+        <w:tblLook w:firstColumn="1" w:firstRow="1" w:lastColumn="0" w:lastRow="0" w:noHBand="0" w:noVBand="1" w:val="04A0"/>
+        <w:tblBorders>
+          <w:top w:val="single" w:sz="5" w:color="D9D9D9"/>
+          <w:left w:val="single" w:sz="5" w:color="D9D9D9"/>
+          <w:bottom w:val="single" w:sz="5" w:color="D9D9D9"/>
+          <w:right w:val="single" w:sz="5" w:color="D9D9D9"/>
+          <w:insideH w:val="single" w:sz="5" w:color="D9D9D9"/>
+          <w:insideV w:val="single" w:sz="5" w:color="D9D9D9"/>
+        </w:tblBorders>
+      </w:tblPr>
+      <w:tblGrid>
+        <w:gridCol w:w="2268"/>
+        <w:gridCol w:w="3969"/>
+        <w:gridCol w:w="3402"/>
+      </w:tblGrid>
+      <w:tr>
+        <w:trPr>
+          <w:tblHeader w:val="true"/>
+          <w:cantSplit/>
+        </w:trPr>
+        <w:tc>
+          <w:tcPr>
+            <w:tcW w:type="dxa" w:w="2268"/>
+            <w:vAlign w:val="center"/>
+            <w:shd w:fill="213B58"/>
+            <w:tcMar>
+              <w:top w:w="95" w:type="dxa"/>
+              <w:bottom w:w="95" w:type="dxa"/>
+              <w:start w:w="90" w:type="dxa"/>
+              <w:end w:w="90" w:type="dxa"/>
+            </w:tcMar>
+          </w:tcPr>
+          <w:p>
+            <w:pPr>
+              <w:spacing w:after="0" w:line="259" w:lineRule="auto"/>
+              <w:jc w:val="left"/>
+            </w:pPr>
+            <w:r>
+              <w:rPr>
+                <w:rFonts w:ascii="Arial" w:hAnsi="Arial" w:eastAsia="PingFang SC"/>
+                <w:b/>
+                <w:color w:val="FFFFFF"/>
+                <w:sz w:val="17"/>
+              </w:rPr>
+              <w:t>NMS IoU</w:t>
+            </w:r>
+          </w:p>
+        </w:tc>
+        <w:tc>
+          <w:tcPr>
+            <w:tcW w:type="dxa" w:w="3969"/>
+            <w:vAlign w:val="center"/>
+            <w:shd w:fill="213B58"/>
+            <w:tcMar>
+              <w:top w:w="95" w:type="dxa"/>
+              <w:bottom w:w="95" w:type="dxa"/>
+              <w:start w:w="90" w:type="dxa"/>
+              <w:end w:w="90" w:type="dxa"/>
+            </w:tcMar>
+          </w:tcPr>
+          <w:p>
+            <w:pPr>
+              <w:spacing w:after="0" w:line="259" w:lineRule="auto"/>
+              <w:jc w:val="center"/>
+            </w:pPr>
+            <w:r>
+              <w:rPr>
+                <w:rFonts w:ascii="Arial" w:hAnsi="Arial" w:eastAsia="PingFang SC"/>
+                <w:b/>
+                <w:color w:val="FFFFFF"/>
+                <w:sz w:val="17"/>
+              </w:rPr>
+              <w:t>Mean boxes/image</w:t>
+            </w:r>
+          </w:p>
+        </w:tc>
+        <w:tc>
+          <w:tcPr>
+            <w:tcW w:type="dxa" w:w="3402"/>
+            <w:vAlign w:val="center"/>
+            <w:shd w:fill="213B58"/>
+            <w:tcMar>
+              <w:top w:w="95" w:type="dxa"/>
+              <w:bottom w:w="95" w:type="dxa"/>
+              <w:start w:w="90" w:type="dxa"/>
+              <w:end w:w="90" w:type="dxa"/>
+            </w:tcMar>
+          </w:tcPr>
+          <w:p>
+            <w:pPr>
+              <w:spacing w:after="0" w:line="259" w:lineRule="auto"/>
+              <w:jc w:val="center"/>
+            </w:pPr>
+            <w:r>
+              <w:rPr>
+                <w:rFonts w:ascii="Arial" w:hAnsi="Arial" w:eastAsia="PingFang SC"/>
+                <w:b/>
+                <w:color w:val="FFFFFF"/>
+                <w:sz w:val="17"/>
+              </w:rPr>
+              <w:t>Weed boxes</w:t>
+            </w:r>
+          </w:p>
+        </w:tc>
+      </w:tr>
+      <w:tr>
+        <w:trPr>
+          <w:cantSplit/>
+        </w:trPr>
+        <w:tc>
+          <w:tcPr>
+            <w:tcW w:type="dxa" w:w="2268"/>
+            <w:vAlign w:val="center"/>
+            <w:tcMar>
+              <w:top w:w="95" w:type="dxa"/>
+              <w:bottom w:w="95" w:type="dxa"/>
+              <w:start w:w="90" w:type="dxa"/>
+              <w:end w:w="90" w:type="dxa"/>
+            </w:tcMar>
+          </w:tcPr>
+          <w:p>
+            <w:pPr>
+              <w:spacing w:after="0" w:line="259" w:lineRule="auto"/>
+              <w:jc w:val="left"/>
+            </w:pPr>
+            <w:r>
+              <w:rPr>
+                <w:rFonts w:ascii="Arial" w:hAnsi="Arial" w:eastAsia="PingFang SC"/>
+                <w:b w:val="0"/>
+                <w:color w:val="17212B"/>
+                <w:sz w:val="17"/>
+              </w:rPr>
+              <w:t>0.50</w:t>
+            </w:r>
+          </w:p>
+        </w:tc>
+        <w:tc>
+          <w:tcPr>
+            <w:tcW w:type="dxa" w:w="3969"/>
+            <w:vAlign w:val="center"/>
+            <w:tcMar>
+              <w:top w:w="95" w:type="dxa"/>
+              <w:bottom w:w="95" w:type="dxa"/>
+              <w:start w:w="90" w:type="dxa"/>
+              <w:end w:w="90" w:type="dxa"/>
+            </w:tcMar>
+          </w:tcPr>
+          <w:p>
+            <w:pPr>
+              <w:spacing w:after="0" w:line="259" w:lineRule="auto"/>
+              <w:jc w:val="center"/>
+            </w:pPr>
+            <w:r>
+              <w:rPr>
+                <w:rFonts w:ascii="Arial" w:hAnsi="Arial" w:eastAsia="PingFang SC"/>
+                <w:b w:val="0"/>
+                <w:color w:val="17212B"/>
+                <w:sz w:val="17"/>
+              </w:rPr>
+              <w:t>14.40</w:t>
+            </w:r>
+          </w:p>
+        </w:tc>
+        <w:tc>
+          <w:tcPr>
+            <w:tcW w:type="dxa" w:w="3402"/>
+            <w:vAlign w:val="center"/>
+            <w:tcMar>
+              <w:top w:w="95" w:type="dxa"/>
+              <w:bottom w:w="95" w:type="dxa"/>
+              <w:start w:w="90" w:type="dxa"/>
+              <w:end w:w="90" w:type="dxa"/>
+            </w:tcMar>
+          </w:tcPr>
+          <w:p>
+            <w:pPr>
+              <w:spacing w:after="0" w:line="259" w:lineRule="auto"/>
+              <w:jc w:val="center"/>
+            </w:pPr>
+            <w:r>
+              <w:rPr>
+                <w:rFonts w:ascii="Arial" w:hAnsi="Arial" w:eastAsia="PingFang SC"/>
+                <w:b w:val="0"/>
+                <w:color w:val="17212B"/>
+                <w:sz w:val="17"/>
+              </w:rPr>
+              <w:t>193</w:t>
+            </w:r>
+          </w:p>
+        </w:tc>
+      </w:tr>
+      <w:tr>
+        <w:trPr>
+          <w:cantSplit/>
+        </w:trPr>
+        <w:tc>
+          <w:tcPr>
+            <w:tcW w:type="dxa" w:w="2268"/>
+            <w:vAlign w:val="center"/>
+            <w:shd w:fill="F2F6FA"/>
+            <w:tcMar>
+              <w:top w:w="95" w:type="dxa"/>
+              <w:bottom w:w="95" w:type="dxa"/>
+              <w:start w:w="90" w:type="dxa"/>
+              <w:end w:w="90" w:type="dxa"/>
+            </w:tcMar>
+          </w:tcPr>
+          <w:p>
+            <w:pPr>
+              <w:spacing w:after="0" w:line="259" w:lineRule="auto"/>
+              <w:jc w:val="left"/>
+            </w:pPr>
+            <w:r>
+              <w:rPr>
+                <w:rFonts w:ascii="Arial" w:hAnsi="Arial" w:eastAsia="PingFang SC"/>
+                <w:b w:val="0"/>
+                <w:color w:val="17212B"/>
+                <w:sz w:val="17"/>
+              </w:rPr>
+              <w:t>0.60</w:t>
+            </w:r>
+          </w:p>
+        </w:tc>
+        <w:tc>
+          <w:tcPr>
+            <w:tcW w:type="dxa" w:w="3969"/>
+            <w:vAlign w:val="center"/>
+            <w:shd w:fill="F2F6FA"/>
+            <w:tcMar>
+              <w:top w:w="95" w:type="dxa"/>
+              <w:bottom w:w="95" w:type="dxa"/>
+              <w:start w:w="90" w:type="dxa"/>
+              <w:end w:w="90" w:type="dxa"/>
+            </w:tcMar>
+          </w:tcPr>
+          <w:p>
+            <w:pPr>
+              <w:spacing w:after="0" w:line="259" w:lineRule="auto"/>
+              <w:jc w:val="center"/>
+            </w:pPr>
+            <w:r>
+              <w:rPr>
+                <w:rFonts w:ascii="Arial" w:hAnsi="Arial" w:eastAsia="PingFang SC"/>
+                <w:b w:val="0"/>
+                <w:color w:val="17212B"/>
+                <w:sz w:val="17"/>
+              </w:rPr>
+              <w:t>14.55</w:t>
+            </w:r>
+          </w:p>
+        </w:tc>
+        <w:tc>
+          <w:tcPr>
+            <w:tcW w:type="dxa" w:w="3402"/>
+            <w:vAlign w:val="center"/>
+            <w:shd w:fill="F2F6FA"/>
+            <w:tcMar>
+              <w:top w:w="95" w:type="dxa"/>
+              <w:bottom w:w="95" w:type="dxa"/>
+              <w:start w:w="90" w:type="dxa"/>
+              <w:end w:w="90" w:type="dxa"/>
+            </w:tcMar>
+          </w:tcPr>
+          <w:p>
+            <w:pPr>
+              <w:spacing w:after="0" w:line="259" w:lineRule="auto"/>
+              <w:jc w:val="center"/>
+            </w:pPr>
+            <w:r>
+              <w:rPr>
+                <w:rFonts w:ascii="Arial" w:hAnsi="Arial" w:eastAsia="PingFang SC"/>
+                <w:b w:val="0"/>
+                <w:color w:val="17212B"/>
+                <w:sz w:val="17"/>
+              </w:rPr>
+              <w:t>195</w:t>
+            </w:r>
+          </w:p>
+        </w:tc>
+      </w:tr>
+      <w:tr>
+        <w:trPr>
+          <w:cantSplit/>
+        </w:trPr>
+        <w:tc>
+          <w:tcPr>
+            <w:tcW w:type="dxa" w:w="2268"/>
+            <w:vAlign w:val="center"/>
+            <w:tcMar>
+              <w:top w:w="95" w:type="dxa"/>
+              <w:bottom w:w="95" w:type="dxa"/>
+              <w:start w:w="90" w:type="dxa"/>
+              <w:end w:w="90" w:type="dxa"/>
+            </w:tcMar>
+          </w:tcPr>
+          <w:p>
+            <w:pPr>
+              <w:spacing w:after="0" w:line="259" w:lineRule="auto"/>
+              <w:jc w:val="left"/>
+            </w:pPr>
+            <w:r>
+              <w:rPr>
+                <w:rFonts w:ascii="Arial" w:hAnsi="Arial" w:eastAsia="PingFang SC"/>
+                <w:b w:val="0"/>
+                <w:color w:val="17212B"/>
+                <w:sz w:val="17"/>
+              </w:rPr>
+              <w:t>0.70</w:t>
+            </w:r>
+          </w:p>
+        </w:tc>
+        <w:tc>
+          <w:tcPr>
+            <w:tcW w:type="dxa" w:w="3969"/>
+            <w:vAlign w:val="center"/>
+            <w:tcMar>
+              <w:top w:w="95" w:type="dxa"/>
+              <w:bottom w:w="95" w:type="dxa"/>
+              <w:start w:w="90" w:type="dxa"/>
+              <w:end w:w="90" w:type="dxa"/>
+            </w:tcMar>
+          </w:tcPr>
+          <w:p>
+            <w:pPr>
+              <w:spacing w:after="0" w:line="259" w:lineRule="auto"/>
+              <w:jc w:val="center"/>
+            </w:pPr>
+            <w:r>
+              <w:rPr>
+                <w:rFonts w:ascii="Arial" w:hAnsi="Arial" w:eastAsia="PingFang SC"/>
+                <w:b w:val="0"/>
+                <w:color w:val="17212B"/>
+                <w:sz w:val="17"/>
+              </w:rPr>
+              <w:t>14.65</w:t>
+            </w:r>
+          </w:p>
+        </w:tc>
+        <w:tc>
+          <w:tcPr>
+            <w:tcW w:type="dxa" w:w="3402"/>
+            <w:vAlign w:val="center"/>
+            <w:tcMar>
+              <w:top w:w="95" w:type="dxa"/>
+              <w:bottom w:w="95" w:type="dxa"/>
+              <w:start w:w="90" w:type="dxa"/>
+              <w:end w:w="90" w:type="dxa"/>
+            </w:tcMar>
+          </w:tcPr>
+          <w:p>
+            <w:pPr>
+              <w:spacing w:after="0" w:line="259" w:lineRule="auto"/>
+              <w:jc w:val="center"/>
+            </w:pPr>
+            <w:r>
+              <w:rPr>
+                <w:rFonts w:ascii="Arial" w:hAnsi="Arial" w:eastAsia="PingFang SC"/>
+                <w:b w:val="0"/>
+                <w:color w:val="17212B"/>
+                <w:sz w:val="17"/>
+              </w:rPr>
+              <w:t>196</w:t>
+            </w:r>
+          </w:p>
+        </w:tc>
+      </w:tr>
+    </w:tbl>
+    <w:p>
+      <w:pPr>
+        <w:spacing w:after="0"/>
+      </w:pPr>
+    </w:p>
+    <w:p>
+      <w:r>
+        <w:t>在当前前 20 张 validation images 上，NMS IoU threshold 对预测框数量影响较小，而 confidence threshold 更关键。conf=0.40, iou=0.50 可以作为当前 YOLO prediction visualization 的候选设置：它比 conf=0.25 更干净，同时不像 conf=0.50 那样过度减少预测框。</w:t>
+      </w:r>
+    </w:p>
+    <w:p>
+      <w:r>
+        <w:t>限制：该分析只统计预测框数量和平均置信度，没有直接计算 TP、FP、FN。因此不能说明 conf=0.40 是最终最优阈值。最终阈值仍需要结合人工可视化、PR/F1 曲线或验证集 detection metrics 判断。</w:t>
       </w:r>
     </w:p>
     <w:p>
@@ -7154,7 +8311,456 @@
         <w:pStyle w:val="Heading1"/>
       </w:pPr>
       <w:r>
-        <w:t>17 YOLO / U-Net 路线选择标准</w:t>
+        <w:t>17 当前 YOLO 阶段结论与后续规划</w:t>
+      </w:r>
+    </w:p>
+    <w:p>
+      <w:r>
+        <w:t>当前最佳 YOLO 检测 baseline 为 YOLOv8n crop+weed r010。以下为验证集 all-class detection metrics 及模型规模，后续可作为 MobileNetV3-YOLOv8n 轻量化研究的对照基线。</w:t>
+      </w:r>
+    </w:p>
+    <w:tbl>
+      <w:tblPr>
+        <w:tblW w:type="auto" w:w="0"/>
+        <w:jc w:val="center"/>
+        <w:tblLayout w:type="fixed"/>
+        <w:tblLook w:firstColumn="1" w:firstRow="1" w:lastColumn="0" w:lastRow="0" w:noHBand="0" w:noVBand="1" w:val="04A0"/>
+        <w:tblBorders>
+          <w:top w:val="single" w:sz="5" w:color="D9D9D9"/>
+          <w:left w:val="single" w:sz="5" w:color="D9D9D9"/>
+          <w:bottom w:val="single" w:sz="5" w:color="D9D9D9"/>
+          <w:right w:val="single" w:sz="5" w:color="D9D9D9"/>
+          <w:insideH w:val="single" w:sz="5" w:color="D9D9D9"/>
+          <w:insideV w:val="single" w:sz="5" w:color="D9D9D9"/>
+        </w:tblBorders>
+      </w:tblPr>
+      <w:tblGrid>
+        <w:gridCol w:w="1304"/>
+        <w:gridCol w:w="1304"/>
+        <w:gridCol w:w="1247"/>
+        <w:gridCol w:w="1474"/>
+        <w:gridCol w:w="1361"/>
+        <w:gridCol w:w="1304"/>
+        <w:gridCol w:w="1644"/>
+      </w:tblGrid>
+      <w:tr>
+        <w:trPr>
+          <w:tblHeader w:val="true"/>
+          <w:cantSplit/>
+        </w:trPr>
+        <w:tc>
+          <w:tcPr>
+            <w:tcW w:type="dxa" w:w="1304"/>
+            <w:vAlign w:val="center"/>
+            <w:shd w:fill="213B58"/>
+            <w:tcMar>
+              <w:top w:w="95" w:type="dxa"/>
+              <w:bottom w:w="95" w:type="dxa"/>
+              <w:start w:w="90" w:type="dxa"/>
+              <w:end w:w="90" w:type="dxa"/>
+            </w:tcMar>
+          </w:tcPr>
+          <w:p>
+            <w:pPr>
+              <w:spacing w:after="0" w:line="259" w:lineRule="auto"/>
+              <w:jc w:val="left"/>
+            </w:pPr>
+            <w:r>
+              <w:rPr>
+                <w:rFonts w:ascii="Arial" w:hAnsi="Arial" w:eastAsia="PingFang SC"/>
+                <w:b/>
+                <w:color w:val="FFFFFF"/>
+                <w:sz w:val="15"/>
+              </w:rPr>
+              <w:t>Precision</w:t>
+            </w:r>
+          </w:p>
+        </w:tc>
+        <w:tc>
+          <w:tcPr>
+            <w:tcW w:type="dxa" w:w="1304"/>
+            <w:vAlign w:val="center"/>
+            <w:shd w:fill="213B58"/>
+            <w:tcMar>
+              <w:top w:w="95" w:type="dxa"/>
+              <w:bottom w:w="95" w:type="dxa"/>
+              <w:start w:w="90" w:type="dxa"/>
+              <w:end w:w="90" w:type="dxa"/>
+            </w:tcMar>
+          </w:tcPr>
+          <w:p>
+            <w:pPr>
+              <w:spacing w:after="0" w:line="259" w:lineRule="auto"/>
+              <w:jc w:val="center"/>
+            </w:pPr>
+            <w:r>
+              <w:rPr>
+                <w:rFonts w:ascii="Arial" w:hAnsi="Arial" w:eastAsia="PingFang SC"/>
+                <w:b/>
+                <w:color w:val="FFFFFF"/>
+                <w:sz w:val="15"/>
+              </w:rPr>
+              <w:t>Recall</w:t>
+            </w:r>
+          </w:p>
+        </w:tc>
+        <w:tc>
+          <w:tcPr>
+            <w:tcW w:type="dxa" w:w="1247"/>
+            <w:vAlign w:val="center"/>
+            <w:shd w:fill="213B58"/>
+            <w:tcMar>
+              <w:top w:w="95" w:type="dxa"/>
+              <w:bottom w:w="95" w:type="dxa"/>
+              <w:start w:w="90" w:type="dxa"/>
+              <w:end w:w="90" w:type="dxa"/>
+            </w:tcMar>
+          </w:tcPr>
+          <w:p>
+            <w:pPr>
+              <w:spacing w:after="0" w:line="259" w:lineRule="auto"/>
+              <w:jc w:val="center"/>
+            </w:pPr>
+            <w:r>
+              <w:rPr>
+                <w:rFonts w:ascii="Arial" w:hAnsi="Arial" w:eastAsia="PingFang SC"/>
+                <w:b/>
+                <w:color w:val="FFFFFF"/>
+                <w:sz w:val="15"/>
+              </w:rPr>
+              <w:t>mAP50</w:t>
+            </w:r>
+          </w:p>
+        </w:tc>
+        <w:tc>
+          <w:tcPr>
+            <w:tcW w:type="dxa" w:w="1474"/>
+            <w:vAlign w:val="center"/>
+            <w:shd w:fill="213B58"/>
+            <w:tcMar>
+              <w:top w:w="95" w:type="dxa"/>
+              <w:bottom w:w="95" w:type="dxa"/>
+              <w:start w:w="90" w:type="dxa"/>
+              <w:end w:w="90" w:type="dxa"/>
+            </w:tcMar>
+          </w:tcPr>
+          <w:p>
+            <w:pPr>
+              <w:spacing w:after="0" w:line="259" w:lineRule="auto"/>
+              <w:jc w:val="center"/>
+            </w:pPr>
+            <w:r>
+              <w:rPr>
+                <w:rFonts w:ascii="Arial" w:hAnsi="Arial" w:eastAsia="PingFang SC"/>
+                <w:b/>
+                <w:color w:val="FFFFFF"/>
+                <w:sz w:val="15"/>
+              </w:rPr>
+              <w:t>mAP50-95</w:t>
+            </w:r>
+          </w:p>
+        </w:tc>
+        <w:tc>
+          <w:tcPr>
+            <w:tcW w:type="dxa" w:w="1361"/>
+            <w:vAlign w:val="center"/>
+            <w:shd w:fill="213B58"/>
+            <w:tcMar>
+              <w:top w:w="95" w:type="dxa"/>
+              <w:bottom w:w="95" w:type="dxa"/>
+              <w:start w:w="90" w:type="dxa"/>
+              <w:end w:w="90" w:type="dxa"/>
+            </w:tcMar>
+          </w:tcPr>
+          <w:p>
+            <w:pPr>
+              <w:spacing w:after="0" w:line="259" w:lineRule="auto"/>
+              <w:jc w:val="center"/>
+            </w:pPr>
+            <w:r>
+              <w:rPr>
+                <w:rFonts w:ascii="Arial" w:hAnsi="Arial" w:eastAsia="PingFang SC"/>
+                <w:b/>
+                <w:color w:val="FFFFFF"/>
+                <w:sz w:val="15"/>
+              </w:rPr>
+              <w:t>Params</w:t>
+            </w:r>
+          </w:p>
+        </w:tc>
+        <w:tc>
+          <w:tcPr>
+            <w:tcW w:type="dxa" w:w="1304"/>
+            <w:vAlign w:val="center"/>
+            <w:shd w:fill="213B58"/>
+            <w:tcMar>
+              <w:top w:w="95" w:type="dxa"/>
+              <w:bottom w:w="95" w:type="dxa"/>
+              <w:start w:w="90" w:type="dxa"/>
+              <w:end w:w="90" w:type="dxa"/>
+            </w:tcMar>
+          </w:tcPr>
+          <w:p>
+            <w:pPr>
+              <w:spacing w:after="0" w:line="259" w:lineRule="auto"/>
+              <w:jc w:val="center"/>
+            </w:pPr>
+            <w:r>
+              <w:rPr>
+                <w:rFonts w:ascii="Arial" w:hAnsi="Arial" w:eastAsia="PingFang SC"/>
+                <w:b/>
+                <w:color w:val="FFFFFF"/>
+                <w:sz w:val="15"/>
+              </w:rPr>
+              <w:t>GFLOPs</w:t>
+            </w:r>
+          </w:p>
+        </w:tc>
+        <w:tc>
+          <w:tcPr>
+            <w:tcW w:type="dxa" w:w="1644"/>
+            <w:vAlign w:val="center"/>
+            <w:shd w:fill="213B58"/>
+            <w:tcMar>
+              <w:top w:w="95" w:type="dxa"/>
+              <w:bottom w:w="95" w:type="dxa"/>
+              <w:start w:w="90" w:type="dxa"/>
+              <w:end w:w="90" w:type="dxa"/>
+            </w:tcMar>
+          </w:tcPr>
+          <w:p>
+            <w:pPr>
+              <w:spacing w:after="0" w:line="259" w:lineRule="auto"/>
+              <w:jc w:val="center"/>
+            </w:pPr>
+            <w:r>
+              <w:rPr>
+                <w:rFonts w:ascii="Arial" w:hAnsi="Arial" w:eastAsia="PingFang SC"/>
+                <w:b/>
+                <w:color w:val="FFFFFF"/>
+                <w:sz w:val="15"/>
+              </w:rPr>
+              <w:t>Model size</w:t>
+            </w:r>
+          </w:p>
+        </w:tc>
+      </w:tr>
+      <w:tr>
+        <w:trPr>
+          <w:cantSplit/>
+        </w:trPr>
+        <w:tc>
+          <w:tcPr>
+            <w:tcW w:type="dxa" w:w="1304"/>
+            <w:vAlign w:val="center"/>
+            <w:tcMar>
+              <w:top w:w="95" w:type="dxa"/>
+              <w:bottom w:w="95" w:type="dxa"/>
+              <w:start w:w="90" w:type="dxa"/>
+              <w:end w:w="90" w:type="dxa"/>
+            </w:tcMar>
+          </w:tcPr>
+          <w:p>
+            <w:pPr>
+              <w:spacing w:after="0" w:line="259" w:lineRule="auto"/>
+              <w:jc w:val="left"/>
+            </w:pPr>
+            <w:r>
+              <w:rPr>
+                <w:rFonts w:ascii="Arial" w:hAnsi="Arial" w:eastAsia="PingFang SC"/>
+                <w:b w:val="0"/>
+                <w:color w:val="17212B"/>
+                <w:sz w:val="15"/>
+              </w:rPr>
+              <w:t>0.50539</w:t>
+            </w:r>
+          </w:p>
+        </w:tc>
+        <w:tc>
+          <w:tcPr>
+            <w:tcW w:type="dxa" w:w="1304"/>
+            <w:vAlign w:val="center"/>
+            <w:tcMar>
+              <w:top w:w="95" w:type="dxa"/>
+              <w:bottom w:w="95" w:type="dxa"/>
+              <w:start w:w="90" w:type="dxa"/>
+              <w:end w:w="90" w:type="dxa"/>
+            </w:tcMar>
+          </w:tcPr>
+          <w:p>
+            <w:pPr>
+              <w:spacing w:after="0" w:line="259" w:lineRule="auto"/>
+              <w:jc w:val="center"/>
+            </w:pPr>
+            <w:r>
+              <w:rPr>
+                <w:rFonts w:ascii="Arial" w:hAnsi="Arial" w:eastAsia="PingFang SC"/>
+                <w:b w:val="0"/>
+                <w:color w:val="17212B"/>
+                <w:sz w:val="15"/>
+              </w:rPr>
+              <w:t>0.58950</w:t>
+            </w:r>
+          </w:p>
+        </w:tc>
+        <w:tc>
+          <w:tcPr>
+            <w:tcW w:type="dxa" w:w="1247"/>
+            <w:vAlign w:val="center"/>
+            <w:tcMar>
+              <w:top w:w="95" w:type="dxa"/>
+              <w:bottom w:w="95" w:type="dxa"/>
+              <w:start w:w="90" w:type="dxa"/>
+              <w:end w:w="90" w:type="dxa"/>
+            </w:tcMar>
+          </w:tcPr>
+          <w:p>
+            <w:pPr>
+              <w:spacing w:after="0" w:line="259" w:lineRule="auto"/>
+              <w:jc w:val="center"/>
+            </w:pPr>
+            <w:r>
+              <w:rPr>
+                <w:rFonts w:ascii="Arial" w:hAnsi="Arial" w:eastAsia="PingFang SC"/>
+                <w:b w:val="0"/>
+                <w:color w:val="17212B"/>
+                <w:sz w:val="15"/>
+              </w:rPr>
+              <w:t>0.53062</w:t>
+            </w:r>
+          </w:p>
+        </w:tc>
+        <w:tc>
+          <w:tcPr>
+            <w:tcW w:type="dxa" w:w="1474"/>
+            <w:vAlign w:val="center"/>
+            <w:tcMar>
+              <w:top w:w="95" w:type="dxa"/>
+              <w:bottom w:w="95" w:type="dxa"/>
+              <w:start w:w="90" w:type="dxa"/>
+              <w:end w:w="90" w:type="dxa"/>
+            </w:tcMar>
+          </w:tcPr>
+          <w:p>
+            <w:pPr>
+              <w:spacing w:after="0" w:line="259" w:lineRule="auto"/>
+              <w:jc w:val="center"/>
+            </w:pPr>
+            <w:r>
+              <w:rPr>
+                <w:rFonts w:ascii="Arial" w:hAnsi="Arial" w:eastAsia="PingFang SC"/>
+                <w:b w:val="0"/>
+                <w:color w:val="17212B"/>
+                <w:sz w:val="15"/>
+              </w:rPr>
+              <w:t>0.29557</w:t>
+            </w:r>
+          </w:p>
+        </w:tc>
+        <w:tc>
+          <w:tcPr>
+            <w:tcW w:type="dxa" w:w="1361"/>
+            <w:vAlign w:val="center"/>
+            <w:tcMar>
+              <w:top w:w="95" w:type="dxa"/>
+              <w:bottom w:w="95" w:type="dxa"/>
+              <w:start w:w="90" w:type="dxa"/>
+              <w:end w:w="90" w:type="dxa"/>
+            </w:tcMar>
+          </w:tcPr>
+          <w:p>
+            <w:pPr>
+              <w:spacing w:after="0" w:line="259" w:lineRule="auto"/>
+              <w:jc w:val="center"/>
+            </w:pPr>
+            <w:r>
+              <w:rPr>
+                <w:rFonts w:ascii="Arial" w:hAnsi="Arial" w:eastAsia="PingFang SC"/>
+                <w:b w:val="0"/>
+                <w:color w:val="17212B"/>
+                <w:sz w:val="15"/>
+              </w:rPr>
+              <w:t>≈ 3.01M</w:t>
+            </w:r>
+          </w:p>
+        </w:tc>
+        <w:tc>
+          <w:tcPr>
+            <w:tcW w:type="dxa" w:w="1304"/>
+            <w:vAlign w:val="center"/>
+            <w:tcMar>
+              <w:top w:w="95" w:type="dxa"/>
+              <w:bottom w:w="95" w:type="dxa"/>
+              <w:start w:w="90" w:type="dxa"/>
+              <w:end w:w="90" w:type="dxa"/>
+            </w:tcMar>
+          </w:tcPr>
+          <w:p>
+            <w:pPr>
+              <w:spacing w:after="0" w:line="259" w:lineRule="auto"/>
+              <w:jc w:val="center"/>
+            </w:pPr>
+            <w:r>
+              <w:rPr>
+                <w:rFonts w:ascii="Arial" w:hAnsi="Arial" w:eastAsia="PingFang SC"/>
+                <w:b w:val="0"/>
+                <w:color w:val="17212B"/>
+                <w:sz w:val="15"/>
+              </w:rPr>
+              <w:t>≈ 4.61</w:t>
+            </w:r>
+          </w:p>
+        </w:tc>
+        <w:tc>
+          <w:tcPr>
+            <w:tcW w:type="dxa" w:w="1644"/>
+            <w:vAlign w:val="center"/>
+            <w:tcMar>
+              <w:top w:w="95" w:type="dxa"/>
+              <w:bottom w:w="95" w:type="dxa"/>
+              <w:start w:w="90" w:type="dxa"/>
+              <w:end w:w="90" w:type="dxa"/>
+            </w:tcMar>
+          </w:tcPr>
+          <w:p>
+            <w:pPr>
+              <w:spacing w:after="0" w:line="259" w:lineRule="auto"/>
+              <w:jc w:val="center"/>
+            </w:pPr>
+            <w:r>
+              <w:rPr>
+                <w:rFonts w:ascii="Arial" w:hAnsi="Arial" w:eastAsia="PingFang SC"/>
+                <w:b w:val="0"/>
+                <w:color w:val="17212B"/>
+                <w:sz w:val="15"/>
+              </w:rPr>
+              <w:t>≈ 6.21 MB</w:t>
+            </w:r>
+          </w:p>
+        </w:tc>
+      </w:tr>
+    </w:tbl>
+    <w:p>
+      <w:pPr>
+        <w:spacing w:after="0"/>
+      </w:pPr>
+    </w:p>
+    <w:p>
+      <w:r>
+        <w:t>检测支线已完成 bbox 分布统计、r020/r010 大框过滤对比、weed-only 对照、prediction visualization 和 post-processing threshold analysis。WeedMap common split 中 dense vegetation samples 占多数，因此项目主线仍是 MobileNetV2ShallowUNet + boundary weighted CE r5_w4 语义分割：Pixel accuracy 96.98% ± 0.24%，Mean IoU 76.71% ± 0.55%，Weed IoU 59.82% ± 0.64%。YOLO 检测支线作为 sparse vegetation scenarios 的候选路线，也是后续 MobileNetV3-YOLOv8n 轻量化检测研究的基础。</w:t>
+      </w:r>
+    </w:p>
+    <w:p>
+      <w:r>
+        <w:t>后续可研究 MobileNetV3-YOLOv8n 轻量化变体：用 MobileNetV3-style backbone 改造 YOLOv8n 的特征提取部分，保留 YOLOv8 Neck、Detection Head 和 anchor-free detection framework。该变体目前尚未实现；后续需在一致条件下对比检测指标、参数量、GFLOPs、模型大小和推理速度。</w:t>
+      </w:r>
+    </w:p>
+    <w:p>
+      <w:pPr>
+        <w:pStyle w:val="Heading1"/>
+      </w:pPr>
+      <w:r>
+        <w:t>18 YOLO / U-Net 路线选择标准</w:t>
       </w:r>
     </w:p>
     <w:p>
@@ -7549,7 +9155,7 @@
         <w:pStyle w:val="Heading1"/>
       </w:pPr>
       <w:r>
-        <w:t>18 给老师汇报用总结</w:t>
+        <w:t>19 给老师汇报用总结</w:t>
       </w:r>
     </w:p>
     <w:p>
@@ -7569,7 +9175,7 @@
     </w:p>
     <w:p>
       <w:r>
-        <w:t>YOLO 检测支线现已完成 bbox 统计、r020/r010 大框过滤实验、weed-only 对照以及同一验证样本的预测可视化。r010 相比 r020 的 weed mAP 略升但 recall 略降，weed-only 在当前设置下也未超过 crop+weed；因此暂选 crop+weed r010 作为 YOLOv8n 候选 baseline。调整推理 conf 阈值可减少低置信度框，但仍需权衡漏检。后续先稳定并完整记录 YOLOv8n 指标与计算成本，再考虑 MobileNetV3-style backbone 轻量化。语义分割仍是当前项目主线。</w:t>
+        <w:t>YOLO 检测支线现已完成 bbox 统计、r020/r010 大框过滤实验、weed-only 对照及预测可视化。当前最佳 YOLOv8n crop+weed r010 baseline 的验证集 all-class Precision 为 0.50539、Recall 为 0.58950、mAP50 为 0.53062、mAP50-95 为 0.29557；参数量约 3.01M、GFLOPs 约 4.61、模型大小约 6.21 MB。新增的前 20 张验证图像阈值分析表明，confidence threshold 比 NMS IoU threshold 更影响预测框数量；conf=0.40、iou=0.50 可作为当前可视化候选，但最终阈值需要结合 TP、FP、FN 相关评估。后续可研究 MobileNetV3-YOLOv8n 轻量化检测；在 dense 样本占多数的 common split 上，语义分割仍是当前项目主线。</w:t>
       </w:r>
     </w:p>
     <w:sectPr>

</xml_diff>

<commit_message>
Update reports with latest YOLO and VCR router results
</commit_message>
<xml_diff>
--- a/reports/weedmap_progress_report.docx
+++ b/reports/weedmap_progress_report.docx
@@ -12,7 +12,7 @@
     </w:p>
     <w:p>
       <w:r>
-        <w:t>面向导师的阶段性汇报。报告总结真实 WeedMap 数据处理、统一样本对照、三 seed 语义分割实验、VCR 场景分析，以及 YOLOv8n 检测支线和推理后处理阈值分析。当前语义分割主线最佳设置为 MobileNetV2ShallowUNet 方案 A + boundary weighted CE r5_w4：验证集 Pixel accuracy 96.98% ± 0.24%，Mean IoU 76.71% ± 0.55%，Weed IoU 59.82% ± 0.64%。YOLO 当前最佳 baseline 为 crop+weed r010，作为稀疏植被场景的候选路线。</w:t>
+        <w:t>面向导师的阶段性汇报。报告总结真实 WeedMap 数据处理、统一样本对照、三 seed 语义分割实验、VCR regression attention router，以及 YOLO 检测数据构建、后处理阈值和 MobileNetV3-Small-YOLOv8 轻量化实验。当前语义分割主线最佳设置为 MobileNetV2ShallowUNet 方案 A + boundary weighted CE r5_w4：验证集 Pixel accuracy 96.98% ± 0.24%，Mean IoU 76.71% ± 0.55%，Weed IoU 59.82% ± 0.64%。YOLOv8n crop+weed r010 仍是检测基线；MobileNetV3 变体减小了参数量和 GFLOPs，但精度及当前 CPU 延迟尚未超过该基线。</w:t>
       </w:r>
     </w:p>
     <w:p>
@@ -5632,7 +5632,412 @@
         <w:pStyle w:val="Heading1"/>
       </w:pPr>
       <w:r>
-        <w:t>11 YOLO detection pipeline 的两个阶段</w:t>
+        <w:t>11 VCR Regression Attention Router</w:t>
+      </w:r>
+    </w:p>
+    <w:p>
+      <w:r>
+        <w:t>目的：在 weed recognition pipeline 前端，根据场景植被覆盖程度选择后续分支。模型不直接做三分类，而是先从原始 G、R、RE、NIR 四个波段回归连续 VCR，再按 predicted VCR &lt; 0.20、0.20 至 0.30、&gt; 0.30 分别路由到 sparse YOLO、transition 双模型或人工确认、dense semantic segmentation。不输入 NDVI，因为 VCR 标签由 NDVI threshold 生成，直接输入 NDVI 可能只是复现标签规则。</w:t>
+      </w:r>
+    </w:p>
+    <w:p>
+      <w:r>
+        <w:t>数据准备使用现有 VCR summary，并生成 outputs/vcr_regression_samples.csv；454 条样本全部校验通过。由于 sparse、transition、dense 仅有 13、9、432 张，直接三分类容易全部预测 dense 并获得虚高 accuracy，因此采用连续 VCR regression。</w:t>
+      </w:r>
+    </w:p>
+    <w:tbl>
+      <w:tblPr>
+        <w:tblW w:type="auto" w:w="0"/>
+        <w:jc w:val="center"/>
+        <w:tblLayout w:type="fixed"/>
+        <w:tblLook w:firstColumn="1" w:firstRow="1" w:lastColumn="0" w:lastRow="0" w:noHBand="0" w:noVBand="1" w:val="04A0"/>
+        <w:tblBorders>
+          <w:top w:val="single" w:sz="5" w:color="D9D9D9"/>
+          <w:left w:val="single" w:sz="5" w:color="D9D9D9"/>
+          <w:bottom w:val="single" w:sz="5" w:color="D9D9D9"/>
+          <w:right w:val="single" w:sz="5" w:color="D9D9D9"/>
+          <w:insideH w:val="single" w:sz="5" w:color="D9D9D9"/>
+          <w:insideV w:val="single" w:sz="5" w:color="D9D9D9"/>
+        </w:tblBorders>
+      </w:tblPr>
+      <w:tblGrid>
+        <w:gridCol w:w="2268"/>
+        <w:gridCol w:w="2835"/>
+        <w:gridCol w:w="4535"/>
+      </w:tblGrid>
+      <w:tr>
+        <w:trPr>
+          <w:tblHeader w:val="true"/>
+          <w:cantSplit/>
+        </w:trPr>
+        <w:tc>
+          <w:tcPr>
+            <w:tcW w:type="dxa" w:w="2268"/>
+            <w:vAlign w:val="center"/>
+            <w:shd w:fill="213B58"/>
+            <w:tcMar>
+              <w:top w:w="95" w:type="dxa"/>
+              <w:bottom w:w="95" w:type="dxa"/>
+              <w:start w:w="90" w:type="dxa"/>
+              <w:end w:w="90" w:type="dxa"/>
+            </w:tcMar>
+          </w:tcPr>
+          <w:p>
+            <w:pPr>
+              <w:spacing w:after="0" w:line="259" w:lineRule="auto"/>
+              <w:jc w:val="left"/>
+            </w:pPr>
+            <w:r>
+              <w:rPr>
+                <w:rFonts w:ascii="Arial" w:hAnsi="Arial" w:eastAsia="PingFang SC"/>
+                <w:b/>
+                <w:color w:val="FFFFFF"/>
+                <w:sz w:val="16"/>
+              </w:rPr>
+              <w:t>模型</w:t>
+            </w:r>
+          </w:p>
+        </w:tc>
+        <w:tc>
+          <w:tcPr>
+            <w:tcW w:type="dxa" w:w="2835"/>
+            <w:vAlign w:val="center"/>
+            <w:shd w:fill="213B58"/>
+            <w:tcMar>
+              <w:top w:w="95" w:type="dxa"/>
+              <w:bottom w:w="95" w:type="dxa"/>
+              <w:start w:w="90" w:type="dxa"/>
+              <w:end w:w="90" w:type="dxa"/>
+            </w:tcMar>
+          </w:tcPr>
+          <w:p>
+            <w:pPr>
+              <w:spacing w:after="0" w:line="259" w:lineRule="auto"/>
+              <w:jc w:val="center"/>
+            </w:pPr>
+            <w:r>
+              <w:rPr>
+                <w:rFonts w:ascii="Arial" w:hAnsi="Arial" w:eastAsia="PingFang SC"/>
+                <w:b/>
+                <w:color w:val="FFFFFF"/>
+                <w:sz w:val="16"/>
+              </w:rPr>
+              <w:t>正式设置</w:t>
+            </w:r>
+          </w:p>
+        </w:tc>
+        <w:tc>
+          <w:tcPr>
+            <w:tcW w:type="dxa" w:w="4535"/>
+            <w:vAlign w:val="center"/>
+            <w:shd w:fill="213B58"/>
+            <w:tcMar>
+              <w:top w:w="95" w:type="dxa"/>
+              <w:bottom w:w="95" w:type="dxa"/>
+              <w:start w:w="90" w:type="dxa"/>
+              <w:end w:w="90" w:type="dxa"/>
+            </w:tcMar>
+          </w:tcPr>
+          <w:p>
+            <w:pPr>
+              <w:spacing w:after="0" w:line="259" w:lineRule="auto"/>
+              <w:jc w:val="center"/>
+            </w:pPr>
+            <w:r>
+              <w:rPr>
+                <w:rFonts w:ascii="Arial" w:hAnsi="Arial" w:eastAsia="PingFang SC"/>
+                <w:b/>
+                <w:color w:val="FFFFFF"/>
+                <w:sz w:val="16"/>
+              </w:rPr>
+              <w:t>关键结果</w:t>
+            </w:r>
+          </w:p>
+        </w:tc>
+      </w:tr>
+      <w:tr>
+        <w:trPr>
+          <w:cantSplit/>
+        </w:trPr>
+        <w:tc>
+          <w:tcPr>
+            <w:tcW w:type="dxa" w:w="2268"/>
+            <w:vAlign w:val="center"/>
+            <w:tcMar>
+              <w:top w:w="95" w:type="dxa"/>
+              <w:bottom w:w="95" w:type="dxa"/>
+              <w:start w:w="90" w:type="dxa"/>
+              <w:end w:w="90" w:type="dxa"/>
+            </w:tcMar>
+          </w:tcPr>
+          <w:p>
+            <w:pPr>
+              <w:spacing w:after="0" w:line="259" w:lineRule="auto"/>
+              <w:jc w:val="left"/>
+            </w:pPr>
+            <w:r>
+              <w:rPr>
+                <w:rFonts w:ascii="Arial" w:hAnsi="Arial" w:eastAsia="PingFang SC"/>
+                <w:b w:val="0"/>
+                <w:color w:val="17212B"/>
+                <w:sz w:val="16"/>
+              </w:rPr>
+              <w:t>Tiny CNN</w:t>
+            </w:r>
+          </w:p>
+        </w:tc>
+        <w:tc>
+          <w:tcPr>
+            <w:tcW w:type="dxa" w:w="2835"/>
+            <w:vAlign w:val="center"/>
+            <w:tcMar>
+              <w:top w:w="95" w:type="dxa"/>
+              <w:bottom w:w="95" w:type="dxa"/>
+              <w:start w:w="90" w:type="dxa"/>
+              <w:end w:w="90" w:type="dxa"/>
+            </w:tcMar>
+          </w:tcPr>
+          <w:p>
+            <w:pPr>
+              <w:spacing w:after="0" w:line="259" w:lineRule="auto"/>
+              <w:jc w:val="center"/>
+            </w:pPr>
+            <w:r>
+              <w:rPr>
+                <w:rFonts w:ascii="Arial" w:hAnsi="Arial" w:eastAsia="PingFang SC"/>
+                <w:b w:val="0"/>
+                <w:color w:val="17212B"/>
+                <w:sz w:val="16"/>
+              </w:rPr>
+              <w:t>30 epochs × 3 seeds</w:t>
+            </w:r>
+          </w:p>
+        </w:tc>
+        <w:tc>
+          <w:tcPr>
+            <w:tcW w:type="dxa" w:w="4535"/>
+            <w:vAlign w:val="center"/>
+            <w:tcMar>
+              <w:top w:w="95" w:type="dxa"/>
+              <w:bottom w:w="95" w:type="dxa"/>
+              <w:start w:w="90" w:type="dxa"/>
+              <w:end w:w="90" w:type="dxa"/>
+            </w:tcMar>
+          </w:tcPr>
+          <w:p>
+            <w:pPr>
+              <w:spacing w:after="0" w:line="259" w:lineRule="auto"/>
+              <w:jc w:val="center"/>
+            </w:pPr>
+            <w:r>
+              <w:rPr>
+                <w:rFonts w:ascii="Arial" w:hAnsi="Arial" w:eastAsia="PingFang SC"/>
+                <w:b w:val="0"/>
+                <w:color w:val="17212B"/>
+                <w:sz w:val="16"/>
+              </w:rPr>
+              <w:t>MAE 0.1014 ± 0.0101</w:t>
+            </w:r>
+          </w:p>
+        </w:tc>
+      </w:tr>
+      <w:tr>
+        <w:trPr>
+          <w:cantSplit/>
+        </w:trPr>
+        <w:tc>
+          <w:tcPr>
+            <w:tcW w:type="dxa" w:w="2268"/>
+            <w:vAlign w:val="center"/>
+            <w:shd w:fill="F2F6FA"/>
+            <w:tcMar>
+              <w:top w:w="95" w:type="dxa"/>
+              <w:bottom w:w="95" w:type="dxa"/>
+              <w:start w:w="90" w:type="dxa"/>
+              <w:end w:w="90" w:type="dxa"/>
+            </w:tcMar>
+          </w:tcPr>
+          <w:p>
+            <w:pPr>
+              <w:spacing w:after="0" w:line="259" w:lineRule="auto"/>
+              <w:jc w:val="left"/>
+            </w:pPr>
+            <w:r>
+              <w:rPr>
+                <w:rFonts w:ascii="Arial" w:hAnsi="Arial" w:eastAsia="PingFang SC"/>
+                <w:b w:val="0"/>
+                <w:color w:val="17212B"/>
+                <w:sz w:val="16"/>
+              </w:rPr>
+              <w:t>SE-Tiny CNN</w:t>
+            </w:r>
+          </w:p>
+        </w:tc>
+        <w:tc>
+          <w:tcPr>
+            <w:tcW w:type="dxa" w:w="2835"/>
+            <w:vAlign w:val="center"/>
+            <w:shd w:fill="F2F6FA"/>
+            <w:tcMar>
+              <w:top w:w="95" w:type="dxa"/>
+              <w:bottom w:w="95" w:type="dxa"/>
+              <w:start w:w="90" w:type="dxa"/>
+              <w:end w:w="90" w:type="dxa"/>
+            </w:tcMar>
+          </w:tcPr>
+          <w:p>
+            <w:pPr>
+              <w:spacing w:after="0" w:line="259" w:lineRule="auto"/>
+              <w:jc w:val="center"/>
+            </w:pPr>
+            <w:r>
+              <w:rPr>
+                <w:rFonts w:ascii="Arial" w:hAnsi="Arial" w:eastAsia="PingFang SC"/>
+                <w:b w:val="0"/>
+                <w:color w:val="17212B"/>
+                <w:sz w:val="16"/>
+              </w:rPr>
+              <w:t>30 epochs × 3 seeds</w:t>
+            </w:r>
+          </w:p>
+        </w:tc>
+        <w:tc>
+          <w:tcPr>
+            <w:tcW w:type="dxa" w:w="4535"/>
+            <w:vAlign w:val="center"/>
+            <w:shd w:fill="F2F6FA"/>
+            <w:tcMar>
+              <w:top w:w="95" w:type="dxa"/>
+              <w:bottom w:w="95" w:type="dxa"/>
+              <w:start w:w="90" w:type="dxa"/>
+              <w:end w:w="90" w:type="dxa"/>
+            </w:tcMar>
+          </w:tcPr>
+          <w:p>
+            <w:pPr>
+              <w:spacing w:after="0" w:line="259" w:lineRule="auto"/>
+              <w:jc w:val="center"/>
+            </w:pPr>
+            <w:r>
+              <w:rPr>
+                <w:rFonts w:ascii="Arial" w:hAnsi="Arial" w:eastAsia="PingFang SC"/>
+                <w:b w:val="0"/>
+                <w:color w:val="17212B"/>
+                <w:sz w:val="16"/>
+              </w:rPr>
+              <w:t>MAE 0.1055 ± 0.0044</w:t>
+            </w:r>
+          </w:p>
+        </w:tc>
+      </w:tr>
+      <w:tr>
+        <w:trPr>
+          <w:cantSplit/>
+        </w:trPr>
+        <w:tc>
+          <w:tcPr>
+            <w:tcW w:type="dxa" w:w="2268"/>
+            <w:vAlign w:val="center"/>
+            <w:tcMar>
+              <w:top w:w="95" w:type="dxa"/>
+              <w:bottom w:w="95" w:type="dxa"/>
+              <w:start w:w="90" w:type="dxa"/>
+              <w:end w:w="90" w:type="dxa"/>
+            </w:tcMar>
+          </w:tcPr>
+          <w:p>
+            <w:pPr>
+              <w:spacing w:after="0" w:line="259" w:lineRule="auto"/>
+              <w:jc w:val="left"/>
+            </w:pPr>
+            <w:r>
+              <w:rPr>
+                <w:rFonts w:ascii="Arial" w:hAnsi="Arial" w:eastAsia="PingFang SC"/>
+                <w:b w:val="0"/>
+                <w:color w:val="17212B"/>
+                <w:sz w:val="16"/>
+              </w:rPr>
+              <w:t>CBAM-Tiny CNN</w:t>
+            </w:r>
+          </w:p>
+        </w:tc>
+        <w:tc>
+          <w:tcPr>
+            <w:tcW w:type="dxa" w:w="2835"/>
+            <w:vAlign w:val="center"/>
+            <w:tcMar>
+              <w:top w:w="95" w:type="dxa"/>
+              <w:bottom w:w="95" w:type="dxa"/>
+              <w:start w:w="90" w:type="dxa"/>
+              <w:end w:w="90" w:type="dxa"/>
+            </w:tcMar>
+          </w:tcPr>
+          <w:p>
+            <w:pPr>
+              <w:spacing w:after="0" w:line="259" w:lineRule="auto"/>
+              <w:jc w:val="center"/>
+            </w:pPr>
+            <w:r>
+              <w:rPr>
+                <w:rFonts w:ascii="Arial" w:hAnsi="Arial" w:eastAsia="PingFang SC"/>
+                <w:b w:val="0"/>
+                <w:color w:val="17212B"/>
+                <w:sz w:val="16"/>
+              </w:rPr>
+              <w:t>30 epochs × 3 seeds</w:t>
+            </w:r>
+          </w:p>
+        </w:tc>
+        <w:tc>
+          <w:tcPr>
+            <w:tcW w:type="dxa" w:w="4535"/>
+            <w:vAlign w:val="center"/>
+            <w:tcMar>
+              <w:top w:w="95" w:type="dxa"/>
+              <w:bottom w:w="95" w:type="dxa"/>
+              <w:start w:w="90" w:type="dxa"/>
+              <w:end w:w="90" w:type="dxa"/>
+            </w:tcMar>
+          </w:tcPr>
+          <w:p>
+            <w:pPr>
+              <w:spacing w:after="0" w:line="259" w:lineRule="auto"/>
+              <w:jc w:val="center"/>
+            </w:pPr>
+            <w:r>
+              <w:rPr>
+                <w:rFonts w:ascii="Arial" w:hAnsi="Arial" w:eastAsia="PingFang SC"/>
+                <w:b w:val="0"/>
+                <w:color w:val="17212B"/>
+                <w:sz w:val="16"/>
+              </w:rPr>
+              <w:t>MAE 0.0923 ± 0.0133；sparse recall 0.1111 ± 0.1925</w:t>
+            </w:r>
+          </w:p>
+        </w:tc>
+      </w:tr>
+    </w:tbl>
+    <w:p>
+      <w:pPr>
+        <w:spacing w:after="0"/>
+      </w:pPr>
+    </w:p>
+    <w:p>
+      <w:r>
+        <w:t>正式实验实际使用 Huber loss（delta=0.1），各 run 按 validation MAE 选择 best checkpoint。CBAM-Tiny CNN 的平均 MAE 最低，说明 attention 可能有助于学习植被覆盖程度；但 non-dense 样本太少，validation sparse 仅 3 张，每错一张都会造成很大波动，且特定 subset 与相邻帧可能带来空间数据泄漏风险。</w:t>
+      </w:r>
+    </w:p>
+    <w:p>
+      <w:r>
+        <w:t>结论：VCR regression attention router 的探索性实验有效完成，但 sparse recall 仍然不足，当前不能替代 NDVI-VCR 零训练规则，也不能作为部署模块。项目主线仍是 dense vegetation 场景下的 MobileNetV2ShallowUNet + boundary weighted CE r5_w4 语义分割；YOLO 是 sparse 场景候选路线，VCR router 的长期作用是连接两条分支。后续需增加 sparse / transition 样本，并采用 repeated stratified cross-validation 和 subset-level holdout。</w:t>
+      </w:r>
+    </w:p>
+    <w:p>
+      <w:pPr>
+        <w:pStyle w:val="Heading1"/>
+      </w:pPr>
+      <w:r>
+        <w:t>12 YOLO detection pipeline 的两个阶段</w:t>
       </w:r>
     </w:p>
     <w:p>
@@ -5650,7 +6055,7 @@
     </w:p>
     <w:p>
       <w:r>
-        <w:t>这一阶段的 filtering 是数据集构建阶段的 bbox 清洗：先统计并可视化连通域候选框，再根据 bbox filtering rules 从 semantic mask 自动生成较合理的 YOLO 训练标签。</w:t>
+        <w:t>WeedMap 原始标签没有 instance identity。connected component 只能近似生成 bbox：稀疏场景中的独立小 component 可能接近单株或单簇；密集粘连区域的大 component 可能包含多株植株或片状杂草，不能直接解释为单株。这一阶段的 filtering 是训练标签构建阶段的 bbox 清洗，应结合 width、height、area、aspect ratio 和 bbox/image area ratio 分布及框叠加可视化确定规则，避免误删真实小 weed。</w:t>
       </w:r>
     </w:p>
     <w:p>
@@ -5668,7 +6073,7 @@
     </w:p>
     <w:p>
       <w:r>
-        <w:t>YOLO 网络输出候选框、类别和置信度；confidence filtering 去掉低置信度预测框，NMS 去掉高度重叠的重复预测框。两者属于 inference post-processing，不属于 backbone，也不同于 A 阶段用于生成训练标签的 dataset bbox filtering。</w:t>
+        <w:t>YOLO 网络输出候选框、类别和置信度；confidence filtering 去掉低置信度预测框，NMS 去掉高度重叠的重复预测框。两者属于 inference post-processing，不属于 backbone，也不同于 A 阶段用于生成训练标签的 dataset bbox filtering。当前 YOLOv8n 验证的是 mask → connected components → bbox → detection dataset → training/inference 流程，不是 MobileNetV3-YOLOv3 复现。</w:t>
       </w:r>
     </w:p>
     <w:p>
@@ -5676,7 +6081,7 @@
         <w:pStyle w:val="Heading1"/>
       </w:pPr>
       <w:r>
-        <w:t>12 YOLO bbox 分布与标签局限</w:t>
+        <w:t>13 YOLO bbox 分布与标签局限</w:t>
       </w:r>
     </w:p>
     <w:p>
@@ -6072,7 +6477,7 @@
     </w:p>
     <w:p>
       <w:r>
-        <w:t>连通域框只是实例目标的近似标签。稀疏场景中的独立小框可能接近单株或单簇；大面积粘连 component 可能包含多株植物或片状杂草，不能直接解释为单株植物。bbox 分布统计和可视化用于判断数据集阶段的过滤规则。</w:t>
+        <w:t>统计由 analyze_yolo_bbox_statistics.py 生成，用于评估 min-area、max-area-ratio、min-width 和 min-height 等规则。连通域框只是实例目标的近似标签；bbox 分布统计与可视化用于判断数据集阶段的过滤规则，不会自动修改标签，也不能替代人工 instance annotations。</w:t>
       </w:r>
     </w:p>
     <w:p>
@@ -6080,12 +6485,12 @@
         <w:pStyle w:val="Heading1"/>
       </w:pPr>
       <w:r>
-        <w:t>13 YOLOv8n r020 与 r010 大框过滤对比</w:t>
+        <w:t>14 YOLOv8n bbox filtering 对比</w:t>
       </w:r>
     </w:p>
     <w:p>
       <w:r>
-        <w:t>两组 crop+weed YOLOv8n 实验仅调整数据集构建阶段的 max-box-area-ratio：r020 为 0.20，r010 为 0.10。下表列出验证集 weed 类指标。</w:t>
+        <w:t>r020、r015、r010 均使用 YOLOv8n、5 epochs、imgsz=480、batch=4、device=mps、seed=0，以及相同的 363/91 train/validation images。仅调整数据集构建阶段的 max-box-area-ratio；min-area=80、min-box-width=6、min-box-height=6 保持不变。</w:t>
       </w:r>
     </w:p>
     <w:tbl>
@@ -6105,11 +6510,11 @@
       </w:tblPr>
       <w:tblGrid>
         <w:gridCol w:w="1361"/>
-        <w:gridCol w:w="1587"/>
         <w:gridCol w:w="1361"/>
-        <w:gridCol w:w="1361"/>
-        <w:gridCol w:w="1928"/>
-        <w:gridCol w:w="2041"/>
+        <w:gridCol w:w="1417"/>
+        <w:gridCol w:w="1417"/>
+        <w:gridCol w:w="1757"/>
+        <w:gridCol w:w="2268"/>
       </w:tblGrid>
       <w:tr>
         <w:trPr>
@@ -6138,7 +6543,7 @@
                 <w:rFonts w:ascii="Arial" w:hAnsi="Arial" w:eastAsia="PingFang SC"/>
                 <w:b/>
                 <w:color w:val="FFFFFF"/>
-                <w:sz w:val="16"/>
+                <w:sz w:val="15"/>
               </w:rPr>
               <w:t>设置</w:t>
             </w:r>
@@ -6146,7 +6551,7 @@
         </w:tc>
         <w:tc>
           <w:tcPr>
-            <w:tcW w:type="dxa" w:w="1587"/>
+            <w:tcW w:type="dxa" w:w="1361"/>
             <w:vAlign w:val="center"/>
             <w:shd w:fill="213B58"/>
             <w:tcMar>
@@ -6166,15 +6571,15 @@
                 <w:rFonts w:ascii="Arial" w:hAnsi="Arial" w:eastAsia="PingFang SC"/>
                 <w:b/>
                 <w:color w:val="FFFFFF"/>
-                <w:sz w:val="16"/>
-              </w:rPr>
-              <w:t>Max area ratio</w:t>
-            </w:r>
-          </w:p>
-        </w:tc>
-        <w:tc>
-          <w:tcPr>
-            <w:tcW w:type="dxa" w:w="1361"/>
+                <w:sz w:val="15"/>
+              </w:rPr>
+              <w:t>类别</w:t>
+            </w:r>
+          </w:p>
+        </w:tc>
+        <w:tc>
+          <w:tcPr>
+            <w:tcW w:type="dxa" w:w="1417"/>
             <w:vAlign w:val="center"/>
             <w:shd w:fill="213B58"/>
             <w:tcMar>
@@ -6194,15 +6599,15 @@
                 <w:rFonts w:ascii="Arial" w:hAnsi="Arial" w:eastAsia="PingFang SC"/>
                 <w:b/>
                 <w:color w:val="FFFFFF"/>
-                <w:sz w:val="16"/>
-              </w:rPr>
-              <w:t>Weed P</w:t>
-            </w:r>
-          </w:p>
-        </w:tc>
-        <w:tc>
-          <w:tcPr>
-            <w:tcW w:type="dxa" w:w="1361"/>
+                <w:sz w:val="15"/>
+              </w:rPr>
+              <w:t>P</w:t>
+            </w:r>
+          </w:p>
+        </w:tc>
+        <w:tc>
+          <w:tcPr>
+            <w:tcW w:type="dxa" w:w="1417"/>
             <w:vAlign w:val="center"/>
             <w:shd w:fill="213B58"/>
             <w:tcMar>
@@ -6222,15 +6627,15 @@
                 <w:rFonts w:ascii="Arial" w:hAnsi="Arial" w:eastAsia="PingFang SC"/>
                 <w:b/>
                 <w:color w:val="FFFFFF"/>
-                <w:sz w:val="16"/>
-              </w:rPr>
-              <w:t>Weed R</w:t>
-            </w:r>
-          </w:p>
-        </w:tc>
-        <w:tc>
-          <w:tcPr>
-            <w:tcW w:type="dxa" w:w="1928"/>
+                <w:sz w:val="15"/>
+              </w:rPr>
+              <w:t>R</w:t>
+            </w:r>
+          </w:p>
+        </w:tc>
+        <w:tc>
+          <w:tcPr>
+            <w:tcW w:type="dxa" w:w="1757"/>
             <w:vAlign w:val="center"/>
             <w:shd w:fill="213B58"/>
             <w:tcMar>
@@ -6250,15 +6655,15 @@
                 <w:rFonts w:ascii="Arial" w:hAnsi="Arial" w:eastAsia="PingFang SC"/>
                 <w:b/>
                 <w:color w:val="FFFFFF"/>
-                <w:sz w:val="16"/>
-              </w:rPr>
-              <w:t>Weed mAP50</w:t>
-            </w:r>
-          </w:p>
-        </w:tc>
-        <w:tc>
-          <w:tcPr>
-            <w:tcW w:type="dxa" w:w="2041"/>
+                <w:sz w:val="15"/>
+              </w:rPr>
+              <w:t>mAP50</w:t>
+            </w:r>
+          </w:p>
+        </w:tc>
+        <w:tc>
+          <w:tcPr>
+            <w:tcW w:type="dxa" w:w="2268"/>
             <w:vAlign w:val="center"/>
             <w:shd w:fill="213B58"/>
             <w:tcMar>
@@ -6278,9 +6683,9 @@
                 <w:rFonts w:ascii="Arial" w:hAnsi="Arial" w:eastAsia="PingFang SC"/>
                 <w:b/>
                 <w:color w:val="FFFFFF"/>
-                <w:sz w:val="16"/>
-              </w:rPr>
-              <w:t>Weed mAP50-95</w:t>
+                <w:sz w:val="15"/>
+              </w:rPr>
+              <w:t>mAP50-95</w:t>
             </w:r>
           </w:p>
         </w:tc>
@@ -6310,7 +6715,7 @@
                 <w:rFonts w:ascii="Arial" w:hAnsi="Arial" w:eastAsia="PingFang SC"/>
                 <w:b w:val="0"/>
                 <w:color w:val="17212B"/>
-                <w:sz w:val="16"/>
+                <w:sz w:val="15"/>
               </w:rPr>
               <w:t>r020</w:t>
             </w:r>
@@ -6318,7 +6723,7 @@
         </w:tc>
         <w:tc>
           <w:tcPr>
-            <w:tcW w:type="dxa" w:w="1587"/>
+            <w:tcW w:type="dxa" w:w="1361"/>
             <w:vAlign w:val="center"/>
             <w:tcMar>
               <w:top w:w="95" w:type="dxa"/>
@@ -6337,15 +6742,15 @@
                 <w:rFonts w:ascii="Arial" w:hAnsi="Arial" w:eastAsia="PingFang SC"/>
                 <w:b w:val="0"/>
                 <w:color w:val="17212B"/>
-                <w:sz w:val="16"/>
-              </w:rPr>
-              <w:t>0.20</w:t>
-            </w:r>
-          </w:p>
-        </w:tc>
-        <w:tc>
-          <w:tcPr>
-            <w:tcW w:type="dxa" w:w="1361"/>
+                <w:sz w:val="15"/>
+              </w:rPr>
+              <w:t>all</w:t>
+            </w:r>
+          </w:p>
+        </w:tc>
+        <w:tc>
+          <w:tcPr>
+            <w:tcW w:type="dxa" w:w="1417"/>
             <w:vAlign w:val="center"/>
             <w:tcMar>
               <w:top w:w="95" w:type="dxa"/>
@@ -6364,15 +6769,15 @@
                 <w:rFonts w:ascii="Arial" w:hAnsi="Arial" w:eastAsia="PingFang SC"/>
                 <w:b w:val="0"/>
                 <w:color w:val="17212B"/>
-                <w:sz w:val="16"/>
-              </w:rPr>
-              <w:t>0.470</w:t>
-            </w:r>
-          </w:p>
-        </w:tc>
-        <w:tc>
-          <w:tcPr>
-            <w:tcW w:type="dxa" w:w="1361"/>
+                <w:sz w:val="15"/>
+              </w:rPr>
+              <w:t>0.498</w:t>
+            </w:r>
+          </w:p>
+        </w:tc>
+        <w:tc>
+          <w:tcPr>
+            <w:tcW w:type="dxa" w:w="1417"/>
             <w:vAlign w:val="center"/>
             <w:tcMar>
               <w:top w:w="95" w:type="dxa"/>
@@ -6391,15 +6796,15 @@
                 <w:rFonts w:ascii="Arial" w:hAnsi="Arial" w:eastAsia="PingFang SC"/>
                 <w:b w:val="0"/>
                 <w:color w:val="17212B"/>
-                <w:sz w:val="16"/>
-              </w:rPr>
-              <w:t>0.538</w:t>
-            </w:r>
-          </w:p>
-        </w:tc>
-        <w:tc>
-          <w:tcPr>
-            <w:tcW w:type="dxa" w:w="1928"/>
+                <w:sz w:val="15"/>
+              </w:rPr>
+              <w:t>0.594</w:t>
+            </w:r>
+          </w:p>
+        </w:tc>
+        <w:tc>
+          <w:tcPr>
+            <w:tcW w:type="dxa" w:w="1757"/>
             <w:vAlign w:val="center"/>
             <w:tcMar>
               <w:top w:w="95" w:type="dxa"/>
@@ -6418,15 +6823,15 @@
                 <w:rFonts w:ascii="Arial" w:hAnsi="Arial" w:eastAsia="PingFang SC"/>
                 <w:b w:val="0"/>
                 <w:color w:val="17212B"/>
-                <w:sz w:val="16"/>
-              </w:rPr>
-              <w:t>0.457</w:t>
-            </w:r>
-          </w:p>
-        </w:tc>
-        <w:tc>
-          <w:tcPr>
-            <w:tcW w:type="dxa" w:w="2041"/>
+                <w:sz w:val="15"/>
+              </w:rPr>
+              <w:t>0.526</w:t>
+            </w:r>
+          </w:p>
+        </w:tc>
+        <w:tc>
+          <w:tcPr>
+            <w:tcW w:type="dxa" w:w="2268"/>
             <w:vAlign w:val="center"/>
             <w:tcMar>
               <w:top w:w="95" w:type="dxa"/>
@@ -6445,9 +6850,9 @@
                 <w:rFonts w:ascii="Arial" w:hAnsi="Arial" w:eastAsia="PingFang SC"/>
                 <w:b w:val="0"/>
                 <w:color w:val="17212B"/>
-                <w:sz w:val="16"/>
-              </w:rPr>
-              <w:t>0.212</w:t>
+                <w:sz w:val="15"/>
+              </w:rPr>
+              <w:t>0.291</w:t>
             </w:r>
           </w:p>
         </w:tc>
@@ -6478,15 +6883,15 @@
                 <w:rFonts w:ascii="Arial" w:hAnsi="Arial" w:eastAsia="PingFang SC"/>
                 <w:b w:val="0"/>
                 <w:color w:val="17212B"/>
-                <w:sz w:val="16"/>
-              </w:rPr>
-              <w:t>r010</w:t>
-            </w:r>
-          </w:p>
-        </w:tc>
-        <w:tc>
-          <w:tcPr>
-            <w:tcW w:type="dxa" w:w="1587"/>
+                <w:sz w:val="15"/>
+              </w:rPr>
+              <w:t>r020</w:t>
+            </w:r>
+          </w:p>
+        </w:tc>
+        <w:tc>
+          <w:tcPr>
+            <w:tcW w:type="dxa" w:w="1361"/>
             <w:vAlign w:val="center"/>
             <w:shd w:fill="F2F6FA"/>
             <w:tcMar>
@@ -6506,15 +6911,15 @@
                 <w:rFonts w:ascii="Arial" w:hAnsi="Arial" w:eastAsia="PingFang SC"/>
                 <w:b w:val="0"/>
                 <w:color w:val="17212B"/>
-                <w:sz w:val="16"/>
-              </w:rPr>
-              <w:t>0.10</w:t>
-            </w:r>
-          </w:p>
-        </w:tc>
-        <w:tc>
-          <w:tcPr>
-            <w:tcW w:type="dxa" w:w="1361"/>
+                <w:sz w:val="15"/>
+              </w:rPr>
+              <w:t>crop</w:t>
+            </w:r>
+          </w:p>
+        </w:tc>
+        <w:tc>
+          <w:tcPr>
+            <w:tcW w:type="dxa" w:w="1417"/>
             <w:vAlign w:val="center"/>
             <w:shd w:fill="F2F6FA"/>
             <w:tcMar>
@@ -6534,15 +6939,15 @@
                 <w:rFonts w:ascii="Arial" w:hAnsi="Arial" w:eastAsia="PingFang SC"/>
                 <w:b w:val="0"/>
                 <w:color w:val="17212B"/>
-                <w:sz w:val="16"/>
-              </w:rPr>
-              <w:t>0.482</w:t>
-            </w:r>
-          </w:p>
-        </w:tc>
-        <w:tc>
-          <w:tcPr>
-            <w:tcW w:type="dxa" w:w="1361"/>
+                <w:sz w:val="15"/>
+              </w:rPr>
+              <w:t>0.525</w:t>
+            </w:r>
+          </w:p>
+        </w:tc>
+        <w:tc>
+          <w:tcPr>
+            <w:tcW w:type="dxa" w:w="1417"/>
             <w:vAlign w:val="center"/>
             <w:shd w:fill="F2F6FA"/>
             <w:tcMar>
@@ -6562,15 +6967,15 @@
                 <w:rFonts w:ascii="Arial" w:hAnsi="Arial" w:eastAsia="PingFang SC"/>
                 <w:b w:val="0"/>
                 <w:color w:val="17212B"/>
-                <w:sz w:val="16"/>
-              </w:rPr>
-              <w:t>0.530</w:t>
-            </w:r>
-          </w:p>
-        </w:tc>
-        <w:tc>
-          <w:tcPr>
-            <w:tcW w:type="dxa" w:w="1928"/>
+                <w:sz w:val="15"/>
+              </w:rPr>
+              <w:t>0.650</w:t>
+            </w:r>
+          </w:p>
+        </w:tc>
+        <w:tc>
+          <w:tcPr>
+            <w:tcW w:type="dxa" w:w="1757"/>
             <w:vAlign w:val="center"/>
             <w:shd w:fill="F2F6FA"/>
             <w:tcMar>
@@ -6590,15 +6995,15 @@
                 <w:rFonts w:ascii="Arial" w:hAnsi="Arial" w:eastAsia="PingFang SC"/>
                 <w:b w:val="0"/>
                 <w:color w:val="17212B"/>
-                <w:sz w:val="16"/>
-              </w:rPr>
-              <w:t>0.460</w:t>
-            </w:r>
-          </w:p>
-        </w:tc>
-        <w:tc>
-          <w:tcPr>
-            <w:tcW w:type="dxa" w:w="2041"/>
+                <w:sz w:val="15"/>
+              </w:rPr>
+              <w:t>0.595</w:t>
+            </w:r>
+          </w:p>
+        </w:tc>
+        <w:tc>
+          <w:tcPr>
+            <w:tcW w:type="dxa" w:w="2268"/>
             <w:vAlign w:val="center"/>
             <w:shd w:fill="F2F6FA"/>
             <w:tcMar>
@@ -6618,7 +7023,1194 @@
                 <w:rFonts w:ascii="Arial" w:hAnsi="Arial" w:eastAsia="PingFang SC"/>
                 <w:b w:val="0"/>
                 <w:color w:val="17212B"/>
-                <w:sz w:val="16"/>
+                <w:sz w:val="15"/>
+              </w:rPr>
+              <w:t>0.370</w:t>
+            </w:r>
+          </w:p>
+        </w:tc>
+      </w:tr>
+      <w:tr>
+        <w:trPr>
+          <w:cantSplit/>
+        </w:trPr>
+        <w:tc>
+          <w:tcPr>
+            <w:tcW w:type="dxa" w:w="1361"/>
+            <w:vAlign w:val="center"/>
+            <w:tcMar>
+              <w:top w:w="95" w:type="dxa"/>
+              <w:bottom w:w="95" w:type="dxa"/>
+              <w:start w:w="90" w:type="dxa"/>
+              <w:end w:w="90" w:type="dxa"/>
+            </w:tcMar>
+          </w:tcPr>
+          <w:p>
+            <w:pPr>
+              <w:spacing w:after="0" w:line="259" w:lineRule="auto"/>
+              <w:jc w:val="left"/>
+            </w:pPr>
+            <w:r>
+              <w:rPr>
+                <w:rFonts w:ascii="Arial" w:hAnsi="Arial" w:eastAsia="PingFang SC"/>
+                <w:b w:val="0"/>
+                <w:color w:val="17212B"/>
+                <w:sz w:val="15"/>
+              </w:rPr>
+              <w:t>r020</w:t>
+            </w:r>
+          </w:p>
+        </w:tc>
+        <w:tc>
+          <w:tcPr>
+            <w:tcW w:type="dxa" w:w="1361"/>
+            <w:vAlign w:val="center"/>
+            <w:tcMar>
+              <w:top w:w="95" w:type="dxa"/>
+              <w:bottom w:w="95" w:type="dxa"/>
+              <w:start w:w="90" w:type="dxa"/>
+              <w:end w:w="90" w:type="dxa"/>
+            </w:tcMar>
+          </w:tcPr>
+          <w:p>
+            <w:pPr>
+              <w:spacing w:after="0" w:line="259" w:lineRule="auto"/>
+              <w:jc w:val="center"/>
+            </w:pPr>
+            <w:r>
+              <w:rPr>
+                <w:rFonts w:ascii="Arial" w:hAnsi="Arial" w:eastAsia="PingFang SC"/>
+                <w:b w:val="0"/>
+                <w:color w:val="17212B"/>
+                <w:sz w:val="15"/>
+              </w:rPr>
+              <w:t>weed</w:t>
+            </w:r>
+          </w:p>
+        </w:tc>
+        <w:tc>
+          <w:tcPr>
+            <w:tcW w:type="dxa" w:w="1417"/>
+            <w:vAlign w:val="center"/>
+            <w:tcMar>
+              <w:top w:w="95" w:type="dxa"/>
+              <w:bottom w:w="95" w:type="dxa"/>
+              <w:start w:w="90" w:type="dxa"/>
+              <w:end w:w="90" w:type="dxa"/>
+            </w:tcMar>
+          </w:tcPr>
+          <w:p>
+            <w:pPr>
+              <w:spacing w:after="0" w:line="259" w:lineRule="auto"/>
+              <w:jc w:val="center"/>
+            </w:pPr>
+            <w:r>
+              <w:rPr>
+                <w:rFonts w:ascii="Arial" w:hAnsi="Arial" w:eastAsia="PingFang SC"/>
+                <w:b w:val="0"/>
+                <w:color w:val="17212B"/>
+                <w:sz w:val="15"/>
+              </w:rPr>
+              <w:t>0.470</w:t>
+            </w:r>
+          </w:p>
+        </w:tc>
+        <w:tc>
+          <w:tcPr>
+            <w:tcW w:type="dxa" w:w="1417"/>
+            <w:vAlign w:val="center"/>
+            <w:tcMar>
+              <w:top w:w="95" w:type="dxa"/>
+              <w:bottom w:w="95" w:type="dxa"/>
+              <w:start w:w="90" w:type="dxa"/>
+              <w:end w:w="90" w:type="dxa"/>
+            </w:tcMar>
+          </w:tcPr>
+          <w:p>
+            <w:pPr>
+              <w:spacing w:after="0" w:line="259" w:lineRule="auto"/>
+              <w:jc w:val="center"/>
+            </w:pPr>
+            <w:r>
+              <w:rPr>
+                <w:rFonts w:ascii="Arial" w:hAnsi="Arial" w:eastAsia="PingFang SC"/>
+                <w:b w:val="0"/>
+                <w:color w:val="17212B"/>
+                <w:sz w:val="15"/>
+              </w:rPr>
+              <w:t>0.538</w:t>
+            </w:r>
+          </w:p>
+        </w:tc>
+        <w:tc>
+          <w:tcPr>
+            <w:tcW w:type="dxa" w:w="1757"/>
+            <w:vAlign w:val="center"/>
+            <w:tcMar>
+              <w:top w:w="95" w:type="dxa"/>
+              <w:bottom w:w="95" w:type="dxa"/>
+              <w:start w:w="90" w:type="dxa"/>
+              <w:end w:w="90" w:type="dxa"/>
+            </w:tcMar>
+          </w:tcPr>
+          <w:p>
+            <w:pPr>
+              <w:spacing w:after="0" w:line="259" w:lineRule="auto"/>
+              <w:jc w:val="center"/>
+            </w:pPr>
+            <w:r>
+              <w:rPr>
+                <w:rFonts w:ascii="Arial" w:hAnsi="Arial" w:eastAsia="PingFang SC"/>
+                <w:b w:val="0"/>
+                <w:color w:val="17212B"/>
+                <w:sz w:val="15"/>
+              </w:rPr>
+              <w:t>0.457</w:t>
+            </w:r>
+          </w:p>
+        </w:tc>
+        <w:tc>
+          <w:tcPr>
+            <w:tcW w:type="dxa" w:w="2268"/>
+            <w:vAlign w:val="center"/>
+            <w:tcMar>
+              <w:top w:w="95" w:type="dxa"/>
+              <w:bottom w:w="95" w:type="dxa"/>
+              <w:start w:w="90" w:type="dxa"/>
+              <w:end w:w="90" w:type="dxa"/>
+            </w:tcMar>
+          </w:tcPr>
+          <w:p>
+            <w:pPr>
+              <w:spacing w:after="0" w:line="259" w:lineRule="auto"/>
+              <w:jc w:val="center"/>
+            </w:pPr>
+            <w:r>
+              <w:rPr>
+                <w:rFonts w:ascii="Arial" w:hAnsi="Arial" w:eastAsia="PingFang SC"/>
+                <w:b w:val="0"/>
+                <w:color w:val="17212B"/>
+                <w:sz w:val="15"/>
+              </w:rPr>
+              <w:t>0.212</w:t>
+            </w:r>
+          </w:p>
+        </w:tc>
+      </w:tr>
+      <w:tr>
+        <w:trPr>
+          <w:cantSplit/>
+        </w:trPr>
+        <w:tc>
+          <w:tcPr>
+            <w:tcW w:type="dxa" w:w="1361"/>
+            <w:vAlign w:val="center"/>
+            <w:shd w:fill="F2F6FA"/>
+            <w:tcMar>
+              <w:top w:w="95" w:type="dxa"/>
+              <w:bottom w:w="95" w:type="dxa"/>
+              <w:start w:w="90" w:type="dxa"/>
+              <w:end w:w="90" w:type="dxa"/>
+            </w:tcMar>
+          </w:tcPr>
+          <w:p>
+            <w:pPr>
+              <w:spacing w:after="0" w:line="259" w:lineRule="auto"/>
+              <w:jc w:val="left"/>
+            </w:pPr>
+            <w:r>
+              <w:rPr>
+                <w:rFonts w:ascii="Arial" w:hAnsi="Arial" w:eastAsia="PingFang SC"/>
+                <w:b w:val="0"/>
+                <w:color w:val="17212B"/>
+                <w:sz w:val="15"/>
+              </w:rPr>
+              <w:t>r015</w:t>
+            </w:r>
+          </w:p>
+        </w:tc>
+        <w:tc>
+          <w:tcPr>
+            <w:tcW w:type="dxa" w:w="1361"/>
+            <w:vAlign w:val="center"/>
+            <w:shd w:fill="F2F6FA"/>
+            <w:tcMar>
+              <w:top w:w="95" w:type="dxa"/>
+              <w:bottom w:w="95" w:type="dxa"/>
+              <w:start w:w="90" w:type="dxa"/>
+              <w:end w:w="90" w:type="dxa"/>
+            </w:tcMar>
+          </w:tcPr>
+          <w:p>
+            <w:pPr>
+              <w:spacing w:after="0" w:line="259" w:lineRule="auto"/>
+              <w:jc w:val="center"/>
+            </w:pPr>
+            <w:r>
+              <w:rPr>
+                <w:rFonts w:ascii="Arial" w:hAnsi="Arial" w:eastAsia="PingFang SC"/>
+                <w:b w:val="0"/>
+                <w:color w:val="17212B"/>
+                <w:sz w:val="15"/>
+              </w:rPr>
+              <w:t>all</w:t>
+            </w:r>
+          </w:p>
+        </w:tc>
+        <w:tc>
+          <w:tcPr>
+            <w:tcW w:type="dxa" w:w="1417"/>
+            <w:vAlign w:val="center"/>
+            <w:shd w:fill="F2F6FA"/>
+            <w:tcMar>
+              <w:top w:w="95" w:type="dxa"/>
+              <w:bottom w:w="95" w:type="dxa"/>
+              <w:start w:w="90" w:type="dxa"/>
+              <w:end w:w="90" w:type="dxa"/>
+            </w:tcMar>
+          </w:tcPr>
+          <w:p>
+            <w:pPr>
+              <w:spacing w:after="0" w:line="259" w:lineRule="auto"/>
+              <w:jc w:val="center"/>
+            </w:pPr>
+            <w:r>
+              <w:rPr>
+                <w:rFonts w:ascii="Arial" w:hAnsi="Arial" w:eastAsia="PingFang SC"/>
+                <w:b w:val="0"/>
+                <w:color w:val="17212B"/>
+                <w:sz w:val="15"/>
+              </w:rPr>
+              <w:t>0.508</w:t>
+            </w:r>
+          </w:p>
+        </w:tc>
+        <w:tc>
+          <w:tcPr>
+            <w:tcW w:type="dxa" w:w="1417"/>
+            <w:vAlign w:val="center"/>
+            <w:shd w:fill="F2F6FA"/>
+            <w:tcMar>
+              <w:top w:w="95" w:type="dxa"/>
+              <w:bottom w:w="95" w:type="dxa"/>
+              <w:start w:w="90" w:type="dxa"/>
+              <w:end w:w="90" w:type="dxa"/>
+            </w:tcMar>
+          </w:tcPr>
+          <w:p>
+            <w:pPr>
+              <w:spacing w:after="0" w:line="259" w:lineRule="auto"/>
+              <w:jc w:val="center"/>
+            </w:pPr>
+            <w:r>
+              <w:rPr>
+                <w:rFonts w:ascii="Arial" w:hAnsi="Arial" w:eastAsia="PingFang SC"/>
+                <w:b w:val="0"/>
+                <w:color w:val="17212B"/>
+                <w:sz w:val="15"/>
+              </w:rPr>
+              <w:t>0.587</w:t>
+            </w:r>
+          </w:p>
+        </w:tc>
+        <w:tc>
+          <w:tcPr>
+            <w:tcW w:type="dxa" w:w="1757"/>
+            <w:vAlign w:val="center"/>
+            <w:shd w:fill="F2F6FA"/>
+            <w:tcMar>
+              <w:top w:w="95" w:type="dxa"/>
+              <w:bottom w:w="95" w:type="dxa"/>
+              <w:start w:w="90" w:type="dxa"/>
+              <w:end w:w="90" w:type="dxa"/>
+            </w:tcMar>
+          </w:tcPr>
+          <w:p>
+            <w:pPr>
+              <w:spacing w:after="0" w:line="259" w:lineRule="auto"/>
+              <w:jc w:val="center"/>
+            </w:pPr>
+            <w:r>
+              <w:rPr>
+                <w:rFonts w:ascii="Arial" w:hAnsi="Arial" w:eastAsia="PingFang SC"/>
+                <w:b w:val="0"/>
+                <w:color w:val="17212B"/>
+                <w:sz w:val="15"/>
+              </w:rPr>
+              <w:t>0.530</w:t>
+            </w:r>
+          </w:p>
+        </w:tc>
+        <w:tc>
+          <w:tcPr>
+            <w:tcW w:type="dxa" w:w="2268"/>
+            <w:vAlign w:val="center"/>
+            <w:shd w:fill="F2F6FA"/>
+            <w:tcMar>
+              <w:top w:w="95" w:type="dxa"/>
+              <w:bottom w:w="95" w:type="dxa"/>
+              <w:start w:w="90" w:type="dxa"/>
+              <w:end w:w="90" w:type="dxa"/>
+            </w:tcMar>
+          </w:tcPr>
+          <w:p>
+            <w:pPr>
+              <w:spacing w:after="0" w:line="259" w:lineRule="auto"/>
+              <w:jc w:val="center"/>
+            </w:pPr>
+            <w:r>
+              <w:rPr>
+                <w:rFonts w:ascii="Arial" w:hAnsi="Arial" w:eastAsia="PingFang SC"/>
+                <w:b w:val="0"/>
+                <w:color w:val="17212B"/>
+                <w:sz w:val="15"/>
+              </w:rPr>
+              <w:t>0.297</w:t>
+            </w:r>
+          </w:p>
+        </w:tc>
+      </w:tr>
+      <w:tr>
+        <w:trPr>
+          <w:cantSplit/>
+        </w:trPr>
+        <w:tc>
+          <w:tcPr>
+            <w:tcW w:type="dxa" w:w="1361"/>
+            <w:vAlign w:val="center"/>
+            <w:tcMar>
+              <w:top w:w="95" w:type="dxa"/>
+              <w:bottom w:w="95" w:type="dxa"/>
+              <w:start w:w="90" w:type="dxa"/>
+              <w:end w:w="90" w:type="dxa"/>
+            </w:tcMar>
+          </w:tcPr>
+          <w:p>
+            <w:pPr>
+              <w:spacing w:after="0" w:line="259" w:lineRule="auto"/>
+              <w:jc w:val="left"/>
+            </w:pPr>
+            <w:r>
+              <w:rPr>
+                <w:rFonts w:ascii="Arial" w:hAnsi="Arial" w:eastAsia="PingFang SC"/>
+                <w:b w:val="0"/>
+                <w:color w:val="17212B"/>
+                <w:sz w:val="15"/>
+              </w:rPr>
+              <w:t>r015</w:t>
+            </w:r>
+          </w:p>
+        </w:tc>
+        <w:tc>
+          <w:tcPr>
+            <w:tcW w:type="dxa" w:w="1361"/>
+            <w:vAlign w:val="center"/>
+            <w:tcMar>
+              <w:top w:w="95" w:type="dxa"/>
+              <w:bottom w:w="95" w:type="dxa"/>
+              <w:start w:w="90" w:type="dxa"/>
+              <w:end w:w="90" w:type="dxa"/>
+            </w:tcMar>
+          </w:tcPr>
+          <w:p>
+            <w:pPr>
+              <w:spacing w:after="0" w:line="259" w:lineRule="auto"/>
+              <w:jc w:val="center"/>
+            </w:pPr>
+            <w:r>
+              <w:rPr>
+                <w:rFonts w:ascii="Arial" w:hAnsi="Arial" w:eastAsia="PingFang SC"/>
+                <w:b w:val="0"/>
+                <w:color w:val="17212B"/>
+                <w:sz w:val="15"/>
+              </w:rPr>
+              <w:t>crop</w:t>
+            </w:r>
+          </w:p>
+        </w:tc>
+        <w:tc>
+          <w:tcPr>
+            <w:tcW w:type="dxa" w:w="1417"/>
+            <w:vAlign w:val="center"/>
+            <w:tcMar>
+              <w:top w:w="95" w:type="dxa"/>
+              <w:bottom w:w="95" w:type="dxa"/>
+              <w:start w:w="90" w:type="dxa"/>
+              <w:end w:w="90" w:type="dxa"/>
+            </w:tcMar>
+          </w:tcPr>
+          <w:p>
+            <w:pPr>
+              <w:spacing w:after="0" w:line="259" w:lineRule="auto"/>
+              <w:jc w:val="center"/>
+            </w:pPr>
+            <w:r>
+              <w:rPr>
+                <w:rFonts w:ascii="Arial" w:hAnsi="Arial" w:eastAsia="PingFang SC"/>
+                <w:b w:val="0"/>
+                <w:color w:val="17212B"/>
+                <w:sz w:val="15"/>
+              </w:rPr>
+              <w:t>0.522</w:t>
+            </w:r>
+          </w:p>
+        </w:tc>
+        <w:tc>
+          <w:tcPr>
+            <w:tcW w:type="dxa" w:w="1417"/>
+            <w:vAlign w:val="center"/>
+            <w:tcMar>
+              <w:top w:w="95" w:type="dxa"/>
+              <w:bottom w:w="95" w:type="dxa"/>
+              <w:start w:w="90" w:type="dxa"/>
+              <w:end w:w="90" w:type="dxa"/>
+            </w:tcMar>
+          </w:tcPr>
+          <w:p>
+            <w:pPr>
+              <w:spacing w:after="0" w:line="259" w:lineRule="auto"/>
+              <w:jc w:val="center"/>
+            </w:pPr>
+            <w:r>
+              <w:rPr>
+                <w:rFonts w:ascii="Arial" w:hAnsi="Arial" w:eastAsia="PingFang SC"/>
+                <w:b w:val="0"/>
+                <w:color w:val="17212B"/>
+                <w:sz w:val="15"/>
+              </w:rPr>
+              <w:t>0.672</w:t>
+            </w:r>
+          </w:p>
+        </w:tc>
+        <w:tc>
+          <w:tcPr>
+            <w:tcW w:type="dxa" w:w="1757"/>
+            <w:vAlign w:val="center"/>
+            <w:tcMar>
+              <w:top w:w="95" w:type="dxa"/>
+              <w:bottom w:w="95" w:type="dxa"/>
+              <w:start w:w="90" w:type="dxa"/>
+              <w:end w:w="90" w:type="dxa"/>
+            </w:tcMar>
+          </w:tcPr>
+          <w:p>
+            <w:pPr>
+              <w:spacing w:after="0" w:line="259" w:lineRule="auto"/>
+              <w:jc w:val="center"/>
+            </w:pPr>
+            <w:r>
+              <w:rPr>
+                <w:rFonts w:ascii="Arial" w:hAnsi="Arial" w:eastAsia="PingFang SC"/>
+                <w:b w:val="0"/>
+                <w:color w:val="17212B"/>
+                <w:sz w:val="15"/>
+              </w:rPr>
+              <w:t>0.616</w:t>
+            </w:r>
+          </w:p>
+        </w:tc>
+        <w:tc>
+          <w:tcPr>
+            <w:tcW w:type="dxa" w:w="2268"/>
+            <w:vAlign w:val="center"/>
+            <w:tcMar>
+              <w:top w:w="95" w:type="dxa"/>
+              <w:bottom w:w="95" w:type="dxa"/>
+              <w:start w:w="90" w:type="dxa"/>
+              <w:end w:w="90" w:type="dxa"/>
+            </w:tcMar>
+          </w:tcPr>
+          <w:p>
+            <w:pPr>
+              <w:spacing w:after="0" w:line="259" w:lineRule="auto"/>
+              <w:jc w:val="center"/>
+            </w:pPr>
+            <w:r>
+              <w:rPr>
+                <w:rFonts w:ascii="Arial" w:hAnsi="Arial" w:eastAsia="PingFang SC"/>
+                <w:b w:val="0"/>
+                <w:color w:val="17212B"/>
+                <w:sz w:val="15"/>
+              </w:rPr>
+              <w:t>0.387</w:t>
+            </w:r>
+          </w:p>
+        </w:tc>
+      </w:tr>
+      <w:tr>
+        <w:trPr>
+          <w:cantSplit/>
+        </w:trPr>
+        <w:tc>
+          <w:tcPr>
+            <w:tcW w:type="dxa" w:w="1361"/>
+            <w:vAlign w:val="center"/>
+            <w:shd w:fill="F2F6FA"/>
+            <w:tcMar>
+              <w:top w:w="95" w:type="dxa"/>
+              <w:bottom w:w="95" w:type="dxa"/>
+              <w:start w:w="90" w:type="dxa"/>
+              <w:end w:w="90" w:type="dxa"/>
+            </w:tcMar>
+          </w:tcPr>
+          <w:p>
+            <w:pPr>
+              <w:spacing w:after="0" w:line="259" w:lineRule="auto"/>
+              <w:jc w:val="left"/>
+            </w:pPr>
+            <w:r>
+              <w:rPr>
+                <w:rFonts w:ascii="Arial" w:hAnsi="Arial" w:eastAsia="PingFang SC"/>
+                <w:b w:val="0"/>
+                <w:color w:val="17212B"/>
+                <w:sz w:val="15"/>
+              </w:rPr>
+              <w:t>r015</w:t>
+            </w:r>
+          </w:p>
+        </w:tc>
+        <w:tc>
+          <w:tcPr>
+            <w:tcW w:type="dxa" w:w="1361"/>
+            <w:vAlign w:val="center"/>
+            <w:shd w:fill="F2F6FA"/>
+            <w:tcMar>
+              <w:top w:w="95" w:type="dxa"/>
+              <w:bottom w:w="95" w:type="dxa"/>
+              <w:start w:w="90" w:type="dxa"/>
+              <w:end w:w="90" w:type="dxa"/>
+            </w:tcMar>
+          </w:tcPr>
+          <w:p>
+            <w:pPr>
+              <w:spacing w:after="0" w:line="259" w:lineRule="auto"/>
+              <w:jc w:val="center"/>
+            </w:pPr>
+            <w:r>
+              <w:rPr>
+                <w:rFonts w:ascii="Arial" w:hAnsi="Arial" w:eastAsia="PingFang SC"/>
+                <w:b w:val="0"/>
+                <w:color w:val="17212B"/>
+                <w:sz w:val="15"/>
+              </w:rPr>
+              <w:t>weed</w:t>
+            </w:r>
+          </w:p>
+        </w:tc>
+        <w:tc>
+          <w:tcPr>
+            <w:tcW w:type="dxa" w:w="1417"/>
+            <w:vAlign w:val="center"/>
+            <w:shd w:fill="F2F6FA"/>
+            <w:tcMar>
+              <w:top w:w="95" w:type="dxa"/>
+              <w:bottom w:w="95" w:type="dxa"/>
+              <w:start w:w="90" w:type="dxa"/>
+              <w:end w:w="90" w:type="dxa"/>
+            </w:tcMar>
+          </w:tcPr>
+          <w:p>
+            <w:pPr>
+              <w:spacing w:after="0" w:line="259" w:lineRule="auto"/>
+              <w:jc w:val="center"/>
+            </w:pPr>
+            <w:r>
+              <w:rPr>
+                <w:rFonts w:ascii="Arial" w:hAnsi="Arial" w:eastAsia="PingFang SC"/>
+                <w:b w:val="0"/>
+                <w:color w:val="17212B"/>
+                <w:sz w:val="15"/>
+              </w:rPr>
+              <w:t>0.492</w:t>
+            </w:r>
+          </w:p>
+        </w:tc>
+        <w:tc>
+          <w:tcPr>
+            <w:tcW w:type="dxa" w:w="1417"/>
+            <w:vAlign w:val="center"/>
+            <w:shd w:fill="F2F6FA"/>
+            <w:tcMar>
+              <w:top w:w="95" w:type="dxa"/>
+              <w:bottom w:w="95" w:type="dxa"/>
+              <w:start w:w="90" w:type="dxa"/>
+              <w:end w:w="90" w:type="dxa"/>
+            </w:tcMar>
+          </w:tcPr>
+          <w:p>
+            <w:pPr>
+              <w:spacing w:after="0" w:line="259" w:lineRule="auto"/>
+              <w:jc w:val="center"/>
+            </w:pPr>
+            <w:r>
+              <w:rPr>
+                <w:rFonts w:ascii="Arial" w:hAnsi="Arial" w:eastAsia="PingFang SC"/>
+                <w:b w:val="0"/>
+                <w:color w:val="17212B"/>
+                <w:sz w:val="15"/>
+              </w:rPr>
+              <w:t>0.505</w:t>
+            </w:r>
+          </w:p>
+        </w:tc>
+        <w:tc>
+          <w:tcPr>
+            <w:tcW w:type="dxa" w:w="1757"/>
+            <w:vAlign w:val="center"/>
+            <w:shd w:fill="F2F6FA"/>
+            <w:tcMar>
+              <w:top w:w="95" w:type="dxa"/>
+              <w:bottom w:w="95" w:type="dxa"/>
+              <w:start w:w="90" w:type="dxa"/>
+              <w:end w:w="90" w:type="dxa"/>
+            </w:tcMar>
+          </w:tcPr>
+          <w:p>
+            <w:pPr>
+              <w:spacing w:after="0" w:line="259" w:lineRule="auto"/>
+              <w:jc w:val="center"/>
+            </w:pPr>
+            <w:r>
+              <w:rPr>
+                <w:rFonts w:ascii="Arial" w:hAnsi="Arial" w:eastAsia="PingFang SC"/>
+                <w:b w:val="0"/>
+                <w:color w:val="17212B"/>
+                <w:sz w:val="15"/>
+              </w:rPr>
+              <w:t>0.445</w:t>
+            </w:r>
+          </w:p>
+        </w:tc>
+        <w:tc>
+          <w:tcPr>
+            <w:tcW w:type="dxa" w:w="2268"/>
+            <w:vAlign w:val="center"/>
+            <w:shd w:fill="F2F6FA"/>
+            <w:tcMar>
+              <w:top w:w="95" w:type="dxa"/>
+              <w:bottom w:w="95" w:type="dxa"/>
+              <w:start w:w="90" w:type="dxa"/>
+              <w:end w:w="90" w:type="dxa"/>
+            </w:tcMar>
+          </w:tcPr>
+          <w:p>
+            <w:pPr>
+              <w:spacing w:after="0" w:line="259" w:lineRule="auto"/>
+              <w:jc w:val="center"/>
+            </w:pPr>
+            <w:r>
+              <w:rPr>
+                <w:rFonts w:ascii="Arial" w:hAnsi="Arial" w:eastAsia="PingFang SC"/>
+                <w:b w:val="0"/>
+                <w:color w:val="17212B"/>
+                <w:sz w:val="15"/>
+              </w:rPr>
+              <w:t>0.206</w:t>
+            </w:r>
+          </w:p>
+        </w:tc>
+      </w:tr>
+      <w:tr>
+        <w:trPr>
+          <w:cantSplit/>
+        </w:trPr>
+        <w:tc>
+          <w:tcPr>
+            <w:tcW w:type="dxa" w:w="1361"/>
+            <w:vAlign w:val="center"/>
+            <w:tcMar>
+              <w:top w:w="95" w:type="dxa"/>
+              <w:bottom w:w="95" w:type="dxa"/>
+              <w:start w:w="90" w:type="dxa"/>
+              <w:end w:w="90" w:type="dxa"/>
+            </w:tcMar>
+          </w:tcPr>
+          <w:p>
+            <w:pPr>
+              <w:spacing w:after="0" w:line="259" w:lineRule="auto"/>
+              <w:jc w:val="left"/>
+            </w:pPr>
+            <w:r>
+              <w:rPr>
+                <w:rFonts w:ascii="Arial" w:hAnsi="Arial" w:eastAsia="PingFang SC"/>
+                <w:b w:val="0"/>
+                <w:color w:val="17212B"/>
+                <w:sz w:val="15"/>
+              </w:rPr>
+              <w:t>r010</w:t>
+            </w:r>
+          </w:p>
+        </w:tc>
+        <w:tc>
+          <w:tcPr>
+            <w:tcW w:type="dxa" w:w="1361"/>
+            <w:vAlign w:val="center"/>
+            <w:tcMar>
+              <w:top w:w="95" w:type="dxa"/>
+              <w:bottom w:w="95" w:type="dxa"/>
+              <w:start w:w="90" w:type="dxa"/>
+              <w:end w:w="90" w:type="dxa"/>
+            </w:tcMar>
+          </w:tcPr>
+          <w:p>
+            <w:pPr>
+              <w:spacing w:after="0" w:line="259" w:lineRule="auto"/>
+              <w:jc w:val="center"/>
+            </w:pPr>
+            <w:r>
+              <w:rPr>
+                <w:rFonts w:ascii="Arial" w:hAnsi="Arial" w:eastAsia="PingFang SC"/>
+                <w:b w:val="0"/>
+                <w:color w:val="17212B"/>
+                <w:sz w:val="15"/>
+              </w:rPr>
+              <w:t>all</w:t>
+            </w:r>
+          </w:p>
+        </w:tc>
+        <w:tc>
+          <w:tcPr>
+            <w:tcW w:type="dxa" w:w="1417"/>
+            <w:vAlign w:val="center"/>
+            <w:tcMar>
+              <w:top w:w="95" w:type="dxa"/>
+              <w:bottom w:w="95" w:type="dxa"/>
+              <w:start w:w="90" w:type="dxa"/>
+              <w:end w:w="90" w:type="dxa"/>
+            </w:tcMar>
+          </w:tcPr>
+          <w:p>
+            <w:pPr>
+              <w:spacing w:after="0" w:line="259" w:lineRule="auto"/>
+              <w:jc w:val="center"/>
+            </w:pPr>
+            <w:r>
+              <w:rPr>
+                <w:rFonts w:ascii="Arial" w:hAnsi="Arial" w:eastAsia="PingFang SC"/>
+                <w:b w:val="0"/>
+                <w:color w:val="17212B"/>
+                <w:sz w:val="15"/>
+              </w:rPr>
+              <w:t>0.505</w:t>
+            </w:r>
+          </w:p>
+        </w:tc>
+        <w:tc>
+          <w:tcPr>
+            <w:tcW w:type="dxa" w:w="1417"/>
+            <w:vAlign w:val="center"/>
+            <w:tcMar>
+              <w:top w:w="95" w:type="dxa"/>
+              <w:bottom w:w="95" w:type="dxa"/>
+              <w:start w:w="90" w:type="dxa"/>
+              <w:end w:w="90" w:type="dxa"/>
+            </w:tcMar>
+          </w:tcPr>
+          <w:p>
+            <w:pPr>
+              <w:spacing w:after="0" w:line="259" w:lineRule="auto"/>
+              <w:jc w:val="center"/>
+            </w:pPr>
+            <w:r>
+              <w:rPr>
+                <w:rFonts w:ascii="Arial" w:hAnsi="Arial" w:eastAsia="PingFang SC"/>
+                <w:b w:val="0"/>
+                <w:color w:val="17212B"/>
+                <w:sz w:val="15"/>
+              </w:rPr>
+              <w:t>0.591</w:t>
+            </w:r>
+          </w:p>
+        </w:tc>
+        <w:tc>
+          <w:tcPr>
+            <w:tcW w:type="dxa" w:w="1757"/>
+            <w:vAlign w:val="center"/>
+            <w:tcMar>
+              <w:top w:w="95" w:type="dxa"/>
+              <w:bottom w:w="95" w:type="dxa"/>
+              <w:start w:w="90" w:type="dxa"/>
+              <w:end w:w="90" w:type="dxa"/>
+            </w:tcMar>
+          </w:tcPr>
+          <w:p>
+            <w:pPr>
+              <w:spacing w:after="0" w:line="259" w:lineRule="auto"/>
+              <w:jc w:val="center"/>
+            </w:pPr>
+            <w:r>
+              <w:rPr>
+                <w:rFonts w:ascii="Arial" w:hAnsi="Arial" w:eastAsia="PingFang SC"/>
+                <w:b w:val="0"/>
+                <w:color w:val="17212B"/>
+                <w:sz w:val="15"/>
+              </w:rPr>
+              <w:t>0.531</w:t>
+            </w:r>
+          </w:p>
+        </w:tc>
+        <w:tc>
+          <w:tcPr>
+            <w:tcW w:type="dxa" w:w="2268"/>
+            <w:vAlign w:val="center"/>
+            <w:tcMar>
+              <w:top w:w="95" w:type="dxa"/>
+              <w:bottom w:w="95" w:type="dxa"/>
+              <w:start w:w="90" w:type="dxa"/>
+              <w:end w:w="90" w:type="dxa"/>
+            </w:tcMar>
+          </w:tcPr>
+          <w:p>
+            <w:pPr>
+              <w:spacing w:after="0" w:line="259" w:lineRule="auto"/>
+              <w:jc w:val="center"/>
+            </w:pPr>
+            <w:r>
+              <w:rPr>
+                <w:rFonts w:ascii="Arial" w:hAnsi="Arial" w:eastAsia="PingFang SC"/>
+                <w:b w:val="0"/>
+                <w:color w:val="17212B"/>
+                <w:sz w:val="15"/>
+              </w:rPr>
+              <w:t>0.296</w:t>
+            </w:r>
+          </w:p>
+        </w:tc>
+      </w:tr>
+      <w:tr>
+        <w:trPr>
+          <w:cantSplit/>
+        </w:trPr>
+        <w:tc>
+          <w:tcPr>
+            <w:tcW w:type="dxa" w:w="1361"/>
+            <w:vAlign w:val="center"/>
+            <w:shd w:fill="F2F6FA"/>
+            <w:tcMar>
+              <w:top w:w="95" w:type="dxa"/>
+              <w:bottom w:w="95" w:type="dxa"/>
+              <w:start w:w="90" w:type="dxa"/>
+              <w:end w:w="90" w:type="dxa"/>
+            </w:tcMar>
+          </w:tcPr>
+          <w:p>
+            <w:pPr>
+              <w:spacing w:after="0" w:line="259" w:lineRule="auto"/>
+              <w:jc w:val="left"/>
+            </w:pPr>
+            <w:r>
+              <w:rPr>
+                <w:rFonts w:ascii="Arial" w:hAnsi="Arial" w:eastAsia="PingFang SC"/>
+                <w:b w:val="0"/>
+                <w:color w:val="17212B"/>
+                <w:sz w:val="15"/>
+              </w:rPr>
+              <w:t>r010</w:t>
+            </w:r>
+          </w:p>
+        </w:tc>
+        <w:tc>
+          <w:tcPr>
+            <w:tcW w:type="dxa" w:w="1361"/>
+            <w:vAlign w:val="center"/>
+            <w:shd w:fill="F2F6FA"/>
+            <w:tcMar>
+              <w:top w:w="95" w:type="dxa"/>
+              <w:bottom w:w="95" w:type="dxa"/>
+              <w:start w:w="90" w:type="dxa"/>
+              <w:end w:w="90" w:type="dxa"/>
+            </w:tcMar>
+          </w:tcPr>
+          <w:p>
+            <w:pPr>
+              <w:spacing w:after="0" w:line="259" w:lineRule="auto"/>
+              <w:jc w:val="center"/>
+            </w:pPr>
+            <w:r>
+              <w:rPr>
+                <w:rFonts w:ascii="Arial" w:hAnsi="Arial" w:eastAsia="PingFang SC"/>
+                <w:b w:val="0"/>
+                <w:color w:val="17212B"/>
+                <w:sz w:val="15"/>
+              </w:rPr>
+              <w:t>crop</w:t>
+            </w:r>
+          </w:p>
+        </w:tc>
+        <w:tc>
+          <w:tcPr>
+            <w:tcW w:type="dxa" w:w="1417"/>
+            <w:vAlign w:val="center"/>
+            <w:shd w:fill="F2F6FA"/>
+            <w:tcMar>
+              <w:top w:w="95" w:type="dxa"/>
+              <w:bottom w:w="95" w:type="dxa"/>
+              <w:start w:w="90" w:type="dxa"/>
+              <w:end w:w="90" w:type="dxa"/>
+            </w:tcMar>
+          </w:tcPr>
+          <w:p>
+            <w:pPr>
+              <w:spacing w:after="0" w:line="259" w:lineRule="auto"/>
+              <w:jc w:val="center"/>
+            </w:pPr>
+            <w:r>
+              <w:rPr>
+                <w:rFonts w:ascii="Arial" w:hAnsi="Arial" w:eastAsia="PingFang SC"/>
+                <w:b w:val="0"/>
+                <w:color w:val="17212B"/>
+                <w:sz w:val="15"/>
+              </w:rPr>
+              <w:t>0.527</w:t>
+            </w:r>
+          </w:p>
+        </w:tc>
+        <w:tc>
+          <w:tcPr>
+            <w:tcW w:type="dxa" w:w="1417"/>
+            <w:vAlign w:val="center"/>
+            <w:shd w:fill="F2F6FA"/>
+            <w:tcMar>
+              <w:top w:w="95" w:type="dxa"/>
+              <w:bottom w:w="95" w:type="dxa"/>
+              <w:start w:w="90" w:type="dxa"/>
+              <w:end w:w="90" w:type="dxa"/>
+            </w:tcMar>
+          </w:tcPr>
+          <w:p>
+            <w:pPr>
+              <w:spacing w:after="0" w:line="259" w:lineRule="auto"/>
+              <w:jc w:val="center"/>
+            </w:pPr>
+            <w:r>
+              <w:rPr>
+                <w:rFonts w:ascii="Arial" w:hAnsi="Arial" w:eastAsia="PingFang SC"/>
+                <w:b w:val="0"/>
+                <w:color w:val="17212B"/>
+                <w:sz w:val="15"/>
+              </w:rPr>
+              <w:t>0.652</w:t>
+            </w:r>
+          </w:p>
+        </w:tc>
+        <w:tc>
+          <w:tcPr>
+            <w:tcW w:type="dxa" w:w="1757"/>
+            <w:vAlign w:val="center"/>
+            <w:shd w:fill="F2F6FA"/>
+            <w:tcMar>
+              <w:top w:w="95" w:type="dxa"/>
+              <w:bottom w:w="95" w:type="dxa"/>
+              <w:start w:w="90" w:type="dxa"/>
+              <w:end w:w="90" w:type="dxa"/>
+            </w:tcMar>
+          </w:tcPr>
+          <w:p>
+            <w:pPr>
+              <w:spacing w:after="0" w:line="259" w:lineRule="auto"/>
+              <w:jc w:val="center"/>
+            </w:pPr>
+            <w:r>
+              <w:rPr>
+                <w:rFonts w:ascii="Arial" w:hAnsi="Arial" w:eastAsia="PingFang SC"/>
+                <w:b w:val="0"/>
+                <w:color w:val="17212B"/>
+                <w:sz w:val="15"/>
+              </w:rPr>
+              <w:t>0.601</w:t>
+            </w:r>
+          </w:p>
+        </w:tc>
+        <w:tc>
+          <w:tcPr>
+            <w:tcW w:type="dxa" w:w="2268"/>
+            <w:vAlign w:val="center"/>
+            <w:shd w:fill="F2F6FA"/>
+            <w:tcMar>
+              <w:top w:w="95" w:type="dxa"/>
+              <w:bottom w:w="95" w:type="dxa"/>
+              <w:start w:w="90" w:type="dxa"/>
+              <w:end w:w="90" w:type="dxa"/>
+            </w:tcMar>
+          </w:tcPr>
+          <w:p>
+            <w:pPr>
+              <w:spacing w:after="0" w:line="259" w:lineRule="auto"/>
+              <w:jc w:val="center"/>
+            </w:pPr>
+            <w:r>
+              <w:rPr>
+                <w:rFonts w:ascii="Arial" w:hAnsi="Arial" w:eastAsia="PingFang SC"/>
+                <w:b w:val="0"/>
+                <w:color w:val="17212B"/>
+                <w:sz w:val="15"/>
+              </w:rPr>
+              <w:t>0.376</w:t>
+            </w:r>
+          </w:p>
+        </w:tc>
+      </w:tr>
+      <w:tr>
+        <w:trPr>
+          <w:cantSplit/>
+        </w:trPr>
+        <w:tc>
+          <w:tcPr>
+            <w:tcW w:type="dxa" w:w="1361"/>
+            <w:vAlign w:val="center"/>
+            <w:tcMar>
+              <w:top w:w="95" w:type="dxa"/>
+              <w:bottom w:w="95" w:type="dxa"/>
+              <w:start w:w="90" w:type="dxa"/>
+              <w:end w:w="90" w:type="dxa"/>
+            </w:tcMar>
+          </w:tcPr>
+          <w:p>
+            <w:pPr>
+              <w:spacing w:after="0" w:line="259" w:lineRule="auto"/>
+              <w:jc w:val="left"/>
+            </w:pPr>
+            <w:r>
+              <w:rPr>
+                <w:rFonts w:ascii="Arial" w:hAnsi="Arial" w:eastAsia="PingFang SC"/>
+                <w:b w:val="0"/>
+                <w:color w:val="17212B"/>
+                <w:sz w:val="15"/>
+              </w:rPr>
+              <w:t>r010</w:t>
+            </w:r>
+          </w:p>
+        </w:tc>
+        <w:tc>
+          <w:tcPr>
+            <w:tcW w:type="dxa" w:w="1361"/>
+            <w:vAlign w:val="center"/>
+            <w:tcMar>
+              <w:top w:w="95" w:type="dxa"/>
+              <w:bottom w:w="95" w:type="dxa"/>
+              <w:start w:w="90" w:type="dxa"/>
+              <w:end w:w="90" w:type="dxa"/>
+            </w:tcMar>
+          </w:tcPr>
+          <w:p>
+            <w:pPr>
+              <w:spacing w:after="0" w:line="259" w:lineRule="auto"/>
+              <w:jc w:val="center"/>
+            </w:pPr>
+            <w:r>
+              <w:rPr>
+                <w:rFonts w:ascii="Arial" w:hAnsi="Arial" w:eastAsia="PingFang SC"/>
+                <w:b w:val="0"/>
+                <w:color w:val="17212B"/>
+                <w:sz w:val="15"/>
+              </w:rPr>
+              <w:t>weed</w:t>
+            </w:r>
+          </w:p>
+        </w:tc>
+        <w:tc>
+          <w:tcPr>
+            <w:tcW w:type="dxa" w:w="1417"/>
+            <w:vAlign w:val="center"/>
+            <w:tcMar>
+              <w:top w:w="95" w:type="dxa"/>
+              <w:bottom w:w="95" w:type="dxa"/>
+              <w:start w:w="90" w:type="dxa"/>
+              <w:end w:w="90" w:type="dxa"/>
+            </w:tcMar>
+          </w:tcPr>
+          <w:p>
+            <w:pPr>
+              <w:spacing w:after="0" w:line="259" w:lineRule="auto"/>
+              <w:jc w:val="center"/>
+            </w:pPr>
+            <w:r>
+              <w:rPr>
+                <w:rFonts w:ascii="Arial" w:hAnsi="Arial" w:eastAsia="PingFang SC"/>
+                <w:b w:val="0"/>
+                <w:color w:val="17212B"/>
+                <w:sz w:val="15"/>
+              </w:rPr>
+              <w:t>0.482</w:t>
+            </w:r>
+          </w:p>
+        </w:tc>
+        <w:tc>
+          <w:tcPr>
+            <w:tcW w:type="dxa" w:w="1417"/>
+            <w:vAlign w:val="center"/>
+            <w:tcMar>
+              <w:top w:w="95" w:type="dxa"/>
+              <w:bottom w:w="95" w:type="dxa"/>
+              <w:start w:w="90" w:type="dxa"/>
+              <w:end w:w="90" w:type="dxa"/>
+            </w:tcMar>
+          </w:tcPr>
+          <w:p>
+            <w:pPr>
+              <w:spacing w:after="0" w:line="259" w:lineRule="auto"/>
+              <w:jc w:val="center"/>
+            </w:pPr>
+            <w:r>
+              <w:rPr>
+                <w:rFonts w:ascii="Arial" w:hAnsi="Arial" w:eastAsia="PingFang SC"/>
+                <w:b w:val="0"/>
+                <w:color w:val="17212B"/>
+                <w:sz w:val="15"/>
+              </w:rPr>
+              <w:t>0.530</w:t>
+            </w:r>
+          </w:p>
+        </w:tc>
+        <w:tc>
+          <w:tcPr>
+            <w:tcW w:type="dxa" w:w="1757"/>
+            <w:vAlign w:val="center"/>
+            <w:tcMar>
+              <w:top w:w="95" w:type="dxa"/>
+              <w:bottom w:w="95" w:type="dxa"/>
+              <w:start w:w="90" w:type="dxa"/>
+              <w:end w:w="90" w:type="dxa"/>
+            </w:tcMar>
+          </w:tcPr>
+          <w:p>
+            <w:pPr>
+              <w:spacing w:after="0" w:line="259" w:lineRule="auto"/>
+              <w:jc w:val="center"/>
+            </w:pPr>
+            <w:r>
+              <w:rPr>
+                <w:rFonts w:ascii="Arial" w:hAnsi="Arial" w:eastAsia="PingFang SC"/>
+                <w:b w:val="0"/>
+                <w:color w:val="17212B"/>
+                <w:sz w:val="15"/>
+              </w:rPr>
+              <w:t>0.460</w:t>
+            </w:r>
+          </w:p>
+        </w:tc>
+        <w:tc>
+          <w:tcPr>
+            <w:tcW w:type="dxa" w:w="2268"/>
+            <w:vAlign w:val="center"/>
+            <w:tcMar>
+              <w:top w:w="95" w:type="dxa"/>
+              <w:bottom w:w="95" w:type="dxa"/>
+              <w:start w:w="90" w:type="dxa"/>
+              <w:end w:w="90" w:type="dxa"/>
+            </w:tcMar>
+          </w:tcPr>
+          <w:p>
+            <w:pPr>
+              <w:spacing w:after="0" w:line="259" w:lineRule="auto"/>
+              <w:jc w:val="center"/>
+            </w:pPr>
+            <w:r>
+              <w:rPr>
+                <w:rFonts w:ascii="Arial" w:hAnsi="Arial" w:eastAsia="PingFang SC"/>
+                <w:b w:val="0"/>
+                <w:color w:val="17212B"/>
+                <w:sz w:val="15"/>
               </w:rPr>
               <w:t>0.215</w:t>
             </w:r>
@@ -6633,7 +8225,7 @@
     </w:p>
     <w:p>
       <w:r>
-        <w:t>r010 的 weed mAP50 和 mAP50-95 分别提高 0.003，weed recall 下降 0.008。提升幅度有限；r010 可作为当前 YOLO 候选设置，但不能认为它显著优于 r020。</w:t>
+        <w:t>相对 r020，r010 的 weed mAP50 和 mAP50-95 均提高 0.003，weed recall 下降 0.008。r015 的 all mAP50 与 r010 几乎持平、mAP50-95 略高，但 weed recall 和 weed mAP 均低于 r010。综合整体与 weed 指标，r010 保留为当前最佳过滤设置；三组差异很小，不能声称过滤阈值带来显著提升。</w:t>
       </w:r>
     </w:p>
     <w:p>
@@ -6641,7 +8233,7 @@
         <w:pStyle w:val="Heading1"/>
       </w:pPr>
       <w:r>
-        <w:t>14 YOLO weed-only 与 crop+weed 对照</w:t>
+        <w:t>15 YOLO weed-only 与 crop+weed 对照</w:t>
       </w:r>
     </w:p>
     <w:p>
@@ -7110,7 +8702,7 @@
     </w:p>
     <w:p>
       <w:r>
-        <w:t>当前设置下，weed-only 的四项 weed 指标均未超过 crop+weed。保留 crop 类可能有助于模型学习作物行结构以及 weed/crop 区分；这一解释尚需进一步验证。</w:t>
+        <w:t>当前数据构建方式、YOLOv8n、5 epochs、seed=0 条件下，weed-only 的四项 weed 指标均未超过 crop+weed。保留 crop 类可能有助于模型学习作物行结构以及 weed/crop 区分，但这不构成对 weed-only 路线的最终否定；crop+weed r010 作为主要检测设置，weed-only r010 作为对照记录。</w:t>
       </w:r>
     </w:p>
     <w:p>
@@ -7118,17 +8710,17 @@
         <w:pStyle w:val="Heading1"/>
       </w:pPr>
       <w:r>
-        <w:t>15 YOLO 预测可视化与 confidence threshold</w:t>
+        <w:t>16 YOLO 预测可视化与 confidence threshold</w:t>
       </w:r>
     </w:p>
     <w:p>
       <w:r>
-        <w:t>visualize_yolo_predictions.py 用于比较 crop+weed r010 与 weed-only r010 在同一 validation sample 上的 ground truth 和预测框。sample index=0 的可视化中，crop+weed r010 的预测框数量更克制、输出更干净；weed-only r010 更容易产生密集 weed 候选框。这是单张样本的定性观察，整体效果仍以验证集指标为准。</w:t>
+        <w:t>visualize_yolo_predictions.py 在同一 validation sample（sample index=0）上并列展示 RGB、crop+weed r010 ground truth/prediction、weed-only r010 ground truth/prediction。crop+weed r010 的预测框相对更克制，weed-only r010 更容易产生密集候选框或重复框。该观察仅来自单张样本，不能替代整体验证集指标。</w:t>
       </w:r>
     </w:p>
     <w:p>
       <w:r>
-        <w:t>将 conf threshold 从 0.25 提高到 0.40 后，低置信度预测框减少，可视化更干净。提高 conf 可能减少误检，也可能增加漏检，因此不能直接认为 0.40 是最优阈值。conf filtering 与 NMS 均在推理后处理阶段执行，不改变 backbone 或数据集 bbox 过滤规则。</w:t>
+        <w:t>将 confidence threshold 从 0.25 提高到 0.40 后，低置信度框明显减少，展示更干净；但提高阈值也可能增加漏检，不能把 0.40 直接解释为最佳部署阈值。confidence filtering 与 NMS 均属于推理后处理，不改变 backbone、训练结果或数据集 bbox 过滤规则。</w:t>
       </w:r>
     </w:p>
     <w:p>
@@ -7136,7 +8728,7 @@
         <w:pStyle w:val="Heading1"/>
       </w:pPr>
       <w:r>
-        <w:t>16 YOLO Post-processing Threshold Analysis</w:t>
+        <w:t>17 YOLO Post-processing Threshold Analysis</w:t>
       </w:r>
     </w:p>
     <w:p>
@@ -8303,7 +9895,20 @@
     </w:p>
     <w:p>
       <w:r>
-        <w:t>限制：该分析只统计预测框数量和平均置信度，没有直接计算 TP、FP、FN。因此不能说明 conf=0.40 是最终最优阈值。最终阈值仍需要结合人工可视化、PR/F1 曲线或验证集 detection metrics 判断。</w:t>
+        <w:t>限制：前 20 张图分析只统计预测框数量和平均置信度，没有直接计算 TP、FP、FN，因此不能说明 conf=0.40 是最终最优阈值。</w:t>
+      </w:r>
+    </w:p>
+    <w:p>
+      <w:pPr>
+        <w:pStyle w:val="Heading2"/>
+      </w:pPr>
+      <w:r>
+        <w:t>完整验证集 PR F1 sweep</w:t>
+      </w:r>
+    </w:p>
+    <w:p>
+      <w:r>
+        <w:t>r010 best checkpoint 的平均 F1 在 conf≈0.164 达到最高值 0.544；crop 与 weed 的最佳 F1 阈值分别约为 0.164 和 0.169。conf=0.25/0.30/0.40/0.50 的平均 F1 分别为 0.509、0.466、0.364、0.247。conf=0.40 的平均 precision 约 0.747，但平均 recall 仅约 0.241，因此只适合作为干净展示候选；需要平衡 precision/recall 时应从 conf≈0.16 开始，再结合误喷与漏喷成本校准。当前 CPU 完整验证 inference 约为 10.4 ms/image。</w:t>
       </w:r>
     </w:p>
     <w:p>
@@ -8311,12 +9916,20 @@
         <w:pStyle w:val="Heading1"/>
       </w:pPr>
       <w:r>
-        <w:t>17 当前 YOLO 阶段结论与后续规划</w:t>
+        <w:t>18 YOLO lightweight baseline 与 MobileNetV3 优化</w:t>
+      </w:r>
+    </w:p>
+    <w:p>
+      <w:pPr>
+        <w:pStyle w:val="Heading2"/>
+      </w:pPr>
+      <w:r>
+        <w:t>YOLOv8n lightweight baseline metrics</w:t>
       </w:r>
     </w:p>
     <w:p>
       <w:r>
-        <w:t>当前最佳 YOLO 检测 baseline 为 YOLOv8n crop+weed r010。以下为验证集 all-class detection metrics 及模型规模，后续可作为 MobileNetV3-YOLOv8n 轻量化研究的对照基线。</w:t>
+        <w:t>下表汇总四个 5 epochs runs。检测指标取 results.csv 最后一轮 all-class 值，Params、GFLOPs（imgsz=480）和 model size 取 best.pt；crop+weed 与 weed-only 的类别口径不同，不宜直接用 all-class 指标比较检测效果。</w:t>
       </w:r>
     </w:p>
     <w:tbl>
@@ -8335,13 +9948,15 @@
         </w:tblBorders>
       </w:tblPr>
       <w:tblGrid>
-        <w:gridCol w:w="1304"/>
-        <w:gridCol w:w="1304"/>
-        <w:gridCol w:w="1247"/>
         <w:gridCol w:w="1474"/>
-        <w:gridCol w:w="1361"/>
-        <w:gridCol w:w="1304"/>
-        <w:gridCol w:w="1644"/>
+        <w:gridCol w:w="1077"/>
+        <w:gridCol w:w="794"/>
+        <w:gridCol w:w="794"/>
+        <w:gridCol w:w="964"/>
+        <w:gridCol w:w="1134"/>
+        <w:gridCol w:w="1191"/>
+        <w:gridCol w:w="907"/>
+        <w:gridCol w:w="1134"/>
       </w:tblGrid>
       <w:tr>
         <w:trPr>
@@ -8350,7 +9965,7 @@
         </w:trPr>
         <w:tc>
           <w:tcPr>
-            <w:tcW w:type="dxa" w:w="1304"/>
+            <w:tcW w:type="dxa" w:w="1474"/>
             <w:vAlign w:val="center"/>
             <w:shd w:fill="213B58"/>
             <w:tcMar>
@@ -8370,15 +9985,15 @@
                 <w:rFonts w:ascii="Arial" w:hAnsi="Arial" w:eastAsia="PingFang SC"/>
                 <w:b/>
                 <w:color w:val="FFFFFF"/>
-                <w:sz w:val="15"/>
-              </w:rPr>
-              <w:t>Precision</w:t>
-            </w:r>
-          </w:p>
-        </w:tc>
-        <w:tc>
-          <w:tcPr>
-            <w:tcW w:type="dxa" w:w="1304"/>
+                <w:sz w:val="13"/>
+              </w:rPr>
+              <w:t>Run</w:t>
+            </w:r>
+          </w:p>
+        </w:tc>
+        <w:tc>
+          <w:tcPr>
+            <w:tcW w:type="dxa" w:w="1077"/>
             <w:vAlign w:val="center"/>
             <w:shd w:fill="213B58"/>
             <w:tcMar>
@@ -8398,15 +10013,15 @@
                 <w:rFonts w:ascii="Arial" w:hAnsi="Arial" w:eastAsia="PingFang SC"/>
                 <w:b/>
                 <w:color w:val="FFFFFF"/>
-                <w:sz w:val="15"/>
-              </w:rPr>
-              <w:t>Recall</w:t>
-            </w:r>
-          </w:p>
-        </w:tc>
-        <w:tc>
-          <w:tcPr>
-            <w:tcW w:type="dxa" w:w="1247"/>
+                <w:sz w:val="13"/>
+              </w:rPr>
+              <w:t>类别</w:t>
+            </w:r>
+          </w:p>
+        </w:tc>
+        <w:tc>
+          <w:tcPr>
+            <w:tcW w:type="dxa" w:w="794"/>
             <w:vAlign w:val="center"/>
             <w:shd w:fill="213B58"/>
             <w:tcMar>
@@ -8426,15 +10041,15 @@
                 <w:rFonts w:ascii="Arial" w:hAnsi="Arial" w:eastAsia="PingFang SC"/>
                 <w:b/>
                 <w:color w:val="FFFFFF"/>
-                <w:sz w:val="15"/>
-              </w:rPr>
-              <w:t>mAP50</w:t>
-            </w:r>
-          </w:p>
-        </w:tc>
-        <w:tc>
-          <w:tcPr>
-            <w:tcW w:type="dxa" w:w="1474"/>
+                <w:sz w:val="13"/>
+              </w:rPr>
+              <w:t>P</w:t>
+            </w:r>
+          </w:p>
+        </w:tc>
+        <w:tc>
+          <w:tcPr>
+            <w:tcW w:type="dxa" w:w="794"/>
             <w:vAlign w:val="center"/>
             <w:shd w:fill="213B58"/>
             <w:tcMar>
@@ -8454,15 +10069,15 @@
                 <w:rFonts w:ascii="Arial" w:hAnsi="Arial" w:eastAsia="PingFang SC"/>
                 <w:b/>
                 <w:color w:val="FFFFFF"/>
-                <w:sz w:val="15"/>
-              </w:rPr>
-              <w:t>mAP50-95</w:t>
-            </w:r>
-          </w:p>
-        </w:tc>
-        <w:tc>
-          <w:tcPr>
-            <w:tcW w:type="dxa" w:w="1361"/>
+                <w:sz w:val="13"/>
+              </w:rPr>
+              <w:t>R</w:t>
+            </w:r>
+          </w:p>
+        </w:tc>
+        <w:tc>
+          <w:tcPr>
+            <w:tcW w:type="dxa" w:w="964"/>
             <w:vAlign w:val="center"/>
             <w:shd w:fill="213B58"/>
             <w:tcMar>
@@ -8482,15 +10097,15 @@
                 <w:rFonts w:ascii="Arial" w:hAnsi="Arial" w:eastAsia="PingFang SC"/>
                 <w:b/>
                 <w:color w:val="FFFFFF"/>
-                <w:sz w:val="15"/>
-              </w:rPr>
-              <w:t>Params</w:t>
-            </w:r>
-          </w:p>
-        </w:tc>
-        <w:tc>
-          <w:tcPr>
-            <w:tcW w:type="dxa" w:w="1304"/>
+                <w:sz w:val="13"/>
+              </w:rPr>
+              <w:t>mAP50</w:t>
+            </w:r>
+          </w:p>
+        </w:tc>
+        <w:tc>
+          <w:tcPr>
+            <w:tcW w:type="dxa" w:w="1134"/>
             <w:vAlign w:val="center"/>
             <w:shd w:fill="213B58"/>
             <w:tcMar>
@@ -8510,15 +10125,15 @@
                 <w:rFonts w:ascii="Arial" w:hAnsi="Arial" w:eastAsia="PingFang SC"/>
                 <w:b/>
                 <w:color w:val="FFFFFF"/>
-                <w:sz w:val="15"/>
-              </w:rPr>
-              <w:t>GFLOPs</w:t>
-            </w:r>
-          </w:p>
-        </w:tc>
-        <w:tc>
-          <w:tcPr>
-            <w:tcW w:type="dxa" w:w="1644"/>
+                <w:sz w:val="13"/>
+              </w:rPr>
+              <w:t>mAP50-95</w:t>
+            </w:r>
+          </w:p>
+        </w:tc>
+        <w:tc>
+          <w:tcPr>
+            <w:tcW w:type="dxa" w:w="1191"/>
             <w:vAlign w:val="center"/>
             <w:shd w:fill="213B58"/>
             <w:tcMar>
@@ -8538,9 +10153,65 @@
                 <w:rFonts w:ascii="Arial" w:hAnsi="Arial" w:eastAsia="PingFang SC"/>
                 <w:b/>
                 <w:color w:val="FFFFFF"/>
-                <w:sz w:val="15"/>
-              </w:rPr>
-              <w:t>Model size</w:t>
+                <w:sz w:val="13"/>
+              </w:rPr>
+              <w:t>Params</w:t>
+            </w:r>
+          </w:p>
+        </w:tc>
+        <w:tc>
+          <w:tcPr>
+            <w:tcW w:type="dxa" w:w="907"/>
+            <w:vAlign w:val="center"/>
+            <w:shd w:fill="213B58"/>
+            <w:tcMar>
+              <w:top w:w="95" w:type="dxa"/>
+              <w:bottom w:w="95" w:type="dxa"/>
+              <w:start w:w="90" w:type="dxa"/>
+              <w:end w:w="90" w:type="dxa"/>
+            </w:tcMar>
+          </w:tcPr>
+          <w:p>
+            <w:pPr>
+              <w:spacing w:after="0" w:line="259" w:lineRule="auto"/>
+              <w:jc w:val="center"/>
+            </w:pPr>
+            <w:r>
+              <w:rPr>
+                <w:rFonts w:ascii="Arial" w:hAnsi="Arial" w:eastAsia="PingFang SC"/>
+                <w:b/>
+                <w:color w:val="FFFFFF"/>
+                <w:sz w:val="13"/>
+              </w:rPr>
+              <w:t>GFLOPs</w:t>
+            </w:r>
+          </w:p>
+        </w:tc>
+        <w:tc>
+          <w:tcPr>
+            <w:tcW w:type="dxa" w:w="1134"/>
+            <w:vAlign w:val="center"/>
+            <w:shd w:fill="213B58"/>
+            <w:tcMar>
+              <w:top w:w="95" w:type="dxa"/>
+              <w:bottom w:w="95" w:type="dxa"/>
+              <w:start w:w="90" w:type="dxa"/>
+              <w:end w:w="90" w:type="dxa"/>
+            </w:tcMar>
+          </w:tcPr>
+          <w:p>
+            <w:pPr>
+              <w:spacing w:after="0" w:line="259" w:lineRule="auto"/>
+              <w:jc w:val="center"/>
+            </w:pPr>
+            <w:r>
+              <w:rPr>
+                <w:rFonts w:ascii="Arial" w:hAnsi="Arial" w:eastAsia="PingFang SC"/>
+                <w:b/>
+                <w:color w:val="FFFFFF"/>
+                <w:sz w:val="13"/>
+              </w:rPr>
+              <w:t>Size</w:t>
             </w:r>
           </w:p>
         </w:tc>
@@ -8551,7 +10222,7 @@
         </w:trPr>
         <w:tc>
           <w:tcPr>
-            <w:tcW w:type="dxa" w:w="1304"/>
+            <w:tcW w:type="dxa" w:w="1474"/>
             <w:vAlign w:val="center"/>
             <w:tcMar>
               <w:top w:w="95" w:type="dxa"/>
@@ -8570,15 +10241,15 @@
                 <w:rFonts w:ascii="Arial" w:hAnsi="Arial" w:eastAsia="PingFang SC"/>
                 <w:b w:val="0"/>
                 <w:color w:val="17212B"/>
-                <w:sz w:val="15"/>
-              </w:rPr>
-              <w:t>0.50539</w:t>
-            </w:r>
-          </w:p>
-        </w:tc>
-        <w:tc>
-          <w:tcPr>
-            <w:tcW w:type="dxa" w:w="1304"/>
+                <w:sz w:val="13"/>
+              </w:rPr>
+              <w:t>r020</w:t>
+            </w:r>
+          </w:p>
+        </w:tc>
+        <w:tc>
+          <w:tcPr>
+            <w:tcW w:type="dxa" w:w="1077"/>
             <w:vAlign w:val="center"/>
             <w:tcMar>
               <w:top w:w="95" w:type="dxa"/>
@@ -8597,15 +10268,15 @@
                 <w:rFonts w:ascii="Arial" w:hAnsi="Arial" w:eastAsia="PingFang SC"/>
                 <w:b w:val="0"/>
                 <w:color w:val="17212B"/>
-                <w:sz w:val="15"/>
-              </w:rPr>
-              <w:t>0.58950</w:t>
-            </w:r>
-          </w:p>
-        </w:tc>
-        <w:tc>
-          <w:tcPr>
-            <w:tcW w:type="dxa" w:w="1247"/>
+                <w:sz w:val="13"/>
+              </w:rPr>
+              <w:t>crop+weed</w:t>
+            </w:r>
+          </w:p>
+        </w:tc>
+        <w:tc>
+          <w:tcPr>
+            <w:tcW w:type="dxa" w:w="794"/>
             <w:vAlign w:val="center"/>
             <w:tcMar>
               <w:top w:w="95" w:type="dxa"/>
@@ -8624,15 +10295,15 @@
                 <w:rFonts w:ascii="Arial" w:hAnsi="Arial" w:eastAsia="PingFang SC"/>
                 <w:b w:val="0"/>
                 <w:color w:val="17212B"/>
-                <w:sz w:val="15"/>
-              </w:rPr>
-              <w:t>0.53062</w:t>
-            </w:r>
-          </w:p>
-        </w:tc>
-        <w:tc>
-          <w:tcPr>
-            <w:tcW w:type="dxa" w:w="1474"/>
+                <w:sz w:val="13"/>
+              </w:rPr>
+              <w:t>0.49736</w:t>
+            </w:r>
+          </w:p>
+        </w:tc>
+        <w:tc>
+          <w:tcPr>
+            <w:tcW w:type="dxa" w:w="794"/>
             <w:vAlign w:val="center"/>
             <w:tcMar>
               <w:top w:w="95" w:type="dxa"/>
@@ -8651,15 +10322,15 @@
                 <w:rFonts w:ascii="Arial" w:hAnsi="Arial" w:eastAsia="PingFang SC"/>
                 <w:b w:val="0"/>
                 <w:color w:val="17212B"/>
-                <w:sz w:val="15"/>
-              </w:rPr>
-              <w:t>0.29557</w:t>
-            </w:r>
-          </w:p>
-        </w:tc>
-        <w:tc>
-          <w:tcPr>
-            <w:tcW w:type="dxa" w:w="1361"/>
+                <w:sz w:val="13"/>
+              </w:rPr>
+              <w:t>0.59299</w:t>
+            </w:r>
+          </w:p>
+        </w:tc>
+        <w:tc>
+          <w:tcPr>
+            <w:tcW w:type="dxa" w:w="964"/>
             <w:vAlign w:val="center"/>
             <w:tcMar>
               <w:top w:w="95" w:type="dxa"/>
@@ -8678,15 +10349,15 @@
                 <w:rFonts w:ascii="Arial" w:hAnsi="Arial" w:eastAsia="PingFang SC"/>
                 <w:b w:val="0"/>
                 <w:color w:val="17212B"/>
-                <w:sz w:val="15"/>
-              </w:rPr>
-              <w:t>≈ 3.01M</w:t>
-            </w:r>
-          </w:p>
-        </w:tc>
-        <w:tc>
-          <w:tcPr>
-            <w:tcW w:type="dxa" w:w="1304"/>
+                <w:sz w:val="13"/>
+              </w:rPr>
+              <w:t>0.52611</w:t>
+            </w:r>
+          </w:p>
+        </w:tc>
+        <w:tc>
+          <w:tcPr>
+            <w:tcW w:type="dxa" w:w="1134"/>
             <w:vAlign w:val="center"/>
             <w:tcMar>
               <w:top w:w="95" w:type="dxa"/>
@@ -8705,15 +10376,15 @@
                 <w:rFonts w:ascii="Arial" w:hAnsi="Arial" w:eastAsia="PingFang SC"/>
                 <w:b w:val="0"/>
                 <w:color w:val="17212B"/>
-                <w:sz w:val="15"/>
-              </w:rPr>
-              <w:t>≈ 4.61</w:t>
-            </w:r>
-          </w:p>
-        </w:tc>
-        <w:tc>
-          <w:tcPr>
-            <w:tcW w:type="dxa" w:w="1644"/>
+                <w:sz w:val="13"/>
+              </w:rPr>
+              <w:t>0.29074</w:t>
+            </w:r>
+          </w:p>
+        </w:tc>
+        <w:tc>
+          <w:tcPr>
+            <w:tcW w:type="dxa" w:w="1191"/>
             <w:vAlign w:val="center"/>
             <w:tcMar>
               <w:top w:w="95" w:type="dxa"/>
@@ -8732,9 +10403,825 @@
                 <w:rFonts w:ascii="Arial" w:hAnsi="Arial" w:eastAsia="PingFang SC"/>
                 <w:b w:val="0"/>
                 <w:color w:val="17212B"/>
-                <w:sz w:val="15"/>
-              </w:rPr>
-              <w:t>≈ 6.21 MB</w:t>
+                <w:sz w:val="13"/>
+              </w:rPr>
+              <w:t>3,011,238</w:t>
+            </w:r>
+          </w:p>
+        </w:tc>
+        <w:tc>
+          <w:tcPr>
+            <w:tcW w:type="dxa" w:w="907"/>
+            <w:vAlign w:val="center"/>
+            <w:tcMar>
+              <w:top w:w="95" w:type="dxa"/>
+              <w:bottom w:w="95" w:type="dxa"/>
+              <w:start w:w="90" w:type="dxa"/>
+              <w:end w:w="90" w:type="dxa"/>
+            </w:tcMar>
+          </w:tcPr>
+          <w:p>
+            <w:pPr>
+              <w:spacing w:after="0" w:line="259" w:lineRule="auto"/>
+              <w:jc w:val="center"/>
+            </w:pPr>
+            <w:r>
+              <w:rPr>
+                <w:rFonts w:ascii="Arial" w:hAnsi="Arial" w:eastAsia="PingFang SC"/>
+                <w:b w:val="0"/>
+                <w:color w:val="17212B"/>
+                <w:sz w:val="13"/>
+              </w:rPr>
+              <w:t>4.6084</w:t>
+            </w:r>
+          </w:p>
+        </w:tc>
+        <w:tc>
+          <w:tcPr>
+            <w:tcW w:type="dxa" w:w="1134"/>
+            <w:vAlign w:val="center"/>
+            <w:tcMar>
+              <w:top w:w="95" w:type="dxa"/>
+              <w:bottom w:w="95" w:type="dxa"/>
+              <w:start w:w="90" w:type="dxa"/>
+              <w:end w:w="90" w:type="dxa"/>
+            </w:tcMar>
+          </w:tcPr>
+          <w:p>
+            <w:pPr>
+              <w:spacing w:after="0" w:line="259" w:lineRule="auto"/>
+              <w:jc w:val="center"/>
+            </w:pPr>
+            <w:r>
+              <w:rPr>
+                <w:rFonts w:ascii="Arial" w:hAnsi="Arial" w:eastAsia="PingFang SC"/>
+                <w:b w:val="0"/>
+                <w:color w:val="17212B"/>
+                <w:sz w:val="13"/>
+              </w:rPr>
+              <w:t>6.214 MB</w:t>
+            </w:r>
+          </w:p>
+        </w:tc>
+      </w:tr>
+      <w:tr>
+        <w:trPr>
+          <w:cantSplit/>
+        </w:trPr>
+        <w:tc>
+          <w:tcPr>
+            <w:tcW w:type="dxa" w:w="1474"/>
+            <w:vAlign w:val="center"/>
+            <w:shd w:fill="F2F6FA"/>
+            <w:tcMar>
+              <w:top w:w="95" w:type="dxa"/>
+              <w:bottom w:w="95" w:type="dxa"/>
+              <w:start w:w="90" w:type="dxa"/>
+              <w:end w:w="90" w:type="dxa"/>
+            </w:tcMar>
+          </w:tcPr>
+          <w:p>
+            <w:pPr>
+              <w:spacing w:after="0" w:line="259" w:lineRule="auto"/>
+              <w:jc w:val="left"/>
+            </w:pPr>
+            <w:r>
+              <w:rPr>
+                <w:rFonts w:ascii="Arial" w:hAnsi="Arial" w:eastAsia="PingFang SC"/>
+                <w:b w:val="0"/>
+                <w:color w:val="17212B"/>
+                <w:sz w:val="13"/>
+              </w:rPr>
+              <w:t>r015</w:t>
+            </w:r>
+          </w:p>
+        </w:tc>
+        <w:tc>
+          <w:tcPr>
+            <w:tcW w:type="dxa" w:w="1077"/>
+            <w:vAlign w:val="center"/>
+            <w:shd w:fill="F2F6FA"/>
+            <w:tcMar>
+              <w:top w:w="95" w:type="dxa"/>
+              <w:bottom w:w="95" w:type="dxa"/>
+              <w:start w:w="90" w:type="dxa"/>
+              <w:end w:w="90" w:type="dxa"/>
+            </w:tcMar>
+          </w:tcPr>
+          <w:p>
+            <w:pPr>
+              <w:spacing w:after="0" w:line="259" w:lineRule="auto"/>
+              <w:jc w:val="center"/>
+            </w:pPr>
+            <w:r>
+              <w:rPr>
+                <w:rFonts w:ascii="Arial" w:hAnsi="Arial" w:eastAsia="PingFang SC"/>
+                <w:b w:val="0"/>
+                <w:color w:val="17212B"/>
+                <w:sz w:val="13"/>
+              </w:rPr>
+              <w:t>crop+weed</w:t>
+            </w:r>
+          </w:p>
+        </w:tc>
+        <w:tc>
+          <w:tcPr>
+            <w:tcW w:type="dxa" w:w="794"/>
+            <w:vAlign w:val="center"/>
+            <w:shd w:fill="F2F6FA"/>
+            <w:tcMar>
+              <w:top w:w="95" w:type="dxa"/>
+              <w:bottom w:w="95" w:type="dxa"/>
+              <w:start w:w="90" w:type="dxa"/>
+              <w:end w:w="90" w:type="dxa"/>
+            </w:tcMar>
+          </w:tcPr>
+          <w:p>
+            <w:pPr>
+              <w:spacing w:after="0" w:line="259" w:lineRule="auto"/>
+              <w:jc w:val="center"/>
+            </w:pPr>
+            <w:r>
+              <w:rPr>
+                <w:rFonts w:ascii="Arial" w:hAnsi="Arial" w:eastAsia="PingFang SC"/>
+                <w:b w:val="0"/>
+                <w:color w:val="17212B"/>
+                <w:sz w:val="13"/>
+              </w:rPr>
+              <w:t>0.50758</w:t>
+            </w:r>
+          </w:p>
+        </w:tc>
+        <w:tc>
+          <w:tcPr>
+            <w:tcW w:type="dxa" w:w="794"/>
+            <w:vAlign w:val="center"/>
+            <w:shd w:fill="F2F6FA"/>
+            <w:tcMar>
+              <w:top w:w="95" w:type="dxa"/>
+              <w:bottom w:w="95" w:type="dxa"/>
+              <w:start w:w="90" w:type="dxa"/>
+              <w:end w:w="90" w:type="dxa"/>
+            </w:tcMar>
+          </w:tcPr>
+          <w:p>
+            <w:pPr>
+              <w:spacing w:after="0" w:line="259" w:lineRule="auto"/>
+              <w:jc w:val="center"/>
+            </w:pPr>
+            <w:r>
+              <w:rPr>
+                <w:rFonts w:ascii="Arial" w:hAnsi="Arial" w:eastAsia="PingFang SC"/>
+                <w:b w:val="0"/>
+                <w:color w:val="17212B"/>
+                <w:sz w:val="13"/>
+              </w:rPr>
+              <w:t>0.58699</w:t>
+            </w:r>
+          </w:p>
+        </w:tc>
+        <w:tc>
+          <w:tcPr>
+            <w:tcW w:type="dxa" w:w="964"/>
+            <w:vAlign w:val="center"/>
+            <w:shd w:fill="F2F6FA"/>
+            <w:tcMar>
+              <w:top w:w="95" w:type="dxa"/>
+              <w:bottom w:w="95" w:type="dxa"/>
+              <w:start w:w="90" w:type="dxa"/>
+              <w:end w:w="90" w:type="dxa"/>
+            </w:tcMar>
+          </w:tcPr>
+          <w:p>
+            <w:pPr>
+              <w:spacing w:after="0" w:line="259" w:lineRule="auto"/>
+              <w:jc w:val="center"/>
+            </w:pPr>
+            <w:r>
+              <w:rPr>
+                <w:rFonts w:ascii="Arial" w:hAnsi="Arial" w:eastAsia="PingFang SC"/>
+                <w:b w:val="0"/>
+                <w:color w:val="17212B"/>
+                <w:sz w:val="13"/>
+              </w:rPr>
+              <w:t>0.53032</w:t>
+            </w:r>
+          </w:p>
+        </w:tc>
+        <w:tc>
+          <w:tcPr>
+            <w:tcW w:type="dxa" w:w="1134"/>
+            <w:vAlign w:val="center"/>
+            <w:shd w:fill="F2F6FA"/>
+            <w:tcMar>
+              <w:top w:w="95" w:type="dxa"/>
+              <w:bottom w:w="95" w:type="dxa"/>
+              <w:start w:w="90" w:type="dxa"/>
+              <w:end w:w="90" w:type="dxa"/>
+            </w:tcMar>
+          </w:tcPr>
+          <w:p>
+            <w:pPr>
+              <w:spacing w:after="0" w:line="259" w:lineRule="auto"/>
+              <w:jc w:val="center"/>
+            </w:pPr>
+            <w:r>
+              <w:rPr>
+                <w:rFonts w:ascii="Arial" w:hAnsi="Arial" w:eastAsia="PingFang SC"/>
+                <w:b w:val="0"/>
+                <w:color w:val="17212B"/>
+                <w:sz w:val="13"/>
+              </w:rPr>
+              <w:t>0.29651</w:t>
+            </w:r>
+          </w:p>
+        </w:tc>
+        <w:tc>
+          <w:tcPr>
+            <w:tcW w:type="dxa" w:w="1191"/>
+            <w:vAlign w:val="center"/>
+            <w:shd w:fill="F2F6FA"/>
+            <w:tcMar>
+              <w:top w:w="95" w:type="dxa"/>
+              <w:bottom w:w="95" w:type="dxa"/>
+              <w:start w:w="90" w:type="dxa"/>
+              <w:end w:w="90" w:type="dxa"/>
+            </w:tcMar>
+          </w:tcPr>
+          <w:p>
+            <w:pPr>
+              <w:spacing w:after="0" w:line="259" w:lineRule="auto"/>
+              <w:jc w:val="center"/>
+            </w:pPr>
+            <w:r>
+              <w:rPr>
+                <w:rFonts w:ascii="Arial" w:hAnsi="Arial" w:eastAsia="PingFang SC"/>
+                <w:b w:val="0"/>
+                <w:color w:val="17212B"/>
+                <w:sz w:val="13"/>
+              </w:rPr>
+              <w:t>3,011,238</w:t>
+            </w:r>
+          </w:p>
+        </w:tc>
+        <w:tc>
+          <w:tcPr>
+            <w:tcW w:type="dxa" w:w="907"/>
+            <w:vAlign w:val="center"/>
+            <w:shd w:fill="F2F6FA"/>
+            <w:tcMar>
+              <w:top w:w="95" w:type="dxa"/>
+              <w:bottom w:w="95" w:type="dxa"/>
+              <w:start w:w="90" w:type="dxa"/>
+              <w:end w:w="90" w:type="dxa"/>
+            </w:tcMar>
+          </w:tcPr>
+          <w:p>
+            <w:pPr>
+              <w:spacing w:after="0" w:line="259" w:lineRule="auto"/>
+              <w:jc w:val="center"/>
+            </w:pPr>
+            <w:r>
+              <w:rPr>
+                <w:rFonts w:ascii="Arial" w:hAnsi="Arial" w:eastAsia="PingFang SC"/>
+                <w:b w:val="0"/>
+                <w:color w:val="17212B"/>
+                <w:sz w:val="13"/>
+              </w:rPr>
+              <w:t>4.6084</w:t>
+            </w:r>
+          </w:p>
+        </w:tc>
+        <w:tc>
+          <w:tcPr>
+            <w:tcW w:type="dxa" w:w="1134"/>
+            <w:vAlign w:val="center"/>
+            <w:shd w:fill="F2F6FA"/>
+            <w:tcMar>
+              <w:top w:w="95" w:type="dxa"/>
+              <w:bottom w:w="95" w:type="dxa"/>
+              <w:start w:w="90" w:type="dxa"/>
+              <w:end w:w="90" w:type="dxa"/>
+            </w:tcMar>
+          </w:tcPr>
+          <w:p>
+            <w:pPr>
+              <w:spacing w:after="0" w:line="259" w:lineRule="auto"/>
+              <w:jc w:val="center"/>
+            </w:pPr>
+            <w:r>
+              <w:rPr>
+                <w:rFonts w:ascii="Arial" w:hAnsi="Arial" w:eastAsia="PingFang SC"/>
+                <w:b w:val="0"/>
+                <w:color w:val="17212B"/>
+                <w:sz w:val="13"/>
+              </w:rPr>
+              <w:t>6.214 MB</w:t>
+            </w:r>
+          </w:p>
+        </w:tc>
+      </w:tr>
+      <w:tr>
+        <w:trPr>
+          <w:cantSplit/>
+        </w:trPr>
+        <w:tc>
+          <w:tcPr>
+            <w:tcW w:type="dxa" w:w="1474"/>
+            <w:vAlign w:val="center"/>
+            <w:tcMar>
+              <w:top w:w="95" w:type="dxa"/>
+              <w:bottom w:w="95" w:type="dxa"/>
+              <w:start w:w="90" w:type="dxa"/>
+              <w:end w:w="90" w:type="dxa"/>
+            </w:tcMar>
+          </w:tcPr>
+          <w:p>
+            <w:pPr>
+              <w:spacing w:after="0" w:line="259" w:lineRule="auto"/>
+              <w:jc w:val="left"/>
+            </w:pPr>
+            <w:r>
+              <w:rPr>
+                <w:rFonts w:ascii="Arial" w:hAnsi="Arial" w:eastAsia="PingFang SC"/>
+                <w:b w:val="0"/>
+                <w:color w:val="17212B"/>
+                <w:sz w:val="13"/>
+              </w:rPr>
+              <w:t>r010</w:t>
+            </w:r>
+          </w:p>
+        </w:tc>
+        <w:tc>
+          <w:tcPr>
+            <w:tcW w:type="dxa" w:w="1077"/>
+            <w:vAlign w:val="center"/>
+            <w:tcMar>
+              <w:top w:w="95" w:type="dxa"/>
+              <w:bottom w:w="95" w:type="dxa"/>
+              <w:start w:w="90" w:type="dxa"/>
+              <w:end w:w="90" w:type="dxa"/>
+            </w:tcMar>
+          </w:tcPr>
+          <w:p>
+            <w:pPr>
+              <w:spacing w:after="0" w:line="259" w:lineRule="auto"/>
+              <w:jc w:val="center"/>
+            </w:pPr>
+            <w:r>
+              <w:rPr>
+                <w:rFonts w:ascii="Arial" w:hAnsi="Arial" w:eastAsia="PingFang SC"/>
+                <w:b w:val="0"/>
+                <w:color w:val="17212B"/>
+                <w:sz w:val="13"/>
+              </w:rPr>
+              <w:t>crop+weed</w:t>
+            </w:r>
+          </w:p>
+        </w:tc>
+        <w:tc>
+          <w:tcPr>
+            <w:tcW w:type="dxa" w:w="794"/>
+            <w:vAlign w:val="center"/>
+            <w:tcMar>
+              <w:top w:w="95" w:type="dxa"/>
+              <w:bottom w:w="95" w:type="dxa"/>
+              <w:start w:w="90" w:type="dxa"/>
+              <w:end w:w="90" w:type="dxa"/>
+            </w:tcMar>
+          </w:tcPr>
+          <w:p>
+            <w:pPr>
+              <w:spacing w:after="0" w:line="259" w:lineRule="auto"/>
+              <w:jc w:val="center"/>
+            </w:pPr>
+            <w:r>
+              <w:rPr>
+                <w:rFonts w:ascii="Arial" w:hAnsi="Arial" w:eastAsia="PingFang SC"/>
+                <w:b w:val="0"/>
+                <w:color w:val="17212B"/>
+                <w:sz w:val="13"/>
+              </w:rPr>
+              <w:t>0.50539</w:t>
+            </w:r>
+          </w:p>
+        </w:tc>
+        <w:tc>
+          <w:tcPr>
+            <w:tcW w:type="dxa" w:w="794"/>
+            <w:vAlign w:val="center"/>
+            <w:tcMar>
+              <w:top w:w="95" w:type="dxa"/>
+              <w:bottom w:w="95" w:type="dxa"/>
+              <w:start w:w="90" w:type="dxa"/>
+              <w:end w:w="90" w:type="dxa"/>
+            </w:tcMar>
+          </w:tcPr>
+          <w:p>
+            <w:pPr>
+              <w:spacing w:after="0" w:line="259" w:lineRule="auto"/>
+              <w:jc w:val="center"/>
+            </w:pPr>
+            <w:r>
+              <w:rPr>
+                <w:rFonts w:ascii="Arial" w:hAnsi="Arial" w:eastAsia="PingFang SC"/>
+                <w:b w:val="0"/>
+                <w:color w:val="17212B"/>
+                <w:sz w:val="13"/>
+              </w:rPr>
+              <w:t>0.58950</w:t>
+            </w:r>
+          </w:p>
+        </w:tc>
+        <w:tc>
+          <w:tcPr>
+            <w:tcW w:type="dxa" w:w="964"/>
+            <w:vAlign w:val="center"/>
+            <w:tcMar>
+              <w:top w:w="95" w:type="dxa"/>
+              <w:bottom w:w="95" w:type="dxa"/>
+              <w:start w:w="90" w:type="dxa"/>
+              <w:end w:w="90" w:type="dxa"/>
+            </w:tcMar>
+          </w:tcPr>
+          <w:p>
+            <w:pPr>
+              <w:spacing w:after="0" w:line="259" w:lineRule="auto"/>
+              <w:jc w:val="center"/>
+            </w:pPr>
+            <w:r>
+              <w:rPr>
+                <w:rFonts w:ascii="Arial" w:hAnsi="Arial" w:eastAsia="PingFang SC"/>
+                <w:b w:val="0"/>
+                <w:color w:val="17212B"/>
+                <w:sz w:val="13"/>
+              </w:rPr>
+              <w:t>0.53062</w:t>
+            </w:r>
+          </w:p>
+        </w:tc>
+        <w:tc>
+          <w:tcPr>
+            <w:tcW w:type="dxa" w:w="1134"/>
+            <w:vAlign w:val="center"/>
+            <w:tcMar>
+              <w:top w:w="95" w:type="dxa"/>
+              <w:bottom w:w="95" w:type="dxa"/>
+              <w:start w:w="90" w:type="dxa"/>
+              <w:end w:w="90" w:type="dxa"/>
+            </w:tcMar>
+          </w:tcPr>
+          <w:p>
+            <w:pPr>
+              <w:spacing w:after="0" w:line="259" w:lineRule="auto"/>
+              <w:jc w:val="center"/>
+            </w:pPr>
+            <w:r>
+              <w:rPr>
+                <w:rFonts w:ascii="Arial" w:hAnsi="Arial" w:eastAsia="PingFang SC"/>
+                <w:b w:val="0"/>
+                <w:color w:val="17212B"/>
+                <w:sz w:val="13"/>
+              </w:rPr>
+              <w:t>0.29557</w:t>
+            </w:r>
+          </w:p>
+        </w:tc>
+        <w:tc>
+          <w:tcPr>
+            <w:tcW w:type="dxa" w:w="1191"/>
+            <w:vAlign w:val="center"/>
+            <w:tcMar>
+              <w:top w:w="95" w:type="dxa"/>
+              <w:bottom w:w="95" w:type="dxa"/>
+              <w:start w:w="90" w:type="dxa"/>
+              <w:end w:w="90" w:type="dxa"/>
+            </w:tcMar>
+          </w:tcPr>
+          <w:p>
+            <w:pPr>
+              <w:spacing w:after="0" w:line="259" w:lineRule="auto"/>
+              <w:jc w:val="center"/>
+            </w:pPr>
+            <w:r>
+              <w:rPr>
+                <w:rFonts w:ascii="Arial" w:hAnsi="Arial" w:eastAsia="PingFang SC"/>
+                <w:b w:val="0"/>
+                <w:color w:val="17212B"/>
+                <w:sz w:val="13"/>
+              </w:rPr>
+              <w:t>3,011,238</w:t>
+            </w:r>
+          </w:p>
+        </w:tc>
+        <w:tc>
+          <w:tcPr>
+            <w:tcW w:type="dxa" w:w="907"/>
+            <w:vAlign w:val="center"/>
+            <w:tcMar>
+              <w:top w:w="95" w:type="dxa"/>
+              <w:bottom w:w="95" w:type="dxa"/>
+              <w:start w:w="90" w:type="dxa"/>
+              <w:end w:w="90" w:type="dxa"/>
+            </w:tcMar>
+          </w:tcPr>
+          <w:p>
+            <w:pPr>
+              <w:spacing w:after="0" w:line="259" w:lineRule="auto"/>
+              <w:jc w:val="center"/>
+            </w:pPr>
+            <w:r>
+              <w:rPr>
+                <w:rFonts w:ascii="Arial" w:hAnsi="Arial" w:eastAsia="PingFang SC"/>
+                <w:b w:val="0"/>
+                <w:color w:val="17212B"/>
+                <w:sz w:val="13"/>
+              </w:rPr>
+              <w:t>4.6084</w:t>
+            </w:r>
+          </w:p>
+        </w:tc>
+        <w:tc>
+          <w:tcPr>
+            <w:tcW w:type="dxa" w:w="1134"/>
+            <w:vAlign w:val="center"/>
+            <w:tcMar>
+              <w:top w:w="95" w:type="dxa"/>
+              <w:bottom w:w="95" w:type="dxa"/>
+              <w:start w:w="90" w:type="dxa"/>
+              <w:end w:w="90" w:type="dxa"/>
+            </w:tcMar>
+          </w:tcPr>
+          <w:p>
+            <w:pPr>
+              <w:spacing w:after="0" w:line="259" w:lineRule="auto"/>
+              <w:jc w:val="center"/>
+            </w:pPr>
+            <w:r>
+              <w:rPr>
+                <w:rFonts w:ascii="Arial" w:hAnsi="Arial" w:eastAsia="PingFang SC"/>
+                <w:b w:val="0"/>
+                <w:color w:val="17212B"/>
+                <w:sz w:val="13"/>
+              </w:rPr>
+              <w:t>6.214 MB</w:t>
+            </w:r>
+          </w:p>
+        </w:tc>
+      </w:tr>
+      <w:tr>
+        <w:trPr>
+          <w:cantSplit/>
+        </w:trPr>
+        <w:tc>
+          <w:tcPr>
+            <w:tcW w:type="dxa" w:w="1474"/>
+            <w:vAlign w:val="center"/>
+            <w:shd w:fill="F2F6FA"/>
+            <w:tcMar>
+              <w:top w:w="95" w:type="dxa"/>
+              <w:bottom w:w="95" w:type="dxa"/>
+              <w:start w:w="90" w:type="dxa"/>
+              <w:end w:w="90" w:type="dxa"/>
+            </w:tcMar>
+          </w:tcPr>
+          <w:p>
+            <w:pPr>
+              <w:spacing w:after="0" w:line="259" w:lineRule="auto"/>
+              <w:jc w:val="left"/>
+            </w:pPr>
+            <w:r>
+              <w:rPr>
+                <w:rFonts w:ascii="Arial" w:hAnsi="Arial" w:eastAsia="PingFang SC"/>
+                <w:b w:val="0"/>
+                <w:color w:val="17212B"/>
+                <w:sz w:val="13"/>
+              </w:rPr>
+              <w:t>weed-only r010</w:t>
+            </w:r>
+          </w:p>
+        </w:tc>
+        <w:tc>
+          <w:tcPr>
+            <w:tcW w:type="dxa" w:w="1077"/>
+            <w:vAlign w:val="center"/>
+            <w:shd w:fill="F2F6FA"/>
+            <w:tcMar>
+              <w:top w:w="95" w:type="dxa"/>
+              <w:bottom w:w="95" w:type="dxa"/>
+              <w:start w:w="90" w:type="dxa"/>
+              <w:end w:w="90" w:type="dxa"/>
+            </w:tcMar>
+          </w:tcPr>
+          <w:p>
+            <w:pPr>
+              <w:spacing w:after="0" w:line="259" w:lineRule="auto"/>
+              <w:jc w:val="center"/>
+            </w:pPr>
+            <w:r>
+              <w:rPr>
+                <w:rFonts w:ascii="Arial" w:hAnsi="Arial" w:eastAsia="PingFang SC"/>
+                <w:b w:val="0"/>
+                <w:color w:val="17212B"/>
+                <w:sz w:val="13"/>
+              </w:rPr>
+              <w:t>weed-only</w:t>
+            </w:r>
+          </w:p>
+        </w:tc>
+        <w:tc>
+          <w:tcPr>
+            <w:tcW w:type="dxa" w:w="794"/>
+            <w:vAlign w:val="center"/>
+            <w:shd w:fill="F2F6FA"/>
+            <w:tcMar>
+              <w:top w:w="95" w:type="dxa"/>
+              <w:bottom w:w="95" w:type="dxa"/>
+              <w:start w:w="90" w:type="dxa"/>
+              <w:end w:w="90" w:type="dxa"/>
+            </w:tcMar>
+          </w:tcPr>
+          <w:p>
+            <w:pPr>
+              <w:spacing w:after="0" w:line="259" w:lineRule="auto"/>
+              <w:jc w:val="center"/>
+            </w:pPr>
+            <w:r>
+              <w:rPr>
+                <w:rFonts w:ascii="Arial" w:hAnsi="Arial" w:eastAsia="PingFang SC"/>
+                <w:b w:val="0"/>
+                <w:color w:val="17212B"/>
+                <w:sz w:val="13"/>
+              </w:rPr>
+              <w:t>0.43149</w:t>
+            </w:r>
+          </w:p>
+        </w:tc>
+        <w:tc>
+          <w:tcPr>
+            <w:tcW w:type="dxa" w:w="794"/>
+            <w:vAlign w:val="center"/>
+            <w:shd w:fill="F2F6FA"/>
+            <w:tcMar>
+              <w:top w:w="95" w:type="dxa"/>
+              <w:bottom w:w="95" w:type="dxa"/>
+              <w:start w:w="90" w:type="dxa"/>
+              <w:end w:w="90" w:type="dxa"/>
+            </w:tcMar>
+          </w:tcPr>
+          <w:p>
+            <w:pPr>
+              <w:spacing w:after="0" w:line="259" w:lineRule="auto"/>
+              <w:jc w:val="center"/>
+            </w:pPr>
+            <w:r>
+              <w:rPr>
+                <w:rFonts w:ascii="Arial" w:hAnsi="Arial" w:eastAsia="PingFang SC"/>
+                <w:b w:val="0"/>
+                <w:color w:val="17212B"/>
+                <w:sz w:val="13"/>
+              </w:rPr>
+              <w:t>0.48721</w:t>
+            </w:r>
+          </w:p>
+        </w:tc>
+        <w:tc>
+          <w:tcPr>
+            <w:tcW w:type="dxa" w:w="964"/>
+            <w:vAlign w:val="center"/>
+            <w:shd w:fill="F2F6FA"/>
+            <w:tcMar>
+              <w:top w:w="95" w:type="dxa"/>
+              <w:bottom w:w="95" w:type="dxa"/>
+              <w:start w:w="90" w:type="dxa"/>
+              <w:end w:w="90" w:type="dxa"/>
+            </w:tcMar>
+          </w:tcPr>
+          <w:p>
+            <w:pPr>
+              <w:spacing w:after="0" w:line="259" w:lineRule="auto"/>
+              <w:jc w:val="center"/>
+            </w:pPr>
+            <w:r>
+              <w:rPr>
+                <w:rFonts w:ascii="Arial" w:hAnsi="Arial" w:eastAsia="PingFang SC"/>
+                <w:b w:val="0"/>
+                <w:color w:val="17212B"/>
+                <w:sz w:val="13"/>
+              </w:rPr>
+              <w:t>0.42087</w:t>
+            </w:r>
+          </w:p>
+        </w:tc>
+        <w:tc>
+          <w:tcPr>
+            <w:tcW w:type="dxa" w:w="1134"/>
+            <w:vAlign w:val="center"/>
+            <w:shd w:fill="F2F6FA"/>
+            <w:tcMar>
+              <w:top w:w="95" w:type="dxa"/>
+              <w:bottom w:w="95" w:type="dxa"/>
+              <w:start w:w="90" w:type="dxa"/>
+              <w:end w:w="90" w:type="dxa"/>
+            </w:tcMar>
+          </w:tcPr>
+          <w:p>
+            <w:pPr>
+              <w:spacing w:after="0" w:line="259" w:lineRule="auto"/>
+              <w:jc w:val="center"/>
+            </w:pPr>
+            <w:r>
+              <w:rPr>
+                <w:rFonts w:ascii="Arial" w:hAnsi="Arial" w:eastAsia="PingFang SC"/>
+                <w:b w:val="0"/>
+                <w:color w:val="17212B"/>
+                <w:sz w:val="13"/>
+              </w:rPr>
+              <w:t>0.18213</w:t>
+            </w:r>
+          </w:p>
+        </w:tc>
+        <w:tc>
+          <w:tcPr>
+            <w:tcW w:type="dxa" w:w="1191"/>
+            <w:vAlign w:val="center"/>
+            <w:shd w:fill="F2F6FA"/>
+            <w:tcMar>
+              <w:top w:w="95" w:type="dxa"/>
+              <w:bottom w:w="95" w:type="dxa"/>
+              <w:start w:w="90" w:type="dxa"/>
+              <w:end w:w="90" w:type="dxa"/>
+            </w:tcMar>
+          </w:tcPr>
+          <w:p>
+            <w:pPr>
+              <w:spacing w:after="0" w:line="259" w:lineRule="auto"/>
+              <w:jc w:val="center"/>
+            </w:pPr>
+            <w:r>
+              <w:rPr>
+                <w:rFonts w:ascii="Arial" w:hAnsi="Arial" w:eastAsia="PingFang SC"/>
+                <w:b w:val="0"/>
+                <w:color w:val="17212B"/>
+                <w:sz w:val="13"/>
+              </w:rPr>
+              <w:t>3,011,043</w:t>
+            </w:r>
+          </w:p>
+        </w:tc>
+        <w:tc>
+          <w:tcPr>
+            <w:tcW w:type="dxa" w:w="907"/>
+            <w:vAlign w:val="center"/>
+            <w:shd w:fill="F2F6FA"/>
+            <w:tcMar>
+              <w:top w:w="95" w:type="dxa"/>
+              <w:bottom w:w="95" w:type="dxa"/>
+              <w:start w:w="90" w:type="dxa"/>
+              <w:end w:w="90" w:type="dxa"/>
+            </w:tcMar>
+          </w:tcPr>
+          <w:p>
+            <w:pPr>
+              <w:spacing w:after="0" w:line="259" w:lineRule="auto"/>
+              <w:jc w:val="center"/>
+            </w:pPr>
+            <w:r>
+              <w:rPr>
+                <w:rFonts w:ascii="Arial" w:hAnsi="Arial" w:eastAsia="PingFang SC"/>
+                <w:b w:val="0"/>
+                <w:color w:val="17212B"/>
+                <w:sz w:val="13"/>
+              </w:rPr>
+              <w:t>4.6078</w:t>
+            </w:r>
+          </w:p>
+        </w:tc>
+        <w:tc>
+          <w:tcPr>
+            <w:tcW w:type="dxa" w:w="1134"/>
+            <w:vAlign w:val="center"/>
+            <w:shd w:fill="F2F6FA"/>
+            <w:tcMar>
+              <w:top w:w="95" w:type="dxa"/>
+              <w:bottom w:w="95" w:type="dxa"/>
+              <w:start w:w="90" w:type="dxa"/>
+              <w:end w:w="90" w:type="dxa"/>
+            </w:tcMar>
+          </w:tcPr>
+          <w:p>
+            <w:pPr>
+              <w:spacing w:after="0" w:line="259" w:lineRule="auto"/>
+              <w:jc w:val="center"/>
+            </w:pPr>
+            <w:r>
+              <w:rPr>
+                <w:rFonts w:ascii="Arial" w:hAnsi="Arial" w:eastAsia="PingFang SC"/>
+                <w:b w:val="0"/>
+                <w:color w:val="17212B"/>
+                <w:sz w:val="13"/>
+              </w:rPr>
+              <w:t>6.214 MB</w:t>
             </w:r>
           </w:p>
         </w:tc>
@@ -8747,12 +11234,1073 @@
     </w:p>
     <w:p>
       <w:r>
-        <w:t>检测支线已完成 bbox 分布统计、r020/r010 大框过滤对比、weed-only 对照、prediction visualization 和 post-processing threshold analysis。WeedMap common split 中 dense vegetation samples 占多数，因此项目主线仍是 MobileNetV2ShallowUNet + boundary weighted CE r5_w4 语义分割：Pixel accuracy 96.98% ± 0.24%，Mean IoU 76.71% ± 0.55%，Weed IoU 59.82% ± 0.64%。YOLO 检测支线作为 sparse vegetation scenarios 的候选路线，也是后续 MobileNetV3-YOLOv8n 轻量化检测研究的基础。</w:t>
+        <w:t>当前最佳 YOLO baseline 是 crop+weed r010：mAP50=0.53062、mAP50-95=0.29557、约 3.01M Params、4.61 GFLOPs、6.21 MB。</w:t>
+      </w:r>
+    </w:p>
+    <w:p>
+      <w:pPr>
+        <w:pStyle w:val="Heading2"/>
+      </w:pPr>
+      <w:r>
+        <w:t>MobileNetV3 Small YOLOv8 optimization workflow</w:t>
       </w:r>
     </w:p>
     <w:p>
       <w:r>
-        <w:t>后续可研究 MobileNetV3-YOLOv8n 轻量化变体：用 MobileNetV3-style backbone 改造 YOLOv8n 的特征提取部分，保留 YOLOv8 Neck、Detection Head 和 anchor-free detection framework。该变体目前尚未实现；后续需在一致条件下对比检测指标、参数量、GFLOPs、模型大小和推理速度。</w:t>
+        <w:t>已实现 MobileNetV3-Small backbone，输出 P3/8、P4/16、P5/32 特征，后接 YOLOv8-style PAN-FPN 与 anchor-free Detect head。backbone 加载官方 ImageNet 预训练权重，模型入口显式完成 ImageNet mean/std 归一化。训练采用两阶段方案：冻结 backbone 5 epochs 预热新 neck/head，再从最佳 warm-up 权重解冻全模型训练 20 epochs。</w:t>
+      </w:r>
+    </w:p>
+    <w:tbl>
+      <w:tblPr>
+        <w:tblW w:type="auto" w:w="0"/>
+        <w:jc w:val="center"/>
+        <w:tblLayout w:type="fixed"/>
+        <w:tblLook w:firstColumn="1" w:firstRow="1" w:lastColumn="0" w:lastRow="0" w:noHBand="0" w:noVBand="1" w:val="04A0"/>
+        <w:tblBorders>
+          <w:top w:val="single" w:sz="5" w:color="D9D9D9"/>
+          <w:left w:val="single" w:sz="5" w:color="D9D9D9"/>
+          <w:bottom w:val="single" w:sz="5" w:color="D9D9D9"/>
+          <w:right w:val="single" w:sz="5" w:color="D9D9D9"/>
+          <w:insideH w:val="single" w:sz="5" w:color="D9D9D9"/>
+          <w:insideV w:val="single" w:sz="5" w:color="D9D9D9"/>
+        </w:tblBorders>
+      </w:tblPr>
+      <w:tblGrid>
+        <w:gridCol w:w="2268"/>
+        <w:gridCol w:w="680"/>
+        <w:gridCol w:w="680"/>
+        <w:gridCol w:w="850"/>
+        <w:gridCol w:w="1020"/>
+        <w:gridCol w:w="1020"/>
+        <w:gridCol w:w="737"/>
+        <w:gridCol w:w="964"/>
+        <w:gridCol w:w="1191"/>
+      </w:tblGrid>
+      <w:tr>
+        <w:trPr>
+          <w:tblHeader w:val="true"/>
+          <w:cantSplit/>
+        </w:trPr>
+        <w:tc>
+          <w:tcPr>
+            <w:tcW w:type="dxa" w:w="2268"/>
+            <w:vAlign w:val="center"/>
+            <w:shd w:fill="213B58"/>
+            <w:tcMar>
+              <w:top w:w="95" w:type="dxa"/>
+              <w:bottom w:w="95" w:type="dxa"/>
+              <w:start w:w="90" w:type="dxa"/>
+              <w:end w:w="90" w:type="dxa"/>
+            </w:tcMar>
+          </w:tcPr>
+          <w:p>
+            <w:pPr>
+              <w:spacing w:after="0" w:line="259" w:lineRule="auto"/>
+              <w:jc w:val="left"/>
+            </w:pPr>
+            <w:r>
+              <w:rPr>
+                <w:rFonts w:ascii="Arial" w:hAnsi="Arial" w:eastAsia="PingFang SC"/>
+                <w:b/>
+                <w:color w:val="FFFFFF"/>
+                <w:sz w:val="13"/>
+              </w:rPr>
+              <w:t>模型</w:t>
+            </w:r>
+          </w:p>
+        </w:tc>
+        <w:tc>
+          <w:tcPr>
+            <w:tcW w:type="dxa" w:w="680"/>
+            <w:vAlign w:val="center"/>
+            <w:shd w:fill="213B58"/>
+            <w:tcMar>
+              <w:top w:w="95" w:type="dxa"/>
+              <w:bottom w:w="95" w:type="dxa"/>
+              <w:start w:w="90" w:type="dxa"/>
+              <w:end w:w="90" w:type="dxa"/>
+            </w:tcMar>
+          </w:tcPr>
+          <w:p>
+            <w:pPr>
+              <w:spacing w:after="0" w:line="259" w:lineRule="auto"/>
+              <w:jc w:val="center"/>
+            </w:pPr>
+            <w:r>
+              <w:rPr>
+                <w:rFonts w:ascii="Arial" w:hAnsi="Arial" w:eastAsia="PingFang SC"/>
+                <w:b/>
+                <w:color w:val="FFFFFF"/>
+                <w:sz w:val="13"/>
+              </w:rPr>
+              <w:t>P</w:t>
+            </w:r>
+          </w:p>
+        </w:tc>
+        <w:tc>
+          <w:tcPr>
+            <w:tcW w:type="dxa" w:w="680"/>
+            <w:vAlign w:val="center"/>
+            <w:shd w:fill="213B58"/>
+            <w:tcMar>
+              <w:top w:w="95" w:type="dxa"/>
+              <w:bottom w:w="95" w:type="dxa"/>
+              <w:start w:w="90" w:type="dxa"/>
+              <w:end w:w="90" w:type="dxa"/>
+            </w:tcMar>
+          </w:tcPr>
+          <w:p>
+            <w:pPr>
+              <w:spacing w:after="0" w:line="259" w:lineRule="auto"/>
+              <w:jc w:val="center"/>
+            </w:pPr>
+            <w:r>
+              <w:rPr>
+                <w:rFonts w:ascii="Arial" w:hAnsi="Arial" w:eastAsia="PingFang SC"/>
+                <w:b/>
+                <w:color w:val="FFFFFF"/>
+                <w:sz w:val="13"/>
+              </w:rPr>
+              <w:t>R</w:t>
+            </w:r>
+          </w:p>
+        </w:tc>
+        <w:tc>
+          <w:tcPr>
+            <w:tcW w:type="dxa" w:w="850"/>
+            <w:vAlign w:val="center"/>
+            <w:shd w:fill="213B58"/>
+            <w:tcMar>
+              <w:top w:w="95" w:type="dxa"/>
+              <w:bottom w:w="95" w:type="dxa"/>
+              <w:start w:w="90" w:type="dxa"/>
+              <w:end w:w="90" w:type="dxa"/>
+            </w:tcMar>
+          </w:tcPr>
+          <w:p>
+            <w:pPr>
+              <w:spacing w:after="0" w:line="259" w:lineRule="auto"/>
+              <w:jc w:val="center"/>
+            </w:pPr>
+            <w:r>
+              <w:rPr>
+                <w:rFonts w:ascii="Arial" w:hAnsi="Arial" w:eastAsia="PingFang SC"/>
+                <w:b/>
+                <w:color w:val="FFFFFF"/>
+                <w:sz w:val="13"/>
+              </w:rPr>
+              <w:t>mAP50</w:t>
+            </w:r>
+          </w:p>
+        </w:tc>
+        <w:tc>
+          <w:tcPr>
+            <w:tcW w:type="dxa" w:w="1020"/>
+            <w:vAlign w:val="center"/>
+            <w:shd w:fill="213B58"/>
+            <w:tcMar>
+              <w:top w:w="95" w:type="dxa"/>
+              <w:bottom w:w="95" w:type="dxa"/>
+              <w:start w:w="90" w:type="dxa"/>
+              <w:end w:w="90" w:type="dxa"/>
+            </w:tcMar>
+          </w:tcPr>
+          <w:p>
+            <w:pPr>
+              <w:spacing w:after="0" w:line="259" w:lineRule="auto"/>
+              <w:jc w:val="center"/>
+            </w:pPr>
+            <w:r>
+              <w:rPr>
+                <w:rFonts w:ascii="Arial" w:hAnsi="Arial" w:eastAsia="PingFang SC"/>
+                <w:b/>
+                <w:color w:val="FFFFFF"/>
+                <w:sz w:val="13"/>
+              </w:rPr>
+              <w:t>mAP50-95</w:t>
+            </w:r>
+          </w:p>
+        </w:tc>
+        <w:tc>
+          <w:tcPr>
+            <w:tcW w:type="dxa" w:w="1020"/>
+            <w:vAlign w:val="center"/>
+            <w:shd w:fill="213B58"/>
+            <w:tcMar>
+              <w:top w:w="95" w:type="dxa"/>
+              <w:bottom w:w="95" w:type="dxa"/>
+              <w:start w:w="90" w:type="dxa"/>
+              <w:end w:w="90" w:type="dxa"/>
+            </w:tcMar>
+          </w:tcPr>
+          <w:p>
+            <w:pPr>
+              <w:spacing w:after="0" w:line="259" w:lineRule="auto"/>
+              <w:jc w:val="center"/>
+            </w:pPr>
+            <w:r>
+              <w:rPr>
+                <w:rFonts w:ascii="Arial" w:hAnsi="Arial" w:eastAsia="PingFang SC"/>
+                <w:b/>
+                <w:color w:val="FFFFFF"/>
+                <w:sz w:val="13"/>
+              </w:rPr>
+              <w:t>Params</w:t>
+            </w:r>
+          </w:p>
+        </w:tc>
+        <w:tc>
+          <w:tcPr>
+            <w:tcW w:type="dxa" w:w="737"/>
+            <w:vAlign w:val="center"/>
+            <w:shd w:fill="213B58"/>
+            <w:tcMar>
+              <w:top w:w="95" w:type="dxa"/>
+              <w:bottom w:w="95" w:type="dxa"/>
+              <w:start w:w="90" w:type="dxa"/>
+              <w:end w:w="90" w:type="dxa"/>
+            </w:tcMar>
+          </w:tcPr>
+          <w:p>
+            <w:pPr>
+              <w:spacing w:after="0" w:line="259" w:lineRule="auto"/>
+              <w:jc w:val="center"/>
+            </w:pPr>
+            <w:r>
+              <w:rPr>
+                <w:rFonts w:ascii="Arial" w:hAnsi="Arial" w:eastAsia="PingFang SC"/>
+                <w:b/>
+                <w:color w:val="FFFFFF"/>
+                <w:sz w:val="13"/>
+              </w:rPr>
+              <w:t>GFLOPs</w:t>
+            </w:r>
+          </w:p>
+        </w:tc>
+        <w:tc>
+          <w:tcPr>
+            <w:tcW w:type="dxa" w:w="964"/>
+            <w:vAlign w:val="center"/>
+            <w:shd w:fill="213B58"/>
+            <w:tcMar>
+              <w:top w:w="95" w:type="dxa"/>
+              <w:bottom w:w="95" w:type="dxa"/>
+              <w:start w:w="90" w:type="dxa"/>
+              <w:end w:w="90" w:type="dxa"/>
+            </w:tcMar>
+          </w:tcPr>
+          <w:p>
+            <w:pPr>
+              <w:spacing w:after="0" w:line="259" w:lineRule="auto"/>
+              <w:jc w:val="center"/>
+            </w:pPr>
+            <w:r>
+              <w:rPr>
+                <w:rFonts w:ascii="Arial" w:hAnsi="Arial" w:eastAsia="PingFang SC"/>
+                <w:b/>
+                <w:color w:val="FFFFFF"/>
+                <w:sz w:val="13"/>
+              </w:rPr>
+              <w:t>Size</w:t>
+            </w:r>
+          </w:p>
+        </w:tc>
+        <w:tc>
+          <w:tcPr>
+            <w:tcW w:type="dxa" w:w="1191"/>
+            <w:vAlign w:val="center"/>
+            <w:shd w:fill="213B58"/>
+            <w:tcMar>
+              <w:top w:w="95" w:type="dxa"/>
+              <w:bottom w:w="95" w:type="dxa"/>
+              <w:start w:w="90" w:type="dxa"/>
+              <w:end w:w="90" w:type="dxa"/>
+            </w:tcMar>
+          </w:tcPr>
+          <w:p>
+            <w:pPr>
+              <w:spacing w:after="0" w:line="259" w:lineRule="auto"/>
+              <w:jc w:val="center"/>
+            </w:pPr>
+            <w:r>
+              <w:rPr>
+                <w:rFonts w:ascii="Arial" w:hAnsi="Arial" w:eastAsia="PingFang SC"/>
+                <w:b/>
+                <w:color w:val="FFFFFF"/>
+                <w:sz w:val="13"/>
+              </w:rPr>
+              <w:t>CPU</w:t>
+            </w:r>
+          </w:p>
+        </w:tc>
+      </w:tr>
+      <w:tr>
+        <w:trPr>
+          <w:cantSplit/>
+        </w:trPr>
+        <w:tc>
+          <w:tcPr>
+            <w:tcW w:type="dxa" w:w="2268"/>
+            <w:vAlign w:val="center"/>
+            <w:tcMar>
+              <w:top w:w="95" w:type="dxa"/>
+              <w:bottom w:w="95" w:type="dxa"/>
+              <w:start w:w="90" w:type="dxa"/>
+              <w:end w:w="90" w:type="dxa"/>
+            </w:tcMar>
+          </w:tcPr>
+          <w:p>
+            <w:pPr>
+              <w:spacing w:after="0" w:line="259" w:lineRule="auto"/>
+              <w:jc w:val="left"/>
+            </w:pPr>
+            <w:r>
+              <w:rPr>
+                <w:rFonts w:ascii="Arial" w:hAnsi="Arial" w:eastAsia="PingFang SC"/>
+                <w:b w:val="0"/>
+                <w:color w:val="17212B"/>
+                <w:sz w:val="13"/>
+              </w:rPr>
+              <w:t>YOLOv8n r010</w:t>
+            </w:r>
+          </w:p>
+        </w:tc>
+        <w:tc>
+          <w:tcPr>
+            <w:tcW w:type="dxa" w:w="680"/>
+            <w:vAlign w:val="center"/>
+            <w:tcMar>
+              <w:top w:w="95" w:type="dxa"/>
+              <w:bottom w:w="95" w:type="dxa"/>
+              <w:start w:w="90" w:type="dxa"/>
+              <w:end w:w="90" w:type="dxa"/>
+            </w:tcMar>
+          </w:tcPr>
+          <w:p>
+            <w:pPr>
+              <w:spacing w:after="0" w:line="259" w:lineRule="auto"/>
+              <w:jc w:val="center"/>
+            </w:pPr>
+            <w:r>
+              <w:rPr>
+                <w:rFonts w:ascii="Arial" w:hAnsi="Arial" w:eastAsia="PingFang SC"/>
+                <w:b w:val="0"/>
+                <w:color w:val="17212B"/>
+                <w:sz w:val="13"/>
+              </w:rPr>
+              <w:t>0.5049</w:t>
+            </w:r>
+          </w:p>
+        </w:tc>
+        <w:tc>
+          <w:tcPr>
+            <w:tcW w:type="dxa" w:w="680"/>
+            <w:vAlign w:val="center"/>
+            <w:tcMar>
+              <w:top w:w="95" w:type="dxa"/>
+              <w:bottom w:w="95" w:type="dxa"/>
+              <w:start w:w="90" w:type="dxa"/>
+              <w:end w:w="90" w:type="dxa"/>
+            </w:tcMar>
+          </w:tcPr>
+          <w:p>
+            <w:pPr>
+              <w:spacing w:after="0" w:line="259" w:lineRule="auto"/>
+              <w:jc w:val="center"/>
+            </w:pPr>
+            <w:r>
+              <w:rPr>
+                <w:rFonts w:ascii="Arial" w:hAnsi="Arial" w:eastAsia="PingFang SC"/>
+                <w:b w:val="0"/>
+                <w:color w:val="17212B"/>
+                <w:sz w:val="13"/>
+              </w:rPr>
+              <w:t>0.5909</w:t>
+            </w:r>
+          </w:p>
+        </w:tc>
+        <w:tc>
+          <w:tcPr>
+            <w:tcW w:type="dxa" w:w="850"/>
+            <w:vAlign w:val="center"/>
+            <w:tcMar>
+              <w:top w:w="95" w:type="dxa"/>
+              <w:bottom w:w="95" w:type="dxa"/>
+              <w:start w:w="90" w:type="dxa"/>
+              <w:end w:w="90" w:type="dxa"/>
+            </w:tcMar>
+          </w:tcPr>
+          <w:p>
+            <w:pPr>
+              <w:spacing w:after="0" w:line="259" w:lineRule="auto"/>
+              <w:jc w:val="center"/>
+            </w:pPr>
+            <w:r>
+              <w:rPr>
+                <w:rFonts w:ascii="Arial" w:hAnsi="Arial" w:eastAsia="PingFang SC"/>
+                <w:b w:val="0"/>
+                <w:color w:val="17212B"/>
+                <w:sz w:val="13"/>
+              </w:rPr>
+              <w:t>0.5306</w:t>
+            </w:r>
+          </w:p>
+        </w:tc>
+        <w:tc>
+          <w:tcPr>
+            <w:tcW w:type="dxa" w:w="1020"/>
+            <w:vAlign w:val="center"/>
+            <w:tcMar>
+              <w:top w:w="95" w:type="dxa"/>
+              <w:bottom w:w="95" w:type="dxa"/>
+              <w:start w:w="90" w:type="dxa"/>
+              <w:end w:w="90" w:type="dxa"/>
+            </w:tcMar>
+          </w:tcPr>
+          <w:p>
+            <w:pPr>
+              <w:spacing w:after="0" w:line="259" w:lineRule="auto"/>
+              <w:jc w:val="center"/>
+            </w:pPr>
+            <w:r>
+              <w:rPr>
+                <w:rFonts w:ascii="Arial" w:hAnsi="Arial" w:eastAsia="PingFang SC"/>
+                <w:b w:val="0"/>
+                <w:color w:val="17212B"/>
+                <w:sz w:val="13"/>
+              </w:rPr>
+              <w:t>0.2956</w:t>
+            </w:r>
+          </w:p>
+        </w:tc>
+        <w:tc>
+          <w:tcPr>
+            <w:tcW w:type="dxa" w:w="1020"/>
+            <w:vAlign w:val="center"/>
+            <w:tcMar>
+              <w:top w:w="95" w:type="dxa"/>
+              <w:bottom w:w="95" w:type="dxa"/>
+              <w:start w:w="90" w:type="dxa"/>
+              <w:end w:w="90" w:type="dxa"/>
+            </w:tcMar>
+          </w:tcPr>
+          <w:p>
+            <w:pPr>
+              <w:spacing w:after="0" w:line="259" w:lineRule="auto"/>
+              <w:jc w:val="center"/>
+            </w:pPr>
+            <w:r>
+              <w:rPr>
+                <w:rFonts w:ascii="Arial" w:hAnsi="Arial" w:eastAsia="PingFang SC"/>
+                <w:b w:val="0"/>
+                <w:color w:val="17212B"/>
+                <w:sz w:val="13"/>
+              </w:rPr>
+              <w:t>3.01M</w:t>
+            </w:r>
+          </w:p>
+        </w:tc>
+        <w:tc>
+          <w:tcPr>
+            <w:tcW w:type="dxa" w:w="737"/>
+            <w:vAlign w:val="center"/>
+            <w:tcMar>
+              <w:top w:w="95" w:type="dxa"/>
+              <w:bottom w:w="95" w:type="dxa"/>
+              <w:start w:w="90" w:type="dxa"/>
+              <w:end w:w="90" w:type="dxa"/>
+            </w:tcMar>
+          </w:tcPr>
+          <w:p>
+            <w:pPr>
+              <w:spacing w:after="0" w:line="259" w:lineRule="auto"/>
+              <w:jc w:val="center"/>
+            </w:pPr>
+            <w:r>
+              <w:rPr>
+                <w:rFonts w:ascii="Arial" w:hAnsi="Arial" w:eastAsia="PingFang SC"/>
+                <w:b w:val="0"/>
+                <w:color w:val="17212B"/>
+                <w:sz w:val="13"/>
+              </w:rPr>
+              <w:t>4.61</w:t>
+            </w:r>
+          </w:p>
+        </w:tc>
+        <w:tc>
+          <w:tcPr>
+            <w:tcW w:type="dxa" w:w="964"/>
+            <w:vAlign w:val="center"/>
+            <w:tcMar>
+              <w:top w:w="95" w:type="dxa"/>
+              <w:bottom w:w="95" w:type="dxa"/>
+              <w:start w:w="90" w:type="dxa"/>
+              <w:end w:w="90" w:type="dxa"/>
+            </w:tcMar>
+          </w:tcPr>
+          <w:p>
+            <w:pPr>
+              <w:spacing w:after="0" w:line="259" w:lineRule="auto"/>
+              <w:jc w:val="center"/>
+            </w:pPr>
+            <w:r>
+              <w:rPr>
+                <w:rFonts w:ascii="Arial" w:hAnsi="Arial" w:eastAsia="PingFang SC"/>
+                <w:b w:val="0"/>
+                <w:color w:val="17212B"/>
+                <w:sz w:val="13"/>
+              </w:rPr>
+              <w:t>6.21 MB</w:t>
+            </w:r>
+          </w:p>
+        </w:tc>
+        <w:tc>
+          <w:tcPr>
+            <w:tcW w:type="dxa" w:w="1191"/>
+            <w:vAlign w:val="center"/>
+            <w:tcMar>
+              <w:top w:w="95" w:type="dxa"/>
+              <w:bottom w:w="95" w:type="dxa"/>
+              <w:start w:w="90" w:type="dxa"/>
+              <w:end w:w="90" w:type="dxa"/>
+            </w:tcMar>
+          </w:tcPr>
+          <w:p>
+            <w:pPr>
+              <w:spacing w:after="0" w:line="259" w:lineRule="auto"/>
+              <w:jc w:val="center"/>
+            </w:pPr>
+            <w:r>
+              <w:rPr>
+                <w:rFonts w:ascii="Arial" w:hAnsi="Arial" w:eastAsia="PingFang SC"/>
+                <w:b w:val="0"/>
+                <w:color w:val="17212B"/>
+                <w:sz w:val="13"/>
+              </w:rPr>
+              <w:t>10.4 ms</w:t>
+            </w:r>
+          </w:p>
+        </w:tc>
+      </w:tr>
+      <w:tr>
+        <w:trPr>
+          <w:cantSplit/>
+        </w:trPr>
+        <w:tc>
+          <w:tcPr>
+            <w:tcW w:type="dxa" w:w="2268"/>
+            <w:vAlign w:val="center"/>
+            <w:shd w:fill="F2F6FA"/>
+            <w:tcMar>
+              <w:top w:w="95" w:type="dxa"/>
+              <w:bottom w:w="95" w:type="dxa"/>
+              <w:start w:w="90" w:type="dxa"/>
+              <w:end w:w="90" w:type="dxa"/>
+            </w:tcMar>
+          </w:tcPr>
+          <w:p>
+            <w:pPr>
+              <w:spacing w:after="0" w:line="259" w:lineRule="auto"/>
+              <w:jc w:val="left"/>
+            </w:pPr>
+            <w:r>
+              <w:rPr>
+                <w:rFonts w:ascii="Arial" w:hAnsi="Arial" w:eastAsia="PingFang SC"/>
+                <w:b w:val="0"/>
+                <w:color w:val="17212B"/>
+                <w:sz w:val="13"/>
+              </w:rPr>
+              <w:t>MobileNetV3 初始 5 ep</w:t>
+            </w:r>
+          </w:p>
+        </w:tc>
+        <w:tc>
+          <w:tcPr>
+            <w:tcW w:type="dxa" w:w="680"/>
+            <w:vAlign w:val="center"/>
+            <w:shd w:fill="F2F6FA"/>
+            <w:tcMar>
+              <w:top w:w="95" w:type="dxa"/>
+              <w:bottom w:w="95" w:type="dxa"/>
+              <w:start w:w="90" w:type="dxa"/>
+              <w:end w:w="90" w:type="dxa"/>
+            </w:tcMar>
+          </w:tcPr>
+          <w:p>
+            <w:pPr>
+              <w:spacing w:after="0" w:line="259" w:lineRule="auto"/>
+              <w:jc w:val="center"/>
+            </w:pPr>
+            <w:r>
+              <w:rPr>
+                <w:rFonts w:ascii="Arial" w:hAnsi="Arial" w:eastAsia="PingFang SC"/>
+                <w:b w:val="0"/>
+                <w:color w:val="17212B"/>
+                <w:sz w:val="13"/>
+              </w:rPr>
+              <w:t>0.2251</w:t>
+            </w:r>
+          </w:p>
+        </w:tc>
+        <w:tc>
+          <w:tcPr>
+            <w:tcW w:type="dxa" w:w="680"/>
+            <w:vAlign w:val="center"/>
+            <w:shd w:fill="F2F6FA"/>
+            <w:tcMar>
+              <w:top w:w="95" w:type="dxa"/>
+              <w:bottom w:w="95" w:type="dxa"/>
+              <w:start w:w="90" w:type="dxa"/>
+              <w:end w:w="90" w:type="dxa"/>
+            </w:tcMar>
+          </w:tcPr>
+          <w:p>
+            <w:pPr>
+              <w:spacing w:after="0" w:line="259" w:lineRule="auto"/>
+              <w:jc w:val="center"/>
+            </w:pPr>
+            <w:r>
+              <w:rPr>
+                <w:rFonts w:ascii="Arial" w:hAnsi="Arial" w:eastAsia="PingFang SC"/>
+                <w:b w:val="0"/>
+                <w:color w:val="17212B"/>
+                <w:sz w:val="13"/>
+              </w:rPr>
+              <w:t>0.2594</w:t>
+            </w:r>
+          </w:p>
+        </w:tc>
+        <w:tc>
+          <w:tcPr>
+            <w:tcW w:type="dxa" w:w="850"/>
+            <w:vAlign w:val="center"/>
+            <w:shd w:fill="F2F6FA"/>
+            <w:tcMar>
+              <w:top w:w="95" w:type="dxa"/>
+              <w:bottom w:w="95" w:type="dxa"/>
+              <w:start w:w="90" w:type="dxa"/>
+              <w:end w:w="90" w:type="dxa"/>
+            </w:tcMar>
+          </w:tcPr>
+          <w:p>
+            <w:pPr>
+              <w:spacing w:after="0" w:line="259" w:lineRule="auto"/>
+              <w:jc w:val="center"/>
+            </w:pPr>
+            <w:r>
+              <w:rPr>
+                <w:rFonts w:ascii="Arial" w:hAnsi="Arial" w:eastAsia="PingFang SC"/>
+                <w:b w:val="0"/>
+                <w:color w:val="17212B"/>
+                <w:sz w:val="13"/>
+              </w:rPr>
+              <w:t>0.1284</w:t>
+            </w:r>
+          </w:p>
+        </w:tc>
+        <w:tc>
+          <w:tcPr>
+            <w:tcW w:type="dxa" w:w="1020"/>
+            <w:vAlign w:val="center"/>
+            <w:shd w:fill="F2F6FA"/>
+            <w:tcMar>
+              <w:top w:w="95" w:type="dxa"/>
+              <w:bottom w:w="95" w:type="dxa"/>
+              <w:start w:w="90" w:type="dxa"/>
+              <w:end w:w="90" w:type="dxa"/>
+            </w:tcMar>
+          </w:tcPr>
+          <w:p>
+            <w:pPr>
+              <w:spacing w:after="0" w:line="259" w:lineRule="auto"/>
+              <w:jc w:val="center"/>
+            </w:pPr>
+            <w:r>
+              <w:rPr>
+                <w:rFonts w:ascii="Arial" w:hAnsi="Arial" w:eastAsia="PingFang SC"/>
+                <w:b w:val="0"/>
+                <w:color w:val="17212B"/>
+                <w:sz w:val="13"/>
+              </w:rPr>
+              <w:t>0.0325</w:t>
+            </w:r>
+          </w:p>
+        </w:tc>
+        <w:tc>
+          <w:tcPr>
+            <w:tcW w:type="dxa" w:w="1020"/>
+            <w:vAlign w:val="center"/>
+            <w:shd w:fill="F2F6FA"/>
+            <w:tcMar>
+              <w:top w:w="95" w:type="dxa"/>
+              <w:bottom w:w="95" w:type="dxa"/>
+              <w:start w:w="90" w:type="dxa"/>
+              <w:end w:w="90" w:type="dxa"/>
+            </w:tcMar>
+          </w:tcPr>
+          <w:p>
+            <w:pPr>
+              <w:spacing w:after="0" w:line="259" w:lineRule="auto"/>
+              <w:jc w:val="center"/>
+            </w:pPr>
+            <w:r>
+              <w:rPr>
+                <w:rFonts w:ascii="Arial" w:hAnsi="Arial" w:eastAsia="PingFang SC"/>
+                <w:b w:val="0"/>
+                <w:color w:val="17212B"/>
+                <w:sz w:val="13"/>
+              </w:rPr>
+              <w:t>2.39M</w:t>
+            </w:r>
+          </w:p>
+        </w:tc>
+        <w:tc>
+          <w:tcPr>
+            <w:tcW w:type="dxa" w:w="737"/>
+            <w:vAlign w:val="center"/>
+            <w:shd w:fill="F2F6FA"/>
+            <w:tcMar>
+              <w:top w:w="95" w:type="dxa"/>
+              <w:bottom w:w="95" w:type="dxa"/>
+              <w:start w:w="90" w:type="dxa"/>
+              <w:end w:w="90" w:type="dxa"/>
+            </w:tcMar>
+          </w:tcPr>
+          <w:p>
+            <w:pPr>
+              <w:spacing w:after="0" w:line="259" w:lineRule="auto"/>
+              <w:jc w:val="center"/>
+            </w:pPr>
+            <w:r>
+              <w:rPr>
+                <w:rFonts w:ascii="Arial" w:hAnsi="Arial" w:eastAsia="PingFang SC"/>
+                <w:b w:val="0"/>
+                <w:color w:val="17212B"/>
+                <w:sz w:val="13"/>
+              </w:rPr>
+              <w:t>2.55</w:t>
+            </w:r>
+          </w:p>
+        </w:tc>
+        <w:tc>
+          <w:tcPr>
+            <w:tcW w:type="dxa" w:w="964"/>
+            <w:vAlign w:val="center"/>
+            <w:shd w:fill="F2F6FA"/>
+            <w:tcMar>
+              <w:top w:w="95" w:type="dxa"/>
+              <w:bottom w:w="95" w:type="dxa"/>
+              <w:start w:w="90" w:type="dxa"/>
+              <w:end w:w="90" w:type="dxa"/>
+            </w:tcMar>
+          </w:tcPr>
+          <w:p>
+            <w:pPr>
+              <w:spacing w:after="0" w:line="259" w:lineRule="auto"/>
+              <w:jc w:val="center"/>
+            </w:pPr>
+            <w:r>
+              <w:rPr>
+                <w:rFonts w:ascii="Arial" w:hAnsi="Arial" w:eastAsia="PingFang SC"/>
+                <w:b w:val="0"/>
+                <w:color w:val="17212B"/>
+                <w:sz w:val="13"/>
+              </w:rPr>
+              <w:t>5.04 MB</w:t>
+            </w:r>
+          </w:p>
+        </w:tc>
+        <w:tc>
+          <w:tcPr>
+            <w:tcW w:type="dxa" w:w="1191"/>
+            <w:vAlign w:val="center"/>
+            <w:shd w:fill="F2F6FA"/>
+            <w:tcMar>
+              <w:top w:w="95" w:type="dxa"/>
+              <w:bottom w:w="95" w:type="dxa"/>
+              <w:start w:w="90" w:type="dxa"/>
+              <w:end w:w="90" w:type="dxa"/>
+            </w:tcMar>
+          </w:tcPr>
+          <w:p>
+            <w:pPr>
+              <w:spacing w:after="0" w:line="259" w:lineRule="auto"/>
+              <w:jc w:val="center"/>
+            </w:pPr>
+            <w:r>
+              <w:rPr>
+                <w:rFonts w:ascii="Arial" w:hAnsi="Arial" w:eastAsia="PingFang SC"/>
+                <w:b w:val="0"/>
+                <w:color w:val="17212B"/>
+                <w:sz w:val="13"/>
+              </w:rPr>
+              <w:t>25–41 ms</w:t>
+            </w:r>
+          </w:p>
+        </w:tc>
+      </w:tr>
+      <w:tr>
+        <w:trPr>
+          <w:cantSplit/>
+        </w:trPr>
+        <w:tc>
+          <w:tcPr>
+            <w:tcW w:type="dxa" w:w="2268"/>
+            <w:vAlign w:val="center"/>
+            <w:tcMar>
+              <w:top w:w="95" w:type="dxa"/>
+              <w:bottom w:w="95" w:type="dxa"/>
+              <w:start w:w="90" w:type="dxa"/>
+              <w:end w:w="90" w:type="dxa"/>
+            </w:tcMar>
+          </w:tcPr>
+          <w:p>
+            <w:pPr>
+              <w:spacing w:after="0" w:line="259" w:lineRule="auto"/>
+              <w:jc w:val="left"/>
+            </w:pPr>
+            <w:r>
+              <w:rPr>
+                <w:rFonts w:ascii="Arial" w:hAnsi="Arial" w:eastAsia="PingFang SC"/>
+                <w:b w:val="0"/>
+                <w:color w:val="17212B"/>
+                <w:sz w:val="13"/>
+              </w:rPr>
+              <w:t>MobileNetV3 两阶段</w:t>
+            </w:r>
+          </w:p>
+        </w:tc>
+        <w:tc>
+          <w:tcPr>
+            <w:tcW w:type="dxa" w:w="680"/>
+            <w:vAlign w:val="center"/>
+            <w:tcMar>
+              <w:top w:w="95" w:type="dxa"/>
+              <w:bottom w:w="95" w:type="dxa"/>
+              <w:start w:w="90" w:type="dxa"/>
+              <w:end w:w="90" w:type="dxa"/>
+            </w:tcMar>
+          </w:tcPr>
+          <w:p>
+            <w:pPr>
+              <w:spacing w:after="0" w:line="259" w:lineRule="auto"/>
+              <w:jc w:val="center"/>
+            </w:pPr>
+            <w:r>
+              <w:rPr>
+                <w:rFonts w:ascii="Arial" w:hAnsi="Arial" w:eastAsia="PingFang SC"/>
+                <w:b w:val="0"/>
+                <w:color w:val="17212B"/>
+                <w:sz w:val="13"/>
+              </w:rPr>
+              <w:t>0.4773</w:t>
+            </w:r>
+          </w:p>
+        </w:tc>
+        <w:tc>
+          <w:tcPr>
+            <w:tcW w:type="dxa" w:w="680"/>
+            <w:vAlign w:val="center"/>
+            <w:tcMar>
+              <w:top w:w="95" w:type="dxa"/>
+              <w:bottom w:w="95" w:type="dxa"/>
+              <w:start w:w="90" w:type="dxa"/>
+              <w:end w:w="90" w:type="dxa"/>
+            </w:tcMar>
+          </w:tcPr>
+          <w:p>
+            <w:pPr>
+              <w:spacing w:after="0" w:line="259" w:lineRule="auto"/>
+              <w:jc w:val="center"/>
+            </w:pPr>
+            <w:r>
+              <w:rPr>
+                <w:rFonts w:ascii="Arial" w:hAnsi="Arial" w:eastAsia="PingFang SC"/>
+                <w:b w:val="0"/>
+                <w:color w:val="17212B"/>
+                <w:sz w:val="13"/>
+              </w:rPr>
+              <w:t>0.5269</w:t>
+            </w:r>
+          </w:p>
+        </w:tc>
+        <w:tc>
+          <w:tcPr>
+            <w:tcW w:type="dxa" w:w="850"/>
+            <w:vAlign w:val="center"/>
+            <w:tcMar>
+              <w:top w:w="95" w:type="dxa"/>
+              <w:bottom w:w="95" w:type="dxa"/>
+              <w:start w:w="90" w:type="dxa"/>
+              <w:end w:w="90" w:type="dxa"/>
+            </w:tcMar>
+          </w:tcPr>
+          <w:p>
+            <w:pPr>
+              <w:spacing w:after="0" w:line="259" w:lineRule="auto"/>
+              <w:jc w:val="center"/>
+            </w:pPr>
+            <w:r>
+              <w:rPr>
+                <w:rFonts w:ascii="Arial" w:hAnsi="Arial" w:eastAsia="PingFang SC"/>
+                <w:b w:val="0"/>
+                <w:color w:val="17212B"/>
+                <w:sz w:val="13"/>
+              </w:rPr>
+              <w:t>0.4810</w:t>
+            </w:r>
+          </w:p>
+        </w:tc>
+        <w:tc>
+          <w:tcPr>
+            <w:tcW w:type="dxa" w:w="1020"/>
+            <w:vAlign w:val="center"/>
+            <w:tcMar>
+              <w:top w:w="95" w:type="dxa"/>
+              <w:bottom w:w="95" w:type="dxa"/>
+              <w:start w:w="90" w:type="dxa"/>
+              <w:end w:w="90" w:type="dxa"/>
+            </w:tcMar>
+          </w:tcPr>
+          <w:p>
+            <w:pPr>
+              <w:spacing w:after="0" w:line="259" w:lineRule="auto"/>
+              <w:jc w:val="center"/>
+            </w:pPr>
+            <w:r>
+              <w:rPr>
+                <w:rFonts w:ascii="Arial" w:hAnsi="Arial" w:eastAsia="PingFang SC"/>
+                <w:b w:val="0"/>
+                <w:color w:val="17212B"/>
+                <w:sz w:val="13"/>
+              </w:rPr>
+              <w:t>0.2106</w:t>
+            </w:r>
+          </w:p>
+        </w:tc>
+        <w:tc>
+          <w:tcPr>
+            <w:tcW w:type="dxa" w:w="1020"/>
+            <w:vAlign w:val="center"/>
+            <w:tcMar>
+              <w:top w:w="95" w:type="dxa"/>
+              <w:bottom w:w="95" w:type="dxa"/>
+              <w:start w:w="90" w:type="dxa"/>
+              <w:end w:w="90" w:type="dxa"/>
+            </w:tcMar>
+          </w:tcPr>
+          <w:p>
+            <w:pPr>
+              <w:spacing w:after="0" w:line="259" w:lineRule="auto"/>
+              <w:jc w:val="center"/>
+            </w:pPr>
+            <w:r>
+              <w:rPr>
+                <w:rFonts w:ascii="Arial" w:hAnsi="Arial" w:eastAsia="PingFang SC"/>
+                <w:b w:val="0"/>
+                <w:color w:val="17212B"/>
+                <w:sz w:val="13"/>
+              </w:rPr>
+              <w:t>2.39M</w:t>
+            </w:r>
+          </w:p>
+        </w:tc>
+        <w:tc>
+          <w:tcPr>
+            <w:tcW w:type="dxa" w:w="737"/>
+            <w:vAlign w:val="center"/>
+            <w:tcMar>
+              <w:top w:w="95" w:type="dxa"/>
+              <w:bottom w:w="95" w:type="dxa"/>
+              <w:start w:w="90" w:type="dxa"/>
+              <w:end w:w="90" w:type="dxa"/>
+            </w:tcMar>
+          </w:tcPr>
+          <w:p>
+            <w:pPr>
+              <w:spacing w:after="0" w:line="259" w:lineRule="auto"/>
+              <w:jc w:val="center"/>
+            </w:pPr>
+            <w:r>
+              <w:rPr>
+                <w:rFonts w:ascii="Arial" w:hAnsi="Arial" w:eastAsia="PingFang SC"/>
+                <w:b w:val="0"/>
+                <w:color w:val="17212B"/>
+                <w:sz w:val="13"/>
+              </w:rPr>
+              <w:t>2.55</w:t>
+            </w:r>
+          </w:p>
+        </w:tc>
+        <w:tc>
+          <w:tcPr>
+            <w:tcW w:type="dxa" w:w="964"/>
+            <w:vAlign w:val="center"/>
+            <w:tcMar>
+              <w:top w:w="95" w:type="dxa"/>
+              <w:bottom w:w="95" w:type="dxa"/>
+              <w:start w:w="90" w:type="dxa"/>
+              <w:end w:w="90" w:type="dxa"/>
+            </w:tcMar>
+          </w:tcPr>
+          <w:p>
+            <w:pPr>
+              <w:spacing w:after="0" w:line="259" w:lineRule="auto"/>
+              <w:jc w:val="center"/>
+            </w:pPr>
+            <w:r>
+              <w:rPr>
+                <w:rFonts w:ascii="Arial" w:hAnsi="Arial" w:eastAsia="PingFang SC"/>
+                <w:b w:val="0"/>
+                <w:color w:val="17212B"/>
+                <w:sz w:val="13"/>
+              </w:rPr>
+              <w:t>5.04 MB</w:t>
+            </w:r>
+          </w:p>
+        </w:tc>
+        <w:tc>
+          <w:tcPr>
+            <w:tcW w:type="dxa" w:w="1191"/>
+            <w:vAlign w:val="center"/>
+            <w:tcMar>
+              <w:top w:w="95" w:type="dxa"/>
+              <w:bottom w:w="95" w:type="dxa"/>
+              <w:start w:w="90" w:type="dxa"/>
+              <w:end w:w="90" w:type="dxa"/>
+            </w:tcMar>
+          </w:tcPr>
+          <w:p>
+            <w:pPr>
+              <w:spacing w:after="0" w:line="259" w:lineRule="auto"/>
+              <w:jc w:val="center"/>
+            </w:pPr>
+            <w:r>
+              <w:rPr>
+                <w:rFonts w:ascii="Arial" w:hAnsi="Arial" w:eastAsia="PingFang SC"/>
+                <w:b w:val="0"/>
+                <w:color w:val="17212B"/>
+                <w:sz w:val="13"/>
+              </w:rPr>
+              <w:t>40.8 ms</w:t>
+            </w:r>
+          </w:p>
+        </w:tc>
+      </w:tr>
+    </w:tbl>
+    <w:p>
+      <w:pPr>
+        <w:spacing w:after="0"/>
+      </w:pPr>
+    </w:p>
+    <w:p>
+      <w:r>
+        <w:t>修正归一化并完成两阶段训练后，mAP50 从 0.1284 恢复到 0.4810。相对 YOLOv8n r010，参数量、GFLOPs 和模型文件分别减少约 20.6%、44.7%、18.9%，但 mAP50 与 mAP50-95 仍分别低 0.0496 和 0.0850；当前 CPU inference 40.8 ms/image，约为 baseline 的 3.9 倍。轻量化体积和理论计算量目标已达到，但精度与当前 CPU latency 尚未超过 baseline，因此暂不替换 YOLOv8n r010。后续应在目标硬件重新测速，并继续研究 neck/head 与高 IoU 定位精度。</w:t>
+      </w:r>
+    </w:p>
+    <w:p>
+      <w:r>
+        <w:t>检测支线已完成 detection dataset 构建、bbox statistics、r020/r015/r010 过滤对比、weed-only 对照、prediction visualization、后处理阈值分析、lightweight baseline 汇总和 MobileNetV3 两阶段优化。由于 common split 以 dense vegetation 为主，项目主线仍是 MobileNetV2ShallowUNet + boundary weighted CE r5_w4 语义分割；YOLO 作为 sparse 场景候选路线。</w:t>
       </w:r>
     </w:p>
     <w:p>
@@ -8760,7 +12308,7 @@
         <w:pStyle w:val="Heading1"/>
       </w:pPr>
       <w:r>
-        <w:t>18 YOLO / U-Net 路线选择标准</w:t>
+        <w:t>19 YOLO / U-Net 路线选择标准</w:t>
       </w:r>
     </w:p>
     <w:p>
@@ -9155,7 +12703,7 @@
         <w:pStyle w:val="Heading1"/>
       </w:pPr>
       <w:r>
-        <w:t>19 给老师汇报用总结</w:t>
+        <w:t>20 给老师汇报用总结</w:t>
       </w:r>
     </w:p>
     <w:p>
@@ -9175,7 +12723,12 @@
     </w:p>
     <w:p>
       <w:r>
-        <w:t>YOLO 检测支线现已完成 bbox 统计、r020/r010 大框过滤实验、weed-only 对照及预测可视化。当前最佳 YOLOv8n crop+weed r010 baseline 的验证集 all-class Precision 为 0.50539、Recall 为 0.58950、mAP50 为 0.53062、mAP50-95 为 0.29557；参数量约 3.01M、GFLOPs 约 4.61、模型大小约 6.21 MB。新增的前 20 张验证图像阈值分析表明，confidence threshold 比 NMS IoU threshold 更影响预测框数量；conf=0.40、iou=0.50 可作为当前可视化候选，但最终阈值需要结合 TP、FP、FN 相关评估。后续可研究 MobileNetV3-YOLOv8n 轻量化检测；在 dense 样本占多数的 common split 上，语义分割仍是当前项目主线。</w:t>
+        <w:t>VCR regression attention router 已完成 Tiny CNN、SE-Tiny CNN、CBAM-Tiny CNN 的 30 epochs × 3 seeds 正式实验。CBAM-Tiny CNN 的 MAE 最低，为 0.0923 ± 0.0133，但 sparse recall 仅 0.1111 ± 0.1925。该实验验证了从原始 G/R/RE/NIR 回归连续 VCR 的初步可行性，但受 non-dense 样本极少和空间数据泄漏风险限制，当前不能替代 NDVI-VCR 规则，也不能部署；它用于未来连接 segmentation 与 detection 两条分支。</w:t>
+      </w:r>
+    </w:p>
+    <w:p>
+      <w:r>
+        <w:t>YOLO 检测支线已完成 mask-to-bbox 数据构建、bbox 统计、r020/r015/r010 过滤对比、weed-only 对照、prediction visualization、后处理阈值分析和 lightweight baseline 汇总。当前最佳 YOLOv8n crop+weed r010 的 mAP50 为 0.53062、mAP50-95 为 0.29557，约 3.01M Params、4.61 GFLOPs、6.21 MB。前 20 张图的框数分析显示 confidence threshold 比 NMS IoU 更影响输出数量；完整验证集平均 F1 的最佳起点约为 conf=0.16，conf=0.40 只适合较干净的展示。MobileNetV3-Small-YOLOv8 经归一化修正和 5+20 epochs 两阶段训练后达到 mAP50=0.4810、mAP50-95=0.2106，参数量和 GFLOPs 分别减少约 20.6% 和 44.7%，但精度仍低、当前 CPU inference 反而更慢，因此不替换 r010 baseline。</w:t>
       </w:r>
     </w:p>
     <w:sectPr>

</xml_diff>